<commit_message>
ApparatusRoom 수정 및 임포트
</commit_message>
<xml_diff>
--- a/기획/공장 맵_방 구조 규칙.docx
+++ b/기획/공장 맵_방 구조 규칙.docx
@@ -291,23 +291,13 @@
           <w:bCs/>
         </w:rPr>
       </w:pPr>
-      <w:proofErr w:type="spellStart"/>
       <w:r>
         <w:rPr>
           <w:rFonts w:hint="eastAsia"/>
           <w:b/>
           <w:bCs/>
         </w:rPr>
-        <w:t>DoorSocket</w:t>
-      </w:r>
-      <w:proofErr w:type="spellEnd"/>
-      <w:r>
-        <w:rPr>
-          <w:rFonts w:hint="eastAsia"/>
-          <w:b/>
-          <w:bCs/>
-        </w:rPr>
-        <w:t>(벽에 난 문 구멍): 150*275</w:t>
+        <w:t>DoorSocket(벽에 난 문 구멍): 150*275</w:t>
       </w:r>
     </w:p>
     <w:p>
@@ -411,19 +401,11 @@
       <w:r>
         <w:t>’</w:t>
       </w:r>
-      <w:proofErr w:type="spellStart"/>
       <w:r>
         <w:rPr>
           <w:rFonts w:hint="eastAsia"/>
         </w:rPr>
-        <w:t>를</w:t>
-      </w:r>
-      <w:proofErr w:type="spellEnd"/>
-      <w:r>
-        <w:rPr>
-          <w:rFonts w:hint="eastAsia"/>
-        </w:rPr>
-        <w:t xml:space="preserve"> 이용하여 열 수 있다.</w:t>
+        <w:t>를 이용하여 열 수 있다.</w:t>
       </w:r>
     </w:p>
     <w:p>
@@ -438,21 +420,7 @@
         <w:rPr>
           <w:rFonts w:hint="eastAsia"/>
         </w:rPr>
-        <w:t xml:space="preserve">코어(장치)는 한 </w:t>
-      </w:r>
-      <w:proofErr w:type="spellStart"/>
-      <w:r>
-        <w:rPr>
-          <w:rFonts w:hint="eastAsia"/>
-        </w:rPr>
-        <w:t>맵에</w:t>
-      </w:r>
-      <w:proofErr w:type="spellEnd"/>
-      <w:r>
-        <w:rPr>
-          <w:rFonts w:hint="eastAsia"/>
-        </w:rPr>
-        <w:t xml:space="preserve"> 하나만 생성될 수 있다.</w:t>
+        <w:t>코어(장치)는 한 맵에 하나만 생성될 수 있다.</w:t>
       </w:r>
     </w:p>
     <w:p>
@@ -559,19 +527,11 @@
       <w:r>
         <w:t>’</w:t>
       </w:r>
-      <w:proofErr w:type="spellStart"/>
       <w:r>
         <w:rPr>
           <w:rFonts w:hint="eastAsia"/>
         </w:rPr>
-        <w:t>끼리는</w:t>
-      </w:r>
-      <w:proofErr w:type="spellEnd"/>
-      <w:r>
-        <w:rPr>
-          <w:rFonts w:hint="eastAsia"/>
-        </w:rPr>
-        <w:t xml:space="preserve"> 바로 연결될 수 없다.</w:t>
+        <w:t>끼리는 바로 연결될 수 없다.</w:t>
       </w:r>
     </w:p>
     <w:p>
@@ -594,19 +554,11 @@
       <w:r>
         <w:t>’</w:t>
       </w:r>
-      <w:proofErr w:type="spellStart"/>
       <w:r>
         <w:rPr>
           <w:rFonts w:hint="eastAsia"/>
         </w:rPr>
-        <w:t>끼리는</w:t>
-      </w:r>
-      <w:proofErr w:type="spellEnd"/>
-      <w:r>
-        <w:rPr>
-          <w:rFonts w:hint="eastAsia"/>
-        </w:rPr>
-        <w:t xml:space="preserve"> 바로 연결될 수 있다.</w:t>
+        <w:t>끼리는 바로 연결될 수 있다.</w:t>
       </w:r>
     </w:p>
     <w:p>
@@ -629,19 +581,11 @@
       <w:r>
         <w:t>’</w:t>
       </w:r>
-      <w:proofErr w:type="spellStart"/>
       <w:r>
         <w:rPr>
           <w:rFonts w:hint="eastAsia"/>
         </w:rPr>
-        <w:t>끼리는</w:t>
-      </w:r>
-      <w:proofErr w:type="spellEnd"/>
-      <w:r>
-        <w:rPr>
-          <w:rFonts w:hint="eastAsia"/>
-        </w:rPr>
-        <w:t xml:space="preserve"> 바로 연결될 수 있다.</w:t>
+        <w:t>끼리는 바로 연결될 수 있다.</w:t>
       </w:r>
     </w:p>
     <w:p>
@@ -699,27 +643,7 @@
                 <w:sz w:val="24"/>
               </w:rPr>
               <w:lastRenderedPageBreak/>
-              <w:t xml:space="preserve">0 </w:t>
-            </w:r>
-            <w:proofErr w:type="spellStart"/>
-            <w:r>
-              <w:rPr>
-                <w:rFonts w:hint="eastAsia"/>
-                <w:b/>
-                <w:bCs/>
-                <w:sz w:val="24"/>
-              </w:rPr>
-              <w:t>MainEntranceRoom</w:t>
-            </w:r>
-            <w:proofErr w:type="spellEnd"/>
-            <w:r>
-              <w:rPr>
-                <w:rFonts w:hint="eastAsia"/>
-                <w:b/>
-                <w:bCs/>
-                <w:sz w:val="24"/>
-              </w:rPr>
-              <w:t xml:space="preserve"> / 메인 입구 방</w:t>
+              <w:t>0 MainEntranceRoom / 메인 입구 방</w:t>
             </w:r>
           </w:p>
         </w:tc>
@@ -1294,27 +1218,7 @@
                 <w:bCs/>
                 <w:sz w:val="24"/>
               </w:rPr>
-              <w:t xml:space="preserve">1 </w:t>
-            </w:r>
-            <w:proofErr w:type="spellStart"/>
-            <w:r>
-              <w:rPr>
-                <w:rFonts w:hint="eastAsia"/>
-                <w:b/>
-                <w:bCs/>
-                <w:sz w:val="24"/>
-              </w:rPr>
-              <w:t>GapRoom</w:t>
-            </w:r>
-            <w:proofErr w:type="spellEnd"/>
-            <w:r>
-              <w:rPr>
-                <w:rFonts w:hint="eastAsia"/>
-                <w:b/>
-                <w:bCs/>
-                <w:sz w:val="24"/>
-              </w:rPr>
-              <w:t xml:space="preserve"> / 끊어진 방</w:t>
+              <w:t>1 GapRoom / 끊어진 방</w:t>
             </w:r>
           </w:p>
         </w:tc>
@@ -1335,6 +1239,9 @@
               <w:jc w:val="center"/>
             </w:pPr>
             <w:r>
+              <w:rPr>
+                <w:noProof/>
+              </w:rPr>
               <w:drawing>
                 <wp:inline distT="0" distB="0" distL="0" distR="0" wp14:anchorId="00A960C8" wp14:editId="0FFD5FA7">
                   <wp:extent cx="3091909" cy="1518249"/>
@@ -1892,27 +1799,7 @@
                 <w:bCs/>
                 <w:sz w:val="24"/>
               </w:rPr>
-              <w:t xml:space="preserve">2 </w:t>
-            </w:r>
-            <w:proofErr w:type="spellStart"/>
-            <w:r>
-              <w:rPr>
-                <w:rFonts w:hint="eastAsia"/>
-                <w:b/>
-                <w:bCs/>
-                <w:sz w:val="24"/>
-              </w:rPr>
-              <w:t>ApparatusRoom</w:t>
-            </w:r>
-            <w:proofErr w:type="spellEnd"/>
-            <w:r>
-              <w:rPr>
-                <w:rFonts w:hint="eastAsia"/>
-                <w:b/>
-                <w:bCs/>
-                <w:sz w:val="24"/>
-              </w:rPr>
-              <w:t xml:space="preserve"> / 장치 방(구조 1, 구조 2)</w:t>
+              <w:t>2 ApparatusRoom / 장치 방(구조 1, 구조 2)</w:t>
             </w:r>
           </w:p>
         </w:tc>
@@ -2093,42 +1980,15 @@
               <w:pStyle w:val="a6"/>
               <w:ind w:left="0"/>
               <w:jc w:val="center"/>
-            </w:pPr>
-            <w:r>
-              <w:rPr>
-                <w:rFonts w:hint="eastAsia"/>
-              </w:rPr>
-              <w:t>12</w:t>
-            </w:r>
-            <w:r>
-              <w:rPr>
-                <w:rFonts w:hint="eastAsia"/>
-              </w:rPr>
-              <w:t>00</w:t>
-            </w:r>
-            <w:r>
-              <w:rPr>
-                <w:rFonts w:hint="eastAsia"/>
-              </w:rPr>
-              <w:t>*7</w:t>
-            </w:r>
-            <w:r>
-              <w:rPr>
-                <w:rFonts w:hint="eastAsia"/>
-              </w:rPr>
-              <w:t>00</w:t>
-            </w:r>
-            <w:r>
-              <w:rPr>
-                <w:rFonts w:hint="eastAsia"/>
-              </w:rPr>
-              <w:t>*5</w:t>
-            </w:r>
-            <w:r>
-              <w:rPr>
-                <w:rFonts w:hint="eastAsia"/>
-              </w:rPr>
-              <w:t>00</w:t>
+              <w:rPr>
+                <w:rFonts w:hint="eastAsia"/>
+              </w:rPr>
+            </w:pPr>
+            <w:r>
+              <w:rPr>
+                <w:rFonts w:hint="eastAsia"/>
+              </w:rPr>
+              <w:t>1300*650*600</w:t>
             </w:r>
           </w:p>
         </w:tc>
@@ -2625,27 +2485,7 @@
                 <w:bCs/>
                 <w:sz w:val="24"/>
               </w:rPr>
-              <w:t xml:space="preserve">3 </w:t>
-            </w:r>
-            <w:proofErr w:type="spellStart"/>
-            <w:r>
-              <w:rPr>
-                <w:rFonts w:hint="eastAsia"/>
-                <w:b/>
-                <w:bCs/>
-                <w:sz w:val="24"/>
-              </w:rPr>
-              <w:t>ServerRoom</w:t>
-            </w:r>
-            <w:proofErr w:type="spellEnd"/>
-            <w:r>
-              <w:rPr>
-                <w:rFonts w:hint="eastAsia"/>
-                <w:b/>
-                <w:bCs/>
-                <w:sz w:val="24"/>
-              </w:rPr>
-              <w:t xml:space="preserve"> / 서버 방</w:t>
+              <w:t>3 ServerRoom / 서버 방</w:t>
             </w:r>
           </w:p>
         </w:tc>
@@ -3192,47 +3032,7 @@
                 <w:sz w:val="24"/>
               </w:rPr>
               <w:lastRenderedPageBreak/>
-              <w:t xml:space="preserve">4 </w:t>
-            </w:r>
-            <w:proofErr w:type="spellStart"/>
-            <w:r>
-              <w:rPr>
-                <w:rFonts w:hint="eastAsia"/>
-                <w:b/>
-                <w:bCs/>
-                <w:sz w:val="24"/>
-              </w:rPr>
-              <w:t>CabinetRoom</w:t>
-            </w:r>
-            <w:proofErr w:type="spellEnd"/>
-            <w:r>
-              <w:rPr>
-                <w:rFonts w:hint="eastAsia"/>
-                <w:b/>
-                <w:bCs/>
-                <w:sz w:val="24"/>
-              </w:rPr>
-              <w:t xml:space="preserve"> / </w:t>
-            </w:r>
-            <w:proofErr w:type="spellStart"/>
-            <w:r>
-              <w:rPr>
-                <w:rFonts w:hint="eastAsia"/>
-                <w:b/>
-                <w:bCs/>
-                <w:sz w:val="24"/>
-              </w:rPr>
-              <w:t>캐비넷</w:t>
-            </w:r>
-            <w:proofErr w:type="spellEnd"/>
-            <w:r>
-              <w:rPr>
-                <w:rFonts w:hint="eastAsia"/>
-                <w:b/>
-                <w:bCs/>
-                <w:sz w:val="24"/>
-              </w:rPr>
-              <w:t xml:space="preserve"> 방</w:t>
+              <w:t>4 CabinetRoom / 캐비넷 방</w:t>
             </w:r>
           </w:p>
         </w:tc>
@@ -3939,35 +3739,7 @@
         <w:rPr>
           <w:rFonts w:hint="eastAsia"/>
         </w:rPr>
-        <w:t xml:space="preserve">: 대각선으로 마주보는 모서리에 최대 2개의 </w:t>
-      </w:r>
-      <w:proofErr w:type="spellStart"/>
-      <w:r>
-        <w:rPr>
-          <w:rFonts w:hint="eastAsia"/>
-        </w:rPr>
-        <w:t>캐비넷이</w:t>
-      </w:r>
-      <w:proofErr w:type="spellEnd"/>
-      <w:r>
-        <w:rPr>
-          <w:rFonts w:hint="eastAsia"/>
-        </w:rPr>
-        <w:t xml:space="preserve"> 생성될 수 있다. </w:t>
-      </w:r>
-      <w:proofErr w:type="spellStart"/>
-      <w:r>
-        <w:rPr>
-          <w:rFonts w:hint="eastAsia"/>
-        </w:rPr>
-        <w:t>캐비넷은</w:t>
-      </w:r>
-      <w:proofErr w:type="spellEnd"/>
-      <w:r>
-        <w:rPr>
-          <w:rFonts w:hint="eastAsia"/>
-        </w:rPr>
-        <w:t xml:space="preserve"> 생성되더라도 열리지 않을 수도 있다.</w:t>
+        <w:t>: 대각선으로 마주보는 모서리에 최대 2개의 캐비넷이 생성될 수 있다. 캐비넷은 생성되더라도 열리지 않을 수도 있다.</w:t>
       </w:r>
     </w:p>
     <w:p>
@@ -5831,21 +5603,7 @@
         <w:rPr>
           <w:rFonts w:hint="eastAsia"/>
         </w:rPr>
-        <w:t xml:space="preserve">: </w:t>
-      </w:r>
-      <w:proofErr w:type="spellStart"/>
-      <w:r>
-        <w:rPr>
-          <w:rFonts w:hint="eastAsia"/>
-        </w:rPr>
-        <w:t>꺾임형</w:t>
-      </w:r>
-      <w:proofErr w:type="spellEnd"/>
-      <w:r>
-        <w:rPr>
-          <w:rFonts w:hint="eastAsia"/>
-        </w:rPr>
-        <w:t xml:space="preserve"> </w:t>
+        <w:t xml:space="preserve">: 꺾임형 </w:t>
       </w:r>
       <w:r>
         <w:t>–</w:t>

</xml_diff>

<commit_message>
CabinetRoom 수정 및 임포트
</commit_message>
<xml_diff>
--- a/기획/공장 맵_방 구조 규칙.docx
+++ b/기획/공장 맵_방 구조 규칙.docx
@@ -3253,11 +3253,14 @@
               <w:rPr>
                 <w:noProof/>
               </w:rPr>
+              <w:t xml:space="preserve"> </w:t>
+            </w:r>
+            <w:r>
               <w:drawing>
-                <wp:inline distT="0" distB="0" distL="0" distR="0" wp14:anchorId="5A2EB68E" wp14:editId="4D1E4D49">
-                  <wp:extent cx="1454499" cy="1440000"/>
-                  <wp:effectExtent l="7302" t="0" r="953" b="952"/>
-                  <wp:docPr id="1211547941" name="그림 1" descr="직사각형, 도표, 사각형, 라인이(가) 표시된 사진&#10;&#10;AI 생성 콘텐츠는 정확하지 않을 수 있습니다."/>
+                <wp:inline distT="0" distB="0" distL="0" distR="0" wp14:anchorId="01B6A13F" wp14:editId="5654A170">
+                  <wp:extent cx="2019582" cy="1829055"/>
+                  <wp:effectExtent l="0" t="0" r="0" b="0"/>
+                  <wp:docPr id="962962814" name="그림 1"/>
                   <wp:cNvGraphicFramePr>
                     <a:graphicFrameLocks xmlns:a="http://schemas.openxmlformats.org/drawingml/2006/main" noChangeAspect="1"/>
                   </wp:cNvGraphicFramePr>
@@ -3265,32 +3268,23 @@
                     <a:graphicData uri="http://schemas.openxmlformats.org/drawingml/2006/picture">
                       <pic:pic xmlns:pic="http://schemas.openxmlformats.org/drawingml/2006/picture">
                         <pic:nvPicPr>
-                          <pic:cNvPr id="845686941" name="그림 1" descr="직사각형, 도표, 사각형, 라인이(가) 표시된 사진&#10;&#10;AI 생성 콘텐츠는 정확하지 않을 수 있습니다."/>
+                          <pic:cNvPr id="962962814" name=""/>
                           <pic:cNvPicPr/>
                         </pic:nvPicPr>
-                        <pic:blipFill rotWithShape="1">
+                        <pic:blipFill>
                           <a:blip r:embed="rId13"/>
-                          <a:srcRect r="67750"/>
                           <a:stretch>
                             <a:fillRect/>
                           </a:stretch>
                         </pic:blipFill>
-                        <pic:spPr bwMode="auto">
-                          <a:xfrm rot="16200000">
+                        <pic:spPr>
+                          <a:xfrm>
                             <a:off x="0" y="0"/>
-                            <a:ext cx="1454499" cy="1440000"/>
+                            <a:ext cx="2019582" cy="1829055"/>
                           </a:xfrm>
                           <a:prstGeom prst="rect">
                             <a:avLst/>
                           </a:prstGeom>
-                          <a:ln>
-                            <a:noFill/>
-                          </a:ln>
-                          <a:extLst>
-                            <a:ext uri="{53640926-AAD7-44D8-BBD7-CCE9431645EC}">
-                              <a14:shadowObscured xmlns:a14="http://schemas.microsoft.com/office/drawing/2010/main"/>
-                            </a:ext>
-                          </a:extLst>
                         </pic:spPr>
                       </pic:pic>
                     </a:graphicData>
@@ -3315,10 +3309,10 @@
                 <w:noProof/>
               </w:rPr>
               <w:drawing>
-                <wp:inline distT="0" distB="0" distL="0" distR="0" wp14:anchorId="4E406E1B" wp14:editId="18CCDB47">
-                  <wp:extent cx="1438476" cy="1457528"/>
+                <wp:inline distT="0" distB="0" distL="0" distR="0" wp14:anchorId="066F544B" wp14:editId="78017FCF">
+                  <wp:extent cx="1438476" cy="1448002"/>
                   <wp:effectExtent l="0" t="0" r="9525" b="0"/>
-                  <wp:docPr id="1685143074" name="그림 1"/>
+                  <wp:docPr id="1536322158" name="그림 1"/>
                   <wp:cNvGraphicFramePr>
                     <a:graphicFrameLocks xmlns:a="http://schemas.openxmlformats.org/drawingml/2006/main" noChangeAspect="1"/>
                   </wp:cNvGraphicFramePr>
@@ -3326,7 +3320,7 @@
                     <a:graphicData uri="http://schemas.openxmlformats.org/drawingml/2006/picture">
                       <pic:pic xmlns:pic="http://schemas.openxmlformats.org/drawingml/2006/picture">
                         <pic:nvPicPr>
-                          <pic:cNvPr id="1685143074" name=""/>
+                          <pic:cNvPr id="1536322158" name=""/>
                           <pic:cNvPicPr/>
                         </pic:nvPicPr>
                         <pic:blipFill>
@@ -3338,7 +3332,7 @@
                         <pic:spPr>
                           <a:xfrm>
                             <a:off x="0" y="0"/>
-                            <a:ext cx="1438476" cy="1457528"/>
+                            <a:ext cx="1438476" cy="1448002"/>
                           </a:xfrm>
                           <a:prstGeom prst="rect">
                             <a:avLst/>
@@ -3471,7 +3465,13 @@
               <w:rPr>
                 <w:rFonts w:hint="eastAsia"/>
               </w:rPr>
-              <w:t>12</w:t>
+              <w:t>1</w:t>
+            </w:r>
+            <w:r>
+              <w:rPr>
+                <w:rFonts w:hint="eastAsia"/>
+              </w:rPr>
+              <w:t>3</w:t>
             </w:r>
             <w:r>
               <w:rPr>
@@ -3483,7 +3483,13 @@
               <w:rPr>
                 <w:rFonts w:hint="eastAsia"/>
               </w:rPr>
-              <w:t>*12</w:t>
+              <w:t>*1</w:t>
+            </w:r>
+            <w:r>
+              <w:rPr>
+                <w:rFonts w:hint="eastAsia"/>
+              </w:rPr>
+              <w:t>3</w:t>
             </w:r>
             <w:r>
               <w:rPr>
@@ -3495,7 +3501,13 @@
               <w:rPr>
                 <w:rFonts w:hint="eastAsia"/>
               </w:rPr>
-              <w:t>*15</w:t>
+              <w:t>*1</w:t>
+            </w:r>
+            <w:r>
+              <w:rPr>
+                <w:rFonts w:hint="eastAsia"/>
+              </w:rPr>
+              <w:t>8</w:t>
             </w:r>
             <w:r>
               <w:rPr>
@@ -4011,6 +4023,7 @@
                 <w:noProof/>
                 <w:sz w:val="24"/>
               </w:rPr>
+              <w:lastRenderedPageBreak/>
               <w:t>5 StorageRoom_Rect / 창고_직사각형</w:t>
             </w:r>
           </w:p>
@@ -4172,7 +4185,6 @@
               <w:rPr>
                 <w:rFonts w:hint="eastAsia"/>
               </w:rPr>
-              <w:lastRenderedPageBreak/>
               <w:t>아이템 생성 여부</w:t>
             </w:r>
           </w:p>
@@ -5211,6 +5223,7 @@
               <w:rPr>
                 <w:noProof/>
               </w:rPr>
+              <w:lastRenderedPageBreak/>
               <w:drawing>
                 <wp:inline distT="0" distB="0" distL="0" distR="0" wp14:anchorId="7D5AB49E" wp14:editId="1BD00384">
                   <wp:extent cx="2657846" cy="1838582"/>
@@ -5302,7 +5315,6 @@
               <w:rPr>
                 <w:rFonts w:hint="eastAsia"/>
               </w:rPr>
-              <w:lastRenderedPageBreak/>
               <w:t>: 위에서 봤을 때</w:t>
             </w:r>
             <w:r>
@@ -5342,7 +5354,6 @@
               <w:rPr>
                 <w:rFonts w:hint="eastAsia"/>
               </w:rPr>
-              <w:lastRenderedPageBreak/>
               <w:t xml:space="preserve">방 사이즈 </w:t>
             </w:r>
             <w:r>
@@ -6436,6 +6447,7 @@
               <w:rPr>
                 <w:rFonts w:hint="eastAsia"/>
               </w:rPr>
+              <w:lastRenderedPageBreak/>
               <w:t>문 최소/최대 생성 개수</w:t>
             </w:r>
           </w:p>
@@ -6528,7 +6540,6 @@
               <w:rPr>
                 <w:rFonts w:hint="eastAsia"/>
               </w:rPr>
-              <w:lastRenderedPageBreak/>
               <w:t>1.</w:t>
             </w:r>
             <w:r>

</xml_diff>

<commit_message>
StorageRoom_Rect 수정 및 임포트
</commit_message>
<xml_diff>
--- a/기획/공장 맵_방 구조 규칙.docx
+++ b/기획/공장 맵_방 구조 규칙.docx
@@ -64,28 +64,12 @@
     </w:p>
     <w:p/>
     <w:p>
-      <w:proofErr w:type="gramStart"/>
       <w:r>
         <w:rPr>
           <w:rFonts w:hint="eastAsia"/>
         </w:rPr>
-        <w:t>[ 참고</w:t>
+        <w:t>[ 참고 사항 ]</w:t>
       </w:r>
-      <w:proofErr w:type="gramEnd"/>
-      <w:r>
-        <w:rPr>
-          <w:rFonts w:hint="eastAsia"/>
-        </w:rPr>
-        <w:t xml:space="preserve"> </w:t>
-      </w:r>
-      <w:proofErr w:type="gramStart"/>
-      <w:r>
-        <w:rPr>
-          <w:rFonts w:hint="eastAsia"/>
-        </w:rPr>
-        <w:t>사항 ]</w:t>
-      </w:r>
-      <w:proofErr w:type="gramEnd"/>
     </w:p>
     <w:p>
       <w:pPr>
@@ -307,23 +291,13 @@
           <w:bCs/>
         </w:rPr>
       </w:pPr>
-      <w:proofErr w:type="spellStart"/>
       <w:r>
         <w:rPr>
           <w:rFonts w:hint="eastAsia"/>
           <w:b/>
           <w:bCs/>
         </w:rPr>
-        <w:t>DoorSocket</w:t>
-      </w:r>
-      <w:proofErr w:type="spellEnd"/>
-      <w:r>
-        <w:rPr>
-          <w:rFonts w:hint="eastAsia"/>
-          <w:b/>
-          <w:bCs/>
-        </w:rPr>
-        <w:t>(벽에 난 문 구멍): 150*275</w:t>
+        <w:t>DoorSocket(벽에 난 문 구멍): 150*275</w:t>
       </w:r>
     </w:p>
     <w:p>
@@ -358,7 +332,6 @@
     </w:p>
     <w:p/>
     <w:p>
-      <w:proofErr w:type="gramStart"/>
       <w:r>
         <w:rPr>
           <w:rFonts w:hint="eastAsia"/>
@@ -375,14 +348,7 @@
         <w:rPr>
           <w:rFonts w:hint="eastAsia"/>
         </w:rPr>
-        <w:t>모든</w:t>
-      </w:r>
-      <w:proofErr w:type="gramEnd"/>
-      <w:r>
-        <w:rPr>
-          <w:rFonts w:hint="eastAsia"/>
-        </w:rPr>
-        <w:t xml:space="preserve"> 스테이지 </w:t>
+        <w:t xml:space="preserve">모든 스테이지 </w:t>
       </w:r>
       <w:r>
         <w:rPr>
@@ -400,14 +366,7 @@
         <w:rPr>
           <w:rFonts w:hint="eastAsia"/>
         </w:rPr>
-        <w:t xml:space="preserve"> &amp; </w:t>
-      </w:r>
-      <w:proofErr w:type="gramStart"/>
-      <w:r>
-        <w:rPr>
-          <w:rFonts w:hint="eastAsia"/>
-        </w:rPr>
-        <w:t>규칙</w:t>
+        <w:t xml:space="preserve"> &amp; 규칙</w:t>
       </w:r>
       <w:r>
         <w:rPr>
@@ -415,7 +374,6 @@
         </w:rPr>
         <w:t xml:space="preserve"> ]</w:t>
       </w:r>
-      <w:proofErr w:type="gramEnd"/>
     </w:p>
     <w:p>
       <w:pPr>
@@ -443,19 +401,11 @@
       <w:r>
         <w:t>’</w:t>
       </w:r>
-      <w:proofErr w:type="spellStart"/>
       <w:r>
         <w:rPr>
           <w:rFonts w:hint="eastAsia"/>
         </w:rPr>
-        <w:t>를</w:t>
-      </w:r>
-      <w:proofErr w:type="spellEnd"/>
-      <w:r>
-        <w:rPr>
-          <w:rFonts w:hint="eastAsia"/>
-        </w:rPr>
-        <w:t xml:space="preserve"> 이용하여 열 수 있다.</w:t>
+        <w:t>를 이용하여 열 수 있다.</w:t>
       </w:r>
     </w:p>
     <w:p>
@@ -470,21 +420,7 @@
         <w:rPr>
           <w:rFonts w:hint="eastAsia"/>
         </w:rPr>
-        <w:t xml:space="preserve">코어(장치)는 한 </w:t>
-      </w:r>
-      <w:proofErr w:type="spellStart"/>
-      <w:r>
-        <w:rPr>
-          <w:rFonts w:hint="eastAsia"/>
-        </w:rPr>
-        <w:t>맵에</w:t>
-      </w:r>
-      <w:proofErr w:type="spellEnd"/>
-      <w:r>
-        <w:rPr>
-          <w:rFonts w:hint="eastAsia"/>
-        </w:rPr>
-        <w:t xml:space="preserve"> 하나만 생성될 수 있다.</w:t>
+        <w:t>코어(장치)는 한 맵에 하나만 생성될 수 있다.</w:t>
       </w:r>
     </w:p>
     <w:p>
@@ -591,19 +527,11 @@
       <w:r>
         <w:t>’</w:t>
       </w:r>
-      <w:proofErr w:type="spellStart"/>
       <w:r>
         <w:rPr>
           <w:rFonts w:hint="eastAsia"/>
         </w:rPr>
-        <w:t>끼리는</w:t>
-      </w:r>
-      <w:proofErr w:type="spellEnd"/>
-      <w:r>
-        <w:rPr>
-          <w:rFonts w:hint="eastAsia"/>
-        </w:rPr>
-        <w:t xml:space="preserve"> 바로 연결될 수 없다.</w:t>
+        <w:t>끼리는 바로 연결될 수 없다.</w:t>
       </w:r>
     </w:p>
     <w:p>
@@ -626,19 +554,11 @@
       <w:r>
         <w:t>’</w:t>
       </w:r>
-      <w:proofErr w:type="spellStart"/>
       <w:r>
         <w:rPr>
           <w:rFonts w:hint="eastAsia"/>
         </w:rPr>
-        <w:t>끼리는</w:t>
-      </w:r>
-      <w:proofErr w:type="spellEnd"/>
-      <w:r>
-        <w:rPr>
-          <w:rFonts w:hint="eastAsia"/>
-        </w:rPr>
-        <w:t xml:space="preserve"> 바로 연결될 수 있다.</w:t>
+        <w:t>끼리는 바로 연결될 수 있다.</w:t>
       </w:r>
     </w:p>
     <w:p>
@@ -661,19 +581,11 @@
       <w:r>
         <w:t>’</w:t>
       </w:r>
-      <w:proofErr w:type="spellStart"/>
       <w:r>
         <w:rPr>
           <w:rFonts w:hint="eastAsia"/>
         </w:rPr>
-        <w:t>끼리는</w:t>
-      </w:r>
-      <w:proofErr w:type="spellEnd"/>
-      <w:r>
-        <w:rPr>
-          <w:rFonts w:hint="eastAsia"/>
-        </w:rPr>
-        <w:t xml:space="preserve"> 바로 연결될 수 있다.</w:t>
+        <w:t>끼리는 바로 연결될 수 있다.</w:t>
       </w:r>
     </w:p>
     <w:p>
@@ -731,38 +643,7 @@
                 <w:sz w:val="24"/>
               </w:rPr>
               <w:lastRenderedPageBreak/>
-              <w:t xml:space="preserve">0 </w:t>
-            </w:r>
-            <w:proofErr w:type="spellStart"/>
-            <w:proofErr w:type="gramStart"/>
-            <w:r>
-              <w:rPr>
-                <w:rFonts w:hint="eastAsia"/>
-                <w:b/>
-                <w:bCs/>
-                <w:sz w:val="24"/>
-              </w:rPr>
-              <w:t>MainEntranceRoom</w:t>
-            </w:r>
-            <w:proofErr w:type="spellEnd"/>
-            <w:r>
-              <w:rPr>
-                <w:rFonts w:hint="eastAsia"/>
-                <w:b/>
-                <w:bCs/>
-                <w:sz w:val="24"/>
-              </w:rPr>
-              <w:t xml:space="preserve"> /</w:t>
-            </w:r>
-            <w:proofErr w:type="gramEnd"/>
-            <w:r>
-              <w:rPr>
-                <w:rFonts w:hint="eastAsia"/>
-                <w:b/>
-                <w:bCs/>
-                <w:sz w:val="24"/>
-              </w:rPr>
-              <w:t xml:space="preserve"> 메인 입구 방</w:t>
+              <w:t>0 MainEntranceRoom / 메인 입구 방</w:t>
             </w:r>
           </w:p>
         </w:tc>
@@ -1337,38 +1218,7 @@
                 <w:bCs/>
                 <w:sz w:val="24"/>
               </w:rPr>
-              <w:t xml:space="preserve">1 </w:t>
-            </w:r>
-            <w:proofErr w:type="spellStart"/>
-            <w:proofErr w:type="gramStart"/>
-            <w:r>
-              <w:rPr>
-                <w:rFonts w:hint="eastAsia"/>
-                <w:b/>
-                <w:bCs/>
-                <w:sz w:val="24"/>
-              </w:rPr>
-              <w:t>GapRoom</w:t>
-            </w:r>
-            <w:proofErr w:type="spellEnd"/>
-            <w:r>
-              <w:rPr>
-                <w:rFonts w:hint="eastAsia"/>
-                <w:b/>
-                <w:bCs/>
-                <w:sz w:val="24"/>
-              </w:rPr>
-              <w:t xml:space="preserve"> /</w:t>
-            </w:r>
-            <w:proofErr w:type="gramEnd"/>
-            <w:r>
-              <w:rPr>
-                <w:rFonts w:hint="eastAsia"/>
-                <w:b/>
-                <w:bCs/>
-                <w:sz w:val="24"/>
-              </w:rPr>
-              <w:t xml:space="preserve"> 끊어진 방</w:t>
+              <w:t>1 GapRoom / 끊어진 방</w:t>
             </w:r>
           </w:p>
         </w:tc>
@@ -1949,38 +1799,7 @@
                 <w:bCs/>
                 <w:sz w:val="24"/>
               </w:rPr>
-              <w:t xml:space="preserve">2 </w:t>
-            </w:r>
-            <w:proofErr w:type="spellStart"/>
-            <w:proofErr w:type="gramStart"/>
-            <w:r>
-              <w:rPr>
-                <w:rFonts w:hint="eastAsia"/>
-                <w:b/>
-                <w:bCs/>
-                <w:sz w:val="24"/>
-              </w:rPr>
-              <w:t>ApparatusRoom</w:t>
-            </w:r>
-            <w:proofErr w:type="spellEnd"/>
-            <w:r>
-              <w:rPr>
-                <w:rFonts w:hint="eastAsia"/>
-                <w:b/>
-                <w:bCs/>
-                <w:sz w:val="24"/>
-              </w:rPr>
-              <w:t xml:space="preserve"> /</w:t>
-            </w:r>
-            <w:proofErr w:type="gramEnd"/>
-            <w:r>
-              <w:rPr>
-                <w:rFonts w:hint="eastAsia"/>
-                <w:b/>
-                <w:bCs/>
-                <w:sz w:val="24"/>
-              </w:rPr>
-              <w:t xml:space="preserve"> 장치 방(구조 1, 구조 2)</w:t>
+              <w:t>2 ApparatusRoom / 장치 방(구조 1, 구조 2)</w:t>
             </w:r>
           </w:p>
         </w:tc>
@@ -2585,38 +2404,7 @@
                 <w:bCs/>
                 <w:sz w:val="24"/>
               </w:rPr>
-              <w:t xml:space="preserve">3 </w:t>
-            </w:r>
-            <w:proofErr w:type="spellStart"/>
-            <w:proofErr w:type="gramStart"/>
-            <w:r>
-              <w:rPr>
-                <w:rFonts w:hint="eastAsia"/>
-                <w:b/>
-                <w:bCs/>
-                <w:sz w:val="24"/>
-              </w:rPr>
-              <w:t>ServerRoom</w:t>
-            </w:r>
-            <w:proofErr w:type="spellEnd"/>
-            <w:r>
-              <w:rPr>
-                <w:rFonts w:hint="eastAsia"/>
-                <w:b/>
-                <w:bCs/>
-                <w:sz w:val="24"/>
-              </w:rPr>
-              <w:t xml:space="preserve"> /</w:t>
-            </w:r>
-            <w:proofErr w:type="gramEnd"/>
-            <w:r>
-              <w:rPr>
-                <w:rFonts w:hint="eastAsia"/>
-                <w:b/>
-                <w:bCs/>
-                <w:sz w:val="24"/>
-              </w:rPr>
-              <w:t xml:space="preserve"> 서버 방</w:t>
+              <w:t>3 ServerRoom / 서버 방</w:t>
             </w:r>
           </w:p>
         </w:tc>
@@ -3175,58 +2963,7 @@
                 <w:bCs/>
                 <w:sz w:val="24"/>
               </w:rPr>
-              <w:t xml:space="preserve">4 </w:t>
-            </w:r>
-            <w:proofErr w:type="spellStart"/>
-            <w:proofErr w:type="gramStart"/>
-            <w:r>
-              <w:rPr>
-                <w:rFonts w:hint="eastAsia"/>
-                <w:b/>
-                <w:bCs/>
-                <w:sz w:val="24"/>
-              </w:rPr>
-              <w:t>CabinetRoom</w:t>
-            </w:r>
-            <w:proofErr w:type="spellEnd"/>
-            <w:r>
-              <w:rPr>
-                <w:rFonts w:hint="eastAsia"/>
-                <w:b/>
-                <w:bCs/>
-                <w:sz w:val="24"/>
-              </w:rPr>
-              <w:t xml:space="preserve"> /</w:t>
-            </w:r>
-            <w:proofErr w:type="gramEnd"/>
-            <w:r>
-              <w:rPr>
-                <w:rFonts w:hint="eastAsia"/>
-                <w:b/>
-                <w:bCs/>
-                <w:sz w:val="24"/>
-              </w:rPr>
-              <w:t xml:space="preserve"> </w:t>
-            </w:r>
-            <w:proofErr w:type="spellStart"/>
-            <w:r>
-              <w:rPr>
-                <w:rFonts w:hint="eastAsia"/>
-                <w:b/>
-                <w:bCs/>
-                <w:sz w:val="24"/>
-              </w:rPr>
-              <w:t>캐비넷</w:t>
-            </w:r>
-            <w:proofErr w:type="spellEnd"/>
-            <w:r>
-              <w:rPr>
-                <w:rFonts w:hint="eastAsia"/>
-                <w:b/>
-                <w:bCs/>
-                <w:sz w:val="24"/>
-              </w:rPr>
-              <w:t xml:space="preserve"> 방</w:t>
+              <w:t>4 CabinetRoom / 캐비넷 방</w:t>
             </w:r>
           </w:p>
         </w:tc>
@@ -3970,35 +3707,7 @@
         <w:rPr>
           <w:rFonts w:hint="eastAsia"/>
         </w:rPr>
-        <w:t xml:space="preserve">: 대각선으로 마주보는 모서리에 최대 2개의 </w:t>
-      </w:r>
-      <w:proofErr w:type="spellStart"/>
-      <w:r>
-        <w:rPr>
-          <w:rFonts w:hint="eastAsia"/>
-        </w:rPr>
-        <w:t>캐비넷이</w:t>
-      </w:r>
-      <w:proofErr w:type="spellEnd"/>
-      <w:r>
-        <w:rPr>
-          <w:rFonts w:hint="eastAsia"/>
-        </w:rPr>
-        <w:t xml:space="preserve"> 생성될 수 있다. </w:t>
-      </w:r>
-      <w:proofErr w:type="spellStart"/>
-      <w:r>
-        <w:rPr>
-          <w:rFonts w:hint="eastAsia"/>
-        </w:rPr>
-        <w:t>캐비넷은</w:t>
-      </w:r>
-      <w:proofErr w:type="spellEnd"/>
-      <w:r>
-        <w:rPr>
-          <w:rFonts w:hint="eastAsia"/>
-        </w:rPr>
-        <w:t xml:space="preserve"> 생성되더라도 열리지 않을 수도 있다.</w:t>
+        <w:t>: 대각선으로 마주보는 모서리에 최대 2개의 캐비넷이 생성될 수 있다. 캐비넷은 생성되더라도 열리지 않을 수도 있다.</w:t>
       </w:r>
     </w:p>
     <w:p>
@@ -4076,10 +3785,10 @@
                 <w:noProof/>
               </w:rPr>
               <w:drawing>
-                <wp:inline distT="0" distB="0" distL="0" distR="0" wp14:anchorId="67AEA67F" wp14:editId="3236573D">
-                  <wp:extent cx="2133898" cy="1076475"/>
-                  <wp:effectExtent l="0" t="0" r="0" b="9525"/>
-                  <wp:docPr id="1602645480" name="그림 1"/>
+                <wp:inline distT="0" distB="0" distL="0" distR="0" wp14:anchorId="74170433" wp14:editId="32090A6B">
+                  <wp:extent cx="2772162" cy="1905266"/>
+                  <wp:effectExtent l="0" t="0" r="9525" b="0"/>
+                  <wp:docPr id="1181075830" name="그림 1"/>
                   <wp:cNvGraphicFramePr>
                     <a:graphicFrameLocks xmlns:a="http://schemas.openxmlformats.org/drawingml/2006/main" noChangeAspect="1"/>
                   </wp:cNvGraphicFramePr>
@@ -4087,7 +3796,7 @@
                     <a:graphicData uri="http://schemas.openxmlformats.org/drawingml/2006/picture">
                       <pic:pic xmlns:pic="http://schemas.openxmlformats.org/drawingml/2006/picture">
                         <pic:nvPicPr>
-                          <pic:cNvPr id="1602645480" name=""/>
+                          <pic:cNvPr id="1181075830" name=""/>
                           <pic:cNvPicPr/>
                         </pic:nvPicPr>
                         <pic:blipFill>
@@ -4099,7 +3808,7 @@
                         <pic:spPr>
                           <a:xfrm>
                             <a:off x="0" y="0"/>
-                            <a:ext cx="2133898" cy="1076475"/>
+                            <a:ext cx="2772162" cy="1905266"/>
                           </a:xfrm>
                           <a:prstGeom prst="rect">
                             <a:avLst/>
@@ -5105,6 +4814,7 @@
               <w:rPr>
                 <w:rFonts w:hint="eastAsia"/>
               </w:rPr>
+              <w:lastRenderedPageBreak/>
               <w:t>문 최소/최대 생성 개수</w:t>
             </w:r>
           </w:p>
@@ -5250,7 +4960,6 @@
               <w:rPr>
                 <w:noProof/>
               </w:rPr>
-              <w:lastRenderedPageBreak/>
               <w:drawing>
                 <wp:inline distT="0" distB="0" distL="0" distR="0" wp14:anchorId="7D5AB49E" wp14:editId="1BD00384">
                   <wp:extent cx="2657846" cy="1838582"/>
@@ -5861,21 +5570,7 @@
         <w:rPr>
           <w:rFonts w:hint="eastAsia"/>
         </w:rPr>
-        <w:t xml:space="preserve">: </w:t>
-      </w:r>
-      <w:proofErr w:type="spellStart"/>
-      <w:r>
-        <w:rPr>
-          <w:rFonts w:hint="eastAsia"/>
-        </w:rPr>
-        <w:t>꺾임형</w:t>
-      </w:r>
-      <w:proofErr w:type="spellEnd"/>
-      <w:r>
-        <w:rPr>
-          <w:rFonts w:hint="eastAsia"/>
-        </w:rPr>
-        <w:t xml:space="preserve"> </w:t>
+        <w:t xml:space="preserve">: 꺾임형 </w:t>
       </w:r>
       <w:r>
         <w:t>–</w:t>
@@ -6194,6 +5889,7 @@
               <w:rPr>
                 <w:rFonts w:hint="eastAsia"/>
               </w:rPr>
+              <w:lastRenderedPageBreak/>
               <w:t>비상구 생성 여부</w:t>
             </w:r>
           </w:p>
@@ -6474,7 +6170,6 @@
               <w:rPr>
                 <w:rFonts w:hint="eastAsia"/>
               </w:rPr>
-              <w:lastRenderedPageBreak/>
               <w:t>문 최소/최대 생성 개수</w:t>
             </w:r>
           </w:p>
@@ -7190,6 +6885,7 @@
                 <w:noProof/>
                 <w:sz w:val="24"/>
               </w:rPr>
+              <w:lastRenderedPageBreak/>
               <w:t>10 RailCatwalk / 난간 통로</w:t>
             </w:r>
           </w:p>
@@ -7214,7 +6910,6 @@
               <w:rPr>
                 <w:noProof/>
               </w:rPr>
-              <w:lastRenderedPageBreak/>
               <w:drawing>
                 <wp:inline distT="0" distB="0" distL="0" distR="0" wp14:anchorId="48C8EC82" wp14:editId="274EFAA8">
                   <wp:extent cx="1076475" cy="1857634"/>

</xml_diff>

<commit_message>
StorageRoom_Corner 수정 및 임포트
</commit_message>
<xml_diff>
--- a/기획/공장 맵_방 구조 규칙.docx
+++ b/기획/공장 맵_방 구조 규칙.docx
@@ -64,12 +64,28 @@
     </w:p>
     <w:p/>
     <w:p>
+      <w:proofErr w:type="gramStart"/>
       <w:r>
         <w:rPr>
           <w:rFonts w:hint="eastAsia"/>
         </w:rPr>
-        <w:t>[ 참고 사항 ]</w:t>
+        <w:t>[ 참고</w:t>
       </w:r>
+      <w:proofErr w:type="gramEnd"/>
+      <w:r>
+        <w:rPr>
+          <w:rFonts w:hint="eastAsia"/>
+        </w:rPr>
+        <w:t xml:space="preserve"> </w:t>
+      </w:r>
+      <w:proofErr w:type="gramStart"/>
+      <w:r>
+        <w:rPr>
+          <w:rFonts w:hint="eastAsia"/>
+        </w:rPr>
+        <w:t>사항 ]</w:t>
+      </w:r>
+      <w:proofErr w:type="gramEnd"/>
     </w:p>
     <w:p>
       <w:pPr>
@@ -291,13 +307,23 @@
           <w:bCs/>
         </w:rPr>
       </w:pPr>
+      <w:proofErr w:type="spellStart"/>
       <w:r>
         <w:rPr>
           <w:rFonts w:hint="eastAsia"/>
           <w:b/>
           <w:bCs/>
         </w:rPr>
-        <w:t>DoorSocket(벽에 난 문 구멍): 150*275</w:t>
+        <w:t>DoorSocket</w:t>
+      </w:r>
+      <w:proofErr w:type="spellEnd"/>
+      <w:r>
+        <w:rPr>
+          <w:rFonts w:hint="eastAsia"/>
+          <w:b/>
+          <w:bCs/>
+        </w:rPr>
+        <w:t>(벽에 난 문 구멍): 150*275</w:t>
       </w:r>
     </w:p>
     <w:p>
@@ -332,6 +358,7 @@
     </w:p>
     <w:p/>
     <w:p>
+      <w:proofErr w:type="gramStart"/>
       <w:r>
         <w:rPr>
           <w:rFonts w:hint="eastAsia"/>
@@ -348,7 +375,14 @@
         <w:rPr>
           <w:rFonts w:hint="eastAsia"/>
         </w:rPr>
-        <w:t xml:space="preserve">모든 스테이지 </w:t>
+        <w:t>모든</w:t>
+      </w:r>
+      <w:proofErr w:type="gramEnd"/>
+      <w:r>
+        <w:rPr>
+          <w:rFonts w:hint="eastAsia"/>
+        </w:rPr>
+        <w:t xml:space="preserve"> 스테이지 </w:t>
       </w:r>
       <w:r>
         <w:rPr>
@@ -366,7 +400,14 @@
         <w:rPr>
           <w:rFonts w:hint="eastAsia"/>
         </w:rPr>
-        <w:t xml:space="preserve"> &amp; 규칙</w:t>
+        <w:t xml:space="preserve"> &amp; </w:t>
+      </w:r>
+      <w:proofErr w:type="gramStart"/>
+      <w:r>
+        <w:rPr>
+          <w:rFonts w:hint="eastAsia"/>
+        </w:rPr>
+        <w:t>규칙</w:t>
       </w:r>
       <w:r>
         <w:rPr>
@@ -374,6 +415,7 @@
         </w:rPr>
         <w:t xml:space="preserve"> ]</w:t>
       </w:r>
+      <w:proofErr w:type="gramEnd"/>
     </w:p>
     <w:p>
       <w:pPr>
@@ -401,11 +443,19 @@
       <w:r>
         <w:t>’</w:t>
       </w:r>
+      <w:proofErr w:type="spellStart"/>
       <w:r>
         <w:rPr>
           <w:rFonts w:hint="eastAsia"/>
         </w:rPr>
-        <w:t>를 이용하여 열 수 있다.</w:t>
+        <w:t>를</w:t>
+      </w:r>
+      <w:proofErr w:type="spellEnd"/>
+      <w:r>
+        <w:rPr>
+          <w:rFonts w:hint="eastAsia"/>
+        </w:rPr>
+        <w:t xml:space="preserve"> 이용하여 열 수 있다.</w:t>
       </w:r>
     </w:p>
     <w:p>
@@ -420,7 +470,21 @@
         <w:rPr>
           <w:rFonts w:hint="eastAsia"/>
         </w:rPr>
-        <w:t>코어(장치)는 한 맵에 하나만 생성될 수 있다.</w:t>
+        <w:t xml:space="preserve">코어(장치)는 한 </w:t>
+      </w:r>
+      <w:proofErr w:type="spellStart"/>
+      <w:r>
+        <w:rPr>
+          <w:rFonts w:hint="eastAsia"/>
+        </w:rPr>
+        <w:t>맵에</w:t>
+      </w:r>
+      <w:proofErr w:type="spellEnd"/>
+      <w:r>
+        <w:rPr>
+          <w:rFonts w:hint="eastAsia"/>
+        </w:rPr>
+        <w:t xml:space="preserve"> 하나만 생성될 수 있다.</w:t>
       </w:r>
     </w:p>
     <w:p>
@@ -527,11 +591,19 @@
       <w:r>
         <w:t>’</w:t>
       </w:r>
+      <w:proofErr w:type="spellStart"/>
       <w:r>
         <w:rPr>
           <w:rFonts w:hint="eastAsia"/>
         </w:rPr>
-        <w:t>끼리는 바로 연결될 수 없다.</w:t>
+        <w:t>끼리는</w:t>
+      </w:r>
+      <w:proofErr w:type="spellEnd"/>
+      <w:r>
+        <w:rPr>
+          <w:rFonts w:hint="eastAsia"/>
+        </w:rPr>
+        <w:t xml:space="preserve"> 바로 연결될 수 없다.</w:t>
       </w:r>
     </w:p>
     <w:p>
@@ -554,11 +626,19 @@
       <w:r>
         <w:t>’</w:t>
       </w:r>
+      <w:proofErr w:type="spellStart"/>
       <w:r>
         <w:rPr>
           <w:rFonts w:hint="eastAsia"/>
         </w:rPr>
-        <w:t>끼리는 바로 연결될 수 있다.</w:t>
+        <w:t>끼리는</w:t>
+      </w:r>
+      <w:proofErr w:type="spellEnd"/>
+      <w:r>
+        <w:rPr>
+          <w:rFonts w:hint="eastAsia"/>
+        </w:rPr>
+        <w:t xml:space="preserve"> 바로 연결될 수 있다.</w:t>
       </w:r>
     </w:p>
     <w:p>
@@ -581,11 +661,19 @@
       <w:r>
         <w:t>’</w:t>
       </w:r>
+      <w:proofErr w:type="spellStart"/>
       <w:r>
         <w:rPr>
           <w:rFonts w:hint="eastAsia"/>
         </w:rPr>
-        <w:t>끼리는 바로 연결될 수 있다.</w:t>
+        <w:t>끼리는</w:t>
+      </w:r>
+      <w:proofErr w:type="spellEnd"/>
+      <w:r>
+        <w:rPr>
+          <w:rFonts w:hint="eastAsia"/>
+        </w:rPr>
+        <w:t xml:space="preserve"> 바로 연결될 수 있다.</w:t>
       </w:r>
     </w:p>
     <w:p>
@@ -643,7 +731,38 @@
                 <w:sz w:val="24"/>
               </w:rPr>
               <w:lastRenderedPageBreak/>
-              <w:t>0 MainEntranceRoom / 메인 입구 방</w:t>
+              <w:t xml:space="preserve">0 </w:t>
+            </w:r>
+            <w:proofErr w:type="spellStart"/>
+            <w:proofErr w:type="gramStart"/>
+            <w:r>
+              <w:rPr>
+                <w:rFonts w:hint="eastAsia"/>
+                <w:b/>
+                <w:bCs/>
+                <w:sz w:val="24"/>
+              </w:rPr>
+              <w:t>MainEntranceRoom</w:t>
+            </w:r>
+            <w:proofErr w:type="spellEnd"/>
+            <w:r>
+              <w:rPr>
+                <w:rFonts w:hint="eastAsia"/>
+                <w:b/>
+                <w:bCs/>
+                <w:sz w:val="24"/>
+              </w:rPr>
+              <w:t xml:space="preserve"> /</w:t>
+            </w:r>
+            <w:proofErr w:type="gramEnd"/>
+            <w:r>
+              <w:rPr>
+                <w:rFonts w:hint="eastAsia"/>
+                <w:b/>
+                <w:bCs/>
+                <w:sz w:val="24"/>
+              </w:rPr>
+              <w:t xml:space="preserve"> 메인 입구 방</w:t>
             </w:r>
           </w:p>
         </w:tc>
@@ -1218,7 +1337,38 @@
                 <w:bCs/>
                 <w:sz w:val="24"/>
               </w:rPr>
-              <w:t>1 GapRoom / 끊어진 방</w:t>
+              <w:t xml:space="preserve">1 </w:t>
+            </w:r>
+            <w:proofErr w:type="spellStart"/>
+            <w:proofErr w:type="gramStart"/>
+            <w:r>
+              <w:rPr>
+                <w:rFonts w:hint="eastAsia"/>
+                <w:b/>
+                <w:bCs/>
+                <w:sz w:val="24"/>
+              </w:rPr>
+              <w:t>GapRoom</w:t>
+            </w:r>
+            <w:proofErr w:type="spellEnd"/>
+            <w:r>
+              <w:rPr>
+                <w:rFonts w:hint="eastAsia"/>
+                <w:b/>
+                <w:bCs/>
+                <w:sz w:val="24"/>
+              </w:rPr>
+              <w:t xml:space="preserve"> /</w:t>
+            </w:r>
+            <w:proofErr w:type="gramEnd"/>
+            <w:r>
+              <w:rPr>
+                <w:rFonts w:hint="eastAsia"/>
+                <w:b/>
+                <w:bCs/>
+                <w:sz w:val="24"/>
+              </w:rPr>
+              <w:t xml:space="preserve"> 끊어진 방</w:t>
             </w:r>
           </w:p>
         </w:tc>
@@ -1799,7 +1949,38 @@
                 <w:bCs/>
                 <w:sz w:val="24"/>
               </w:rPr>
-              <w:t>2 ApparatusRoom / 장치 방(구조 1, 구조 2)</w:t>
+              <w:t xml:space="preserve">2 </w:t>
+            </w:r>
+            <w:proofErr w:type="spellStart"/>
+            <w:proofErr w:type="gramStart"/>
+            <w:r>
+              <w:rPr>
+                <w:rFonts w:hint="eastAsia"/>
+                <w:b/>
+                <w:bCs/>
+                <w:sz w:val="24"/>
+              </w:rPr>
+              <w:t>ApparatusRoom</w:t>
+            </w:r>
+            <w:proofErr w:type="spellEnd"/>
+            <w:r>
+              <w:rPr>
+                <w:rFonts w:hint="eastAsia"/>
+                <w:b/>
+                <w:bCs/>
+                <w:sz w:val="24"/>
+              </w:rPr>
+              <w:t xml:space="preserve"> /</w:t>
+            </w:r>
+            <w:proofErr w:type="gramEnd"/>
+            <w:r>
+              <w:rPr>
+                <w:rFonts w:hint="eastAsia"/>
+                <w:b/>
+                <w:bCs/>
+                <w:sz w:val="24"/>
+              </w:rPr>
+              <w:t xml:space="preserve"> 장치 방(구조 1, 구조 2)</w:t>
             </w:r>
           </w:p>
         </w:tc>
@@ -2404,7 +2585,38 @@
                 <w:bCs/>
                 <w:sz w:val="24"/>
               </w:rPr>
-              <w:t>3 ServerRoom / 서버 방</w:t>
+              <w:t xml:space="preserve">3 </w:t>
+            </w:r>
+            <w:proofErr w:type="spellStart"/>
+            <w:proofErr w:type="gramStart"/>
+            <w:r>
+              <w:rPr>
+                <w:rFonts w:hint="eastAsia"/>
+                <w:b/>
+                <w:bCs/>
+                <w:sz w:val="24"/>
+              </w:rPr>
+              <w:t>ServerRoom</w:t>
+            </w:r>
+            <w:proofErr w:type="spellEnd"/>
+            <w:r>
+              <w:rPr>
+                <w:rFonts w:hint="eastAsia"/>
+                <w:b/>
+                <w:bCs/>
+                <w:sz w:val="24"/>
+              </w:rPr>
+              <w:t xml:space="preserve"> /</w:t>
+            </w:r>
+            <w:proofErr w:type="gramEnd"/>
+            <w:r>
+              <w:rPr>
+                <w:rFonts w:hint="eastAsia"/>
+                <w:b/>
+                <w:bCs/>
+                <w:sz w:val="24"/>
+              </w:rPr>
+              <w:t xml:space="preserve"> 서버 방</w:t>
             </w:r>
           </w:p>
         </w:tc>
@@ -2963,7 +3175,58 @@
                 <w:bCs/>
                 <w:sz w:val="24"/>
               </w:rPr>
-              <w:t>4 CabinetRoom / 캐비넷 방</w:t>
+              <w:t xml:space="preserve">4 </w:t>
+            </w:r>
+            <w:proofErr w:type="spellStart"/>
+            <w:proofErr w:type="gramStart"/>
+            <w:r>
+              <w:rPr>
+                <w:rFonts w:hint="eastAsia"/>
+                <w:b/>
+                <w:bCs/>
+                <w:sz w:val="24"/>
+              </w:rPr>
+              <w:t>CabinetRoom</w:t>
+            </w:r>
+            <w:proofErr w:type="spellEnd"/>
+            <w:r>
+              <w:rPr>
+                <w:rFonts w:hint="eastAsia"/>
+                <w:b/>
+                <w:bCs/>
+                <w:sz w:val="24"/>
+              </w:rPr>
+              <w:t xml:space="preserve"> /</w:t>
+            </w:r>
+            <w:proofErr w:type="gramEnd"/>
+            <w:r>
+              <w:rPr>
+                <w:rFonts w:hint="eastAsia"/>
+                <w:b/>
+                <w:bCs/>
+                <w:sz w:val="24"/>
+              </w:rPr>
+              <w:t xml:space="preserve"> </w:t>
+            </w:r>
+            <w:proofErr w:type="spellStart"/>
+            <w:r>
+              <w:rPr>
+                <w:rFonts w:hint="eastAsia"/>
+                <w:b/>
+                <w:bCs/>
+                <w:sz w:val="24"/>
+              </w:rPr>
+              <w:t>캐비넷</w:t>
+            </w:r>
+            <w:proofErr w:type="spellEnd"/>
+            <w:r>
+              <w:rPr>
+                <w:rFonts w:hint="eastAsia"/>
+                <w:b/>
+                <w:bCs/>
+                <w:sz w:val="24"/>
+              </w:rPr>
+              <w:t xml:space="preserve"> 방</w:t>
             </w:r>
           </w:p>
         </w:tc>
@@ -3707,7 +3970,35 @@
         <w:rPr>
           <w:rFonts w:hint="eastAsia"/>
         </w:rPr>
-        <w:t>: 대각선으로 마주보는 모서리에 최대 2개의 캐비넷이 생성될 수 있다. 캐비넷은 생성되더라도 열리지 않을 수도 있다.</w:t>
+        <w:t xml:space="preserve">: 대각선으로 마주보는 모서리에 최대 2개의 </w:t>
+      </w:r>
+      <w:proofErr w:type="spellStart"/>
+      <w:r>
+        <w:rPr>
+          <w:rFonts w:hint="eastAsia"/>
+        </w:rPr>
+        <w:t>캐비넷이</w:t>
+      </w:r>
+      <w:proofErr w:type="spellEnd"/>
+      <w:r>
+        <w:rPr>
+          <w:rFonts w:hint="eastAsia"/>
+        </w:rPr>
+        <w:t xml:space="preserve"> 생성될 수 있다. </w:t>
+      </w:r>
+      <w:proofErr w:type="spellStart"/>
+      <w:r>
+        <w:rPr>
+          <w:rFonts w:hint="eastAsia"/>
+        </w:rPr>
+        <w:t>캐비넷은</w:t>
+      </w:r>
+      <w:proofErr w:type="spellEnd"/>
+      <w:r>
+        <w:rPr>
+          <w:rFonts w:hint="eastAsia"/>
+        </w:rPr>
+        <w:t xml:space="preserve"> 생성되더라도 열리지 않을 수도 있다.</w:t>
       </w:r>
     </w:p>
     <w:p>
@@ -3891,7 +4182,13 @@
               <w:rPr>
                 <w:rFonts w:hint="eastAsia"/>
               </w:rPr>
-              <w:t>*5</w:t>
+              <w:t>*</w:t>
+            </w:r>
+            <w:r>
+              <w:rPr>
+                <w:rFonts w:hint="eastAsia"/>
+              </w:rPr>
+              <w:t>6</w:t>
             </w:r>
             <w:r>
               <w:rPr>
@@ -4373,10 +4670,10 @@
                 <w:noProof/>
               </w:rPr>
               <w:drawing>
-                <wp:inline distT="0" distB="0" distL="0" distR="0" wp14:anchorId="019DBA96" wp14:editId="1B0BCAD6">
-                  <wp:extent cx="2162477" cy="2143424"/>
+                <wp:inline distT="0" distB="0" distL="0" distR="0" wp14:anchorId="497362DE" wp14:editId="6AA4C479">
+                  <wp:extent cx="3096057" cy="2581635"/>
                   <wp:effectExtent l="0" t="0" r="9525" b="9525"/>
-                  <wp:docPr id="1680005441" name="그림 1"/>
+                  <wp:docPr id="2040789360" name="그림 1"/>
                   <wp:cNvGraphicFramePr>
                     <a:graphicFrameLocks xmlns:a="http://schemas.openxmlformats.org/drawingml/2006/main" noChangeAspect="1"/>
                   </wp:cNvGraphicFramePr>
@@ -4384,7 +4681,7 @@
                     <a:graphicData uri="http://schemas.openxmlformats.org/drawingml/2006/picture">
                       <pic:pic xmlns:pic="http://schemas.openxmlformats.org/drawingml/2006/picture">
                         <pic:nvPicPr>
-                          <pic:cNvPr id="1680005441" name=""/>
+                          <pic:cNvPr id="2040789360" name=""/>
                           <pic:cNvPicPr/>
                         </pic:nvPicPr>
                         <pic:blipFill>
@@ -4396,7 +4693,7 @@
                         <pic:spPr>
                           <a:xfrm>
                             <a:off x="0" y="0"/>
-                            <a:ext cx="2162477" cy="2143424"/>
+                            <a:ext cx="3096057" cy="2581635"/>
                           </a:xfrm>
                           <a:prstGeom prst="rect">
                             <a:avLst/>
@@ -4479,7 +4776,13 @@
               <w:rPr>
                 <w:rFonts w:hint="eastAsia"/>
               </w:rPr>
-              <w:t>*5</w:t>
+              <w:t>*</w:t>
+            </w:r>
+            <w:r>
+              <w:rPr>
+                <w:rFonts w:hint="eastAsia"/>
+              </w:rPr>
+              <w:t>6</w:t>
             </w:r>
             <w:r>
               <w:rPr>
@@ -4676,6 +4979,7 @@
               <w:rPr>
                 <w:rFonts w:hint="eastAsia"/>
               </w:rPr>
+              <w:lastRenderedPageBreak/>
               <w:t>방 최소/최대 생성 개수</w:t>
             </w:r>
           </w:p>
@@ -4814,7 +5118,6 @@
               <w:rPr>
                 <w:rFonts w:hint="eastAsia"/>
               </w:rPr>
-              <w:lastRenderedPageBreak/>
               <w:t>문 최소/최대 생성 개수</w:t>
             </w:r>
           </w:p>
@@ -5570,7 +5873,21 @@
         <w:rPr>
           <w:rFonts w:hint="eastAsia"/>
         </w:rPr>
-        <w:t xml:space="preserve">: 꺾임형 </w:t>
+        <w:t xml:space="preserve">: </w:t>
+      </w:r>
+      <w:proofErr w:type="spellStart"/>
+      <w:r>
+        <w:rPr>
+          <w:rFonts w:hint="eastAsia"/>
+        </w:rPr>
+        <w:t>꺾임형</w:t>
+      </w:r>
+      <w:proofErr w:type="spellEnd"/>
+      <w:r>
+        <w:rPr>
+          <w:rFonts w:hint="eastAsia"/>
+        </w:rPr>
+        <w:t xml:space="preserve"> </w:t>
       </w:r>
       <w:r>
         <w:t>–</w:t>
@@ -5767,6 +6084,7 @@
               <w:rPr>
                 <w:rFonts w:hint="eastAsia"/>
               </w:rPr>
+              <w:lastRenderedPageBreak/>
               <w:t xml:space="preserve">방 사이즈 </w:t>
             </w:r>
             <w:r>
@@ -5889,7 +6207,6 @@
               <w:rPr>
                 <w:rFonts w:hint="eastAsia"/>
               </w:rPr>
-              <w:lastRenderedPageBreak/>
               <w:t>비상구 생성 여부</w:t>
             </w:r>
           </w:p>
@@ -6808,6 +7125,7 @@
               <w:rPr>
                 <w:rFonts w:hint="eastAsia"/>
               </w:rPr>
+              <w:lastRenderedPageBreak/>
               <w:t>문 최소/최대 생성 개수</w:t>
             </w:r>
           </w:p>
@@ -6885,7 +7203,6 @@
                 <w:noProof/>
                 <w:sz w:val="24"/>
               </w:rPr>
-              <w:lastRenderedPageBreak/>
               <w:t>10 RailCatwalk / 난간 통로</w:t>
             </w:r>
           </w:p>
@@ -8179,7 +8496,6 @@
                 <w:rFonts w:hint="eastAsia"/>
                 <w:noProof/>
               </w:rPr>
-              <w:lastRenderedPageBreak/>
               <mc:AlternateContent>
                 <mc:Choice Requires="wps">
                   <w:drawing>
@@ -9513,6 +9829,7 @@
               <w:rPr>
                 <w:rFonts w:hint="eastAsia"/>
               </w:rPr>
+              <w:lastRenderedPageBreak/>
               <w:t>층 당 문 필수 개수</w:t>
             </w:r>
           </w:p>

</xml_diff>

<commit_message>
YellowOfficeRoom 수정 및 임포트
</commit_message>
<xml_diff>
--- a/기획/공장 맵_방 구조 규칙.docx
+++ b/기획/공장 맵_방 구조 규칙.docx
@@ -64,28 +64,12 @@
     </w:p>
     <w:p/>
     <w:p>
-      <w:proofErr w:type="gramStart"/>
       <w:r>
         <w:rPr>
           <w:rFonts w:hint="eastAsia"/>
         </w:rPr>
-        <w:t>[ 참고</w:t>
+        <w:t>[ 참고 사항 ]</w:t>
       </w:r>
-      <w:proofErr w:type="gramEnd"/>
-      <w:r>
-        <w:rPr>
-          <w:rFonts w:hint="eastAsia"/>
-        </w:rPr>
-        <w:t xml:space="preserve"> </w:t>
-      </w:r>
-      <w:proofErr w:type="gramStart"/>
-      <w:r>
-        <w:rPr>
-          <w:rFonts w:hint="eastAsia"/>
-        </w:rPr>
-        <w:t>사항 ]</w:t>
-      </w:r>
-      <w:proofErr w:type="gramEnd"/>
     </w:p>
     <w:p>
       <w:pPr>
@@ -307,23 +291,13 @@
           <w:bCs/>
         </w:rPr>
       </w:pPr>
-      <w:proofErr w:type="spellStart"/>
       <w:r>
         <w:rPr>
           <w:rFonts w:hint="eastAsia"/>
           <w:b/>
           <w:bCs/>
         </w:rPr>
-        <w:t>DoorSocket</w:t>
-      </w:r>
-      <w:proofErr w:type="spellEnd"/>
-      <w:r>
-        <w:rPr>
-          <w:rFonts w:hint="eastAsia"/>
-          <w:b/>
-          <w:bCs/>
-        </w:rPr>
-        <w:t>(벽에 난 문 구멍): 150*275</w:t>
+        <w:t>DoorSocket(벽에 난 문 구멍): 150*275</w:t>
       </w:r>
     </w:p>
     <w:p>
@@ -358,7 +332,6 @@
     </w:p>
     <w:p/>
     <w:p>
-      <w:proofErr w:type="gramStart"/>
       <w:r>
         <w:rPr>
           <w:rFonts w:hint="eastAsia"/>
@@ -375,14 +348,7 @@
         <w:rPr>
           <w:rFonts w:hint="eastAsia"/>
         </w:rPr>
-        <w:t>모든</w:t>
-      </w:r>
-      <w:proofErr w:type="gramEnd"/>
-      <w:r>
-        <w:rPr>
-          <w:rFonts w:hint="eastAsia"/>
-        </w:rPr>
-        <w:t xml:space="preserve"> 스테이지 </w:t>
+        <w:t xml:space="preserve">모든 스테이지 </w:t>
       </w:r>
       <w:r>
         <w:rPr>
@@ -400,14 +366,7 @@
         <w:rPr>
           <w:rFonts w:hint="eastAsia"/>
         </w:rPr>
-        <w:t xml:space="preserve"> &amp; </w:t>
-      </w:r>
-      <w:proofErr w:type="gramStart"/>
-      <w:r>
-        <w:rPr>
-          <w:rFonts w:hint="eastAsia"/>
-        </w:rPr>
-        <w:t>규칙</w:t>
+        <w:t xml:space="preserve"> &amp; 규칙</w:t>
       </w:r>
       <w:r>
         <w:rPr>
@@ -415,7 +374,6 @@
         </w:rPr>
         <w:t xml:space="preserve"> ]</w:t>
       </w:r>
-      <w:proofErr w:type="gramEnd"/>
     </w:p>
     <w:p>
       <w:pPr>
@@ -443,19 +401,11 @@
       <w:r>
         <w:t>’</w:t>
       </w:r>
-      <w:proofErr w:type="spellStart"/>
       <w:r>
         <w:rPr>
           <w:rFonts w:hint="eastAsia"/>
         </w:rPr>
-        <w:t>를</w:t>
-      </w:r>
-      <w:proofErr w:type="spellEnd"/>
-      <w:r>
-        <w:rPr>
-          <w:rFonts w:hint="eastAsia"/>
-        </w:rPr>
-        <w:t xml:space="preserve"> 이용하여 열 수 있다.</w:t>
+        <w:t>를 이용하여 열 수 있다.</w:t>
       </w:r>
     </w:p>
     <w:p>
@@ -470,21 +420,7 @@
         <w:rPr>
           <w:rFonts w:hint="eastAsia"/>
         </w:rPr>
-        <w:t xml:space="preserve">코어(장치)는 한 </w:t>
-      </w:r>
-      <w:proofErr w:type="spellStart"/>
-      <w:r>
-        <w:rPr>
-          <w:rFonts w:hint="eastAsia"/>
-        </w:rPr>
-        <w:t>맵에</w:t>
-      </w:r>
-      <w:proofErr w:type="spellEnd"/>
-      <w:r>
-        <w:rPr>
-          <w:rFonts w:hint="eastAsia"/>
-        </w:rPr>
-        <w:t xml:space="preserve"> 하나만 생성될 수 있다.</w:t>
+        <w:t>코어(장치)는 한 맵에 하나만 생성될 수 있다.</w:t>
       </w:r>
     </w:p>
     <w:p>
@@ -591,19 +527,11 @@
       <w:r>
         <w:t>’</w:t>
       </w:r>
-      <w:proofErr w:type="spellStart"/>
       <w:r>
         <w:rPr>
           <w:rFonts w:hint="eastAsia"/>
         </w:rPr>
-        <w:t>끼리는</w:t>
-      </w:r>
-      <w:proofErr w:type="spellEnd"/>
-      <w:r>
-        <w:rPr>
-          <w:rFonts w:hint="eastAsia"/>
-        </w:rPr>
-        <w:t xml:space="preserve"> 바로 연결될 수 없다.</w:t>
+        <w:t>끼리는 바로 연결될 수 없다.</w:t>
       </w:r>
     </w:p>
     <w:p>
@@ -626,19 +554,11 @@
       <w:r>
         <w:t>’</w:t>
       </w:r>
-      <w:proofErr w:type="spellStart"/>
       <w:r>
         <w:rPr>
           <w:rFonts w:hint="eastAsia"/>
         </w:rPr>
-        <w:t>끼리는</w:t>
-      </w:r>
-      <w:proofErr w:type="spellEnd"/>
-      <w:r>
-        <w:rPr>
-          <w:rFonts w:hint="eastAsia"/>
-        </w:rPr>
-        <w:t xml:space="preserve"> 바로 연결될 수 있다.</w:t>
+        <w:t>끼리는 바로 연결될 수 있다.</w:t>
       </w:r>
     </w:p>
     <w:p>
@@ -661,19 +581,11 @@
       <w:r>
         <w:t>’</w:t>
       </w:r>
-      <w:proofErr w:type="spellStart"/>
       <w:r>
         <w:rPr>
           <w:rFonts w:hint="eastAsia"/>
         </w:rPr>
-        <w:t>끼리는</w:t>
-      </w:r>
-      <w:proofErr w:type="spellEnd"/>
-      <w:r>
-        <w:rPr>
-          <w:rFonts w:hint="eastAsia"/>
-        </w:rPr>
-        <w:t xml:space="preserve"> 바로 연결될 수 있다.</w:t>
+        <w:t>끼리는 바로 연결될 수 있다.</w:t>
       </w:r>
     </w:p>
     <w:p>
@@ -731,38 +643,7 @@
                 <w:sz w:val="24"/>
               </w:rPr>
               <w:lastRenderedPageBreak/>
-              <w:t xml:space="preserve">0 </w:t>
-            </w:r>
-            <w:proofErr w:type="spellStart"/>
-            <w:proofErr w:type="gramStart"/>
-            <w:r>
-              <w:rPr>
-                <w:rFonts w:hint="eastAsia"/>
-                <w:b/>
-                <w:bCs/>
-                <w:sz w:val="24"/>
-              </w:rPr>
-              <w:t>MainEntranceRoom</w:t>
-            </w:r>
-            <w:proofErr w:type="spellEnd"/>
-            <w:r>
-              <w:rPr>
-                <w:rFonts w:hint="eastAsia"/>
-                <w:b/>
-                <w:bCs/>
-                <w:sz w:val="24"/>
-              </w:rPr>
-              <w:t xml:space="preserve"> /</w:t>
-            </w:r>
-            <w:proofErr w:type="gramEnd"/>
-            <w:r>
-              <w:rPr>
-                <w:rFonts w:hint="eastAsia"/>
-                <w:b/>
-                <w:bCs/>
-                <w:sz w:val="24"/>
-              </w:rPr>
-              <w:t xml:space="preserve"> 메인 입구 방</w:t>
+              <w:t>0 MainEntranceRoom / 메인 입구 방</w:t>
             </w:r>
           </w:p>
         </w:tc>
@@ -1337,38 +1218,7 @@
                 <w:bCs/>
                 <w:sz w:val="24"/>
               </w:rPr>
-              <w:t xml:space="preserve">1 </w:t>
-            </w:r>
-            <w:proofErr w:type="spellStart"/>
-            <w:proofErr w:type="gramStart"/>
-            <w:r>
-              <w:rPr>
-                <w:rFonts w:hint="eastAsia"/>
-                <w:b/>
-                <w:bCs/>
-                <w:sz w:val="24"/>
-              </w:rPr>
-              <w:t>GapRoom</w:t>
-            </w:r>
-            <w:proofErr w:type="spellEnd"/>
-            <w:r>
-              <w:rPr>
-                <w:rFonts w:hint="eastAsia"/>
-                <w:b/>
-                <w:bCs/>
-                <w:sz w:val="24"/>
-              </w:rPr>
-              <w:t xml:space="preserve"> /</w:t>
-            </w:r>
-            <w:proofErr w:type="gramEnd"/>
-            <w:r>
-              <w:rPr>
-                <w:rFonts w:hint="eastAsia"/>
-                <w:b/>
-                <w:bCs/>
-                <w:sz w:val="24"/>
-              </w:rPr>
-              <w:t xml:space="preserve"> 끊어진 방</w:t>
+              <w:t>1 GapRoom / 끊어진 방</w:t>
             </w:r>
           </w:p>
         </w:tc>
@@ -1949,38 +1799,7 @@
                 <w:bCs/>
                 <w:sz w:val="24"/>
               </w:rPr>
-              <w:t xml:space="preserve">2 </w:t>
-            </w:r>
-            <w:proofErr w:type="spellStart"/>
-            <w:proofErr w:type="gramStart"/>
-            <w:r>
-              <w:rPr>
-                <w:rFonts w:hint="eastAsia"/>
-                <w:b/>
-                <w:bCs/>
-                <w:sz w:val="24"/>
-              </w:rPr>
-              <w:t>ApparatusRoom</w:t>
-            </w:r>
-            <w:proofErr w:type="spellEnd"/>
-            <w:r>
-              <w:rPr>
-                <w:rFonts w:hint="eastAsia"/>
-                <w:b/>
-                <w:bCs/>
-                <w:sz w:val="24"/>
-              </w:rPr>
-              <w:t xml:space="preserve"> /</w:t>
-            </w:r>
-            <w:proofErr w:type="gramEnd"/>
-            <w:r>
-              <w:rPr>
-                <w:rFonts w:hint="eastAsia"/>
-                <w:b/>
-                <w:bCs/>
-                <w:sz w:val="24"/>
-              </w:rPr>
-              <w:t xml:space="preserve"> 장치 방(구조 1, 구조 2)</w:t>
+              <w:t>2 ApparatusRoom / 장치 방(구조 1, 구조 2)</w:t>
             </w:r>
           </w:p>
         </w:tc>
@@ -2585,38 +2404,7 @@
                 <w:bCs/>
                 <w:sz w:val="24"/>
               </w:rPr>
-              <w:t xml:space="preserve">3 </w:t>
-            </w:r>
-            <w:proofErr w:type="spellStart"/>
-            <w:proofErr w:type="gramStart"/>
-            <w:r>
-              <w:rPr>
-                <w:rFonts w:hint="eastAsia"/>
-                <w:b/>
-                <w:bCs/>
-                <w:sz w:val="24"/>
-              </w:rPr>
-              <w:t>ServerRoom</w:t>
-            </w:r>
-            <w:proofErr w:type="spellEnd"/>
-            <w:r>
-              <w:rPr>
-                <w:rFonts w:hint="eastAsia"/>
-                <w:b/>
-                <w:bCs/>
-                <w:sz w:val="24"/>
-              </w:rPr>
-              <w:t xml:space="preserve"> /</w:t>
-            </w:r>
-            <w:proofErr w:type="gramEnd"/>
-            <w:r>
-              <w:rPr>
-                <w:rFonts w:hint="eastAsia"/>
-                <w:b/>
-                <w:bCs/>
-                <w:sz w:val="24"/>
-              </w:rPr>
-              <w:t xml:space="preserve"> 서버 방</w:t>
+              <w:t>3 ServerRoom / 서버 방</w:t>
             </w:r>
           </w:p>
         </w:tc>
@@ -3175,58 +2963,7 @@
                 <w:bCs/>
                 <w:sz w:val="24"/>
               </w:rPr>
-              <w:t xml:space="preserve">4 </w:t>
-            </w:r>
-            <w:proofErr w:type="spellStart"/>
-            <w:proofErr w:type="gramStart"/>
-            <w:r>
-              <w:rPr>
-                <w:rFonts w:hint="eastAsia"/>
-                <w:b/>
-                <w:bCs/>
-                <w:sz w:val="24"/>
-              </w:rPr>
-              <w:t>CabinetRoom</w:t>
-            </w:r>
-            <w:proofErr w:type="spellEnd"/>
-            <w:r>
-              <w:rPr>
-                <w:rFonts w:hint="eastAsia"/>
-                <w:b/>
-                <w:bCs/>
-                <w:sz w:val="24"/>
-              </w:rPr>
-              <w:t xml:space="preserve"> /</w:t>
-            </w:r>
-            <w:proofErr w:type="gramEnd"/>
-            <w:r>
-              <w:rPr>
-                <w:rFonts w:hint="eastAsia"/>
-                <w:b/>
-                <w:bCs/>
-                <w:sz w:val="24"/>
-              </w:rPr>
-              <w:t xml:space="preserve"> </w:t>
-            </w:r>
-            <w:proofErr w:type="spellStart"/>
-            <w:r>
-              <w:rPr>
-                <w:rFonts w:hint="eastAsia"/>
-                <w:b/>
-                <w:bCs/>
-                <w:sz w:val="24"/>
-              </w:rPr>
-              <w:t>캐비넷</w:t>
-            </w:r>
-            <w:proofErr w:type="spellEnd"/>
-            <w:r>
-              <w:rPr>
-                <w:rFonts w:hint="eastAsia"/>
-                <w:b/>
-                <w:bCs/>
-                <w:sz w:val="24"/>
-              </w:rPr>
-              <w:t xml:space="preserve"> 방</w:t>
+              <w:t>4 CabinetRoom / 캐비넷 방</w:t>
             </w:r>
           </w:p>
         </w:tc>
@@ -3970,35 +3707,7 @@
         <w:rPr>
           <w:rFonts w:hint="eastAsia"/>
         </w:rPr>
-        <w:t xml:space="preserve">: 대각선으로 마주보는 모서리에 최대 2개의 </w:t>
-      </w:r>
-      <w:proofErr w:type="spellStart"/>
-      <w:r>
-        <w:rPr>
-          <w:rFonts w:hint="eastAsia"/>
-        </w:rPr>
-        <w:t>캐비넷이</w:t>
-      </w:r>
-      <w:proofErr w:type="spellEnd"/>
-      <w:r>
-        <w:rPr>
-          <w:rFonts w:hint="eastAsia"/>
-        </w:rPr>
-        <w:t xml:space="preserve"> 생성될 수 있다. </w:t>
-      </w:r>
-      <w:proofErr w:type="spellStart"/>
-      <w:r>
-        <w:rPr>
-          <w:rFonts w:hint="eastAsia"/>
-        </w:rPr>
-        <w:t>캐비넷은</w:t>
-      </w:r>
-      <w:proofErr w:type="spellEnd"/>
-      <w:r>
-        <w:rPr>
-          <w:rFonts w:hint="eastAsia"/>
-        </w:rPr>
-        <w:t xml:space="preserve"> 생성되더라도 열리지 않을 수도 있다.</w:t>
+        <w:t>: 대각선으로 마주보는 모서리에 최대 2개의 캐비넷이 생성될 수 있다. 캐비넷은 생성되더라도 열리지 않을 수도 있다.</w:t>
       </w:r>
     </w:p>
     <w:p>
@@ -5873,21 +5582,7 @@
         <w:rPr>
           <w:rFonts w:hint="eastAsia"/>
         </w:rPr>
-        <w:t xml:space="preserve">: </w:t>
-      </w:r>
-      <w:proofErr w:type="spellStart"/>
-      <w:r>
-        <w:rPr>
-          <w:rFonts w:hint="eastAsia"/>
-        </w:rPr>
-        <w:t>꺾임형</w:t>
-      </w:r>
-      <w:proofErr w:type="spellEnd"/>
-      <w:r>
-        <w:rPr>
-          <w:rFonts w:hint="eastAsia"/>
-        </w:rPr>
-        <w:t xml:space="preserve"> </w:t>
+        <w:t xml:space="preserve">: 꺾임형 </w:t>
       </w:r>
       <w:r>
         <w:t>–</w:t>
@@ -6026,11 +5721,12 @@
               <w:rPr>
                 <w:noProof/>
               </w:rPr>
+              <w:lastRenderedPageBreak/>
               <w:drawing>
-                <wp:inline distT="0" distB="0" distL="0" distR="0" wp14:anchorId="6F8D520D" wp14:editId="1B91C253">
-                  <wp:extent cx="2267266" cy="1619476"/>
-                  <wp:effectExtent l="0" t="0" r="0" b="0"/>
-                  <wp:docPr id="1220702586" name="그림 1"/>
+                <wp:inline distT="0" distB="0" distL="0" distR="0" wp14:anchorId="60A3A71F" wp14:editId="014F3199">
+                  <wp:extent cx="2629267" cy="2086266"/>
+                  <wp:effectExtent l="0" t="0" r="0" b="9525"/>
+                  <wp:docPr id="741323406" name="그림 1"/>
                   <wp:cNvGraphicFramePr>
                     <a:graphicFrameLocks xmlns:a="http://schemas.openxmlformats.org/drawingml/2006/main" noChangeAspect="1"/>
                   </wp:cNvGraphicFramePr>
@@ -6038,7 +5734,7 @@
                     <a:graphicData uri="http://schemas.openxmlformats.org/drawingml/2006/picture">
                       <pic:pic xmlns:pic="http://schemas.openxmlformats.org/drawingml/2006/picture">
                         <pic:nvPicPr>
-                          <pic:cNvPr id="1220702586" name=""/>
+                          <pic:cNvPr id="741323406" name=""/>
                           <pic:cNvPicPr/>
                         </pic:nvPicPr>
                         <pic:blipFill>
@@ -6050,7 +5746,7 @@
                         <pic:spPr>
                           <a:xfrm>
                             <a:off x="0" y="0"/>
-                            <a:ext cx="2267266" cy="1619476"/>
+                            <a:ext cx="2629267" cy="2086266"/>
                           </a:xfrm>
                           <a:prstGeom prst="rect">
                             <a:avLst/>
@@ -6084,7 +5780,6 @@
               <w:rPr>
                 <w:rFonts w:hint="eastAsia"/>
               </w:rPr>
-              <w:lastRenderedPageBreak/>
               <w:t xml:space="preserve">방 사이즈 </w:t>
             </w:r>
             <w:r>
@@ -6105,6 +5800,9 @@
               <w:pStyle w:val="a6"/>
               <w:ind w:left="0"/>
               <w:jc w:val="center"/>
+              <w:rPr>
+                <w:rFonts w:hint="eastAsia"/>
+              </w:rPr>
             </w:pPr>
             <w:r>
               <w:rPr>
@@ -6134,13 +5832,13 @@
               <w:rPr>
                 <w:rFonts w:hint="eastAsia"/>
               </w:rPr>
-              <w:t>*5</w:t>
-            </w:r>
-            <w:r>
-              <w:rPr>
-                <w:rFonts w:hint="eastAsia"/>
-              </w:rPr>
-              <w:t>00</w:t>
+              <w:t>*</w:t>
+            </w:r>
+            <w:r>
+              <w:rPr>
+                <w:rFonts w:hint="eastAsia"/>
+              </w:rPr>
+              <w:t>600</w:t>
             </w:r>
           </w:p>
         </w:tc>
@@ -6630,6 +6328,7 @@
               <w:rPr>
                 <w:rFonts w:hint="eastAsia"/>
               </w:rPr>
+              <w:lastRenderedPageBreak/>
               <w:t>2.</w:t>
             </w:r>
             <w:r>
@@ -6711,6 +6410,7 @@
               <w:rPr>
                 <w:rFonts w:hint="eastAsia"/>
               </w:rPr>
+              <w:lastRenderedPageBreak/>
               <w:t xml:space="preserve">방 사이즈 </w:t>
             </w:r>
             <w:r>
@@ -7125,7 +6825,6 @@
               <w:rPr>
                 <w:rFonts w:hint="eastAsia"/>
               </w:rPr>
-              <w:lastRenderedPageBreak/>
               <w:t>문 최소/최대 생성 개수</w:t>
             </w:r>
           </w:p>
@@ -9170,6 +8869,7 @@
                 <w:noProof/>
                 <w:sz w:val="24"/>
               </w:rPr>
+              <w:lastRenderedPageBreak/>
               <w:t>1</w:t>
             </w:r>
             <w:r>
@@ -9829,7 +9529,6 @@
               <w:rPr>
                 <w:rFonts w:hint="eastAsia"/>
               </w:rPr>
-              <w:lastRenderedPageBreak/>
               <w:t>층 당 문 필수 개수</w:t>
             </w:r>
           </w:p>

</xml_diff>

<commit_message>
PIpedHallways_Line 수정 및 임포트
</commit_message>
<xml_diff>
--- a/기획/공장 맵_방 구조 규칙.docx
+++ b/기획/공장 맵_방 구조 규칙.docx
@@ -7483,94 +7483,18 @@
             <w:r>
               <w:rPr>
                 <w:rFonts w:hint="eastAsia"/>
+              </w:rPr>
+              <w:t xml:space="preserve">  </w:t>
+            </w:r>
+            <w:r>
+              <w:rPr>
                 <w:noProof/>
               </w:rPr>
-              <mc:AlternateContent>
-                <mc:Choice Requires="wps">
-                  <w:drawing>
-                    <wp:anchor distT="0" distB="0" distL="114300" distR="114300" simplePos="0" relativeHeight="251664384" behindDoc="0" locked="0" layoutInCell="1" allowOverlap="1" wp14:anchorId="41055FB3" wp14:editId="0BCA43F2">
-                      <wp:simplePos x="0" y="0"/>
-                      <wp:positionH relativeFrom="column">
-                        <wp:posOffset>1496031</wp:posOffset>
-                      </wp:positionH>
-                      <wp:positionV relativeFrom="paragraph">
-                        <wp:posOffset>249873</wp:posOffset>
-                      </wp:positionV>
-                      <wp:extent cx="1274866" cy="848568"/>
-                      <wp:effectExtent l="22543" t="15557" r="24447" b="24448"/>
-                      <wp:wrapNone/>
-                      <wp:docPr id="1407740779" name="직사각형 1"/>
-                      <wp:cNvGraphicFramePr/>
-                      <a:graphic xmlns:a="http://schemas.openxmlformats.org/drawingml/2006/main">
-                        <a:graphicData uri="http://schemas.microsoft.com/office/word/2010/wordprocessingShape">
-                          <wps:wsp>
-                            <wps:cNvSpPr/>
-                            <wps:spPr>
-                              <a:xfrm rot="16200000">
-                                <a:off x="0" y="0"/>
-                                <a:ext cx="1274866" cy="848568"/>
-                              </a:xfrm>
-                              <a:prstGeom prst="rect">
-                                <a:avLst/>
-                              </a:prstGeom>
-                              <a:noFill/>
-                              <a:ln w="28575">
-                                <a:solidFill>
-                                  <a:srgbClr val="EE0000"/>
-                                </a:solidFill>
-                              </a:ln>
-                            </wps:spPr>
-                            <wps:style>
-                              <a:lnRef idx="2">
-                                <a:schemeClr val="accent1">
-                                  <a:shade val="15000"/>
-                                </a:schemeClr>
-                              </a:lnRef>
-                              <a:fillRef idx="1">
-                                <a:schemeClr val="accent1"/>
-                              </a:fillRef>
-                              <a:effectRef idx="0">
-                                <a:schemeClr val="accent1"/>
-                              </a:effectRef>
-                              <a:fontRef idx="minor">
-                                <a:schemeClr val="lt1"/>
-                              </a:fontRef>
-                            </wps:style>
-                            <wps:bodyPr rot="0" spcFirstLastPara="0" vertOverflow="overflow" horzOverflow="overflow" vert="horz" wrap="square" lIns="91440" tIns="45720" rIns="91440" bIns="45720" numCol="1" spcCol="0" rtlCol="0" fromWordArt="0" anchor="ctr" anchorCtr="0" forceAA="0" compatLnSpc="1">
-                              <a:prstTxWarp prst="textNoShape">
-                                <a:avLst/>
-                              </a:prstTxWarp>
-                              <a:noAutofit/>
-                            </wps:bodyPr>
-                          </wps:wsp>
-                        </a:graphicData>
-                      </a:graphic>
-                      <wp14:sizeRelH relativeFrom="margin">
-                        <wp14:pctWidth>0</wp14:pctWidth>
-                      </wp14:sizeRelH>
-                      <wp14:sizeRelV relativeFrom="margin">
-                        <wp14:pctHeight>0</wp14:pctHeight>
-                      </wp14:sizeRelV>
-                    </wp:anchor>
-                  </w:drawing>
-                </mc:Choice>
-                <mc:Fallback>
-                  <w:pict>
-                    <v:rect w14:anchorId="2BB21EFE" id="직사각형 1" o:spid="_x0000_s1026" style="position:absolute;margin-left:117.8pt;margin-top:19.7pt;width:100.4pt;height:66.8pt;rotation:-90;z-index:251664384;visibility:visible;mso-wrap-style:square;mso-width-percent:0;mso-height-percent:0;mso-wrap-distance-left:9pt;mso-wrap-distance-top:0;mso-wrap-distance-right:9pt;mso-wrap-distance-bottom:0;mso-position-horizontal:absolute;mso-position-horizontal-relative:text;mso-position-vertical:absolute;mso-position-vertical-relative:text;mso-width-percent:0;mso-height-percent:0;mso-width-relative:margin;mso-height-relative:margin;v-text-anchor:middle" o:gfxdata="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" filled="f" strokecolor="#e00" strokeweight="2.25pt"/>
-                  </w:pict>
-                </mc:Fallback>
-              </mc:AlternateContent>
-            </w:r>
-            <w:r>
-              <w:rPr>
-                <w:rFonts w:hint="eastAsia"/>
-                <w:noProof/>
-              </w:rPr>
               <w:drawing>
-                <wp:inline distT="0" distB="0" distL="0" distR="0" wp14:anchorId="4072C9DE" wp14:editId="685D5D59">
-                  <wp:extent cx="1399233" cy="1182370"/>
-                  <wp:effectExtent l="0" t="6032" r="4762" b="4763"/>
-                  <wp:docPr id="857501272" name="그림 8"/>
+                <wp:inline distT="0" distB="0" distL="0" distR="0" wp14:anchorId="5FF1B58D" wp14:editId="56CED4DD">
+                  <wp:extent cx="924054" cy="1581371"/>
+                  <wp:effectExtent l="0" t="0" r="9525" b="0"/>
+                  <wp:docPr id="578953292" name="그림 1"/>
                   <wp:cNvGraphicFramePr>
                     <a:graphicFrameLocks xmlns:a="http://schemas.openxmlformats.org/drawingml/2006/main" noChangeAspect="1"/>
                   </wp:cNvGraphicFramePr>
@@ -7578,75 +7502,11 @@
                     <a:graphicData uri="http://schemas.openxmlformats.org/drawingml/2006/picture">
                       <pic:pic xmlns:pic="http://schemas.openxmlformats.org/drawingml/2006/picture">
                         <pic:nvPicPr>
-                          <pic:cNvPr id="0" name="Picture 1"/>
-                          <pic:cNvPicPr>
-                            <a:picLocks noChangeAspect="1" noChangeArrowheads="1"/>
-                          </pic:cNvPicPr>
-                        </pic:nvPicPr>
-                        <pic:blipFill rotWithShape="1">
-                          <a:blip r:embed="rId23" cstate="print">
-                            <a:extLst>
-                              <a:ext uri="{28A0092B-C50C-407E-A947-70E740481C1C}">
-                                <a14:useLocalDpi xmlns:a14="http://schemas.microsoft.com/office/drawing/2010/main" val="0"/>
-                              </a:ext>
-                            </a:extLst>
-                          </a:blip>
-                          <a:srcRect l="27639" t="19541" r="19718" b="14681"/>
-                          <a:stretch>
-                            <a:fillRect/>
-                          </a:stretch>
-                        </pic:blipFill>
-                        <pic:spPr bwMode="auto">
-                          <a:xfrm rot="16200000">
-                            <a:off x="0" y="0"/>
-                            <a:ext cx="1401174" cy="1184010"/>
-                          </a:xfrm>
-                          <a:prstGeom prst="rect">
-                            <a:avLst/>
-                          </a:prstGeom>
-                          <a:noFill/>
-                          <a:ln>
-                            <a:noFill/>
-                          </a:ln>
-                          <a:extLst>
-                            <a:ext uri="{53640926-AAD7-44D8-BBD7-CCE9431645EC}">
-                              <a14:shadowObscured xmlns:a14="http://schemas.microsoft.com/office/drawing/2010/main"/>
-                            </a:ext>
-                          </a:extLst>
-                        </pic:spPr>
-                      </pic:pic>
-                    </a:graphicData>
-                  </a:graphic>
-                </wp:inline>
-              </w:drawing>
-            </w:r>
-            <w:r>
-              <w:rPr>
-                <w:rFonts w:hint="eastAsia"/>
-              </w:rPr>
-              <w:t xml:space="preserve">  </w:t>
-            </w:r>
-            <w:r>
-              <w:rPr>
-                <w:noProof/>
-              </w:rPr>
-              <w:drawing>
-                <wp:inline distT="0" distB="0" distL="0" distR="0" wp14:anchorId="7BEC3C74" wp14:editId="30D8237B">
-                  <wp:extent cx="752580" cy="1381318"/>
-                  <wp:effectExtent l="0" t="0" r="9525" b="9525"/>
-                  <wp:docPr id="2120920161" name="그림 1"/>
-                  <wp:cNvGraphicFramePr>
-                    <a:graphicFrameLocks xmlns:a="http://schemas.openxmlformats.org/drawingml/2006/main" noChangeAspect="1"/>
-                  </wp:cNvGraphicFramePr>
-                  <a:graphic xmlns:a="http://schemas.openxmlformats.org/drawingml/2006/main">
-                    <a:graphicData uri="http://schemas.openxmlformats.org/drawingml/2006/picture">
-                      <pic:pic xmlns:pic="http://schemas.openxmlformats.org/drawingml/2006/picture">
-                        <pic:nvPicPr>
-                          <pic:cNvPr id="2120920161" name=""/>
+                          <pic:cNvPr id="578953292" name=""/>
                           <pic:cNvPicPr/>
                         </pic:nvPicPr>
                         <pic:blipFill>
-                          <a:blip r:embed="rId24"/>
+                          <a:blip r:embed="rId23"/>
                           <a:stretch>
                             <a:fillRect/>
                           </a:stretch>
@@ -7654,7 +7514,7 @@
                         <pic:spPr>
                           <a:xfrm>
                             <a:off x="0" y="0"/>
-                            <a:ext cx="752580" cy="1381318"/>
+                            <a:ext cx="924054" cy="1581371"/>
                           </a:xfrm>
                           <a:prstGeom prst="rect">
                             <a:avLst/>
@@ -7708,6 +7568,9 @@
               <w:pStyle w:val="a6"/>
               <w:ind w:left="0"/>
               <w:jc w:val="center"/>
+              <w:rPr>
+                <w:rFonts w:hint="eastAsia"/>
+              </w:rPr>
             </w:pPr>
             <w:r>
               <w:rPr>
@@ -7719,31 +7582,37 @@
               <w:rPr>
                 <w:rFonts w:hint="eastAsia"/>
               </w:rPr>
+              <w:t>5</w:t>
+            </w:r>
+            <w:r>
+              <w:rPr>
+                <w:rFonts w:hint="eastAsia"/>
+              </w:rPr>
+              <w:t>0</w:t>
+            </w:r>
+            <w:r>
+              <w:rPr>
+                <w:rFonts w:hint="eastAsia"/>
+              </w:rPr>
+              <w:t>*6</w:t>
+            </w:r>
+            <w:r>
+              <w:rPr>
+                <w:rFonts w:hint="eastAsia"/>
+              </w:rPr>
               <w:t>00</w:t>
             </w:r>
             <w:r>
               <w:rPr>
                 <w:rFonts w:hint="eastAsia"/>
               </w:rPr>
-              <w:t>*6</w:t>
-            </w:r>
-            <w:r>
-              <w:rPr>
-                <w:rFonts w:hint="eastAsia"/>
-              </w:rPr>
-              <w:t>00</w:t>
-            </w:r>
-            <w:r>
-              <w:rPr>
-                <w:rFonts w:hint="eastAsia"/>
-              </w:rPr>
-              <w:t>*5</w:t>
-            </w:r>
-            <w:r>
-              <w:rPr>
-                <w:rFonts w:hint="eastAsia"/>
-              </w:rPr>
-              <w:t>00</w:t>
+              <w:t>*</w:t>
+            </w:r>
+            <w:r>
+              <w:rPr>
+                <w:rFonts w:hint="eastAsia"/>
+              </w:rPr>
+              <w:t>600</w:t>
             </w:r>
           </w:p>
         </w:tc>
@@ -8193,146 +8062,6 @@
             <w:r>
               <w:rPr>
                 <w:rFonts w:hint="eastAsia"/>
-                <w:noProof/>
-              </w:rPr>
-              <mc:AlternateContent>
-                <mc:Choice Requires="wps">
-                  <w:drawing>
-                    <wp:anchor distT="0" distB="0" distL="114300" distR="114300" simplePos="0" relativeHeight="251666432" behindDoc="0" locked="0" layoutInCell="1" allowOverlap="1" wp14:anchorId="505B043C" wp14:editId="083D1F31">
-                      <wp:simplePos x="0" y="0"/>
-                      <wp:positionH relativeFrom="column">
-                        <wp:posOffset>914326</wp:posOffset>
-                      </wp:positionH>
-                      <wp:positionV relativeFrom="paragraph">
-                        <wp:posOffset>485164</wp:posOffset>
-                      </wp:positionV>
-                      <wp:extent cx="1251610" cy="1320536"/>
-                      <wp:effectExtent l="19050" t="19050" r="24765" b="13335"/>
-                      <wp:wrapNone/>
-                      <wp:docPr id="1382531454" name="직사각형 1"/>
-                      <wp:cNvGraphicFramePr/>
-                      <a:graphic xmlns:a="http://schemas.openxmlformats.org/drawingml/2006/main">
-                        <a:graphicData uri="http://schemas.microsoft.com/office/word/2010/wordprocessingShape">
-                          <wps:wsp>
-                            <wps:cNvSpPr/>
-                            <wps:spPr>
-                              <a:xfrm>
-                                <a:off x="0" y="0"/>
-                                <a:ext cx="1251610" cy="1320536"/>
-                              </a:xfrm>
-                              <a:prstGeom prst="rect">
-                                <a:avLst/>
-                              </a:prstGeom>
-                              <a:noFill/>
-                              <a:ln w="38100">
-                                <a:solidFill>
-                                  <a:srgbClr val="EE0000"/>
-                                </a:solidFill>
-                              </a:ln>
-                            </wps:spPr>
-                            <wps:style>
-                              <a:lnRef idx="2">
-                                <a:schemeClr val="accent1">
-                                  <a:shade val="15000"/>
-                                </a:schemeClr>
-                              </a:lnRef>
-                              <a:fillRef idx="1">
-                                <a:schemeClr val="accent1"/>
-                              </a:fillRef>
-                              <a:effectRef idx="0">
-                                <a:schemeClr val="accent1"/>
-                              </a:effectRef>
-                              <a:fontRef idx="minor">
-                                <a:schemeClr val="lt1"/>
-                              </a:fontRef>
-                            </wps:style>
-                            <wps:bodyPr rot="0" spcFirstLastPara="0" vertOverflow="overflow" horzOverflow="overflow" vert="horz" wrap="square" lIns="91440" tIns="45720" rIns="91440" bIns="45720" numCol="1" spcCol="0" rtlCol="0" fromWordArt="0" anchor="ctr" anchorCtr="0" forceAA="0" compatLnSpc="1">
-                              <a:prstTxWarp prst="textNoShape">
-                                <a:avLst/>
-                              </a:prstTxWarp>
-                              <a:noAutofit/>
-                            </wps:bodyPr>
-                          </wps:wsp>
-                        </a:graphicData>
-                      </a:graphic>
-                      <wp14:sizeRelH relativeFrom="margin">
-                        <wp14:pctWidth>0</wp14:pctWidth>
-                      </wp14:sizeRelH>
-                      <wp14:sizeRelV relativeFrom="margin">
-                        <wp14:pctHeight>0</wp14:pctHeight>
-                      </wp14:sizeRelV>
-                    </wp:anchor>
-                  </w:drawing>
-                </mc:Choice>
-                <mc:Fallback>
-                  <w:pict>
-                    <v:rect w14:anchorId="3B36198B" id="직사각형 1" o:spid="_x0000_s1026" style="position:absolute;margin-left:1in;margin-top:38.2pt;width:98.55pt;height:104pt;z-index:251666432;visibility:visible;mso-wrap-style:square;mso-width-percent:0;mso-height-percent:0;mso-wrap-distance-left:9pt;mso-wrap-distance-top:0;mso-wrap-distance-right:9pt;mso-wrap-distance-bottom:0;mso-position-horizontal:absolute;mso-position-horizontal-relative:text;mso-position-vertical:absolute;mso-position-vertical-relative:text;mso-width-percent:0;mso-height-percent:0;mso-width-relative:margin;mso-height-relative:margin;v-text-anchor:middle" o:gfxdata="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" filled="f" strokecolor="#e00" strokeweight="3pt"/>
-                  </w:pict>
-                </mc:Fallback>
-              </mc:AlternateContent>
-            </w:r>
-            <w:r>
-              <w:rPr>
-                <w:rFonts w:hint="eastAsia"/>
-                <w:noProof/>
-              </w:rPr>
-              <w:drawing>
-                <wp:inline distT="0" distB="0" distL="0" distR="0" wp14:anchorId="6E9EA487" wp14:editId="2E5D686C">
-                  <wp:extent cx="1531917" cy="1513947"/>
-                  <wp:effectExtent l="0" t="0" r="0" b="0"/>
-                  <wp:docPr id="836317969" name="그림 9" descr="건물, 야외, 창문, 거리이(가) 표시된 사진&#10;&#10;AI 생성 콘텐츠는 정확하지 않을 수 있습니다."/>
-                  <wp:cNvGraphicFramePr>
-                    <a:graphicFrameLocks xmlns:a="http://schemas.openxmlformats.org/drawingml/2006/main" noChangeAspect="1"/>
-                  </wp:cNvGraphicFramePr>
-                  <a:graphic xmlns:a="http://schemas.openxmlformats.org/drawingml/2006/main">
-                    <a:graphicData uri="http://schemas.openxmlformats.org/drawingml/2006/picture">
-                      <pic:pic xmlns:pic="http://schemas.openxmlformats.org/drawingml/2006/picture">
-                        <pic:nvPicPr>
-                          <pic:cNvPr id="1279955636" name="그림 9" descr="건물, 야외, 창문, 거리이(가) 표시된 사진&#10;&#10;AI 생성 콘텐츠는 정확하지 않을 수 있습니다."/>
-                          <pic:cNvPicPr>
-                            <a:picLocks noChangeAspect="1" noChangeArrowheads="1"/>
-                          </pic:cNvPicPr>
-                        </pic:nvPicPr>
-                        <pic:blipFill rotWithShape="1">
-                          <a:blip r:embed="rId25" cstate="print">
-                            <a:extLst>
-                              <a:ext uri="{28A0092B-C50C-407E-A947-70E740481C1C}">
-                                <a14:useLocalDpi xmlns:a14="http://schemas.microsoft.com/office/drawing/2010/main" val="0"/>
-                              </a:ext>
-                            </a:extLst>
-                          </a:blip>
-                          <a:srcRect l="8829" t="15843" r="33582"/>
-                          <a:stretch>
-                            <a:fillRect/>
-                          </a:stretch>
-                        </pic:blipFill>
-                        <pic:spPr bwMode="auto">
-                          <a:xfrm>
-                            <a:off x="0" y="0"/>
-                            <a:ext cx="1532807" cy="1514826"/>
-                          </a:xfrm>
-                          <a:prstGeom prst="rect">
-                            <a:avLst/>
-                          </a:prstGeom>
-                          <a:noFill/>
-                          <a:ln>
-                            <a:noFill/>
-                          </a:ln>
-                          <a:extLst>
-                            <a:ext uri="{53640926-AAD7-44D8-BBD7-CCE9431645EC}">
-                              <a14:shadowObscured xmlns:a14="http://schemas.microsoft.com/office/drawing/2010/main"/>
-                            </a:ext>
-                          </a:extLst>
-                        </pic:spPr>
-                      </pic:pic>
-                    </a:graphicData>
-                  </a:graphic>
-                </wp:inline>
-              </w:drawing>
-            </w:r>
-            <w:r>
-              <w:rPr>
-                <w:rFonts w:hint="eastAsia"/>
               </w:rPr>
               <w:t xml:space="preserve">   </w:t>
             </w:r>
@@ -8356,7 +8085,7 @@
                           <pic:cNvPicPr/>
                         </pic:nvPicPr>
                         <pic:blipFill>
-                          <a:blip r:embed="rId26"/>
+                          <a:blip r:embed="rId24"/>
                           <a:stretch>
                             <a:fillRect/>
                           </a:stretch>
@@ -8966,7 +8695,7 @@
                           <pic:cNvPicPr/>
                         </pic:nvPicPr>
                         <pic:blipFill rotWithShape="1">
-                          <a:blip r:embed="rId27"/>
+                          <a:blip r:embed="rId25"/>
                           <a:srcRect r="68952"/>
                           <a:stretch>
                             <a:fillRect/>
@@ -9021,7 +8750,7 @@
                           <pic:cNvPicPr/>
                         </pic:nvPicPr>
                         <pic:blipFill>
-                          <a:blip r:embed="rId28"/>
+                          <a:blip r:embed="rId26"/>
                           <a:stretch>
                             <a:fillRect/>
                           </a:stretch>
@@ -9073,7 +8802,7 @@
                           <pic:cNvPicPr/>
                         </pic:nvPicPr>
                         <pic:blipFill>
-                          <a:blip r:embed="rId29"/>
+                          <a:blip r:embed="rId27"/>
                           <a:stretch>
                             <a:fillRect/>
                           </a:stretch>

</xml_diff>

<commit_message>
PipedHallways_Grid 수정 및 임포트
</commit_message>
<xml_diff>
--- a/기획/공장 맵_방 구조 규칙.docx
+++ b/기획/공장 맵_방 구조 규칙.docx
@@ -8070,10 +8070,10 @@
                 <w:noProof/>
               </w:rPr>
               <w:drawing>
-                <wp:inline distT="0" distB="0" distL="0" distR="0" wp14:anchorId="0B20FE2F" wp14:editId="453C7C1B">
-                  <wp:extent cx="1857634" cy="1838582"/>
+                <wp:inline distT="0" distB="0" distL="0" distR="0" wp14:anchorId="42E83FE5" wp14:editId="62E81273">
+                  <wp:extent cx="1810003" cy="2010056"/>
                   <wp:effectExtent l="0" t="0" r="0" b="9525"/>
-                  <wp:docPr id="616562177" name="그림 1"/>
+                  <wp:docPr id="1009038333" name="그림 1"/>
                   <wp:cNvGraphicFramePr>
                     <a:graphicFrameLocks xmlns:a="http://schemas.openxmlformats.org/drawingml/2006/main" noChangeAspect="1"/>
                   </wp:cNvGraphicFramePr>
@@ -8081,7 +8081,7 @@
                     <a:graphicData uri="http://schemas.openxmlformats.org/drawingml/2006/picture">
                       <pic:pic xmlns:pic="http://schemas.openxmlformats.org/drawingml/2006/picture">
                         <pic:nvPicPr>
-                          <pic:cNvPr id="616562177" name=""/>
+                          <pic:cNvPr id="1009038333" name=""/>
                           <pic:cNvPicPr/>
                         </pic:nvPicPr>
                         <pic:blipFill>
@@ -8093,7 +8093,7 @@
                         <pic:spPr>
                           <a:xfrm>
                             <a:off x="0" y="0"/>
-                            <a:ext cx="1857634" cy="1838582"/>
+                            <a:ext cx="1810003" cy="2010056"/>
                           </a:xfrm>
                           <a:prstGeom prst="rect">
                             <a:avLst/>
@@ -8147,42 +8147,15 @@
               <w:pStyle w:val="a6"/>
               <w:ind w:left="0"/>
               <w:jc w:val="center"/>
-            </w:pPr>
-            <w:r>
-              <w:rPr>
-                <w:rFonts w:hint="eastAsia"/>
-              </w:rPr>
-              <w:t>12</w:t>
-            </w:r>
-            <w:r>
-              <w:rPr>
-                <w:rFonts w:hint="eastAsia"/>
-              </w:rPr>
-              <w:t>00</w:t>
-            </w:r>
-            <w:r>
-              <w:rPr>
-                <w:rFonts w:hint="eastAsia"/>
-              </w:rPr>
-              <w:t>*12</w:t>
-            </w:r>
-            <w:r>
-              <w:rPr>
-                <w:rFonts w:hint="eastAsia"/>
-              </w:rPr>
-              <w:t>00</w:t>
-            </w:r>
-            <w:r>
-              <w:rPr>
-                <w:rFonts w:hint="eastAsia"/>
-              </w:rPr>
-              <w:t>*5</w:t>
-            </w:r>
-            <w:r>
-              <w:rPr>
-                <w:rFonts w:hint="eastAsia"/>
-              </w:rPr>
-              <w:t>00</w:t>
+              <w:rPr>
+                <w:rFonts w:hint="eastAsia"/>
+              </w:rPr>
+            </w:pPr>
+            <w:r>
+              <w:rPr>
+                <w:rFonts w:hint="eastAsia"/>
+              </w:rPr>
+              <w:t>1400*1400*600</w:t>
             </w:r>
           </w:p>
         </w:tc>
@@ -8598,7 +8571,6 @@
                 <w:noProof/>
                 <w:sz w:val="24"/>
               </w:rPr>
-              <w:lastRenderedPageBreak/>
               <w:t>1</w:t>
             </w:r>
             <w:r>

</xml_diff>

<commit_message>
RailCatwalk 수정 및 임포트
</commit_message>
<xml_diff>
--- a/기획/공장 맵_방 구조 규칙.docx
+++ b/기획/공장 맵_방 구조 규칙.docx
@@ -291,13 +291,23 @@
           <w:bCs/>
         </w:rPr>
       </w:pPr>
+      <w:proofErr w:type="spellStart"/>
       <w:r>
         <w:rPr>
           <w:rFonts w:hint="eastAsia"/>
           <w:b/>
           <w:bCs/>
         </w:rPr>
-        <w:t>DoorSocket(벽에 난 문 구멍): 150*275</w:t>
+        <w:t>DoorSocket</w:t>
+      </w:r>
+      <w:proofErr w:type="spellEnd"/>
+      <w:r>
+        <w:rPr>
+          <w:rFonts w:hint="eastAsia"/>
+          <w:b/>
+          <w:bCs/>
+        </w:rPr>
+        <w:t>(벽에 난 문 구멍): 150*275</w:t>
       </w:r>
     </w:p>
     <w:p>
@@ -401,11 +411,19 @@
       <w:r>
         <w:t>’</w:t>
       </w:r>
+      <w:proofErr w:type="spellStart"/>
       <w:r>
         <w:rPr>
           <w:rFonts w:hint="eastAsia"/>
         </w:rPr>
-        <w:t>를 이용하여 열 수 있다.</w:t>
+        <w:t>를</w:t>
+      </w:r>
+      <w:proofErr w:type="spellEnd"/>
+      <w:r>
+        <w:rPr>
+          <w:rFonts w:hint="eastAsia"/>
+        </w:rPr>
+        <w:t xml:space="preserve"> 이용하여 열 수 있다.</w:t>
       </w:r>
     </w:p>
     <w:p>
@@ -420,7 +438,21 @@
         <w:rPr>
           <w:rFonts w:hint="eastAsia"/>
         </w:rPr>
-        <w:t>코어(장치)는 한 맵에 하나만 생성될 수 있다.</w:t>
+        <w:t xml:space="preserve">코어(장치)는 한 </w:t>
+      </w:r>
+      <w:proofErr w:type="spellStart"/>
+      <w:r>
+        <w:rPr>
+          <w:rFonts w:hint="eastAsia"/>
+        </w:rPr>
+        <w:t>맵에</w:t>
+      </w:r>
+      <w:proofErr w:type="spellEnd"/>
+      <w:r>
+        <w:rPr>
+          <w:rFonts w:hint="eastAsia"/>
+        </w:rPr>
+        <w:t xml:space="preserve"> 하나만 생성될 수 있다.</w:t>
       </w:r>
     </w:p>
     <w:p>
@@ -527,11 +559,19 @@
       <w:r>
         <w:t>’</w:t>
       </w:r>
+      <w:proofErr w:type="spellStart"/>
       <w:r>
         <w:rPr>
           <w:rFonts w:hint="eastAsia"/>
         </w:rPr>
-        <w:t>끼리는 바로 연결될 수 없다.</w:t>
+        <w:t>끼리는</w:t>
+      </w:r>
+      <w:proofErr w:type="spellEnd"/>
+      <w:r>
+        <w:rPr>
+          <w:rFonts w:hint="eastAsia"/>
+        </w:rPr>
+        <w:t xml:space="preserve"> 바로 연결될 수 없다.</w:t>
       </w:r>
     </w:p>
     <w:p>
@@ -554,11 +594,19 @@
       <w:r>
         <w:t>’</w:t>
       </w:r>
+      <w:proofErr w:type="spellStart"/>
       <w:r>
         <w:rPr>
           <w:rFonts w:hint="eastAsia"/>
         </w:rPr>
-        <w:t>끼리는 바로 연결될 수 있다.</w:t>
+        <w:t>끼리는</w:t>
+      </w:r>
+      <w:proofErr w:type="spellEnd"/>
+      <w:r>
+        <w:rPr>
+          <w:rFonts w:hint="eastAsia"/>
+        </w:rPr>
+        <w:t xml:space="preserve"> 바로 연결될 수 있다.</w:t>
       </w:r>
     </w:p>
     <w:p>
@@ -581,11 +629,19 @@
       <w:r>
         <w:t>’</w:t>
       </w:r>
+      <w:proofErr w:type="spellStart"/>
       <w:r>
         <w:rPr>
           <w:rFonts w:hint="eastAsia"/>
         </w:rPr>
-        <w:t>끼리는 바로 연결될 수 있다.</w:t>
+        <w:t>끼리는</w:t>
+      </w:r>
+      <w:proofErr w:type="spellEnd"/>
+      <w:r>
+        <w:rPr>
+          <w:rFonts w:hint="eastAsia"/>
+        </w:rPr>
+        <w:t xml:space="preserve"> 바로 연결될 수 있다.</w:t>
       </w:r>
     </w:p>
     <w:p>
@@ -643,7 +699,27 @@
                 <w:sz w:val="24"/>
               </w:rPr>
               <w:lastRenderedPageBreak/>
-              <w:t>0 MainEntranceRoom / 메인 입구 방</w:t>
+              <w:t xml:space="preserve">0 </w:t>
+            </w:r>
+            <w:proofErr w:type="spellStart"/>
+            <w:r>
+              <w:rPr>
+                <w:rFonts w:hint="eastAsia"/>
+                <w:b/>
+                <w:bCs/>
+                <w:sz w:val="24"/>
+              </w:rPr>
+              <w:t>MainEntranceRoom</w:t>
+            </w:r>
+            <w:proofErr w:type="spellEnd"/>
+            <w:r>
+              <w:rPr>
+                <w:rFonts w:hint="eastAsia"/>
+                <w:b/>
+                <w:bCs/>
+                <w:sz w:val="24"/>
+              </w:rPr>
+              <w:t xml:space="preserve"> / 메인 입구 방</w:t>
             </w:r>
           </w:p>
         </w:tc>
@@ -1218,7 +1294,27 @@
                 <w:bCs/>
                 <w:sz w:val="24"/>
               </w:rPr>
-              <w:t>1 GapRoom / 끊어진 방</w:t>
+              <w:t xml:space="preserve">1 </w:t>
+            </w:r>
+            <w:proofErr w:type="spellStart"/>
+            <w:r>
+              <w:rPr>
+                <w:rFonts w:hint="eastAsia"/>
+                <w:b/>
+                <w:bCs/>
+                <w:sz w:val="24"/>
+              </w:rPr>
+              <w:t>GapRoom</w:t>
+            </w:r>
+            <w:proofErr w:type="spellEnd"/>
+            <w:r>
+              <w:rPr>
+                <w:rFonts w:hint="eastAsia"/>
+                <w:b/>
+                <w:bCs/>
+                <w:sz w:val="24"/>
+              </w:rPr>
+              <w:t xml:space="preserve"> / 끊어진 방</w:t>
             </w:r>
           </w:p>
         </w:tc>
@@ -1799,7 +1895,27 @@
                 <w:bCs/>
                 <w:sz w:val="24"/>
               </w:rPr>
-              <w:t>2 ApparatusRoom / 장치 방(구조 1, 구조 2)</w:t>
+              <w:t xml:space="preserve">2 </w:t>
+            </w:r>
+            <w:proofErr w:type="spellStart"/>
+            <w:r>
+              <w:rPr>
+                <w:rFonts w:hint="eastAsia"/>
+                <w:b/>
+                <w:bCs/>
+                <w:sz w:val="24"/>
+              </w:rPr>
+              <w:t>ApparatusRoom</w:t>
+            </w:r>
+            <w:proofErr w:type="spellEnd"/>
+            <w:r>
+              <w:rPr>
+                <w:rFonts w:hint="eastAsia"/>
+                <w:b/>
+                <w:bCs/>
+                <w:sz w:val="24"/>
+              </w:rPr>
+              <w:t xml:space="preserve"> / 장치 방(구조 1, 구조 2)</w:t>
             </w:r>
           </w:p>
         </w:tc>
@@ -2404,7 +2520,27 @@
                 <w:bCs/>
                 <w:sz w:val="24"/>
               </w:rPr>
-              <w:t>3 ServerRoom / 서버 방</w:t>
+              <w:t xml:space="preserve">3 </w:t>
+            </w:r>
+            <w:proofErr w:type="spellStart"/>
+            <w:r>
+              <w:rPr>
+                <w:rFonts w:hint="eastAsia"/>
+                <w:b/>
+                <w:bCs/>
+                <w:sz w:val="24"/>
+              </w:rPr>
+              <w:t>ServerRoom</w:t>
+            </w:r>
+            <w:proofErr w:type="spellEnd"/>
+            <w:r>
+              <w:rPr>
+                <w:rFonts w:hint="eastAsia"/>
+                <w:b/>
+                <w:bCs/>
+                <w:sz w:val="24"/>
+              </w:rPr>
+              <w:t xml:space="preserve"> / 서버 방</w:t>
             </w:r>
           </w:p>
         </w:tc>
@@ -2963,7 +3099,47 @@
                 <w:bCs/>
                 <w:sz w:val="24"/>
               </w:rPr>
-              <w:t>4 CabinetRoom / 캐비넷 방</w:t>
+              <w:t xml:space="preserve">4 </w:t>
+            </w:r>
+            <w:proofErr w:type="spellStart"/>
+            <w:r>
+              <w:rPr>
+                <w:rFonts w:hint="eastAsia"/>
+                <w:b/>
+                <w:bCs/>
+                <w:sz w:val="24"/>
+              </w:rPr>
+              <w:t>CabinetRoom</w:t>
+            </w:r>
+            <w:proofErr w:type="spellEnd"/>
+            <w:r>
+              <w:rPr>
+                <w:rFonts w:hint="eastAsia"/>
+                <w:b/>
+                <w:bCs/>
+                <w:sz w:val="24"/>
+              </w:rPr>
+              <w:t xml:space="preserve"> / </w:t>
+            </w:r>
+            <w:proofErr w:type="spellStart"/>
+            <w:r>
+              <w:rPr>
+                <w:rFonts w:hint="eastAsia"/>
+                <w:b/>
+                <w:bCs/>
+                <w:sz w:val="24"/>
+              </w:rPr>
+              <w:t>캐비넷</w:t>
+            </w:r>
+            <w:proofErr w:type="spellEnd"/>
+            <w:r>
+              <w:rPr>
+                <w:rFonts w:hint="eastAsia"/>
+                <w:b/>
+                <w:bCs/>
+                <w:sz w:val="24"/>
+              </w:rPr>
+              <w:t xml:space="preserve"> 방</w:t>
             </w:r>
           </w:p>
         </w:tc>
@@ -3713,7 +3889,35 @@
         <w:rPr>
           <w:rFonts w:hint="eastAsia"/>
         </w:rPr>
-        <w:t>: 대각선으로 마주보는 모서리에 최대 2개의 캐비넷이 생성될 수 있다. 캐비넷은 생성되더라도 열리지 않을 수도 있다.</w:t>
+        <w:t xml:space="preserve">: 대각선으로 마주보는 모서리에 최대 2개의 </w:t>
+      </w:r>
+      <w:proofErr w:type="spellStart"/>
+      <w:r>
+        <w:rPr>
+          <w:rFonts w:hint="eastAsia"/>
+        </w:rPr>
+        <w:t>캐비넷이</w:t>
+      </w:r>
+      <w:proofErr w:type="spellEnd"/>
+      <w:r>
+        <w:rPr>
+          <w:rFonts w:hint="eastAsia"/>
+        </w:rPr>
+        <w:t xml:space="preserve"> 생성될 수 있다. </w:t>
+      </w:r>
+      <w:proofErr w:type="spellStart"/>
+      <w:r>
+        <w:rPr>
+          <w:rFonts w:hint="eastAsia"/>
+        </w:rPr>
+        <w:t>캐비넷은</w:t>
+      </w:r>
+      <w:proofErr w:type="spellEnd"/>
+      <w:r>
+        <w:rPr>
+          <w:rFonts w:hint="eastAsia"/>
+        </w:rPr>
+        <w:t xml:space="preserve"> 생성되더라도 열리지 않을 수도 있다.</w:t>
       </w:r>
     </w:p>
     <w:p>
@@ -5588,7 +5792,21 @@
         <w:rPr>
           <w:rFonts w:hint="eastAsia"/>
         </w:rPr>
-        <w:t xml:space="preserve">: 꺾임형 </w:t>
+        <w:t xml:space="preserve">: </w:t>
+      </w:r>
+      <w:proofErr w:type="spellStart"/>
+      <w:r>
+        <w:rPr>
+          <w:rFonts w:hint="eastAsia"/>
+        </w:rPr>
+        <w:t>꺾임형</w:t>
+      </w:r>
+      <w:proofErr w:type="spellEnd"/>
+      <w:r>
+        <w:rPr>
+          <w:rFonts w:hint="eastAsia"/>
+        </w:rPr>
+        <w:t xml:space="preserve"> </w:t>
       </w:r>
       <w:r>
         <w:t>–</w:t>
@@ -6930,10 +7148,10 @@
                 <w:noProof/>
               </w:rPr>
               <w:drawing>
-                <wp:inline distT="0" distB="0" distL="0" distR="0" wp14:anchorId="48C8EC82" wp14:editId="274EFAA8">
-                  <wp:extent cx="1076475" cy="1857634"/>
-                  <wp:effectExtent l="0" t="0" r="9525" b="9525"/>
-                  <wp:docPr id="2105328893" name="그림 1"/>
+                <wp:inline distT="0" distB="0" distL="0" distR="0" wp14:anchorId="10B24BDD" wp14:editId="26DDEEAA">
+                  <wp:extent cx="1372568" cy="1913861"/>
+                  <wp:effectExtent l="0" t="0" r="0" b="0"/>
+                  <wp:docPr id="1480969266" name="그림 1"/>
                   <wp:cNvGraphicFramePr>
                     <a:graphicFrameLocks xmlns:a="http://schemas.openxmlformats.org/drawingml/2006/main" noChangeAspect="1"/>
                   </wp:cNvGraphicFramePr>
@@ -6941,7 +7159,7 @@
                     <a:graphicData uri="http://schemas.openxmlformats.org/drawingml/2006/picture">
                       <pic:pic xmlns:pic="http://schemas.openxmlformats.org/drawingml/2006/picture">
                         <pic:nvPicPr>
-                          <pic:cNvPr id="2105328893" name=""/>
+                          <pic:cNvPr id="1480969266" name=""/>
                           <pic:cNvPicPr/>
                         </pic:nvPicPr>
                         <pic:blipFill>
@@ -6953,7 +7171,7 @@
                         <pic:spPr>
                           <a:xfrm>
                             <a:off x="0" y="0"/>
-                            <a:ext cx="1076475" cy="1857634"/>
+                            <a:ext cx="1376476" cy="1919311"/>
                           </a:xfrm>
                           <a:prstGeom prst="rect">
                             <a:avLst/>
@@ -7007,6 +7225,9 @@
               <w:pStyle w:val="a6"/>
               <w:ind w:left="0"/>
               <w:jc w:val="center"/>
+              <w:rPr>
+                <w:rFonts w:hint="eastAsia"/>
+              </w:rPr>
             </w:pPr>
             <w:r>
               <w:rPr>
@@ -7018,37 +7239,49 @@
               <w:rPr>
                 <w:rFonts w:hint="eastAsia"/>
               </w:rPr>
+              <w:t>5</w:t>
+            </w:r>
+            <w:r>
+              <w:rPr>
+                <w:rFonts w:hint="eastAsia"/>
+              </w:rPr>
+              <w:t>0</w:t>
+            </w:r>
+            <w:r>
+              <w:rPr>
+                <w:rFonts w:hint="eastAsia"/>
+              </w:rPr>
+              <w:t>*1</w:t>
+            </w:r>
+            <w:r>
+              <w:rPr>
+                <w:rFonts w:hint="eastAsia"/>
+              </w:rPr>
+              <w:t>3</w:t>
+            </w:r>
+            <w:r>
+              <w:rPr>
+                <w:rFonts w:hint="eastAsia"/>
+              </w:rPr>
               <w:t>00</w:t>
             </w:r>
             <w:r>
               <w:rPr>
                 <w:rFonts w:hint="eastAsia"/>
               </w:rPr>
-              <w:t>*12</w:t>
-            </w:r>
-            <w:r>
-              <w:rPr>
-                <w:rFonts w:hint="eastAsia"/>
-              </w:rPr>
-              <w:t>00</w:t>
-            </w:r>
-            <w:r>
-              <w:rPr>
-                <w:rFonts w:hint="eastAsia"/>
-              </w:rPr>
               <w:t>*</w:t>
             </w:r>
             <w:r>
               <w:rPr>
                 <w:rFonts w:hint="eastAsia"/>
               </w:rPr>
-              <w:t>10</w:t>
-            </w:r>
-            <w:r>
-              <w:rPr>
-                <w:rFonts w:hint="eastAsia"/>
-              </w:rPr>
-              <w:t>00</w:t>
+              <w:t>1</w:t>
+            </w:r>
+            <w:r>
+              <w:rPr>
+                <w:rFonts w:hint="eastAsia"/>
+              </w:rPr>
+              <w:t>200</w:t>
             </w:r>
           </w:p>
         </w:tc>

</xml_diff>

<commit_message>
StorageRoom_Step 수정 및 임포트
</commit_message>
<xml_diff>
--- a/기획/공장 맵_방 구조 규칙.docx
+++ b/기획/공장 맵_방 구조 규칙.docx
@@ -64,12 +64,28 @@
     </w:p>
     <w:p/>
     <w:p>
+      <w:proofErr w:type="gramStart"/>
       <w:r>
         <w:rPr>
           <w:rFonts w:hint="eastAsia"/>
         </w:rPr>
-        <w:t>[ 참고 사항 ]</w:t>
+        <w:t>[ 참고</w:t>
       </w:r>
+      <w:proofErr w:type="gramEnd"/>
+      <w:r>
+        <w:rPr>
+          <w:rFonts w:hint="eastAsia"/>
+        </w:rPr>
+        <w:t xml:space="preserve"> </w:t>
+      </w:r>
+      <w:proofErr w:type="gramStart"/>
+      <w:r>
+        <w:rPr>
+          <w:rFonts w:hint="eastAsia"/>
+        </w:rPr>
+        <w:t>사항 ]</w:t>
+      </w:r>
+      <w:proofErr w:type="gramEnd"/>
     </w:p>
     <w:p>
       <w:pPr>
@@ -342,6 +358,7 @@
     </w:p>
     <w:p/>
     <w:p>
+      <w:proofErr w:type="gramStart"/>
       <w:r>
         <w:rPr>
           <w:rFonts w:hint="eastAsia"/>
@@ -358,7 +375,14 @@
         <w:rPr>
           <w:rFonts w:hint="eastAsia"/>
         </w:rPr>
-        <w:t xml:space="preserve">모든 스테이지 </w:t>
+        <w:t>모든</w:t>
+      </w:r>
+      <w:proofErr w:type="gramEnd"/>
+      <w:r>
+        <w:rPr>
+          <w:rFonts w:hint="eastAsia"/>
+        </w:rPr>
+        <w:t xml:space="preserve"> 스테이지 </w:t>
       </w:r>
       <w:r>
         <w:rPr>
@@ -376,7 +400,14 @@
         <w:rPr>
           <w:rFonts w:hint="eastAsia"/>
         </w:rPr>
-        <w:t xml:space="preserve"> &amp; 규칙</w:t>
+        <w:t xml:space="preserve"> &amp; </w:t>
+      </w:r>
+      <w:proofErr w:type="gramStart"/>
+      <w:r>
+        <w:rPr>
+          <w:rFonts w:hint="eastAsia"/>
+        </w:rPr>
+        <w:t>규칙</w:t>
       </w:r>
       <w:r>
         <w:rPr>
@@ -384,6 +415,7 @@
         </w:rPr>
         <w:t xml:space="preserve"> ]</w:t>
       </w:r>
+      <w:proofErr w:type="gramEnd"/>
     </w:p>
     <w:p>
       <w:pPr>
@@ -702,6 +734,7 @@
               <w:t xml:space="preserve">0 </w:t>
             </w:r>
             <w:proofErr w:type="spellStart"/>
+            <w:proofErr w:type="gramStart"/>
             <w:r>
               <w:rPr>
                 <w:rFonts w:hint="eastAsia"/>
@@ -719,7 +752,17 @@
                 <w:bCs/>
                 <w:sz w:val="24"/>
               </w:rPr>
-              <w:t xml:space="preserve"> / 메인 입구 방</w:t>
+              <w:t xml:space="preserve"> /</w:t>
+            </w:r>
+            <w:proofErr w:type="gramEnd"/>
+            <w:r>
+              <w:rPr>
+                <w:rFonts w:hint="eastAsia"/>
+                <w:b/>
+                <w:bCs/>
+                <w:sz w:val="24"/>
+              </w:rPr>
+              <w:t xml:space="preserve"> 메인 입구 방</w:t>
             </w:r>
           </w:p>
         </w:tc>
@@ -1297,6 +1340,7 @@
               <w:t xml:space="preserve">1 </w:t>
             </w:r>
             <w:proofErr w:type="spellStart"/>
+            <w:proofErr w:type="gramStart"/>
             <w:r>
               <w:rPr>
                 <w:rFonts w:hint="eastAsia"/>
@@ -1314,7 +1358,17 @@
                 <w:bCs/>
                 <w:sz w:val="24"/>
               </w:rPr>
-              <w:t xml:space="preserve"> / 끊어진 방</w:t>
+              <w:t xml:space="preserve"> /</w:t>
+            </w:r>
+            <w:proofErr w:type="gramEnd"/>
+            <w:r>
+              <w:rPr>
+                <w:rFonts w:hint="eastAsia"/>
+                <w:b/>
+                <w:bCs/>
+                <w:sz w:val="24"/>
+              </w:rPr>
+              <w:t xml:space="preserve"> 끊어진 방</w:t>
             </w:r>
           </w:p>
         </w:tc>
@@ -1898,6 +1952,7 @@
               <w:t xml:space="preserve">2 </w:t>
             </w:r>
             <w:proofErr w:type="spellStart"/>
+            <w:proofErr w:type="gramStart"/>
             <w:r>
               <w:rPr>
                 <w:rFonts w:hint="eastAsia"/>
@@ -1915,7 +1970,17 @@
                 <w:bCs/>
                 <w:sz w:val="24"/>
               </w:rPr>
-              <w:t xml:space="preserve"> / 장치 방(구조 1, 구조 2)</w:t>
+              <w:t xml:space="preserve"> /</w:t>
+            </w:r>
+            <w:proofErr w:type="gramEnd"/>
+            <w:r>
+              <w:rPr>
+                <w:rFonts w:hint="eastAsia"/>
+                <w:b/>
+                <w:bCs/>
+                <w:sz w:val="24"/>
+              </w:rPr>
+              <w:t xml:space="preserve"> 장치 방(구조 1, 구조 2)</w:t>
             </w:r>
           </w:p>
         </w:tc>
@@ -2523,6 +2588,7 @@
               <w:t xml:space="preserve">3 </w:t>
             </w:r>
             <w:proofErr w:type="spellStart"/>
+            <w:proofErr w:type="gramStart"/>
             <w:r>
               <w:rPr>
                 <w:rFonts w:hint="eastAsia"/>
@@ -2540,7 +2606,17 @@
                 <w:bCs/>
                 <w:sz w:val="24"/>
               </w:rPr>
-              <w:t xml:space="preserve"> / 서버 방</w:t>
+              <w:t xml:space="preserve"> /</w:t>
+            </w:r>
+            <w:proofErr w:type="gramEnd"/>
+            <w:r>
+              <w:rPr>
+                <w:rFonts w:hint="eastAsia"/>
+                <w:b/>
+                <w:bCs/>
+                <w:sz w:val="24"/>
+              </w:rPr>
+              <w:t xml:space="preserve"> 서버 방</w:t>
             </w:r>
           </w:p>
         </w:tc>
@@ -3102,6 +3178,7 @@
               <w:t xml:space="preserve">4 </w:t>
             </w:r>
             <w:proofErr w:type="spellStart"/>
+            <w:proofErr w:type="gramStart"/>
             <w:r>
               <w:rPr>
                 <w:rFonts w:hint="eastAsia"/>
@@ -3119,7 +3196,17 @@
                 <w:bCs/>
                 <w:sz w:val="24"/>
               </w:rPr>
-              <w:t xml:space="preserve"> / </w:t>
+              <w:t xml:space="preserve"> /</w:t>
+            </w:r>
+            <w:proofErr w:type="gramEnd"/>
+            <w:r>
+              <w:rPr>
+                <w:rFonts w:hint="eastAsia"/>
+                <w:b/>
+                <w:bCs/>
+                <w:sz w:val="24"/>
+              </w:rPr>
+              <w:t xml:space="preserve"> </w:t>
             </w:r>
             <w:proofErr w:type="spellStart"/>
             <w:r>
@@ -5179,14 +5266,11 @@
               <w:jc w:val="center"/>
             </w:pPr>
             <w:r>
-              <w:rPr>
-                <w:noProof/>
-              </w:rPr>
               <w:drawing>
-                <wp:inline distT="0" distB="0" distL="0" distR="0" wp14:anchorId="7D5AB49E" wp14:editId="1BD00384">
-                  <wp:extent cx="2657846" cy="1838582"/>
+                <wp:inline distT="0" distB="0" distL="0" distR="0" wp14:anchorId="06BB7732" wp14:editId="60D86FDC">
+                  <wp:extent cx="2286319" cy="1991003"/>
                   <wp:effectExtent l="0" t="0" r="0" b="9525"/>
-                  <wp:docPr id="1230972887" name="그림 1"/>
+                  <wp:docPr id="1502741339" name="그림 1"/>
                   <wp:cNvGraphicFramePr>
                     <a:graphicFrameLocks xmlns:a="http://schemas.openxmlformats.org/drawingml/2006/main" noChangeAspect="1"/>
                   </wp:cNvGraphicFramePr>
@@ -5194,7 +5278,7 @@
                     <a:graphicData uri="http://schemas.openxmlformats.org/drawingml/2006/picture">
                       <pic:pic xmlns:pic="http://schemas.openxmlformats.org/drawingml/2006/picture">
                         <pic:nvPicPr>
-                          <pic:cNvPr id="1230972887" name=""/>
+                          <pic:cNvPr id="1502741339" name=""/>
                           <pic:cNvPicPr/>
                         </pic:nvPicPr>
                         <pic:blipFill>
@@ -5206,7 +5290,7 @@
                         <pic:spPr>
                           <a:xfrm>
                             <a:off x="0" y="0"/>
-                            <a:ext cx="2657846" cy="1838582"/>
+                            <a:ext cx="2286319" cy="1991003"/>
                           </a:xfrm>
                           <a:prstGeom prst="rect">
                             <a:avLst/>
@@ -5229,10 +5313,10 @@
                 <w:noProof/>
               </w:rPr>
               <w:drawing>
-                <wp:inline distT="0" distB="0" distL="0" distR="0" wp14:anchorId="65094D2E" wp14:editId="30E2CD5B">
-                  <wp:extent cx="2181529" cy="1857634"/>
-                  <wp:effectExtent l="0" t="0" r="9525" b="9525"/>
-                  <wp:docPr id="2013976693" name="그림 1"/>
+                <wp:inline distT="0" distB="0" distL="0" distR="0" wp14:anchorId="70AA5C1A" wp14:editId="529C3985">
+                  <wp:extent cx="1714739" cy="1562318"/>
+                  <wp:effectExtent l="0" t="0" r="0" b="0"/>
+                  <wp:docPr id="129532125" name="그림 1"/>
                   <wp:cNvGraphicFramePr>
                     <a:graphicFrameLocks xmlns:a="http://schemas.openxmlformats.org/drawingml/2006/main" noChangeAspect="1"/>
                   </wp:cNvGraphicFramePr>
@@ -5240,7 +5324,7 @@
                     <a:graphicData uri="http://schemas.openxmlformats.org/drawingml/2006/picture">
                       <pic:pic xmlns:pic="http://schemas.openxmlformats.org/drawingml/2006/picture">
                         <pic:nvPicPr>
-                          <pic:cNvPr id="2013976693" name=""/>
+                          <pic:cNvPr id="129532125" name=""/>
                           <pic:cNvPicPr/>
                         </pic:nvPicPr>
                         <pic:blipFill>
@@ -5252,7 +5336,7 @@
                         <pic:spPr>
                           <a:xfrm>
                             <a:off x="0" y="0"/>
-                            <a:ext cx="2181529" cy="1857634"/>
+                            <a:ext cx="1714739" cy="1562318"/>
                           </a:xfrm>
                           <a:prstGeom prst="rect">
                             <a:avLst/>
@@ -5361,13 +5445,13 @@
               <w:rPr>
                 <w:rFonts w:hint="eastAsia"/>
               </w:rPr>
-              <w:t>*10</w:t>
-            </w:r>
-            <w:r>
-              <w:rPr>
-                <w:rFonts w:hint="eastAsia"/>
-              </w:rPr>
-              <w:t>00</w:t>
+              <w:t>*</w:t>
+            </w:r>
+            <w:r>
+              <w:rPr>
+                <w:rFonts w:hint="eastAsia"/>
+              </w:rPr>
+              <w:t>1200</w:t>
             </w:r>
           </w:p>
         </w:tc>
@@ -7225,9 +7309,6 @@
               <w:pStyle w:val="a6"/>
               <w:ind w:left="0"/>
               <w:jc w:val="center"/>
-              <w:rPr>
-                <w:rFonts w:hint="eastAsia"/>
-              </w:rPr>
             </w:pPr>
             <w:r>
               <w:rPr>
@@ -9001,6 +9082,9 @@
               <w:t xml:space="preserve"> </w:t>
             </w:r>
             <w:r>
+              <w:rPr>
+                <w:noProof/>
+              </w:rPr>
               <w:drawing>
                 <wp:inline distT="0" distB="0" distL="0" distR="0" wp14:anchorId="1BF0444C" wp14:editId="1919FDDD">
                   <wp:extent cx="1800000" cy="1800000"/>
@@ -9096,9 +9180,6 @@
               <w:pStyle w:val="a6"/>
               <w:ind w:left="0"/>
               <w:jc w:val="center"/>
-              <w:rPr>
-                <w:rFonts w:hint="eastAsia"/>
-              </w:rPr>
             </w:pPr>
             <w:r>
               <w:rPr>

</xml_diff>

<commit_message>
FactoryRoom 수정 및 임포트, RailCatwalk 도면 수정
</commit_message>
<xml_diff>
--- a/기획/공장 맵_방 구조 규칙.docx
+++ b/기획/공장 맵_방 구조 규칙.docx
@@ -64,28 +64,12 @@
     </w:p>
     <w:p/>
     <w:p>
-      <w:proofErr w:type="gramStart"/>
       <w:r>
         <w:rPr>
           <w:rFonts w:hint="eastAsia"/>
         </w:rPr>
-        <w:t>[ 참고</w:t>
+        <w:t>[ 참고 사항 ]</w:t>
       </w:r>
-      <w:proofErr w:type="gramEnd"/>
-      <w:r>
-        <w:rPr>
-          <w:rFonts w:hint="eastAsia"/>
-        </w:rPr>
-        <w:t xml:space="preserve"> </w:t>
-      </w:r>
-      <w:proofErr w:type="gramStart"/>
-      <w:r>
-        <w:rPr>
-          <w:rFonts w:hint="eastAsia"/>
-        </w:rPr>
-        <w:t>사항 ]</w:t>
-      </w:r>
-      <w:proofErr w:type="gramEnd"/>
     </w:p>
     <w:p>
       <w:pPr>
@@ -358,7 +342,6 @@
     </w:p>
     <w:p/>
     <w:p>
-      <w:proofErr w:type="gramStart"/>
       <w:r>
         <w:rPr>
           <w:rFonts w:hint="eastAsia"/>
@@ -375,14 +358,7 @@
         <w:rPr>
           <w:rFonts w:hint="eastAsia"/>
         </w:rPr>
-        <w:t>모든</w:t>
-      </w:r>
-      <w:proofErr w:type="gramEnd"/>
-      <w:r>
-        <w:rPr>
-          <w:rFonts w:hint="eastAsia"/>
-        </w:rPr>
-        <w:t xml:space="preserve"> 스테이지 </w:t>
+        <w:t xml:space="preserve">모든 스테이지 </w:t>
       </w:r>
       <w:r>
         <w:rPr>
@@ -400,14 +376,7 @@
         <w:rPr>
           <w:rFonts w:hint="eastAsia"/>
         </w:rPr>
-        <w:t xml:space="preserve"> &amp; </w:t>
-      </w:r>
-      <w:proofErr w:type="gramStart"/>
-      <w:r>
-        <w:rPr>
-          <w:rFonts w:hint="eastAsia"/>
-        </w:rPr>
-        <w:t>규칙</w:t>
+        <w:t xml:space="preserve"> &amp; 규칙</w:t>
       </w:r>
       <w:r>
         <w:rPr>
@@ -415,7 +384,6 @@
         </w:rPr>
         <w:t xml:space="preserve"> ]</w:t>
       </w:r>
-      <w:proofErr w:type="gramEnd"/>
     </w:p>
     <w:p>
       <w:pPr>
@@ -734,7 +702,6 @@
               <w:t xml:space="preserve">0 </w:t>
             </w:r>
             <w:proofErr w:type="spellStart"/>
-            <w:proofErr w:type="gramStart"/>
             <w:r>
               <w:rPr>
                 <w:rFonts w:hint="eastAsia"/>
@@ -752,17 +719,7 @@
                 <w:bCs/>
                 <w:sz w:val="24"/>
               </w:rPr>
-              <w:t xml:space="preserve"> /</w:t>
-            </w:r>
-            <w:proofErr w:type="gramEnd"/>
-            <w:r>
-              <w:rPr>
-                <w:rFonts w:hint="eastAsia"/>
-                <w:b/>
-                <w:bCs/>
-                <w:sz w:val="24"/>
-              </w:rPr>
-              <w:t xml:space="preserve"> 메인 입구 방</w:t>
+              <w:t xml:space="preserve"> / 메인 입구 방</w:t>
             </w:r>
           </w:p>
         </w:tc>
@@ -1340,7 +1297,6 @@
               <w:t xml:space="preserve">1 </w:t>
             </w:r>
             <w:proofErr w:type="spellStart"/>
-            <w:proofErr w:type="gramStart"/>
             <w:r>
               <w:rPr>
                 <w:rFonts w:hint="eastAsia"/>
@@ -1358,17 +1314,7 @@
                 <w:bCs/>
                 <w:sz w:val="24"/>
               </w:rPr>
-              <w:t xml:space="preserve"> /</w:t>
-            </w:r>
-            <w:proofErr w:type="gramEnd"/>
-            <w:r>
-              <w:rPr>
-                <w:rFonts w:hint="eastAsia"/>
-                <w:b/>
-                <w:bCs/>
-                <w:sz w:val="24"/>
-              </w:rPr>
-              <w:t xml:space="preserve"> 끊어진 방</w:t>
+              <w:t xml:space="preserve"> / 끊어진 방</w:t>
             </w:r>
           </w:p>
         </w:tc>
@@ -1952,7 +1898,6 @@
               <w:t xml:space="preserve">2 </w:t>
             </w:r>
             <w:proofErr w:type="spellStart"/>
-            <w:proofErr w:type="gramStart"/>
             <w:r>
               <w:rPr>
                 <w:rFonts w:hint="eastAsia"/>
@@ -1970,17 +1915,7 @@
                 <w:bCs/>
                 <w:sz w:val="24"/>
               </w:rPr>
-              <w:t xml:space="preserve"> /</w:t>
-            </w:r>
-            <w:proofErr w:type="gramEnd"/>
-            <w:r>
-              <w:rPr>
-                <w:rFonts w:hint="eastAsia"/>
-                <w:b/>
-                <w:bCs/>
-                <w:sz w:val="24"/>
-              </w:rPr>
-              <w:t xml:space="preserve"> 장치 방(구조 1, 구조 2)</w:t>
+              <w:t xml:space="preserve"> / 장치 방(구조 1, 구조 2)</w:t>
             </w:r>
           </w:p>
         </w:tc>
@@ -2588,7 +2523,6 @@
               <w:t xml:space="preserve">3 </w:t>
             </w:r>
             <w:proofErr w:type="spellStart"/>
-            <w:proofErr w:type="gramStart"/>
             <w:r>
               <w:rPr>
                 <w:rFonts w:hint="eastAsia"/>
@@ -2606,17 +2540,7 @@
                 <w:bCs/>
                 <w:sz w:val="24"/>
               </w:rPr>
-              <w:t xml:space="preserve"> /</w:t>
-            </w:r>
-            <w:proofErr w:type="gramEnd"/>
-            <w:r>
-              <w:rPr>
-                <w:rFonts w:hint="eastAsia"/>
-                <w:b/>
-                <w:bCs/>
-                <w:sz w:val="24"/>
-              </w:rPr>
-              <w:t xml:space="preserve"> 서버 방</w:t>
+              <w:t xml:space="preserve"> / 서버 방</w:t>
             </w:r>
           </w:p>
         </w:tc>
@@ -3178,7 +3102,6 @@
               <w:t xml:space="preserve">4 </w:t>
             </w:r>
             <w:proofErr w:type="spellStart"/>
-            <w:proofErr w:type="gramStart"/>
             <w:r>
               <w:rPr>
                 <w:rFonts w:hint="eastAsia"/>
@@ -3196,17 +3119,7 @@
                 <w:bCs/>
                 <w:sz w:val="24"/>
               </w:rPr>
-              <w:t xml:space="preserve"> /</w:t>
-            </w:r>
-            <w:proofErr w:type="gramEnd"/>
-            <w:r>
-              <w:rPr>
-                <w:rFonts w:hint="eastAsia"/>
-                <w:b/>
-                <w:bCs/>
-                <w:sz w:val="24"/>
-              </w:rPr>
-              <w:t xml:space="preserve"> </w:t>
+              <w:t xml:space="preserve"> / </w:t>
             </w:r>
             <w:proofErr w:type="spellStart"/>
             <w:r>
@@ -6526,8 +6439,9 @@
     <w:tbl>
       <w:tblPr>
         <w:tblStyle w:val="ae"/>
+        <w:tblpPr w:leftFromText="142" w:rightFromText="142" w:vertAnchor="text" w:tblpY="1"/>
+        <w:tblOverlap w:val="never"/>
         <w:tblW w:w="0" w:type="auto"/>
-        <w:jc w:val="center"/>
         <w:tblLook w:val="04A0" w:firstRow="1" w:lastRow="0" w:firstColumn="1" w:lastColumn="0" w:noHBand="0" w:noVBand="1"/>
       </w:tblPr>
       <w:tblGrid>
@@ -6537,9 +6451,6 @@
         <w:gridCol w:w="1338"/>
       </w:tblGrid>
       <w:tr>
-        <w:trPr>
-          <w:jc w:val="center"/>
-        </w:trPr>
         <w:tc>
           <w:tcPr>
             <w:tcW w:w="8136" w:type="dxa"/>
@@ -6566,9 +6477,6 @@
         </w:tc>
       </w:tr>
       <w:tr>
-        <w:trPr>
-          <w:jc w:val="center"/>
-        </w:trPr>
         <w:tc>
           <w:tcPr>
             <w:tcW w:w="8136" w:type="dxa"/>
@@ -6588,11 +6496,17 @@
               <w:rPr>
                 <w:noProof/>
               </w:rPr>
+              <w:t xml:space="preserve"> </w:t>
+            </w:r>
+            <w:r>
+              <w:rPr>
+                <w:noProof/>
+              </w:rPr>
               <w:drawing>
-                <wp:inline distT="0" distB="0" distL="0" distR="0" wp14:anchorId="09EAE506" wp14:editId="2F902B1D">
-                  <wp:extent cx="4547890" cy="1944000"/>
-                  <wp:effectExtent l="0" t="0" r="5080" b="0"/>
-                  <wp:docPr id="354687689" name="그림 1"/>
+                <wp:inline distT="0" distB="0" distL="0" distR="0" wp14:anchorId="24765F05" wp14:editId="6528AF2F">
+                  <wp:extent cx="4177962" cy="3485670"/>
+                  <wp:effectExtent l="0" t="0" r="0" b="635"/>
+                  <wp:docPr id="480580491" name="그림 1"/>
                   <wp:cNvGraphicFramePr>
                     <a:graphicFrameLocks xmlns:a="http://schemas.openxmlformats.org/drawingml/2006/main" noChangeAspect="1"/>
                   </wp:cNvGraphicFramePr>
@@ -6600,11 +6514,17 @@
                     <a:graphicData uri="http://schemas.openxmlformats.org/drawingml/2006/picture">
                       <pic:pic xmlns:pic="http://schemas.openxmlformats.org/drawingml/2006/picture">
                         <pic:nvPicPr>
-                          <pic:cNvPr id="354687689" name=""/>
+                          <pic:cNvPr id="480580491" name="그림 1"/>
                           <pic:cNvPicPr/>
                         </pic:nvPicPr>
                         <pic:blipFill>
-                          <a:blip r:embed="rId20"/>
+                          <a:blip r:embed="rId20">
+                            <a:extLst>
+                              <a:ext uri="{28A0092B-C50C-407E-A947-70E740481C1C}">
+                                <a14:useLocalDpi xmlns:a14="http://schemas.microsoft.com/office/drawing/2010/main" val="0"/>
+                              </a:ext>
+                            </a:extLst>
+                          </a:blip>
                           <a:stretch>
                             <a:fillRect/>
                           </a:stretch>
@@ -6612,7 +6532,7 @@
                         <pic:spPr>
                           <a:xfrm>
                             <a:off x="0" y="0"/>
-                            <a:ext cx="4547890" cy="1944000"/>
+                            <a:ext cx="4177962" cy="3485670"/>
                           </a:xfrm>
                           <a:prstGeom prst="rect">
                             <a:avLst/>
@@ -6647,9 +6567,9 @@
                 <w:noProof/>
               </w:rPr>
               <w:drawing>
-                <wp:inline distT="0" distB="0" distL="0" distR="0" wp14:anchorId="5AB745F1" wp14:editId="033BF2C2">
-                  <wp:extent cx="3859801" cy="2349795"/>
-                  <wp:effectExtent l="0" t="0" r="7620" b="0"/>
+                <wp:inline distT="0" distB="0" distL="0" distR="0" wp14:anchorId="5AB745F1" wp14:editId="4233B9A6">
+                  <wp:extent cx="3211373" cy="2878884"/>
+                  <wp:effectExtent l="0" t="0" r="8255" b="0"/>
                   <wp:docPr id="1021474114" name="그림 1"/>
                   <wp:cNvGraphicFramePr>
                     <a:graphicFrameLocks xmlns:a="http://schemas.openxmlformats.org/drawingml/2006/main" noChangeAspect="1"/>
@@ -6658,11 +6578,17 @@
                     <a:graphicData uri="http://schemas.openxmlformats.org/drawingml/2006/picture">
                       <pic:pic xmlns:pic="http://schemas.openxmlformats.org/drawingml/2006/picture">
                         <pic:nvPicPr>
-                          <pic:cNvPr id="1021474114" name=""/>
+                          <pic:cNvPr id="1021474114" name="그림 1"/>
                           <pic:cNvPicPr/>
                         </pic:nvPicPr>
                         <pic:blipFill>
-                          <a:blip r:embed="rId21"/>
+                          <a:blip r:embed="rId21" cstate="print">
+                            <a:extLst>
+                              <a:ext uri="{28A0092B-C50C-407E-A947-70E740481C1C}">
+                                <a14:useLocalDpi xmlns:a14="http://schemas.microsoft.com/office/drawing/2010/main" val="0"/>
+                              </a:ext>
+                            </a:extLst>
+                          </a:blip>
                           <a:stretch>
                             <a:fillRect/>
                           </a:stretch>
@@ -6670,7 +6596,7 @@
                         <pic:spPr>
                           <a:xfrm>
                             <a:off x="0" y="0"/>
-                            <a:ext cx="3868621" cy="2355165"/>
+                            <a:ext cx="3219364" cy="2886048"/>
                           </a:xfrm>
                           <a:prstGeom prst="rect">
                             <a:avLst/>
@@ -6697,9 +6623,6 @@
         </w:tc>
       </w:tr>
       <w:tr>
-        <w:trPr>
-          <w:jc w:val="center"/>
-        </w:trPr>
         <w:tc>
           <w:tcPr>
             <w:tcW w:w="4124" w:type="dxa"/>
@@ -6759,39 +6682,30 @@
               <w:rPr>
                 <w:rFonts w:hint="eastAsia"/>
               </w:rPr>
-              <w:t>*12</w:t>
-            </w:r>
-            <w:r>
-              <w:rPr>
-                <w:rFonts w:hint="eastAsia"/>
-              </w:rPr>
-              <w:t>00</w:t>
-            </w:r>
-            <w:r>
-              <w:rPr>
-                <w:rFonts w:hint="eastAsia"/>
-              </w:rPr>
               <w:t>*</w:t>
             </w:r>
             <w:r>
               <w:rPr>
                 <w:rFonts w:hint="eastAsia"/>
               </w:rPr>
-              <w:t>15</w:t>
-            </w:r>
-            <w:r>
-              <w:rPr>
-                <w:rFonts w:hint="eastAsia"/>
-              </w:rPr>
-              <w:t>00</w:t>
-            </w:r>
-          </w:p>
-        </w:tc>
-      </w:tr>
-      <w:tr>
-        <w:trPr>
-          <w:jc w:val="center"/>
-        </w:trPr>
+              <w:t>1500</w:t>
+            </w:r>
+            <w:r>
+              <w:rPr>
+                <w:rFonts w:hint="eastAsia"/>
+              </w:rPr>
+              <w:t>*</w:t>
+            </w:r>
+            <w:r>
+              <w:rPr>
+                <w:rFonts w:hint="eastAsia"/>
+              </w:rPr>
+              <w:t>1800</w:t>
+            </w:r>
+          </w:p>
+        </w:tc>
+      </w:tr>
+      <w:tr>
         <w:tc>
           <w:tcPr>
             <w:tcW w:w="4124" w:type="dxa"/>
@@ -6832,9 +6746,6 @@
         </w:tc>
       </w:tr>
       <w:tr>
-        <w:trPr>
-          <w:jc w:val="center"/>
-        </w:trPr>
         <w:tc>
           <w:tcPr>
             <w:tcW w:w="4124" w:type="dxa"/>
@@ -6875,9 +6786,6 @@
         </w:tc>
       </w:tr>
       <w:tr>
-        <w:trPr>
-          <w:jc w:val="center"/>
-        </w:trPr>
         <w:tc>
           <w:tcPr>
             <w:tcW w:w="4124" w:type="dxa"/>
@@ -6956,9 +6864,6 @@
         </w:tc>
       </w:tr>
       <w:tr>
-        <w:trPr>
-          <w:jc w:val="center"/>
-        </w:trPr>
         <w:tc>
           <w:tcPr>
             <w:tcW w:w="4124" w:type="dxa"/>
@@ -7034,9 +6939,6 @@
         </w:tc>
       </w:tr>
       <w:tr>
-        <w:trPr>
-          <w:jc w:val="center"/>
-        </w:trPr>
         <w:tc>
           <w:tcPr>
             <w:tcW w:w="4124" w:type="dxa"/>
@@ -7112,9 +7014,6 @@
         </w:tc>
       </w:tr>
       <w:tr>
-        <w:trPr>
-          <w:jc w:val="center"/>
-        </w:trPr>
         <w:tc>
           <w:tcPr>
             <w:tcW w:w="4124" w:type="dxa"/>
@@ -7168,6 +7067,12 @@
       </w:tr>
     </w:tbl>
     <w:p/>
+    <w:p/>
+    <w:p>
+      <w:r>
+        <w:br w:type="textWrapping" w:clear="all"/>
+      </w:r>
+    </w:p>
     <w:tbl>
       <w:tblPr>
         <w:tblStyle w:val="ae"/>
@@ -7232,10 +7137,10 @@
                 <w:noProof/>
               </w:rPr>
               <w:drawing>
-                <wp:inline distT="0" distB="0" distL="0" distR="0" wp14:anchorId="10B24BDD" wp14:editId="26DDEEAA">
-                  <wp:extent cx="1372568" cy="1913861"/>
+                <wp:inline distT="0" distB="0" distL="0" distR="0" wp14:anchorId="4247F2D9" wp14:editId="5D3C3E41">
+                  <wp:extent cx="1371791" cy="1905266"/>
                   <wp:effectExtent l="0" t="0" r="0" b="0"/>
-                  <wp:docPr id="1480969266" name="그림 1"/>
+                  <wp:docPr id="562087254" name="그림 1"/>
                   <wp:cNvGraphicFramePr>
                     <a:graphicFrameLocks xmlns:a="http://schemas.openxmlformats.org/drawingml/2006/main" noChangeAspect="1"/>
                   </wp:cNvGraphicFramePr>
@@ -7243,7 +7148,7 @@
                     <a:graphicData uri="http://schemas.openxmlformats.org/drawingml/2006/picture">
                       <pic:pic xmlns:pic="http://schemas.openxmlformats.org/drawingml/2006/picture">
                         <pic:nvPicPr>
-                          <pic:cNvPr id="1480969266" name=""/>
+                          <pic:cNvPr id="562087254" name=""/>
                           <pic:cNvPicPr/>
                         </pic:nvPicPr>
                         <pic:blipFill>
@@ -7255,7 +7160,7 @@
                         <pic:spPr>
                           <a:xfrm>
                             <a:off x="0" y="0"/>
-                            <a:ext cx="1376476" cy="1919311"/>
+                            <a:ext cx="1371791" cy="1905266"/>
                           </a:xfrm>
                           <a:prstGeom prst="rect">
                             <a:avLst/>
@@ -7553,6 +7458,7 @@
               <w:rPr>
                 <w:rFonts w:hint="eastAsia"/>
               </w:rPr>
+              <w:lastRenderedPageBreak/>
               <w:t>방 최소/최대 생성 개수</w:t>
             </w:r>
           </w:p>
@@ -8657,6 +8563,7 @@
               <w:rPr>
                 <w:rFonts w:hint="eastAsia"/>
               </w:rPr>
+              <w:lastRenderedPageBreak/>
               <w:t>방 최소/최대 생성 개수</w:t>
             </w:r>
           </w:p>

</xml_diff>

<commit_message>
SellingMachine 관련 정보 추가
- json 작성
- 공장 맵_방 구조 규칙 문서에 판매기 생성 여부와 위치 표시
- 난이도(쉬움/보통/어려움)별 총 판매기 개수 추가
</commit_message>
<xml_diff>
--- a/기획/공장 맵_방 구조 규칙.docx
+++ b/기획/공장 맵_방 구조 규칙.docx
@@ -64,12 +64,28 @@
     </w:p>
     <w:p/>
     <w:p>
+      <w:proofErr w:type="gramStart"/>
       <w:r>
         <w:rPr>
           <w:rFonts w:hint="eastAsia"/>
         </w:rPr>
-        <w:t>[ 참고 사항 ]</w:t>
+        <w:t>[ 참고</w:t>
       </w:r>
+      <w:proofErr w:type="gramEnd"/>
+      <w:r>
+        <w:rPr>
+          <w:rFonts w:hint="eastAsia"/>
+        </w:rPr>
+        <w:t xml:space="preserve"> </w:t>
+      </w:r>
+      <w:proofErr w:type="gramStart"/>
+      <w:r>
+        <w:rPr>
+          <w:rFonts w:hint="eastAsia"/>
+        </w:rPr>
+        <w:t>사항 ]</w:t>
+      </w:r>
+      <w:proofErr w:type="gramEnd"/>
     </w:p>
     <w:p>
       <w:pPr>
@@ -340,8 +356,36 @@
         <w:t xml:space="preserve"> 부분: 빈 공간. 점프하면 아래로 떨어짐</w:t>
       </w:r>
     </w:p>
+    <w:p>
+      <w:pPr>
+        <w:pStyle w:val="a6"/>
+        <w:numPr>
+          <w:ilvl w:val="0"/>
+          <w:numId w:val="6"/>
+        </w:numPr>
+        <w:rPr>
+          <w:b/>
+          <w:bCs/>
+        </w:rPr>
+      </w:pPr>
+      <w:proofErr w:type="spellStart"/>
+      <w:r>
+        <w:rPr>
+          <w:rFonts w:hint="eastAsia"/>
+        </w:rPr>
+        <w:t>SellingMachine</w:t>
+      </w:r>
+      <w:proofErr w:type="spellEnd"/>
+      <w:r>
+        <w:rPr>
+          <w:rFonts w:hint="eastAsia"/>
+        </w:rPr>
+        <w:t>(판매기): 큐브 안에서 생길 수 있는 위치는 여러 곳이지만, 큐브 하나 당 하나의 판매기가 생성됨</w:t>
+      </w:r>
+    </w:p>
     <w:p/>
     <w:p>
+      <w:proofErr w:type="gramStart"/>
       <w:r>
         <w:rPr>
           <w:rFonts w:hint="eastAsia"/>
@@ -358,7 +402,14 @@
         <w:rPr>
           <w:rFonts w:hint="eastAsia"/>
         </w:rPr>
-        <w:t xml:space="preserve">모든 스테이지 </w:t>
+        <w:t>모든</w:t>
+      </w:r>
+      <w:proofErr w:type="gramEnd"/>
+      <w:r>
+        <w:rPr>
+          <w:rFonts w:hint="eastAsia"/>
+        </w:rPr>
+        <w:t xml:space="preserve"> 스테이지 </w:t>
       </w:r>
       <w:r>
         <w:rPr>
@@ -376,7 +427,14 @@
         <w:rPr>
           <w:rFonts w:hint="eastAsia"/>
         </w:rPr>
-        <w:t xml:space="preserve"> &amp; 규칙</w:t>
+        <w:t xml:space="preserve"> &amp; </w:t>
+      </w:r>
+      <w:proofErr w:type="gramStart"/>
+      <w:r>
+        <w:rPr>
+          <w:rFonts w:hint="eastAsia"/>
+        </w:rPr>
+        <w:t>규칙</w:t>
       </w:r>
       <w:r>
         <w:rPr>
@@ -384,6 +442,7 @@
         </w:rPr>
         <w:t xml:space="preserve"> ]</w:t>
       </w:r>
+      <w:proofErr w:type="gramEnd"/>
     </w:p>
     <w:p>
       <w:pPr>
@@ -702,6 +761,7 @@
               <w:t xml:space="preserve">0 </w:t>
             </w:r>
             <w:proofErr w:type="spellStart"/>
+            <w:proofErr w:type="gramStart"/>
             <w:r>
               <w:rPr>
                 <w:rFonts w:hint="eastAsia"/>
@@ -719,7 +779,17 @@
                 <w:bCs/>
                 <w:sz w:val="24"/>
               </w:rPr>
-              <w:t xml:space="preserve"> / 메인 입구 방</w:t>
+              <w:t xml:space="preserve"> /</w:t>
+            </w:r>
+            <w:proofErr w:type="gramEnd"/>
+            <w:r>
+              <w:rPr>
+                <w:rFonts w:hint="eastAsia"/>
+                <w:b/>
+                <w:bCs/>
+                <w:sz w:val="24"/>
+              </w:rPr>
+              <w:t xml:space="preserve"> 메인 입구 방</w:t>
             </w:r>
           </w:p>
         </w:tc>
@@ -989,6 +1059,55 @@
               <w:pStyle w:val="a6"/>
               <w:ind w:left="0"/>
               <w:jc w:val="center"/>
+              <w:rPr>
+                <w:rFonts w:hint="eastAsia"/>
+              </w:rPr>
+            </w:pPr>
+            <w:r>
+              <w:rPr>
+                <w:rFonts w:hint="eastAsia"/>
+              </w:rPr>
+              <w:t>판매기 생성 여부</w:t>
+            </w:r>
+          </w:p>
+        </w:tc>
+        <w:tc>
+          <w:tcPr>
+            <w:tcW w:w="4012" w:type="dxa"/>
+            <w:gridSpan w:val="3"/>
+          </w:tcPr>
+          <w:p>
+            <w:pPr>
+              <w:pStyle w:val="a6"/>
+              <w:ind w:left="0"/>
+              <w:jc w:val="center"/>
+              <w:rPr>
+                <w:rFonts w:hint="eastAsia"/>
+              </w:rPr>
+            </w:pPr>
+            <w:r>
+              <w:rPr>
+                <w:rFonts w:hint="eastAsia"/>
+              </w:rPr>
+              <w:t>N</w:t>
+            </w:r>
+          </w:p>
+        </w:tc>
+      </w:tr>
+      <w:tr>
+        <w:trPr>
+          <w:jc w:val="center"/>
+        </w:trPr>
+        <w:tc>
+          <w:tcPr>
+            <w:tcW w:w="4124" w:type="dxa"/>
+            <w:shd w:val="clear" w:color="auto" w:fill="D1D1D1" w:themeFill="background2" w:themeFillShade="E6"/>
+          </w:tcPr>
+          <w:p>
+            <w:pPr>
+              <w:pStyle w:val="a6"/>
+              <w:ind w:left="0"/>
+              <w:jc w:val="center"/>
             </w:pPr>
             <w:bookmarkStart w:id="1" w:name="_Hlk218947344"/>
             <w:bookmarkEnd w:id="0"/>
@@ -1297,6 +1416,7 @@
               <w:t xml:space="preserve">1 </w:t>
             </w:r>
             <w:proofErr w:type="spellStart"/>
+            <w:proofErr w:type="gramStart"/>
             <w:r>
               <w:rPr>
                 <w:rFonts w:hint="eastAsia"/>
@@ -1314,7 +1434,17 @@
                 <w:bCs/>
                 <w:sz w:val="24"/>
               </w:rPr>
-              <w:t xml:space="preserve"> / 끊어진 방</w:t>
+              <w:t xml:space="preserve"> /</w:t>
+            </w:r>
+            <w:proofErr w:type="gramEnd"/>
+            <w:r>
+              <w:rPr>
+                <w:rFonts w:hint="eastAsia"/>
+                <w:b/>
+                <w:bCs/>
+                <w:sz w:val="24"/>
+              </w:rPr>
+              <w:t xml:space="preserve"> 끊어진 방</w:t>
             </w:r>
           </w:p>
         </w:tc>
@@ -1580,6 +1710,55 @@
               <w:pStyle w:val="a6"/>
               <w:ind w:left="0"/>
               <w:jc w:val="center"/>
+              <w:rPr>
+                <w:rFonts w:hint="eastAsia"/>
+              </w:rPr>
+            </w:pPr>
+            <w:r>
+              <w:rPr>
+                <w:rFonts w:hint="eastAsia"/>
+              </w:rPr>
+              <w:t>판매기 생성 여부</w:t>
+            </w:r>
+          </w:p>
+        </w:tc>
+        <w:tc>
+          <w:tcPr>
+            <w:tcW w:w="4012" w:type="dxa"/>
+            <w:gridSpan w:val="3"/>
+          </w:tcPr>
+          <w:p>
+            <w:pPr>
+              <w:pStyle w:val="a6"/>
+              <w:ind w:left="0"/>
+              <w:jc w:val="center"/>
+              <w:rPr>
+                <w:rFonts w:hint="eastAsia"/>
+              </w:rPr>
+            </w:pPr>
+            <w:r>
+              <w:rPr>
+                <w:rFonts w:hint="eastAsia"/>
+              </w:rPr>
+              <w:t>N</w:t>
+            </w:r>
+          </w:p>
+        </w:tc>
+      </w:tr>
+      <w:tr>
+        <w:trPr>
+          <w:jc w:val="center"/>
+        </w:trPr>
+        <w:tc>
+          <w:tcPr>
+            <w:tcW w:w="4124" w:type="dxa"/>
+            <w:shd w:val="clear" w:color="auto" w:fill="D1D1D1" w:themeFill="background2" w:themeFillShade="E6"/>
+          </w:tcPr>
+          <w:p>
+            <w:pPr>
+              <w:pStyle w:val="a6"/>
+              <w:ind w:left="0"/>
+              <w:jc w:val="center"/>
             </w:pPr>
             <w:r>
               <w:rPr>
@@ -1898,6 +2077,7 @@
               <w:t xml:space="preserve">2 </w:t>
             </w:r>
             <w:proofErr w:type="spellStart"/>
+            <w:proofErr w:type="gramStart"/>
             <w:r>
               <w:rPr>
                 <w:rFonts w:hint="eastAsia"/>
@@ -1915,7 +2095,17 @@
                 <w:bCs/>
                 <w:sz w:val="24"/>
               </w:rPr>
-              <w:t xml:space="preserve"> / 장치 방(구조 1, 구조 2)</w:t>
+              <w:t xml:space="preserve"> /</w:t>
+            </w:r>
+            <w:proofErr w:type="gramEnd"/>
+            <w:r>
+              <w:rPr>
+                <w:rFonts w:hint="eastAsia"/>
+                <w:b/>
+                <w:bCs/>
+                <w:sz w:val="24"/>
+              </w:rPr>
+              <w:t xml:space="preserve"> 장치 방(구조 1, 구조 2)</w:t>
             </w:r>
           </w:p>
         </w:tc>
@@ -1940,8 +2130,135 @@
                 <w:noProof/>
               </w:rPr>
               <w:lastRenderedPageBreak/>
+              <mc:AlternateContent>
+                <mc:Choice Requires="wpg">
+                  <w:drawing>
+                    <wp:anchor distT="0" distB="0" distL="114300" distR="114300" simplePos="0" relativeHeight="251679744" behindDoc="0" locked="0" layoutInCell="1" allowOverlap="1" wp14:anchorId="14AF3053" wp14:editId="2E0CD5B6">
+                      <wp:simplePos x="0" y="0"/>
+                      <wp:positionH relativeFrom="column">
+                        <wp:posOffset>2351852</wp:posOffset>
+                      </wp:positionH>
+                      <wp:positionV relativeFrom="paragraph">
+                        <wp:posOffset>315260</wp:posOffset>
+                      </wp:positionV>
+                      <wp:extent cx="241300" cy="261257"/>
+                      <wp:effectExtent l="0" t="0" r="25400" b="24765"/>
+                      <wp:wrapNone/>
+                      <wp:docPr id="465513164" name="그룹 2"/>
+                      <wp:cNvGraphicFramePr/>
+                      <a:graphic xmlns:a="http://schemas.openxmlformats.org/drawingml/2006/main">
+                        <a:graphicData uri="http://schemas.microsoft.com/office/word/2010/wordprocessingGroup">
+                          <wpg:wgp>
+                            <wpg:cNvGrpSpPr/>
+                            <wpg:grpSpPr>
+                              <a:xfrm>
+                                <a:off x="0" y="0"/>
+                                <a:ext cx="241300" cy="261257"/>
+                                <a:chOff x="0" y="0"/>
+                                <a:chExt cx="241300" cy="261257"/>
+                              </a:xfrm>
+                            </wpg:grpSpPr>
+                            <wps:wsp>
+                              <wps:cNvPr id="1817362077" name="직사각형 1"/>
+                              <wps:cNvSpPr/>
+                              <wps:spPr>
+                                <a:xfrm>
+                                  <a:off x="0" y="0"/>
+                                  <a:ext cx="241300" cy="261257"/>
+                                </a:xfrm>
+                                <a:prstGeom prst="rect">
+                                  <a:avLst/>
+                                </a:prstGeom>
+                                <a:solidFill>
+                                  <a:srgbClr val="FF1DC4"/>
+                                </a:solidFill>
+                              </wps:spPr>
+                              <wps:style>
+                                <a:lnRef idx="2">
+                                  <a:schemeClr val="accent1">
+                                    <a:shade val="15000"/>
+                                  </a:schemeClr>
+                                </a:lnRef>
+                                <a:fillRef idx="1">
+                                  <a:schemeClr val="accent1"/>
+                                </a:fillRef>
+                                <a:effectRef idx="0">
+                                  <a:schemeClr val="accent1"/>
+                                </a:effectRef>
+                                <a:fontRef idx="minor">
+                                  <a:schemeClr val="lt1"/>
+                                </a:fontRef>
+                              </wps:style>
+                              <wps:bodyPr rot="0" spcFirstLastPara="0" vertOverflow="overflow" horzOverflow="overflow" vert="horz" wrap="square" lIns="91440" tIns="45720" rIns="91440" bIns="45720" numCol="1" spcCol="0" rtlCol="0" fromWordArt="0" anchor="ctr" anchorCtr="0" forceAA="0" compatLnSpc="1">
+                                <a:prstTxWarp prst="textNoShape">
+                                  <a:avLst/>
+                                </a:prstTxWarp>
+                                <a:noAutofit/>
+                              </wps:bodyPr>
+                            </wps:wsp>
+                            <wps:wsp>
+                              <wps:cNvPr id="1194509168" name="직사각형 1"/>
+                              <wps:cNvSpPr/>
+                              <wps:spPr>
+                                <a:xfrm>
+                                  <a:off x="20096" y="30145"/>
+                                  <a:ext cx="195943" cy="80387"/>
+                                </a:xfrm>
+                                <a:prstGeom prst="rect">
+                                  <a:avLst/>
+                                </a:prstGeom>
+                                <a:solidFill>
+                                  <a:schemeClr val="accent5">
+                                    <a:lumMod val="40000"/>
+                                    <a:lumOff val="60000"/>
+                                  </a:schemeClr>
+                                </a:solidFill>
+                              </wps:spPr>
+                              <wps:style>
+                                <a:lnRef idx="2">
+                                  <a:schemeClr val="accent1">
+                                    <a:shade val="15000"/>
+                                  </a:schemeClr>
+                                </a:lnRef>
+                                <a:fillRef idx="1">
+                                  <a:schemeClr val="accent1"/>
+                                </a:fillRef>
+                                <a:effectRef idx="0">
+                                  <a:schemeClr val="accent1"/>
+                                </a:effectRef>
+                                <a:fontRef idx="minor">
+                                  <a:schemeClr val="lt1"/>
+                                </a:fontRef>
+                              </wps:style>
+                              <wps:bodyPr rot="0" spcFirstLastPara="0" vertOverflow="overflow" horzOverflow="overflow" vert="horz" wrap="square" lIns="91440" tIns="45720" rIns="91440" bIns="45720" numCol="1" spcCol="0" rtlCol="0" fromWordArt="0" anchor="ctr" anchorCtr="0" forceAA="0" compatLnSpc="1">
+                                <a:prstTxWarp prst="textNoShape">
+                                  <a:avLst/>
+                                </a:prstTxWarp>
+                                <a:noAutofit/>
+                              </wps:bodyPr>
+                            </wps:wsp>
+                          </wpg:wgp>
+                        </a:graphicData>
+                      </a:graphic>
+                    </wp:anchor>
+                  </w:drawing>
+                </mc:Choice>
+                <mc:Fallback>
+                  <w:pict>
+                    <v:group w14:anchorId="18D5197B" id="그룹 2" o:spid="_x0000_s1026" style="position:absolute;margin-left:185.2pt;margin-top:24.8pt;width:19pt;height:20.55pt;z-index:251679744" coordsize="241300,261257" o:gfxdata="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">
+                      <v:rect id="직사각형 1" o:spid="_x0000_s1027" style="position:absolute;width:241300;height:261257;visibility:visible;mso-wrap-style:square;v-text-anchor:middle" o:gfxdata="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" fillcolor="#ff1dc4" strokecolor="#030e13 [484]" strokeweight="1pt"/>
+                      <v:rect id="직사각형 1" o:spid="_x0000_s1028" style="position:absolute;left:20096;top:30145;width:195943;height:80387;visibility:visible;mso-wrap-style:square;v-text-anchor:middle" o:gfxdata="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" fillcolor="#e59edc [1304]" strokecolor="#030e13 [484]" strokeweight="1pt"/>
+                    </v:group>
+                  </w:pict>
+                </mc:Fallback>
+              </mc:AlternateContent>
+            </w:r>
+            <w:r>
+              <w:rPr>
+                <w:noProof/>
+              </w:rPr>
               <w:drawing>
-                <wp:inline distT="0" distB="0" distL="0" distR="0" wp14:anchorId="1AF613AE" wp14:editId="6D5DB900">
+                <wp:inline distT="0" distB="0" distL="0" distR="0" wp14:anchorId="1AF613AE" wp14:editId="54A891E4">
                   <wp:extent cx="2410161" cy="1629002"/>
                   <wp:effectExtent l="0" t="0" r="0" b="9525"/>
                   <wp:docPr id="2100099352" name="그림 1"/>
@@ -2110,6 +2427,55 @@
                 <w:rFonts w:hint="eastAsia"/>
               </w:rPr>
               <w:t>N</w:t>
+            </w:r>
+          </w:p>
+        </w:tc>
+      </w:tr>
+      <w:tr>
+        <w:trPr>
+          <w:jc w:val="center"/>
+        </w:trPr>
+        <w:tc>
+          <w:tcPr>
+            <w:tcW w:w="4124" w:type="dxa"/>
+            <w:shd w:val="clear" w:color="auto" w:fill="D1D1D1" w:themeFill="background2" w:themeFillShade="E6"/>
+          </w:tcPr>
+          <w:p>
+            <w:pPr>
+              <w:pStyle w:val="a6"/>
+              <w:ind w:left="0"/>
+              <w:jc w:val="center"/>
+              <w:rPr>
+                <w:rFonts w:hint="eastAsia"/>
+              </w:rPr>
+            </w:pPr>
+            <w:r>
+              <w:rPr>
+                <w:rFonts w:hint="eastAsia"/>
+              </w:rPr>
+              <w:t>판매기 생성 여부</w:t>
+            </w:r>
+          </w:p>
+        </w:tc>
+        <w:tc>
+          <w:tcPr>
+            <w:tcW w:w="4012" w:type="dxa"/>
+            <w:gridSpan w:val="3"/>
+          </w:tcPr>
+          <w:p>
+            <w:pPr>
+              <w:pStyle w:val="a6"/>
+              <w:ind w:left="0"/>
+              <w:jc w:val="center"/>
+              <w:rPr>
+                <w:rFonts w:hint="eastAsia"/>
+              </w:rPr>
+            </w:pPr>
+            <w:r>
+              <w:rPr>
+                <w:rFonts w:hint="eastAsia"/>
+              </w:rPr>
+              <w:t>Y</w:t>
             </w:r>
           </w:p>
         </w:tc>
@@ -2523,6 +2889,7 @@
               <w:t xml:space="preserve">3 </w:t>
             </w:r>
             <w:proofErr w:type="spellStart"/>
+            <w:proofErr w:type="gramStart"/>
             <w:r>
               <w:rPr>
                 <w:rFonts w:hint="eastAsia"/>
@@ -2540,7 +2907,17 @@
                 <w:bCs/>
                 <w:sz w:val="24"/>
               </w:rPr>
-              <w:t xml:space="preserve"> / 서버 방</w:t>
+              <w:t xml:space="preserve"> /</w:t>
+            </w:r>
+            <w:proofErr w:type="gramEnd"/>
+            <w:r>
+              <w:rPr>
+                <w:rFonts w:hint="eastAsia"/>
+                <w:b/>
+                <w:bCs/>
+                <w:sz w:val="24"/>
+              </w:rPr>
+              <w:t xml:space="preserve"> 서버 방</w:t>
             </w:r>
           </w:p>
         </w:tc>
@@ -2803,69 +3180,37 @@
               <w:pStyle w:val="a6"/>
               <w:ind w:left="0"/>
               <w:jc w:val="center"/>
-            </w:pPr>
-            <w:r>
-              <w:rPr>
-                <w:rFonts w:hint="eastAsia"/>
-              </w:rPr>
-              <w:t>맵 난이도</w:t>
-            </w:r>
-          </w:p>
-        </w:tc>
-        <w:tc>
-          <w:tcPr>
-            <w:tcW w:w="1337" w:type="dxa"/>
-            <w:shd w:val="clear" w:color="auto" w:fill="E8E8E8" w:themeFill="background2"/>
-          </w:tcPr>
-          <w:p>
-            <w:pPr>
-              <w:pStyle w:val="a6"/>
-              <w:ind w:left="0"/>
-              <w:jc w:val="center"/>
-            </w:pPr>
-            <w:r>
-              <w:rPr>
-                <w:rFonts w:hint="eastAsia"/>
-              </w:rPr>
-              <w:t>쉬움</w:t>
-            </w:r>
-          </w:p>
-        </w:tc>
-        <w:tc>
-          <w:tcPr>
-            <w:tcW w:w="1337" w:type="dxa"/>
-            <w:shd w:val="clear" w:color="auto" w:fill="E8E8E8" w:themeFill="background2"/>
-          </w:tcPr>
-          <w:p>
-            <w:pPr>
-              <w:pStyle w:val="a6"/>
-              <w:ind w:left="0"/>
-              <w:jc w:val="center"/>
-            </w:pPr>
-            <w:r>
-              <w:rPr>
-                <w:rFonts w:hint="eastAsia"/>
-              </w:rPr>
-              <w:t>보통</w:t>
-            </w:r>
-          </w:p>
-        </w:tc>
-        <w:tc>
-          <w:tcPr>
-            <w:tcW w:w="1338" w:type="dxa"/>
-            <w:shd w:val="clear" w:color="auto" w:fill="E8E8E8" w:themeFill="background2"/>
-          </w:tcPr>
-          <w:p>
-            <w:pPr>
-              <w:pStyle w:val="a6"/>
-              <w:ind w:left="0"/>
-              <w:jc w:val="center"/>
-            </w:pPr>
-            <w:r>
-              <w:rPr>
-                <w:rFonts w:hint="eastAsia"/>
-              </w:rPr>
-              <w:t>어려움</w:t>
+              <w:rPr>
+                <w:rFonts w:hint="eastAsia"/>
+              </w:rPr>
+            </w:pPr>
+            <w:r>
+              <w:rPr>
+                <w:rFonts w:hint="eastAsia"/>
+              </w:rPr>
+              <w:t>판매기 생성 여부</w:t>
+            </w:r>
+          </w:p>
+        </w:tc>
+        <w:tc>
+          <w:tcPr>
+            <w:tcW w:w="4012" w:type="dxa"/>
+            <w:gridSpan w:val="3"/>
+          </w:tcPr>
+          <w:p>
+            <w:pPr>
+              <w:pStyle w:val="a6"/>
+              <w:ind w:left="0"/>
+              <w:jc w:val="center"/>
+              <w:rPr>
+                <w:rFonts w:hint="eastAsia"/>
+              </w:rPr>
+            </w:pPr>
+            <w:r>
+              <w:rPr>
+                <w:rFonts w:hint="eastAsia"/>
+              </w:rPr>
+              <w:t>T</w:t>
             </w:r>
           </w:p>
         </w:tc>
@@ -2889,61 +3234,64 @@
               <w:rPr>
                 <w:rFonts w:hint="eastAsia"/>
               </w:rPr>
-              <w:t>방 최소/최대 생성 개수</w:t>
+              <w:t>맵 난이도</w:t>
             </w:r>
           </w:p>
         </w:tc>
         <w:tc>
           <w:tcPr>
             <w:tcW w:w="1337" w:type="dxa"/>
-          </w:tcPr>
-          <w:p>
-            <w:pPr>
-              <w:pStyle w:val="a6"/>
-              <w:ind w:left="0"/>
-              <w:jc w:val="center"/>
-            </w:pPr>
-            <w:r>
-              <w:rPr>
-                <w:rFonts w:hint="eastAsia"/>
-              </w:rPr>
-              <w:t>1</w:t>
+            <w:shd w:val="clear" w:color="auto" w:fill="E8E8E8" w:themeFill="background2"/>
+          </w:tcPr>
+          <w:p>
+            <w:pPr>
+              <w:pStyle w:val="a6"/>
+              <w:ind w:left="0"/>
+              <w:jc w:val="center"/>
+            </w:pPr>
+            <w:r>
+              <w:rPr>
+                <w:rFonts w:hint="eastAsia"/>
+              </w:rPr>
+              <w:t>쉬움</w:t>
             </w:r>
           </w:p>
         </w:tc>
         <w:tc>
           <w:tcPr>
             <w:tcW w:w="1337" w:type="dxa"/>
-          </w:tcPr>
-          <w:p>
-            <w:pPr>
-              <w:pStyle w:val="a6"/>
-              <w:ind w:left="0"/>
-              <w:jc w:val="center"/>
-            </w:pPr>
-            <w:r>
-              <w:rPr>
-                <w:rFonts w:hint="eastAsia"/>
-              </w:rPr>
-              <w:t>1</w:t>
+            <w:shd w:val="clear" w:color="auto" w:fill="E8E8E8" w:themeFill="background2"/>
+          </w:tcPr>
+          <w:p>
+            <w:pPr>
+              <w:pStyle w:val="a6"/>
+              <w:ind w:left="0"/>
+              <w:jc w:val="center"/>
+            </w:pPr>
+            <w:r>
+              <w:rPr>
+                <w:rFonts w:hint="eastAsia"/>
+              </w:rPr>
+              <w:t>보통</w:t>
             </w:r>
           </w:p>
         </w:tc>
         <w:tc>
           <w:tcPr>
             <w:tcW w:w="1338" w:type="dxa"/>
-          </w:tcPr>
-          <w:p>
-            <w:pPr>
-              <w:pStyle w:val="a6"/>
-              <w:ind w:left="0"/>
-              <w:jc w:val="center"/>
-            </w:pPr>
-            <w:r>
-              <w:rPr>
-                <w:rFonts w:hint="eastAsia"/>
-              </w:rPr>
-              <w:t>1</w:t>
+            <w:shd w:val="clear" w:color="auto" w:fill="E8E8E8" w:themeFill="background2"/>
+          </w:tcPr>
+          <w:p>
+            <w:pPr>
+              <w:pStyle w:val="a6"/>
+              <w:ind w:left="0"/>
+              <w:jc w:val="center"/>
+            </w:pPr>
+            <w:r>
+              <w:rPr>
+                <w:rFonts w:hint="eastAsia"/>
+              </w:rPr>
+              <w:t>어려움</w:t>
             </w:r>
           </w:p>
         </w:tc>
@@ -2967,7 +3315,8 @@
               <w:rPr>
                 <w:rFonts w:hint="eastAsia"/>
               </w:rPr>
-              <w:t>방 추가 생성 확률</w:t>
+              <w:lastRenderedPageBreak/>
+              <w:t>방 최소/최대 생성 개수</w:t>
             </w:r>
           </w:p>
         </w:tc>
@@ -2981,6 +3330,12 @@
               <w:ind w:left="0"/>
               <w:jc w:val="center"/>
             </w:pPr>
+            <w:r>
+              <w:rPr>
+                <w:rFonts w:hint="eastAsia"/>
+              </w:rPr>
+              <w:t>1</w:t>
+            </w:r>
           </w:p>
         </w:tc>
         <w:tc>
@@ -2993,6 +3348,12 @@
               <w:ind w:left="0"/>
               <w:jc w:val="center"/>
             </w:pPr>
+            <w:r>
+              <w:rPr>
+                <w:rFonts w:hint="eastAsia"/>
+              </w:rPr>
+              <w:t>1</w:t>
+            </w:r>
           </w:p>
         </w:tc>
         <w:tc>
@@ -3005,6 +3366,12 @@
               <w:ind w:left="0"/>
               <w:jc w:val="center"/>
             </w:pPr>
+            <w:r>
+              <w:rPr>
+                <w:rFonts w:hint="eastAsia"/>
+              </w:rPr>
+              <w:t>1</w:t>
+            </w:r>
           </w:p>
         </w:tc>
       </w:tr>
@@ -3027,7 +3394,66 @@
               <w:rPr>
                 <w:rFonts w:hint="eastAsia"/>
               </w:rPr>
-              <w:lastRenderedPageBreak/>
+              <w:t>방 추가 생성 확률</w:t>
+            </w:r>
+          </w:p>
+        </w:tc>
+        <w:tc>
+          <w:tcPr>
+            <w:tcW w:w="1337" w:type="dxa"/>
+          </w:tcPr>
+          <w:p>
+            <w:pPr>
+              <w:pStyle w:val="a6"/>
+              <w:ind w:left="0"/>
+              <w:jc w:val="center"/>
+            </w:pPr>
+          </w:p>
+        </w:tc>
+        <w:tc>
+          <w:tcPr>
+            <w:tcW w:w="1337" w:type="dxa"/>
+          </w:tcPr>
+          <w:p>
+            <w:pPr>
+              <w:pStyle w:val="a6"/>
+              <w:ind w:left="0"/>
+              <w:jc w:val="center"/>
+            </w:pPr>
+          </w:p>
+        </w:tc>
+        <w:tc>
+          <w:tcPr>
+            <w:tcW w:w="1338" w:type="dxa"/>
+          </w:tcPr>
+          <w:p>
+            <w:pPr>
+              <w:pStyle w:val="a6"/>
+              <w:ind w:left="0"/>
+              <w:jc w:val="center"/>
+            </w:pPr>
+          </w:p>
+        </w:tc>
+      </w:tr>
+      <w:tr>
+        <w:trPr>
+          <w:jc w:val="center"/>
+        </w:trPr>
+        <w:tc>
+          <w:tcPr>
+            <w:tcW w:w="4124" w:type="dxa"/>
+            <w:shd w:val="clear" w:color="auto" w:fill="D1D1D1" w:themeFill="background2" w:themeFillShade="E6"/>
+          </w:tcPr>
+          <w:p>
+            <w:pPr>
+              <w:pStyle w:val="a6"/>
+              <w:ind w:left="0"/>
+              <w:jc w:val="center"/>
+            </w:pPr>
+            <w:r>
+              <w:rPr>
+                <w:rFonts w:hint="eastAsia"/>
+              </w:rPr>
               <w:t>문 최소/최대 생성 개수</w:t>
             </w:r>
           </w:p>
@@ -3102,6 +3528,7 @@
               <w:t xml:space="preserve">4 </w:t>
             </w:r>
             <w:proofErr w:type="spellStart"/>
+            <w:proofErr w:type="gramStart"/>
             <w:r>
               <w:rPr>
                 <w:rFonts w:hint="eastAsia"/>
@@ -3119,7 +3546,17 @@
                 <w:bCs/>
                 <w:sz w:val="24"/>
               </w:rPr>
-              <w:t xml:space="preserve"> / </w:t>
+              <w:t xml:space="preserve"> /</w:t>
+            </w:r>
+            <w:proofErr w:type="gramEnd"/>
+            <w:r>
+              <w:rPr>
+                <w:rFonts w:hint="eastAsia"/>
+                <w:b/>
+                <w:bCs/>
+                <w:sz w:val="24"/>
+              </w:rPr>
+              <w:t xml:space="preserve"> </w:t>
             </w:r>
             <w:proofErr w:type="spellStart"/>
             <w:r>
@@ -3162,6 +3599,405 @@
                 <w:noProof/>
               </w:rPr>
             </w:pPr>
+            <w:r>
+              <w:rPr>
+                <w:noProof/>
+              </w:rPr>
+              <mc:AlternateContent>
+                <mc:Choice Requires="wpg">
+                  <w:drawing>
+                    <wp:anchor distT="0" distB="0" distL="114300" distR="114300" simplePos="0" relativeHeight="251685888" behindDoc="0" locked="0" layoutInCell="1" allowOverlap="1" wp14:anchorId="7A66F7B2" wp14:editId="0E132D78">
+                      <wp:simplePos x="0" y="0"/>
+                      <wp:positionH relativeFrom="column">
+                        <wp:posOffset>2877185</wp:posOffset>
+                      </wp:positionH>
+                      <wp:positionV relativeFrom="paragraph">
+                        <wp:posOffset>1153851</wp:posOffset>
+                      </wp:positionV>
+                      <wp:extent cx="186055" cy="201295"/>
+                      <wp:effectExtent l="0" t="7620" r="15875" b="15875"/>
+                      <wp:wrapNone/>
+                      <wp:docPr id="389900980" name="그룹 2"/>
+                      <wp:cNvGraphicFramePr/>
+                      <a:graphic xmlns:a="http://schemas.openxmlformats.org/drawingml/2006/main">
+                        <a:graphicData uri="http://schemas.microsoft.com/office/word/2010/wordprocessingGroup">
+                          <wpg:wgp>
+                            <wpg:cNvGrpSpPr/>
+                            <wpg:grpSpPr>
+                              <a:xfrm rot="16200000">
+                                <a:off x="0" y="0"/>
+                                <a:ext cx="186055" cy="201295"/>
+                                <a:chOff x="0" y="0"/>
+                                <a:chExt cx="241300" cy="261257"/>
+                              </a:xfrm>
+                            </wpg:grpSpPr>
+                            <wps:wsp>
+                              <wps:cNvPr id="865182347" name="직사각형 1"/>
+                              <wps:cNvSpPr/>
+                              <wps:spPr>
+                                <a:xfrm>
+                                  <a:off x="0" y="0"/>
+                                  <a:ext cx="241300" cy="261257"/>
+                                </a:xfrm>
+                                <a:prstGeom prst="rect">
+                                  <a:avLst/>
+                                </a:prstGeom>
+                                <a:solidFill>
+                                  <a:srgbClr val="FF1DC4"/>
+                                </a:solidFill>
+                              </wps:spPr>
+                              <wps:style>
+                                <a:lnRef idx="2">
+                                  <a:schemeClr val="accent1">
+                                    <a:shade val="15000"/>
+                                  </a:schemeClr>
+                                </a:lnRef>
+                                <a:fillRef idx="1">
+                                  <a:schemeClr val="accent1"/>
+                                </a:fillRef>
+                                <a:effectRef idx="0">
+                                  <a:schemeClr val="accent1"/>
+                                </a:effectRef>
+                                <a:fontRef idx="minor">
+                                  <a:schemeClr val="lt1"/>
+                                </a:fontRef>
+                              </wps:style>
+                              <wps:bodyPr rot="0" spcFirstLastPara="0" vertOverflow="overflow" horzOverflow="overflow" vert="horz" wrap="square" lIns="91440" tIns="45720" rIns="91440" bIns="45720" numCol="1" spcCol="0" rtlCol="0" fromWordArt="0" anchor="ctr" anchorCtr="0" forceAA="0" compatLnSpc="1">
+                                <a:prstTxWarp prst="textNoShape">
+                                  <a:avLst/>
+                                </a:prstTxWarp>
+                                <a:noAutofit/>
+                              </wps:bodyPr>
+                            </wps:wsp>
+                            <wps:wsp>
+                              <wps:cNvPr id="601601806" name="직사각형 1"/>
+                              <wps:cNvSpPr/>
+                              <wps:spPr>
+                                <a:xfrm>
+                                  <a:off x="20096" y="30145"/>
+                                  <a:ext cx="195943" cy="80387"/>
+                                </a:xfrm>
+                                <a:prstGeom prst="rect">
+                                  <a:avLst/>
+                                </a:prstGeom>
+                                <a:solidFill>
+                                  <a:schemeClr val="accent5">
+                                    <a:lumMod val="40000"/>
+                                    <a:lumOff val="60000"/>
+                                  </a:schemeClr>
+                                </a:solidFill>
+                              </wps:spPr>
+                              <wps:style>
+                                <a:lnRef idx="2">
+                                  <a:schemeClr val="accent1">
+                                    <a:shade val="15000"/>
+                                  </a:schemeClr>
+                                </a:lnRef>
+                                <a:fillRef idx="1">
+                                  <a:schemeClr val="accent1"/>
+                                </a:fillRef>
+                                <a:effectRef idx="0">
+                                  <a:schemeClr val="accent1"/>
+                                </a:effectRef>
+                                <a:fontRef idx="minor">
+                                  <a:schemeClr val="lt1"/>
+                                </a:fontRef>
+                              </wps:style>
+                              <wps:bodyPr rot="0" spcFirstLastPara="0" vertOverflow="overflow" horzOverflow="overflow" vert="horz" wrap="square" lIns="91440" tIns="45720" rIns="91440" bIns="45720" numCol="1" spcCol="0" rtlCol="0" fromWordArt="0" anchor="ctr" anchorCtr="0" forceAA="0" compatLnSpc="1">
+                                <a:prstTxWarp prst="textNoShape">
+                                  <a:avLst/>
+                                </a:prstTxWarp>
+                                <a:noAutofit/>
+                              </wps:bodyPr>
+                            </wps:wsp>
+                          </wpg:wgp>
+                        </a:graphicData>
+                      </a:graphic>
+                      <wp14:sizeRelH relativeFrom="margin">
+                        <wp14:pctWidth>0</wp14:pctWidth>
+                      </wp14:sizeRelH>
+                      <wp14:sizeRelV relativeFrom="margin">
+                        <wp14:pctHeight>0</wp14:pctHeight>
+                      </wp14:sizeRelV>
+                    </wp:anchor>
+                  </w:drawing>
+                </mc:Choice>
+                <mc:Fallback>
+                  <w:pict>
+                    <v:group w14:anchorId="4B22A7FA" id="그룹 2" o:spid="_x0000_s1026" style="position:absolute;margin-left:226.55pt;margin-top:90.85pt;width:14.65pt;height:15.85pt;rotation:-90;z-index:251685888;mso-width-relative:margin;mso-height-relative:margin" coordsize="241300,261257" o:gfxdata="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">
+                      <v:rect id="직사각형 1" o:spid="_x0000_s1027" style="position:absolute;width:241300;height:261257;visibility:visible;mso-wrap-style:square;v-text-anchor:middle" o:gfxdata="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" fillcolor="#ff1dc4" strokecolor="#030e13 [484]" strokeweight="1pt"/>
+                      <v:rect id="직사각형 1" o:spid="_x0000_s1028" style="position:absolute;left:20096;top:30145;width:195943;height:80387;visibility:visible;mso-wrap-style:square;v-text-anchor:middle" o:gfxdata="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" fillcolor="#e59edc [1304]" strokecolor="#030e13 [484]" strokeweight="1pt"/>
+                    </v:group>
+                  </w:pict>
+                </mc:Fallback>
+              </mc:AlternateContent>
+            </w:r>
+            <w:r>
+              <w:rPr>
+                <w:noProof/>
+              </w:rPr>
+              <mc:AlternateContent>
+                <mc:Choice Requires="wpg">
+                  <w:drawing>
+                    <wp:anchor distT="0" distB="0" distL="114300" distR="114300" simplePos="0" relativeHeight="251683840" behindDoc="0" locked="0" layoutInCell="1" allowOverlap="1" wp14:anchorId="3BEF5F69" wp14:editId="7095B3D1">
+                      <wp:simplePos x="0" y="0"/>
+                      <wp:positionH relativeFrom="column">
+                        <wp:posOffset>745490</wp:posOffset>
+                      </wp:positionH>
+                      <wp:positionV relativeFrom="paragraph">
+                        <wp:posOffset>1158240</wp:posOffset>
+                      </wp:positionV>
+                      <wp:extent cx="186055" cy="201295"/>
+                      <wp:effectExtent l="0" t="7620" r="15875" b="15875"/>
+                      <wp:wrapNone/>
+                      <wp:docPr id="259646882" name="그룹 2"/>
+                      <wp:cNvGraphicFramePr/>
+                      <a:graphic xmlns:a="http://schemas.openxmlformats.org/drawingml/2006/main">
+                        <a:graphicData uri="http://schemas.microsoft.com/office/word/2010/wordprocessingGroup">
+                          <wpg:wgp>
+                            <wpg:cNvGrpSpPr/>
+                            <wpg:grpSpPr>
+                              <a:xfrm rot="16200000">
+                                <a:off x="0" y="0"/>
+                                <a:ext cx="186055" cy="201295"/>
+                                <a:chOff x="0" y="0"/>
+                                <a:chExt cx="241300" cy="261257"/>
+                              </a:xfrm>
+                            </wpg:grpSpPr>
+                            <wps:wsp>
+                              <wps:cNvPr id="1542376825" name="직사각형 1"/>
+                              <wps:cNvSpPr/>
+                              <wps:spPr>
+                                <a:xfrm>
+                                  <a:off x="0" y="0"/>
+                                  <a:ext cx="241300" cy="261257"/>
+                                </a:xfrm>
+                                <a:prstGeom prst="rect">
+                                  <a:avLst/>
+                                </a:prstGeom>
+                                <a:solidFill>
+                                  <a:srgbClr val="FF1DC4"/>
+                                </a:solidFill>
+                              </wps:spPr>
+                              <wps:style>
+                                <a:lnRef idx="2">
+                                  <a:schemeClr val="accent1">
+                                    <a:shade val="15000"/>
+                                  </a:schemeClr>
+                                </a:lnRef>
+                                <a:fillRef idx="1">
+                                  <a:schemeClr val="accent1"/>
+                                </a:fillRef>
+                                <a:effectRef idx="0">
+                                  <a:schemeClr val="accent1"/>
+                                </a:effectRef>
+                                <a:fontRef idx="minor">
+                                  <a:schemeClr val="lt1"/>
+                                </a:fontRef>
+                              </wps:style>
+                              <wps:bodyPr rot="0" spcFirstLastPara="0" vertOverflow="overflow" horzOverflow="overflow" vert="horz" wrap="square" lIns="91440" tIns="45720" rIns="91440" bIns="45720" numCol="1" spcCol="0" rtlCol="0" fromWordArt="0" anchor="ctr" anchorCtr="0" forceAA="0" compatLnSpc="1">
+                                <a:prstTxWarp prst="textNoShape">
+                                  <a:avLst/>
+                                </a:prstTxWarp>
+                                <a:noAutofit/>
+                              </wps:bodyPr>
+                            </wps:wsp>
+                            <wps:wsp>
+                              <wps:cNvPr id="1649883505" name="직사각형 1"/>
+                              <wps:cNvSpPr/>
+                              <wps:spPr>
+                                <a:xfrm>
+                                  <a:off x="20096" y="30145"/>
+                                  <a:ext cx="195943" cy="80387"/>
+                                </a:xfrm>
+                                <a:prstGeom prst="rect">
+                                  <a:avLst/>
+                                </a:prstGeom>
+                                <a:solidFill>
+                                  <a:schemeClr val="accent5">
+                                    <a:lumMod val="40000"/>
+                                    <a:lumOff val="60000"/>
+                                  </a:schemeClr>
+                                </a:solidFill>
+                              </wps:spPr>
+                              <wps:style>
+                                <a:lnRef idx="2">
+                                  <a:schemeClr val="accent1">
+                                    <a:shade val="15000"/>
+                                  </a:schemeClr>
+                                </a:lnRef>
+                                <a:fillRef idx="1">
+                                  <a:schemeClr val="accent1"/>
+                                </a:fillRef>
+                                <a:effectRef idx="0">
+                                  <a:schemeClr val="accent1"/>
+                                </a:effectRef>
+                                <a:fontRef idx="minor">
+                                  <a:schemeClr val="lt1"/>
+                                </a:fontRef>
+                              </wps:style>
+                              <wps:bodyPr rot="0" spcFirstLastPara="0" vertOverflow="overflow" horzOverflow="overflow" vert="horz" wrap="square" lIns="91440" tIns="45720" rIns="91440" bIns="45720" numCol="1" spcCol="0" rtlCol="0" fromWordArt="0" anchor="ctr" anchorCtr="0" forceAA="0" compatLnSpc="1">
+                                <a:prstTxWarp prst="textNoShape">
+                                  <a:avLst/>
+                                </a:prstTxWarp>
+                                <a:noAutofit/>
+                              </wps:bodyPr>
+                            </wps:wsp>
+                          </wpg:wgp>
+                        </a:graphicData>
+                      </a:graphic>
+                      <wp14:sizeRelH relativeFrom="margin">
+                        <wp14:pctWidth>0</wp14:pctWidth>
+                      </wp14:sizeRelH>
+                      <wp14:sizeRelV relativeFrom="margin">
+                        <wp14:pctHeight>0</wp14:pctHeight>
+                      </wp14:sizeRelV>
+                    </wp:anchor>
+                  </w:drawing>
+                </mc:Choice>
+                <mc:Fallback>
+                  <w:pict>
+                    <v:group w14:anchorId="7A31F4BF" id="그룹 2" o:spid="_x0000_s1026" style="position:absolute;margin-left:58.7pt;margin-top:91.2pt;width:14.65pt;height:15.85pt;rotation:-90;z-index:251683840;mso-width-relative:margin;mso-height-relative:margin" coordsize="241300,261257" o:gfxdata="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">
+                      <v:rect id="직사각형 1" o:spid="_x0000_s1027" style="position:absolute;width:241300;height:261257;visibility:visible;mso-wrap-style:square;v-text-anchor:middle" o:gfxdata="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" fillcolor="#ff1dc4" strokecolor="#030e13 [484]" strokeweight="1pt"/>
+                      <v:rect id="직사각형 1" o:spid="_x0000_s1028" style="position:absolute;left:20096;top:30145;width:195943;height:80387;visibility:visible;mso-wrap-style:square;v-text-anchor:middle" o:gfxdata="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" fillcolor="#e59edc [1304]" strokecolor="#030e13 [484]" strokeweight="1pt"/>
+                    </v:group>
+                  </w:pict>
+                </mc:Fallback>
+              </mc:AlternateContent>
+            </w:r>
+            <w:r>
+              <w:rPr>
+                <w:noProof/>
+              </w:rPr>
+              <mc:AlternateContent>
+                <mc:Choice Requires="wpg">
+                  <w:drawing>
+                    <wp:anchor distT="0" distB="0" distL="114300" distR="114300" simplePos="0" relativeHeight="251681792" behindDoc="0" locked="0" layoutInCell="1" allowOverlap="1" wp14:anchorId="09681DDD" wp14:editId="309C2073">
+                      <wp:simplePos x="0" y="0"/>
+                      <wp:positionH relativeFrom="column">
+                        <wp:posOffset>730716</wp:posOffset>
+                      </wp:positionH>
+                      <wp:positionV relativeFrom="paragraph">
+                        <wp:posOffset>248920</wp:posOffset>
+                      </wp:positionV>
+                      <wp:extent cx="186055" cy="201295"/>
+                      <wp:effectExtent l="0" t="7620" r="15875" b="15875"/>
+                      <wp:wrapNone/>
+                      <wp:docPr id="1830392981" name="그룹 2"/>
+                      <wp:cNvGraphicFramePr/>
+                      <a:graphic xmlns:a="http://schemas.openxmlformats.org/drawingml/2006/main">
+                        <a:graphicData uri="http://schemas.microsoft.com/office/word/2010/wordprocessingGroup">
+                          <wpg:wgp>
+                            <wpg:cNvGrpSpPr/>
+                            <wpg:grpSpPr>
+                              <a:xfrm rot="16200000">
+                                <a:off x="0" y="0"/>
+                                <a:ext cx="186055" cy="201295"/>
+                                <a:chOff x="0" y="0"/>
+                                <a:chExt cx="241300" cy="261257"/>
+                              </a:xfrm>
+                            </wpg:grpSpPr>
+                            <wps:wsp>
+                              <wps:cNvPr id="2123403096" name="직사각형 1"/>
+                              <wps:cNvSpPr/>
+                              <wps:spPr>
+                                <a:xfrm>
+                                  <a:off x="0" y="0"/>
+                                  <a:ext cx="241300" cy="261257"/>
+                                </a:xfrm>
+                                <a:prstGeom prst="rect">
+                                  <a:avLst/>
+                                </a:prstGeom>
+                                <a:solidFill>
+                                  <a:srgbClr val="FF1DC4"/>
+                                </a:solidFill>
+                              </wps:spPr>
+                              <wps:style>
+                                <a:lnRef idx="2">
+                                  <a:schemeClr val="accent1">
+                                    <a:shade val="15000"/>
+                                  </a:schemeClr>
+                                </a:lnRef>
+                                <a:fillRef idx="1">
+                                  <a:schemeClr val="accent1"/>
+                                </a:fillRef>
+                                <a:effectRef idx="0">
+                                  <a:schemeClr val="accent1"/>
+                                </a:effectRef>
+                                <a:fontRef idx="minor">
+                                  <a:schemeClr val="lt1"/>
+                                </a:fontRef>
+                              </wps:style>
+                              <wps:bodyPr rot="0" spcFirstLastPara="0" vertOverflow="overflow" horzOverflow="overflow" vert="horz" wrap="square" lIns="91440" tIns="45720" rIns="91440" bIns="45720" numCol="1" spcCol="0" rtlCol="0" fromWordArt="0" anchor="ctr" anchorCtr="0" forceAA="0" compatLnSpc="1">
+                                <a:prstTxWarp prst="textNoShape">
+                                  <a:avLst/>
+                                </a:prstTxWarp>
+                                <a:noAutofit/>
+                              </wps:bodyPr>
+                            </wps:wsp>
+                            <wps:wsp>
+                              <wps:cNvPr id="1746948913" name="직사각형 1"/>
+                              <wps:cNvSpPr/>
+                              <wps:spPr>
+                                <a:xfrm>
+                                  <a:off x="20096" y="30145"/>
+                                  <a:ext cx="195943" cy="80387"/>
+                                </a:xfrm>
+                                <a:prstGeom prst="rect">
+                                  <a:avLst/>
+                                </a:prstGeom>
+                                <a:solidFill>
+                                  <a:schemeClr val="accent5">
+                                    <a:lumMod val="40000"/>
+                                    <a:lumOff val="60000"/>
+                                  </a:schemeClr>
+                                </a:solidFill>
+                              </wps:spPr>
+                              <wps:style>
+                                <a:lnRef idx="2">
+                                  <a:schemeClr val="accent1">
+                                    <a:shade val="15000"/>
+                                  </a:schemeClr>
+                                </a:lnRef>
+                                <a:fillRef idx="1">
+                                  <a:schemeClr val="accent1"/>
+                                </a:fillRef>
+                                <a:effectRef idx="0">
+                                  <a:schemeClr val="accent1"/>
+                                </a:effectRef>
+                                <a:fontRef idx="minor">
+                                  <a:schemeClr val="lt1"/>
+                                </a:fontRef>
+                              </wps:style>
+                              <wps:bodyPr rot="0" spcFirstLastPara="0" vertOverflow="overflow" horzOverflow="overflow" vert="horz" wrap="square" lIns="91440" tIns="45720" rIns="91440" bIns="45720" numCol="1" spcCol="0" rtlCol="0" fromWordArt="0" anchor="ctr" anchorCtr="0" forceAA="0" compatLnSpc="1">
+                                <a:prstTxWarp prst="textNoShape">
+                                  <a:avLst/>
+                                </a:prstTxWarp>
+                                <a:noAutofit/>
+                              </wps:bodyPr>
+                            </wps:wsp>
+                          </wpg:wgp>
+                        </a:graphicData>
+                      </a:graphic>
+                      <wp14:sizeRelH relativeFrom="margin">
+                        <wp14:pctWidth>0</wp14:pctWidth>
+                      </wp14:sizeRelH>
+                      <wp14:sizeRelV relativeFrom="margin">
+                        <wp14:pctHeight>0</wp14:pctHeight>
+                      </wp14:sizeRelV>
+                    </wp:anchor>
+                  </w:drawing>
+                </mc:Choice>
+                <mc:Fallback>
+                  <w:pict>
+                    <v:group w14:anchorId="69D69090" id="그룹 2" o:spid="_x0000_s1026" style="position:absolute;margin-left:57.55pt;margin-top:19.6pt;width:14.65pt;height:15.85pt;rotation:-90;z-index:251681792;mso-width-relative:margin;mso-height-relative:margin" coordsize="241300,261257" o:gfxdata="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">
+                      <v:rect id="직사각형 1" o:spid="_x0000_s1027" style="position:absolute;width:241300;height:261257;visibility:visible;mso-wrap-style:square;v-text-anchor:middle" o:gfxdata="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" fillcolor="#ff1dc4" strokecolor="#030e13 [484]" strokeweight="1pt"/>
+                      <v:rect id="직사각형 1" o:spid="_x0000_s1028" style="position:absolute;left:20096;top:30145;width:195943;height:80387;visibility:visible;mso-wrap-style:square;v-text-anchor:middle" o:gfxdata="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" fillcolor="#e59edc [1304]" strokecolor="#030e13 [484]" strokeweight="1pt"/>
+                    </v:group>
+                  </w:pict>
+                </mc:Fallback>
+              </mc:AlternateContent>
+            </w:r>
             <w:r>
               <w:rPr>
                 <w:rFonts w:hint="eastAsia"/>
@@ -3308,7 +4144,7 @@
                 <w:noProof/>
               </w:rPr>
               <w:drawing>
-                <wp:inline distT="0" distB="0" distL="0" distR="0" wp14:anchorId="3E4E963E" wp14:editId="10EFD26E">
+                <wp:inline distT="0" distB="0" distL="0" distR="0" wp14:anchorId="3E4E963E" wp14:editId="5F7DE33D">
                   <wp:extent cx="1268635" cy="2509284"/>
                   <wp:effectExtent l="0" t="0" r="8255" b="5715"/>
                   <wp:docPr id="119790798" name="그림 1" descr="직사각형, 스크린샷, 디자인, 라인이(가) 표시된 사진&#10;&#10;AI 생성 콘텐츠는 정확하지 않을 수 있습니다."/>
@@ -3565,6 +4401,55 @@
               <w:pStyle w:val="a6"/>
               <w:ind w:left="0"/>
               <w:jc w:val="center"/>
+              <w:rPr>
+                <w:rFonts w:hint="eastAsia"/>
+              </w:rPr>
+            </w:pPr>
+            <w:r>
+              <w:rPr>
+                <w:rFonts w:hint="eastAsia"/>
+              </w:rPr>
+              <w:t>판매기 생성 여부</w:t>
+            </w:r>
+          </w:p>
+        </w:tc>
+        <w:tc>
+          <w:tcPr>
+            <w:tcW w:w="4012" w:type="dxa"/>
+            <w:gridSpan w:val="3"/>
+          </w:tcPr>
+          <w:p>
+            <w:pPr>
+              <w:pStyle w:val="a6"/>
+              <w:ind w:left="0"/>
+              <w:jc w:val="center"/>
+              <w:rPr>
+                <w:rFonts w:hint="eastAsia"/>
+              </w:rPr>
+            </w:pPr>
+            <w:r>
+              <w:rPr>
+                <w:rFonts w:hint="eastAsia"/>
+              </w:rPr>
+              <w:t>Y</w:t>
+            </w:r>
+          </w:p>
+        </w:tc>
+      </w:tr>
+      <w:tr>
+        <w:trPr>
+          <w:jc w:val="center"/>
+        </w:trPr>
+        <w:tc>
+          <w:tcPr>
+            <w:tcW w:w="4124" w:type="dxa"/>
+            <w:shd w:val="clear" w:color="auto" w:fill="D1D1D1" w:themeFill="background2" w:themeFillShade="E6"/>
+          </w:tcPr>
+          <w:p>
+            <w:pPr>
+              <w:pStyle w:val="a6"/>
+              <w:ind w:left="0"/>
+              <w:jc w:val="center"/>
             </w:pPr>
             <w:r>
               <w:rPr>
@@ -3880,6 +4765,7 @@
         <w:rPr>
           <w:rFonts w:hint="eastAsia"/>
         </w:rPr>
+        <w:lastRenderedPageBreak/>
         <w:t>: 최대 6개의 문이 생성될 수 있다. 문의 위치는 아래층에 4개, 위층에 2개이다.</w:t>
       </w:r>
       <w:r>
@@ -3994,8 +4880,262 @@
               <w:rPr>
                 <w:noProof/>
               </w:rPr>
+              <mc:AlternateContent>
+                <mc:Choice Requires="wpg">
+                  <w:drawing>
+                    <wp:anchor distT="0" distB="0" distL="114300" distR="114300" simplePos="0" relativeHeight="251708416" behindDoc="0" locked="0" layoutInCell="1" allowOverlap="1" wp14:anchorId="401925FC" wp14:editId="6CBFF42E">
+                      <wp:simplePos x="0" y="0"/>
+                      <wp:positionH relativeFrom="column">
+                        <wp:posOffset>3307922</wp:posOffset>
+                      </wp:positionH>
+                      <wp:positionV relativeFrom="paragraph">
+                        <wp:posOffset>993707</wp:posOffset>
+                      </wp:positionV>
+                      <wp:extent cx="241300" cy="261257"/>
+                      <wp:effectExtent l="9207" t="0" r="15558" b="15557"/>
+                      <wp:wrapNone/>
+                      <wp:docPr id="422204856" name="그룹 2"/>
+                      <wp:cNvGraphicFramePr/>
+                      <a:graphic xmlns:a="http://schemas.openxmlformats.org/drawingml/2006/main">
+                        <a:graphicData uri="http://schemas.microsoft.com/office/word/2010/wordprocessingGroup">
+                          <wpg:wgp>
+                            <wpg:cNvGrpSpPr/>
+                            <wpg:grpSpPr>
+                              <a:xfrm rot="5400000">
+                                <a:off x="0" y="0"/>
+                                <a:ext cx="241300" cy="261257"/>
+                                <a:chOff x="0" y="0"/>
+                                <a:chExt cx="241300" cy="261257"/>
+                              </a:xfrm>
+                            </wpg:grpSpPr>
+                            <wps:wsp>
+                              <wps:cNvPr id="48821403" name="직사각형 1"/>
+                              <wps:cNvSpPr/>
+                              <wps:spPr>
+                                <a:xfrm>
+                                  <a:off x="0" y="0"/>
+                                  <a:ext cx="241300" cy="261257"/>
+                                </a:xfrm>
+                                <a:prstGeom prst="rect">
+                                  <a:avLst/>
+                                </a:prstGeom>
+                                <a:solidFill>
+                                  <a:srgbClr val="FF1DC4"/>
+                                </a:solidFill>
+                              </wps:spPr>
+                              <wps:style>
+                                <a:lnRef idx="2">
+                                  <a:schemeClr val="accent1">
+                                    <a:shade val="15000"/>
+                                  </a:schemeClr>
+                                </a:lnRef>
+                                <a:fillRef idx="1">
+                                  <a:schemeClr val="accent1"/>
+                                </a:fillRef>
+                                <a:effectRef idx="0">
+                                  <a:schemeClr val="accent1"/>
+                                </a:effectRef>
+                                <a:fontRef idx="minor">
+                                  <a:schemeClr val="lt1"/>
+                                </a:fontRef>
+                              </wps:style>
+                              <wps:bodyPr rot="0" spcFirstLastPara="0" vertOverflow="overflow" horzOverflow="overflow" vert="horz" wrap="square" lIns="91440" tIns="45720" rIns="91440" bIns="45720" numCol="1" spcCol="0" rtlCol="0" fromWordArt="0" anchor="ctr" anchorCtr="0" forceAA="0" compatLnSpc="1">
+                                <a:prstTxWarp prst="textNoShape">
+                                  <a:avLst/>
+                                </a:prstTxWarp>
+                                <a:noAutofit/>
+                              </wps:bodyPr>
+                            </wps:wsp>
+                            <wps:wsp>
+                              <wps:cNvPr id="731802336" name="직사각형 1"/>
+                              <wps:cNvSpPr/>
+                              <wps:spPr>
+                                <a:xfrm>
+                                  <a:off x="20096" y="30145"/>
+                                  <a:ext cx="195943" cy="80387"/>
+                                </a:xfrm>
+                                <a:prstGeom prst="rect">
+                                  <a:avLst/>
+                                </a:prstGeom>
+                                <a:solidFill>
+                                  <a:schemeClr val="accent5">
+                                    <a:lumMod val="40000"/>
+                                    <a:lumOff val="60000"/>
+                                  </a:schemeClr>
+                                </a:solidFill>
+                              </wps:spPr>
+                              <wps:style>
+                                <a:lnRef idx="2">
+                                  <a:schemeClr val="accent1">
+                                    <a:shade val="15000"/>
+                                  </a:schemeClr>
+                                </a:lnRef>
+                                <a:fillRef idx="1">
+                                  <a:schemeClr val="accent1"/>
+                                </a:fillRef>
+                                <a:effectRef idx="0">
+                                  <a:schemeClr val="accent1"/>
+                                </a:effectRef>
+                                <a:fontRef idx="minor">
+                                  <a:schemeClr val="lt1"/>
+                                </a:fontRef>
+                              </wps:style>
+                              <wps:bodyPr rot="0" spcFirstLastPara="0" vertOverflow="overflow" horzOverflow="overflow" vert="horz" wrap="square" lIns="91440" tIns="45720" rIns="91440" bIns="45720" numCol="1" spcCol="0" rtlCol="0" fromWordArt="0" anchor="ctr" anchorCtr="0" forceAA="0" compatLnSpc="1">
+                                <a:prstTxWarp prst="textNoShape">
+                                  <a:avLst/>
+                                </a:prstTxWarp>
+                                <a:noAutofit/>
+                              </wps:bodyPr>
+                            </wps:wsp>
+                          </wpg:wgp>
+                        </a:graphicData>
+                      </a:graphic>
+                    </wp:anchor>
+                  </w:drawing>
+                </mc:Choice>
+                <mc:Fallback>
+                  <w:pict>
+                    <v:group w14:anchorId="4278F07D" id="그룹 2" o:spid="_x0000_s1026" style="position:absolute;margin-left:260.45pt;margin-top:78.25pt;width:19pt;height:20.55pt;rotation:90;z-index:251708416" coordsize="241300,261257" o:gfxdata="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">
+                      <v:rect id="직사각형 1" o:spid="_x0000_s1027" style="position:absolute;width:241300;height:261257;visibility:visible;mso-wrap-style:square;v-text-anchor:middle" o:gfxdata="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" fillcolor="#ff1dc4" strokecolor="#030e13 [484]" strokeweight="1pt"/>
+                      <v:rect id="직사각형 1" o:spid="_x0000_s1028" style="position:absolute;left:20096;top:30145;width:195943;height:80387;visibility:visible;mso-wrap-style:square;v-text-anchor:middle" o:gfxdata="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" fillcolor="#e59edc [1304]" strokecolor="#030e13 [484]" strokeweight="1pt"/>
+                    </v:group>
+                  </w:pict>
+                </mc:Fallback>
+              </mc:AlternateContent>
+            </w:r>
+            <w:r>
+              <w:rPr>
+                <w:noProof/>
+              </w:rPr>
+              <mc:AlternateContent>
+                <mc:Choice Requires="wpg">
+                  <w:drawing>
+                    <wp:anchor distT="0" distB="0" distL="114300" distR="114300" simplePos="0" relativeHeight="251687936" behindDoc="0" locked="0" layoutInCell="1" allowOverlap="1" wp14:anchorId="4E36AC87" wp14:editId="5FBED458">
+                      <wp:simplePos x="0" y="0"/>
+                      <wp:positionH relativeFrom="column">
+                        <wp:posOffset>1756410</wp:posOffset>
+                      </wp:positionH>
+                      <wp:positionV relativeFrom="paragraph">
+                        <wp:posOffset>332740</wp:posOffset>
+                      </wp:positionV>
+                      <wp:extent cx="241300" cy="261257"/>
+                      <wp:effectExtent l="0" t="0" r="25400" b="24765"/>
+                      <wp:wrapNone/>
+                      <wp:docPr id="769611374" name="그룹 2"/>
+                      <wp:cNvGraphicFramePr/>
+                      <a:graphic xmlns:a="http://schemas.openxmlformats.org/drawingml/2006/main">
+                        <a:graphicData uri="http://schemas.microsoft.com/office/word/2010/wordprocessingGroup">
+                          <wpg:wgp>
+                            <wpg:cNvGrpSpPr/>
+                            <wpg:grpSpPr>
+                              <a:xfrm>
+                                <a:off x="0" y="0"/>
+                                <a:ext cx="241300" cy="261257"/>
+                                <a:chOff x="0" y="0"/>
+                                <a:chExt cx="241300" cy="261257"/>
+                              </a:xfrm>
+                            </wpg:grpSpPr>
+                            <wps:wsp>
+                              <wps:cNvPr id="443614199" name="직사각형 1"/>
+                              <wps:cNvSpPr/>
+                              <wps:spPr>
+                                <a:xfrm>
+                                  <a:off x="0" y="0"/>
+                                  <a:ext cx="241300" cy="261257"/>
+                                </a:xfrm>
+                                <a:prstGeom prst="rect">
+                                  <a:avLst/>
+                                </a:prstGeom>
+                                <a:solidFill>
+                                  <a:srgbClr val="FF1DC4"/>
+                                </a:solidFill>
+                              </wps:spPr>
+                              <wps:style>
+                                <a:lnRef idx="2">
+                                  <a:schemeClr val="accent1">
+                                    <a:shade val="15000"/>
+                                  </a:schemeClr>
+                                </a:lnRef>
+                                <a:fillRef idx="1">
+                                  <a:schemeClr val="accent1"/>
+                                </a:fillRef>
+                                <a:effectRef idx="0">
+                                  <a:schemeClr val="accent1"/>
+                                </a:effectRef>
+                                <a:fontRef idx="minor">
+                                  <a:schemeClr val="lt1"/>
+                                </a:fontRef>
+                              </wps:style>
+                              <wps:bodyPr rot="0" spcFirstLastPara="0" vertOverflow="overflow" horzOverflow="overflow" vert="horz" wrap="square" lIns="91440" tIns="45720" rIns="91440" bIns="45720" numCol="1" spcCol="0" rtlCol="0" fromWordArt="0" anchor="ctr" anchorCtr="0" forceAA="0" compatLnSpc="1">
+                                <a:prstTxWarp prst="textNoShape">
+                                  <a:avLst/>
+                                </a:prstTxWarp>
+                                <a:noAutofit/>
+                              </wps:bodyPr>
+                            </wps:wsp>
+                            <wps:wsp>
+                              <wps:cNvPr id="1447868108" name="직사각형 1"/>
+                              <wps:cNvSpPr/>
+                              <wps:spPr>
+                                <a:xfrm>
+                                  <a:off x="20096" y="30145"/>
+                                  <a:ext cx="195943" cy="80387"/>
+                                </a:xfrm>
+                                <a:prstGeom prst="rect">
+                                  <a:avLst/>
+                                </a:prstGeom>
+                                <a:solidFill>
+                                  <a:schemeClr val="accent5">
+                                    <a:lumMod val="40000"/>
+                                    <a:lumOff val="60000"/>
+                                  </a:schemeClr>
+                                </a:solidFill>
+                              </wps:spPr>
+                              <wps:style>
+                                <a:lnRef idx="2">
+                                  <a:schemeClr val="accent1">
+                                    <a:shade val="15000"/>
+                                  </a:schemeClr>
+                                </a:lnRef>
+                                <a:fillRef idx="1">
+                                  <a:schemeClr val="accent1"/>
+                                </a:fillRef>
+                                <a:effectRef idx="0">
+                                  <a:schemeClr val="accent1"/>
+                                </a:effectRef>
+                                <a:fontRef idx="minor">
+                                  <a:schemeClr val="lt1"/>
+                                </a:fontRef>
+                              </wps:style>
+                              <wps:bodyPr rot="0" spcFirstLastPara="0" vertOverflow="overflow" horzOverflow="overflow" vert="horz" wrap="square" lIns="91440" tIns="45720" rIns="91440" bIns="45720" numCol="1" spcCol="0" rtlCol="0" fromWordArt="0" anchor="ctr" anchorCtr="0" forceAA="0" compatLnSpc="1">
+                                <a:prstTxWarp prst="textNoShape">
+                                  <a:avLst/>
+                                </a:prstTxWarp>
+                                <a:noAutofit/>
+                              </wps:bodyPr>
+                            </wps:wsp>
+                          </wpg:wgp>
+                        </a:graphicData>
+                      </a:graphic>
+                    </wp:anchor>
+                  </w:drawing>
+                </mc:Choice>
+                <mc:Fallback>
+                  <w:pict>
+                    <v:group w14:anchorId="1CDB5624" id="그룹 2" o:spid="_x0000_s1026" style="position:absolute;margin-left:138.3pt;margin-top:26.2pt;width:19pt;height:20.55pt;z-index:251687936" coordsize="241300,261257" o:gfxdata="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">
+                      <v:rect id="직사각형 1" o:spid="_x0000_s1027" style="position:absolute;width:241300;height:261257;visibility:visible;mso-wrap-style:square;v-text-anchor:middle" o:gfxdata="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" fillcolor="#ff1dc4" strokecolor="#030e13 [484]" strokeweight="1pt"/>
+                      <v:rect id="직사각형 1" o:spid="_x0000_s1028" style="position:absolute;left:20096;top:30145;width:195943;height:80387;visibility:visible;mso-wrap-style:square;v-text-anchor:middle" o:gfxdata="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" fillcolor="#e59edc [1304]" strokecolor="#030e13 [484]" strokeweight="1pt"/>
+                    </v:group>
+                  </w:pict>
+                </mc:Fallback>
+              </mc:AlternateContent>
+            </w:r>
+            <w:r>
+              <w:rPr>
+                <w:noProof/>
+              </w:rPr>
               <w:drawing>
-                <wp:inline distT="0" distB="0" distL="0" distR="0" wp14:anchorId="74170433" wp14:editId="32090A6B">
+                <wp:inline distT="0" distB="0" distL="0" distR="0" wp14:anchorId="74170433" wp14:editId="17C42D19">
                   <wp:extent cx="2772162" cy="1905266"/>
                   <wp:effectExtent l="0" t="0" r="9525" b="0"/>
                   <wp:docPr id="1181075830" name="그림 1"/>
@@ -4218,6 +5358,55 @@
               <w:pStyle w:val="a6"/>
               <w:ind w:left="0"/>
               <w:jc w:val="center"/>
+              <w:rPr>
+                <w:rFonts w:hint="eastAsia"/>
+              </w:rPr>
+            </w:pPr>
+            <w:r>
+              <w:rPr>
+                <w:rFonts w:hint="eastAsia"/>
+              </w:rPr>
+              <w:t>판매기 생성 여부</w:t>
+            </w:r>
+          </w:p>
+        </w:tc>
+        <w:tc>
+          <w:tcPr>
+            <w:tcW w:w="4012" w:type="dxa"/>
+            <w:gridSpan w:val="3"/>
+          </w:tcPr>
+          <w:p>
+            <w:pPr>
+              <w:pStyle w:val="a6"/>
+              <w:ind w:left="0"/>
+              <w:jc w:val="center"/>
+              <w:rPr>
+                <w:rFonts w:hint="eastAsia"/>
+              </w:rPr>
+            </w:pPr>
+            <w:r>
+              <w:rPr>
+                <w:rFonts w:hint="eastAsia"/>
+              </w:rPr>
+              <w:t>Y</w:t>
+            </w:r>
+          </w:p>
+        </w:tc>
+      </w:tr>
+      <w:tr>
+        <w:trPr>
+          <w:jc w:val="center"/>
+        </w:trPr>
+        <w:tc>
+          <w:tcPr>
+            <w:tcW w:w="4124" w:type="dxa"/>
+            <w:shd w:val="clear" w:color="auto" w:fill="D1D1D1" w:themeFill="background2" w:themeFillShade="E6"/>
+          </w:tcPr>
+          <w:p>
+            <w:pPr>
+              <w:pStyle w:val="a6"/>
+              <w:ind w:left="0"/>
+              <w:jc w:val="center"/>
             </w:pPr>
             <w:r>
               <w:rPr>
@@ -4588,8 +5777,262 @@
               <w:rPr>
                 <w:noProof/>
               </w:rPr>
+              <mc:AlternateContent>
+                <mc:Choice Requires="wpg">
+                  <w:drawing>
+                    <wp:anchor distT="0" distB="0" distL="114300" distR="114300" simplePos="0" relativeHeight="251692032" behindDoc="0" locked="0" layoutInCell="1" allowOverlap="1" wp14:anchorId="074954CF" wp14:editId="2B462BBE">
+                      <wp:simplePos x="0" y="0"/>
+                      <wp:positionH relativeFrom="column">
+                        <wp:posOffset>3021110</wp:posOffset>
+                      </wp:positionH>
+                      <wp:positionV relativeFrom="paragraph">
+                        <wp:posOffset>1110439</wp:posOffset>
+                      </wp:positionV>
+                      <wp:extent cx="241300" cy="261257"/>
+                      <wp:effectExtent l="9207" t="0" r="15558" b="15557"/>
+                      <wp:wrapNone/>
+                      <wp:docPr id="521464592" name="그룹 2"/>
+                      <wp:cNvGraphicFramePr/>
+                      <a:graphic xmlns:a="http://schemas.openxmlformats.org/drawingml/2006/main">
+                        <a:graphicData uri="http://schemas.microsoft.com/office/word/2010/wordprocessingGroup">
+                          <wpg:wgp>
+                            <wpg:cNvGrpSpPr/>
+                            <wpg:grpSpPr>
+                              <a:xfrm rot="5400000">
+                                <a:off x="0" y="0"/>
+                                <a:ext cx="241300" cy="261257"/>
+                                <a:chOff x="0" y="0"/>
+                                <a:chExt cx="241300" cy="261257"/>
+                              </a:xfrm>
+                            </wpg:grpSpPr>
+                            <wps:wsp>
+                              <wps:cNvPr id="1625281550" name="직사각형 1"/>
+                              <wps:cNvSpPr/>
+                              <wps:spPr>
+                                <a:xfrm>
+                                  <a:off x="0" y="0"/>
+                                  <a:ext cx="241300" cy="261257"/>
+                                </a:xfrm>
+                                <a:prstGeom prst="rect">
+                                  <a:avLst/>
+                                </a:prstGeom>
+                                <a:solidFill>
+                                  <a:srgbClr val="FF1DC4"/>
+                                </a:solidFill>
+                              </wps:spPr>
+                              <wps:style>
+                                <a:lnRef idx="2">
+                                  <a:schemeClr val="accent1">
+                                    <a:shade val="15000"/>
+                                  </a:schemeClr>
+                                </a:lnRef>
+                                <a:fillRef idx="1">
+                                  <a:schemeClr val="accent1"/>
+                                </a:fillRef>
+                                <a:effectRef idx="0">
+                                  <a:schemeClr val="accent1"/>
+                                </a:effectRef>
+                                <a:fontRef idx="minor">
+                                  <a:schemeClr val="lt1"/>
+                                </a:fontRef>
+                              </wps:style>
+                              <wps:bodyPr rot="0" spcFirstLastPara="0" vertOverflow="overflow" horzOverflow="overflow" vert="horz" wrap="square" lIns="91440" tIns="45720" rIns="91440" bIns="45720" numCol="1" spcCol="0" rtlCol="0" fromWordArt="0" anchor="ctr" anchorCtr="0" forceAA="0" compatLnSpc="1">
+                                <a:prstTxWarp prst="textNoShape">
+                                  <a:avLst/>
+                                </a:prstTxWarp>
+                                <a:noAutofit/>
+                              </wps:bodyPr>
+                            </wps:wsp>
+                            <wps:wsp>
+                              <wps:cNvPr id="790772924" name="직사각형 1"/>
+                              <wps:cNvSpPr/>
+                              <wps:spPr>
+                                <a:xfrm>
+                                  <a:off x="20096" y="30145"/>
+                                  <a:ext cx="195943" cy="80387"/>
+                                </a:xfrm>
+                                <a:prstGeom prst="rect">
+                                  <a:avLst/>
+                                </a:prstGeom>
+                                <a:solidFill>
+                                  <a:schemeClr val="accent5">
+                                    <a:lumMod val="40000"/>
+                                    <a:lumOff val="60000"/>
+                                  </a:schemeClr>
+                                </a:solidFill>
+                              </wps:spPr>
+                              <wps:style>
+                                <a:lnRef idx="2">
+                                  <a:schemeClr val="accent1">
+                                    <a:shade val="15000"/>
+                                  </a:schemeClr>
+                                </a:lnRef>
+                                <a:fillRef idx="1">
+                                  <a:schemeClr val="accent1"/>
+                                </a:fillRef>
+                                <a:effectRef idx="0">
+                                  <a:schemeClr val="accent1"/>
+                                </a:effectRef>
+                                <a:fontRef idx="minor">
+                                  <a:schemeClr val="lt1"/>
+                                </a:fontRef>
+                              </wps:style>
+                              <wps:bodyPr rot="0" spcFirstLastPara="0" vertOverflow="overflow" horzOverflow="overflow" vert="horz" wrap="square" lIns="91440" tIns="45720" rIns="91440" bIns="45720" numCol="1" spcCol="0" rtlCol="0" fromWordArt="0" anchor="ctr" anchorCtr="0" forceAA="0" compatLnSpc="1">
+                                <a:prstTxWarp prst="textNoShape">
+                                  <a:avLst/>
+                                </a:prstTxWarp>
+                                <a:noAutofit/>
+                              </wps:bodyPr>
+                            </wps:wsp>
+                          </wpg:wgp>
+                        </a:graphicData>
+                      </a:graphic>
+                    </wp:anchor>
+                  </w:drawing>
+                </mc:Choice>
+                <mc:Fallback>
+                  <w:pict>
+                    <v:group w14:anchorId="3E6FEF4F" id="그룹 2" o:spid="_x0000_s1026" style="position:absolute;margin-left:237.9pt;margin-top:87.45pt;width:19pt;height:20.55pt;rotation:90;z-index:251692032" coordsize="241300,261257" o:gfxdata="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">
+                      <v:rect id="직사각형 1" o:spid="_x0000_s1027" style="position:absolute;width:241300;height:261257;visibility:visible;mso-wrap-style:square;v-text-anchor:middle" o:gfxdata="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" fillcolor="#ff1dc4" strokecolor="#030e13 [484]" strokeweight="1pt"/>
+                      <v:rect id="직사각형 1" o:spid="_x0000_s1028" style="position:absolute;left:20096;top:30145;width:195943;height:80387;visibility:visible;mso-wrap-style:square;v-text-anchor:middle" o:gfxdata="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" fillcolor="#e59edc [1304]" strokecolor="#030e13 [484]" strokeweight="1pt"/>
+                    </v:group>
+                  </w:pict>
+                </mc:Fallback>
+              </mc:AlternateContent>
+            </w:r>
+            <w:r>
+              <w:rPr>
+                <w:noProof/>
+              </w:rPr>
+              <mc:AlternateContent>
+                <mc:Choice Requires="wpg">
+                  <w:drawing>
+                    <wp:anchor distT="0" distB="0" distL="114300" distR="114300" simplePos="0" relativeHeight="251689984" behindDoc="0" locked="0" layoutInCell="1" allowOverlap="1" wp14:anchorId="0F3AEE40" wp14:editId="5B06D639">
+                      <wp:simplePos x="0" y="0"/>
+                      <wp:positionH relativeFrom="column">
+                        <wp:posOffset>2027774</wp:posOffset>
+                      </wp:positionH>
+                      <wp:positionV relativeFrom="paragraph">
+                        <wp:posOffset>984063</wp:posOffset>
+                      </wp:positionV>
+                      <wp:extent cx="241300" cy="261257"/>
+                      <wp:effectExtent l="0" t="0" r="25400" b="24765"/>
+                      <wp:wrapNone/>
+                      <wp:docPr id="1729609208" name="그룹 2"/>
+                      <wp:cNvGraphicFramePr/>
+                      <a:graphic xmlns:a="http://schemas.openxmlformats.org/drawingml/2006/main">
+                        <a:graphicData uri="http://schemas.microsoft.com/office/word/2010/wordprocessingGroup">
+                          <wpg:wgp>
+                            <wpg:cNvGrpSpPr/>
+                            <wpg:grpSpPr>
+                              <a:xfrm rot="10800000">
+                                <a:off x="0" y="0"/>
+                                <a:ext cx="241300" cy="261257"/>
+                                <a:chOff x="0" y="0"/>
+                                <a:chExt cx="241300" cy="261257"/>
+                              </a:xfrm>
+                            </wpg:grpSpPr>
+                            <wps:wsp>
+                              <wps:cNvPr id="1122256625" name="직사각형 1"/>
+                              <wps:cNvSpPr/>
+                              <wps:spPr>
+                                <a:xfrm>
+                                  <a:off x="0" y="0"/>
+                                  <a:ext cx="241300" cy="261257"/>
+                                </a:xfrm>
+                                <a:prstGeom prst="rect">
+                                  <a:avLst/>
+                                </a:prstGeom>
+                                <a:solidFill>
+                                  <a:srgbClr val="FF1DC4"/>
+                                </a:solidFill>
+                              </wps:spPr>
+                              <wps:style>
+                                <a:lnRef idx="2">
+                                  <a:schemeClr val="accent1">
+                                    <a:shade val="15000"/>
+                                  </a:schemeClr>
+                                </a:lnRef>
+                                <a:fillRef idx="1">
+                                  <a:schemeClr val="accent1"/>
+                                </a:fillRef>
+                                <a:effectRef idx="0">
+                                  <a:schemeClr val="accent1"/>
+                                </a:effectRef>
+                                <a:fontRef idx="minor">
+                                  <a:schemeClr val="lt1"/>
+                                </a:fontRef>
+                              </wps:style>
+                              <wps:bodyPr rot="0" spcFirstLastPara="0" vertOverflow="overflow" horzOverflow="overflow" vert="horz" wrap="square" lIns="91440" tIns="45720" rIns="91440" bIns="45720" numCol="1" spcCol="0" rtlCol="0" fromWordArt="0" anchor="ctr" anchorCtr="0" forceAA="0" compatLnSpc="1">
+                                <a:prstTxWarp prst="textNoShape">
+                                  <a:avLst/>
+                                </a:prstTxWarp>
+                                <a:noAutofit/>
+                              </wps:bodyPr>
+                            </wps:wsp>
+                            <wps:wsp>
+                              <wps:cNvPr id="121124270" name="직사각형 1"/>
+                              <wps:cNvSpPr/>
+                              <wps:spPr>
+                                <a:xfrm>
+                                  <a:off x="20096" y="30145"/>
+                                  <a:ext cx="195943" cy="80387"/>
+                                </a:xfrm>
+                                <a:prstGeom prst="rect">
+                                  <a:avLst/>
+                                </a:prstGeom>
+                                <a:solidFill>
+                                  <a:schemeClr val="accent5">
+                                    <a:lumMod val="40000"/>
+                                    <a:lumOff val="60000"/>
+                                  </a:schemeClr>
+                                </a:solidFill>
+                              </wps:spPr>
+                              <wps:style>
+                                <a:lnRef idx="2">
+                                  <a:schemeClr val="accent1">
+                                    <a:shade val="15000"/>
+                                  </a:schemeClr>
+                                </a:lnRef>
+                                <a:fillRef idx="1">
+                                  <a:schemeClr val="accent1"/>
+                                </a:fillRef>
+                                <a:effectRef idx="0">
+                                  <a:schemeClr val="accent1"/>
+                                </a:effectRef>
+                                <a:fontRef idx="minor">
+                                  <a:schemeClr val="lt1"/>
+                                </a:fontRef>
+                              </wps:style>
+                              <wps:bodyPr rot="0" spcFirstLastPara="0" vertOverflow="overflow" horzOverflow="overflow" vert="horz" wrap="square" lIns="91440" tIns="45720" rIns="91440" bIns="45720" numCol="1" spcCol="0" rtlCol="0" fromWordArt="0" anchor="ctr" anchorCtr="0" forceAA="0" compatLnSpc="1">
+                                <a:prstTxWarp prst="textNoShape">
+                                  <a:avLst/>
+                                </a:prstTxWarp>
+                                <a:noAutofit/>
+                              </wps:bodyPr>
+                            </wps:wsp>
+                          </wpg:wgp>
+                        </a:graphicData>
+                      </a:graphic>
+                    </wp:anchor>
+                  </w:drawing>
+                </mc:Choice>
+                <mc:Fallback>
+                  <w:pict>
+                    <v:group w14:anchorId="3DD2A5B0" id="그룹 2" o:spid="_x0000_s1026" style="position:absolute;margin-left:159.65pt;margin-top:77.5pt;width:19pt;height:20.55pt;rotation:180;z-index:251689984" coordsize="241300,261257" o:gfxdata="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">
+                      <v:rect id="직사각형 1" o:spid="_x0000_s1027" style="position:absolute;width:241300;height:261257;visibility:visible;mso-wrap-style:square;v-text-anchor:middle" o:gfxdata="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" fillcolor="#ff1dc4" strokecolor="#030e13 [484]" strokeweight="1pt"/>
+                      <v:rect id="직사각형 1" o:spid="_x0000_s1028" style="position:absolute;left:20096;top:30145;width:195943;height:80387;visibility:visible;mso-wrap-style:square;v-text-anchor:middle" o:gfxdata="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" fillcolor="#e59edc [1304]" strokecolor="#030e13 [484]" strokeweight="1pt"/>
+                    </v:group>
+                  </w:pict>
+                </mc:Fallback>
+              </mc:AlternateContent>
+            </w:r>
+            <w:r>
+              <w:rPr>
+                <w:noProof/>
+              </w:rPr>
               <w:drawing>
-                <wp:inline distT="0" distB="0" distL="0" distR="0" wp14:anchorId="497362DE" wp14:editId="6AA4C479">
+                <wp:inline distT="0" distB="0" distL="0" distR="0" wp14:anchorId="497362DE" wp14:editId="6CC63A66">
                   <wp:extent cx="3096057" cy="2581635"/>
                   <wp:effectExtent l="0" t="0" r="9525" b="9525"/>
                   <wp:docPr id="2040789360" name="그림 1"/>
@@ -4646,6 +6089,7 @@
               <w:rPr>
                 <w:rFonts w:hint="eastAsia"/>
               </w:rPr>
+              <w:lastRenderedPageBreak/>
               <w:t xml:space="preserve">방 사이즈 </w:t>
             </w:r>
             <w:r>
@@ -4812,69 +6256,37 @@
               <w:pStyle w:val="a6"/>
               <w:ind w:left="0"/>
               <w:jc w:val="center"/>
-            </w:pPr>
-            <w:r>
-              <w:rPr>
-                <w:rFonts w:hint="eastAsia"/>
-              </w:rPr>
-              <w:t>맵 난이도</w:t>
-            </w:r>
-          </w:p>
-        </w:tc>
-        <w:tc>
-          <w:tcPr>
-            <w:tcW w:w="1337" w:type="dxa"/>
-            <w:shd w:val="clear" w:color="auto" w:fill="E8E8E8" w:themeFill="background2"/>
-          </w:tcPr>
-          <w:p>
-            <w:pPr>
-              <w:pStyle w:val="a6"/>
-              <w:ind w:left="0"/>
-              <w:jc w:val="center"/>
-            </w:pPr>
-            <w:r>
-              <w:rPr>
-                <w:rFonts w:hint="eastAsia"/>
-              </w:rPr>
-              <w:t>쉬움</w:t>
-            </w:r>
-          </w:p>
-        </w:tc>
-        <w:tc>
-          <w:tcPr>
-            <w:tcW w:w="1337" w:type="dxa"/>
-            <w:shd w:val="clear" w:color="auto" w:fill="E8E8E8" w:themeFill="background2"/>
-          </w:tcPr>
-          <w:p>
-            <w:pPr>
-              <w:pStyle w:val="a6"/>
-              <w:ind w:left="0"/>
-              <w:jc w:val="center"/>
-            </w:pPr>
-            <w:r>
-              <w:rPr>
-                <w:rFonts w:hint="eastAsia"/>
-              </w:rPr>
-              <w:t>보통</w:t>
-            </w:r>
-          </w:p>
-        </w:tc>
-        <w:tc>
-          <w:tcPr>
-            <w:tcW w:w="1338" w:type="dxa"/>
-            <w:shd w:val="clear" w:color="auto" w:fill="E8E8E8" w:themeFill="background2"/>
-          </w:tcPr>
-          <w:p>
-            <w:pPr>
-              <w:pStyle w:val="a6"/>
-              <w:ind w:left="0"/>
-              <w:jc w:val="center"/>
-            </w:pPr>
-            <w:r>
-              <w:rPr>
-                <w:rFonts w:hint="eastAsia"/>
-              </w:rPr>
-              <w:t>어려움</w:t>
+              <w:rPr>
+                <w:rFonts w:hint="eastAsia"/>
+              </w:rPr>
+            </w:pPr>
+            <w:r>
+              <w:rPr>
+                <w:rFonts w:hint="eastAsia"/>
+              </w:rPr>
+              <w:t>판매기 생성 여부</w:t>
+            </w:r>
+          </w:p>
+        </w:tc>
+        <w:tc>
+          <w:tcPr>
+            <w:tcW w:w="4012" w:type="dxa"/>
+            <w:gridSpan w:val="3"/>
+          </w:tcPr>
+          <w:p>
+            <w:pPr>
+              <w:pStyle w:val="a6"/>
+              <w:ind w:left="0"/>
+              <w:jc w:val="center"/>
+              <w:rPr>
+                <w:rFonts w:hint="eastAsia"/>
+              </w:rPr>
+            </w:pPr>
+            <w:r>
+              <w:rPr>
+                <w:rFonts w:hint="eastAsia"/>
+              </w:rPr>
+              <w:t>Y</w:t>
             </w:r>
           </w:p>
         </w:tc>
@@ -4898,7 +6310,87 @@
               <w:rPr>
                 <w:rFonts w:hint="eastAsia"/>
               </w:rPr>
-              <w:lastRenderedPageBreak/>
+              <w:t>맵 난이도</w:t>
+            </w:r>
+          </w:p>
+        </w:tc>
+        <w:tc>
+          <w:tcPr>
+            <w:tcW w:w="1337" w:type="dxa"/>
+            <w:shd w:val="clear" w:color="auto" w:fill="E8E8E8" w:themeFill="background2"/>
+          </w:tcPr>
+          <w:p>
+            <w:pPr>
+              <w:pStyle w:val="a6"/>
+              <w:ind w:left="0"/>
+              <w:jc w:val="center"/>
+            </w:pPr>
+            <w:r>
+              <w:rPr>
+                <w:rFonts w:hint="eastAsia"/>
+              </w:rPr>
+              <w:t>쉬움</w:t>
+            </w:r>
+          </w:p>
+        </w:tc>
+        <w:tc>
+          <w:tcPr>
+            <w:tcW w:w="1337" w:type="dxa"/>
+            <w:shd w:val="clear" w:color="auto" w:fill="E8E8E8" w:themeFill="background2"/>
+          </w:tcPr>
+          <w:p>
+            <w:pPr>
+              <w:pStyle w:val="a6"/>
+              <w:ind w:left="0"/>
+              <w:jc w:val="center"/>
+            </w:pPr>
+            <w:r>
+              <w:rPr>
+                <w:rFonts w:hint="eastAsia"/>
+              </w:rPr>
+              <w:t>보통</w:t>
+            </w:r>
+          </w:p>
+        </w:tc>
+        <w:tc>
+          <w:tcPr>
+            <w:tcW w:w="1338" w:type="dxa"/>
+            <w:shd w:val="clear" w:color="auto" w:fill="E8E8E8" w:themeFill="background2"/>
+          </w:tcPr>
+          <w:p>
+            <w:pPr>
+              <w:pStyle w:val="a6"/>
+              <w:ind w:left="0"/>
+              <w:jc w:val="center"/>
+            </w:pPr>
+            <w:r>
+              <w:rPr>
+                <w:rFonts w:hint="eastAsia"/>
+              </w:rPr>
+              <w:t>어려움</w:t>
+            </w:r>
+          </w:p>
+        </w:tc>
+      </w:tr>
+      <w:tr>
+        <w:trPr>
+          <w:jc w:val="center"/>
+        </w:trPr>
+        <w:tc>
+          <w:tcPr>
+            <w:tcW w:w="4124" w:type="dxa"/>
+            <w:shd w:val="clear" w:color="auto" w:fill="D1D1D1" w:themeFill="background2" w:themeFillShade="E6"/>
+          </w:tcPr>
+          <w:p>
+            <w:pPr>
+              <w:pStyle w:val="a6"/>
+              <w:ind w:left="0"/>
+              <w:jc w:val="center"/>
+            </w:pPr>
+            <w:r>
+              <w:rPr>
+                <w:rFonts w:hint="eastAsia"/>
+              </w:rPr>
               <w:t>방 최소/최대 생성 개수</w:t>
             </w:r>
           </w:p>
@@ -5179,8 +6671,265 @@
               <w:jc w:val="center"/>
             </w:pPr>
             <w:r>
+              <w:rPr>
+                <w:noProof/>
+              </w:rPr>
+              <mc:AlternateContent>
+                <mc:Choice Requires="wpg">
+                  <w:drawing>
+                    <wp:anchor distT="0" distB="0" distL="114300" distR="114300" simplePos="0" relativeHeight="251698176" behindDoc="0" locked="0" layoutInCell="1" allowOverlap="1" wp14:anchorId="76158CCA" wp14:editId="47525C74">
+                      <wp:simplePos x="0" y="0"/>
+                      <wp:positionH relativeFrom="column">
+                        <wp:posOffset>780304</wp:posOffset>
+                      </wp:positionH>
+                      <wp:positionV relativeFrom="paragraph">
+                        <wp:posOffset>714809</wp:posOffset>
+                      </wp:positionV>
+                      <wp:extent cx="241300" cy="261257"/>
+                      <wp:effectExtent l="9207" t="0" r="15558" b="15557"/>
+                      <wp:wrapNone/>
+                      <wp:docPr id="625049730" name="그룹 2"/>
+                      <wp:cNvGraphicFramePr/>
+                      <a:graphic xmlns:a="http://schemas.openxmlformats.org/drawingml/2006/main">
+                        <a:graphicData uri="http://schemas.microsoft.com/office/word/2010/wordprocessingGroup">
+                          <wpg:wgp>
+                            <wpg:cNvGrpSpPr/>
+                            <wpg:grpSpPr>
+                              <a:xfrm rot="16200000">
+                                <a:off x="0" y="0"/>
+                                <a:ext cx="241300" cy="261257"/>
+                                <a:chOff x="0" y="0"/>
+                                <a:chExt cx="241300" cy="261257"/>
+                              </a:xfrm>
+                            </wpg:grpSpPr>
+                            <wps:wsp>
+                              <wps:cNvPr id="192610198" name="직사각형 1"/>
+                              <wps:cNvSpPr/>
+                              <wps:spPr>
+                                <a:xfrm>
+                                  <a:off x="0" y="0"/>
+                                  <a:ext cx="241300" cy="261257"/>
+                                </a:xfrm>
+                                <a:prstGeom prst="rect">
+                                  <a:avLst/>
+                                </a:prstGeom>
+                                <a:solidFill>
+                                  <a:srgbClr val="FF1DC4"/>
+                                </a:solidFill>
+                              </wps:spPr>
+                              <wps:style>
+                                <a:lnRef idx="2">
+                                  <a:schemeClr val="accent1">
+                                    <a:shade val="15000"/>
+                                  </a:schemeClr>
+                                </a:lnRef>
+                                <a:fillRef idx="1">
+                                  <a:schemeClr val="accent1"/>
+                                </a:fillRef>
+                                <a:effectRef idx="0">
+                                  <a:schemeClr val="accent1"/>
+                                </a:effectRef>
+                                <a:fontRef idx="minor">
+                                  <a:schemeClr val="lt1"/>
+                                </a:fontRef>
+                              </wps:style>
+                              <wps:bodyPr rot="0" spcFirstLastPara="0" vertOverflow="overflow" horzOverflow="overflow" vert="horz" wrap="square" lIns="91440" tIns="45720" rIns="91440" bIns="45720" numCol="1" spcCol="0" rtlCol="0" fromWordArt="0" anchor="ctr" anchorCtr="0" forceAA="0" compatLnSpc="1">
+                                <a:prstTxWarp prst="textNoShape">
+                                  <a:avLst/>
+                                </a:prstTxWarp>
+                                <a:noAutofit/>
+                              </wps:bodyPr>
+                            </wps:wsp>
+                            <wps:wsp>
+                              <wps:cNvPr id="96494812" name="직사각형 1"/>
+                              <wps:cNvSpPr/>
+                              <wps:spPr>
+                                <a:xfrm>
+                                  <a:off x="20096" y="30145"/>
+                                  <a:ext cx="195943" cy="80387"/>
+                                </a:xfrm>
+                                <a:prstGeom prst="rect">
+                                  <a:avLst/>
+                                </a:prstGeom>
+                                <a:solidFill>
+                                  <a:schemeClr val="accent5">
+                                    <a:lumMod val="40000"/>
+                                    <a:lumOff val="60000"/>
+                                  </a:schemeClr>
+                                </a:solidFill>
+                              </wps:spPr>
+                              <wps:style>
+                                <a:lnRef idx="2">
+                                  <a:schemeClr val="accent1">
+                                    <a:shade val="15000"/>
+                                  </a:schemeClr>
+                                </a:lnRef>
+                                <a:fillRef idx="1">
+                                  <a:schemeClr val="accent1"/>
+                                </a:fillRef>
+                                <a:effectRef idx="0">
+                                  <a:schemeClr val="accent1"/>
+                                </a:effectRef>
+                                <a:fontRef idx="minor">
+                                  <a:schemeClr val="lt1"/>
+                                </a:fontRef>
+                              </wps:style>
+                              <wps:bodyPr rot="0" spcFirstLastPara="0" vertOverflow="overflow" horzOverflow="overflow" vert="horz" wrap="square" lIns="91440" tIns="45720" rIns="91440" bIns="45720" numCol="1" spcCol="0" rtlCol="0" fromWordArt="0" anchor="ctr" anchorCtr="0" forceAA="0" compatLnSpc="1">
+                                <a:prstTxWarp prst="textNoShape">
+                                  <a:avLst/>
+                                </a:prstTxWarp>
+                                <a:noAutofit/>
+                              </wps:bodyPr>
+                            </wps:wsp>
+                          </wpg:wgp>
+                        </a:graphicData>
+                      </a:graphic>
+                    </wp:anchor>
+                  </w:drawing>
+                </mc:Choice>
+                <mc:Fallback>
+                  <w:pict>
+                    <v:group w14:anchorId="29310A01" id="그룹 2" o:spid="_x0000_s1026" style="position:absolute;margin-left:61.45pt;margin-top:56.3pt;width:19pt;height:20.55pt;rotation:-90;z-index:251698176" coordsize="241300,261257" o:gfxdata="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">
+                      <v:rect id="직사각형 1" o:spid="_x0000_s1027" style="position:absolute;width:241300;height:261257;visibility:visible;mso-wrap-style:square;v-text-anchor:middle" o:gfxdata="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" fillcolor="#ff1dc4" strokecolor="#030e13 [484]" strokeweight="1pt"/>
+                      <v:rect id="직사각형 1" o:spid="_x0000_s1028" style="position:absolute;left:20096;top:30145;width:195943;height:80387;visibility:visible;mso-wrap-style:square;v-text-anchor:middle" o:gfxdata="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" fillcolor="#e59edc [1304]" strokecolor="#030e13 [484]" strokeweight="1pt"/>
+                    </v:group>
+                  </w:pict>
+                </mc:Fallback>
+              </mc:AlternateContent>
+            </w:r>
+            <w:r>
+              <w:rPr>
+                <w:noProof/>
+              </w:rPr>
+              <mc:AlternateContent>
+                <mc:Choice Requires="wpg">
+                  <w:drawing>
+                    <wp:anchor distT="0" distB="0" distL="114300" distR="114300" simplePos="0" relativeHeight="251696128" behindDoc="0" locked="0" layoutInCell="1" allowOverlap="1" wp14:anchorId="5D250E81" wp14:editId="3857F743">
+                      <wp:simplePos x="0" y="0"/>
+                      <wp:positionH relativeFrom="column">
+                        <wp:posOffset>2144981</wp:posOffset>
+                      </wp:positionH>
+                      <wp:positionV relativeFrom="paragraph">
+                        <wp:posOffset>899496</wp:posOffset>
+                      </wp:positionV>
+                      <wp:extent cx="241300" cy="261257"/>
+                      <wp:effectExtent l="9207" t="0" r="15558" b="15557"/>
+                      <wp:wrapNone/>
+                      <wp:docPr id="633270129" name="그룹 2"/>
+                      <wp:cNvGraphicFramePr/>
+                      <a:graphic xmlns:a="http://schemas.openxmlformats.org/drawingml/2006/main">
+                        <a:graphicData uri="http://schemas.microsoft.com/office/word/2010/wordprocessingGroup">
+                          <wpg:wgp>
+                            <wpg:cNvGrpSpPr/>
+                            <wpg:grpSpPr>
+                              <a:xfrm rot="5400000">
+                                <a:off x="0" y="0"/>
+                                <a:ext cx="241300" cy="261257"/>
+                                <a:chOff x="0" y="0"/>
+                                <a:chExt cx="241300" cy="261257"/>
+                              </a:xfrm>
+                            </wpg:grpSpPr>
+                            <wps:wsp>
+                              <wps:cNvPr id="904482657" name="직사각형 1"/>
+                              <wps:cNvSpPr/>
+                              <wps:spPr>
+                                <a:xfrm>
+                                  <a:off x="0" y="0"/>
+                                  <a:ext cx="241300" cy="261257"/>
+                                </a:xfrm>
+                                <a:prstGeom prst="rect">
+                                  <a:avLst/>
+                                </a:prstGeom>
+                                <a:solidFill>
+                                  <a:srgbClr val="FF1DC4"/>
+                                </a:solidFill>
+                              </wps:spPr>
+                              <wps:style>
+                                <a:lnRef idx="2">
+                                  <a:schemeClr val="accent1">
+                                    <a:shade val="15000"/>
+                                  </a:schemeClr>
+                                </a:lnRef>
+                                <a:fillRef idx="1">
+                                  <a:schemeClr val="accent1"/>
+                                </a:fillRef>
+                                <a:effectRef idx="0">
+                                  <a:schemeClr val="accent1"/>
+                                </a:effectRef>
+                                <a:fontRef idx="minor">
+                                  <a:schemeClr val="lt1"/>
+                                </a:fontRef>
+                              </wps:style>
+                              <wps:bodyPr rot="0" spcFirstLastPara="0" vertOverflow="overflow" horzOverflow="overflow" vert="horz" wrap="square" lIns="91440" tIns="45720" rIns="91440" bIns="45720" numCol="1" spcCol="0" rtlCol="0" fromWordArt="0" anchor="ctr" anchorCtr="0" forceAA="0" compatLnSpc="1">
+                                <a:prstTxWarp prst="textNoShape">
+                                  <a:avLst/>
+                                </a:prstTxWarp>
+                                <a:noAutofit/>
+                              </wps:bodyPr>
+                            </wps:wsp>
+                            <wps:wsp>
+                              <wps:cNvPr id="1468953866" name="직사각형 1"/>
+                              <wps:cNvSpPr/>
+                              <wps:spPr>
+                                <a:xfrm>
+                                  <a:off x="20096" y="30145"/>
+                                  <a:ext cx="195943" cy="80387"/>
+                                </a:xfrm>
+                                <a:prstGeom prst="rect">
+                                  <a:avLst/>
+                                </a:prstGeom>
+                                <a:solidFill>
+                                  <a:schemeClr val="accent5">
+                                    <a:lumMod val="40000"/>
+                                    <a:lumOff val="60000"/>
+                                  </a:schemeClr>
+                                </a:solidFill>
+                              </wps:spPr>
+                              <wps:style>
+                                <a:lnRef idx="2">
+                                  <a:schemeClr val="accent1">
+                                    <a:shade val="15000"/>
+                                  </a:schemeClr>
+                                </a:lnRef>
+                                <a:fillRef idx="1">
+                                  <a:schemeClr val="accent1"/>
+                                </a:fillRef>
+                                <a:effectRef idx="0">
+                                  <a:schemeClr val="accent1"/>
+                                </a:effectRef>
+                                <a:fontRef idx="minor">
+                                  <a:schemeClr val="lt1"/>
+                                </a:fontRef>
+                              </wps:style>
+                              <wps:bodyPr rot="0" spcFirstLastPara="0" vertOverflow="overflow" horzOverflow="overflow" vert="horz" wrap="square" lIns="91440" tIns="45720" rIns="91440" bIns="45720" numCol="1" spcCol="0" rtlCol="0" fromWordArt="0" anchor="ctr" anchorCtr="0" forceAA="0" compatLnSpc="1">
+                                <a:prstTxWarp prst="textNoShape">
+                                  <a:avLst/>
+                                </a:prstTxWarp>
+                                <a:noAutofit/>
+                              </wps:bodyPr>
+                            </wps:wsp>
+                          </wpg:wgp>
+                        </a:graphicData>
+                      </a:graphic>
+                    </wp:anchor>
+                  </w:drawing>
+                </mc:Choice>
+                <mc:Fallback>
+                  <w:pict>
+                    <v:group w14:anchorId="4B705A26" id="그룹 2" o:spid="_x0000_s1026" style="position:absolute;margin-left:168.9pt;margin-top:70.85pt;width:19pt;height:20.55pt;rotation:90;z-index:251696128" coordsize="241300,261257" o:gfxdata="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">
+                      <v:rect id="직사각형 1" o:spid="_x0000_s1027" style="position:absolute;width:241300;height:261257;visibility:visible;mso-wrap-style:square;v-text-anchor:middle" o:gfxdata="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" fillcolor="#ff1dc4" strokecolor="#030e13 [484]" strokeweight="1pt"/>
+                      <v:rect id="직사각형 1" o:spid="_x0000_s1028" style="position:absolute;left:20096;top:30145;width:195943;height:80387;visibility:visible;mso-wrap-style:square;v-text-anchor:middle" o:gfxdata="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" fillcolor="#e59edc [1304]" strokecolor="#030e13 [484]" strokeweight="1pt"/>
+                    </v:group>
+                  </w:pict>
+                </mc:Fallback>
+              </mc:AlternateContent>
+            </w:r>
+            <w:r>
+              <w:rPr>
+                <w:noProof/>
+              </w:rPr>
               <w:drawing>
-                <wp:inline distT="0" distB="0" distL="0" distR="0" wp14:anchorId="06BB7732" wp14:editId="60D86FDC">
+                <wp:inline distT="0" distB="0" distL="0" distR="0" wp14:anchorId="06BB7732" wp14:editId="55981E2B">
                   <wp:extent cx="2286319" cy="1991003"/>
                   <wp:effectExtent l="0" t="0" r="0" b="9525"/>
                   <wp:docPr id="1502741339" name="그림 1"/>
@@ -5452,6 +7201,55 @@
                 <w:rFonts w:hint="eastAsia"/>
               </w:rPr>
               <w:t>N</w:t>
+            </w:r>
+          </w:p>
+        </w:tc>
+      </w:tr>
+      <w:tr>
+        <w:trPr>
+          <w:jc w:val="center"/>
+        </w:trPr>
+        <w:tc>
+          <w:tcPr>
+            <w:tcW w:w="4124" w:type="dxa"/>
+            <w:shd w:val="clear" w:color="auto" w:fill="D1D1D1" w:themeFill="background2" w:themeFillShade="E6"/>
+          </w:tcPr>
+          <w:p>
+            <w:pPr>
+              <w:pStyle w:val="a6"/>
+              <w:ind w:left="0"/>
+              <w:jc w:val="center"/>
+              <w:rPr>
+                <w:rFonts w:hint="eastAsia"/>
+              </w:rPr>
+            </w:pPr>
+            <w:r>
+              <w:rPr>
+                <w:rFonts w:hint="eastAsia"/>
+              </w:rPr>
+              <w:t>판매기 생성 여부</w:t>
+            </w:r>
+          </w:p>
+        </w:tc>
+        <w:tc>
+          <w:tcPr>
+            <w:tcW w:w="4012" w:type="dxa"/>
+            <w:gridSpan w:val="3"/>
+          </w:tcPr>
+          <w:p>
+            <w:pPr>
+              <w:pStyle w:val="a6"/>
+              <w:ind w:left="0"/>
+              <w:jc w:val="center"/>
+              <w:rPr>
+                <w:rFonts w:hint="eastAsia"/>
+              </w:rPr>
+            </w:pPr>
+            <w:r>
+              <w:rPr>
+                <w:rFonts w:hint="eastAsia"/>
+              </w:rPr>
+              <w:t>Y</w:t>
             </w:r>
           </w:p>
         </w:tc>
@@ -5943,8 +7741,135 @@
                 <w:noProof/>
               </w:rPr>
               <w:lastRenderedPageBreak/>
+              <mc:AlternateContent>
+                <mc:Choice Requires="wpg">
+                  <w:drawing>
+                    <wp:anchor distT="0" distB="0" distL="114300" distR="114300" simplePos="0" relativeHeight="251700224" behindDoc="0" locked="0" layoutInCell="1" allowOverlap="1" wp14:anchorId="577E2339" wp14:editId="30FF0DCB">
+                      <wp:simplePos x="0" y="0"/>
+                      <wp:positionH relativeFrom="column">
+                        <wp:posOffset>3505039</wp:posOffset>
+                      </wp:positionH>
+                      <wp:positionV relativeFrom="paragraph">
+                        <wp:posOffset>1541475</wp:posOffset>
+                      </wp:positionV>
+                      <wp:extent cx="241300" cy="261257"/>
+                      <wp:effectExtent l="9207" t="0" r="15558" b="15557"/>
+                      <wp:wrapNone/>
+                      <wp:docPr id="2082699154" name="그룹 2"/>
+                      <wp:cNvGraphicFramePr/>
+                      <a:graphic xmlns:a="http://schemas.openxmlformats.org/drawingml/2006/main">
+                        <a:graphicData uri="http://schemas.microsoft.com/office/word/2010/wordprocessingGroup">
+                          <wpg:wgp>
+                            <wpg:cNvGrpSpPr/>
+                            <wpg:grpSpPr>
+                              <a:xfrm rot="5400000">
+                                <a:off x="0" y="0"/>
+                                <a:ext cx="241300" cy="261257"/>
+                                <a:chOff x="0" y="0"/>
+                                <a:chExt cx="241300" cy="261257"/>
+                              </a:xfrm>
+                            </wpg:grpSpPr>
+                            <wps:wsp>
+                              <wps:cNvPr id="1661244873" name="직사각형 1"/>
+                              <wps:cNvSpPr/>
+                              <wps:spPr>
+                                <a:xfrm>
+                                  <a:off x="0" y="0"/>
+                                  <a:ext cx="241300" cy="261257"/>
+                                </a:xfrm>
+                                <a:prstGeom prst="rect">
+                                  <a:avLst/>
+                                </a:prstGeom>
+                                <a:solidFill>
+                                  <a:srgbClr val="FF1DC4"/>
+                                </a:solidFill>
+                              </wps:spPr>
+                              <wps:style>
+                                <a:lnRef idx="2">
+                                  <a:schemeClr val="accent1">
+                                    <a:shade val="15000"/>
+                                  </a:schemeClr>
+                                </a:lnRef>
+                                <a:fillRef idx="1">
+                                  <a:schemeClr val="accent1"/>
+                                </a:fillRef>
+                                <a:effectRef idx="0">
+                                  <a:schemeClr val="accent1"/>
+                                </a:effectRef>
+                                <a:fontRef idx="minor">
+                                  <a:schemeClr val="lt1"/>
+                                </a:fontRef>
+                              </wps:style>
+                              <wps:bodyPr rot="0" spcFirstLastPara="0" vertOverflow="overflow" horzOverflow="overflow" vert="horz" wrap="square" lIns="91440" tIns="45720" rIns="91440" bIns="45720" numCol="1" spcCol="0" rtlCol="0" fromWordArt="0" anchor="ctr" anchorCtr="0" forceAA="0" compatLnSpc="1">
+                                <a:prstTxWarp prst="textNoShape">
+                                  <a:avLst/>
+                                </a:prstTxWarp>
+                                <a:noAutofit/>
+                              </wps:bodyPr>
+                            </wps:wsp>
+                            <wps:wsp>
+                              <wps:cNvPr id="575153246" name="직사각형 1"/>
+                              <wps:cNvSpPr/>
+                              <wps:spPr>
+                                <a:xfrm>
+                                  <a:off x="20096" y="30145"/>
+                                  <a:ext cx="195943" cy="80387"/>
+                                </a:xfrm>
+                                <a:prstGeom prst="rect">
+                                  <a:avLst/>
+                                </a:prstGeom>
+                                <a:solidFill>
+                                  <a:schemeClr val="accent5">
+                                    <a:lumMod val="40000"/>
+                                    <a:lumOff val="60000"/>
+                                  </a:schemeClr>
+                                </a:solidFill>
+                              </wps:spPr>
+                              <wps:style>
+                                <a:lnRef idx="2">
+                                  <a:schemeClr val="accent1">
+                                    <a:shade val="15000"/>
+                                  </a:schemeClr>
+                                </a:lnRef>
+                                <a:fillRef idx="1">
+                                  <a:schemeClr val="accent1"/>
+                                </a:fillRef>
+                                <a:effectRef idx="0">
+                                  <a:schemeClr val="accent1"/>
+                                </a:effectRef>
+                                <a:fontRef idx="minor">
+                                  <a:schemeClr val="lt1"/>
+                                </a:fontRef>
+                              </wps:style>
+                              <wps:bodyPr rot="0" spcFirstLastPara="0" vertOverflow="overflow" horzOverflow="overflow" vert="horz" wrap="square" lIns="91440" tIns="45720" rIns="91440" bIns="45720" numCol="1" spcCol="0" rtlCol="0" fromWordArt="0" anchor="ctr" anchorCtr="0" forceAA="0" compatLnSpc="1">
+                                <a:prstTxWarp prst="textNoShape">
+                                  <a:avLst/>
+                                </a:prstTxWarp>
+                                <a:noAutofit/>
+                              </wps:bodyPr>
+                            </wps:wsp>
+                          </wpg:wgp>
+                        </a:graphicData>
+                      </a:graphic>
+                    </wp:anchor>
+                  </w:drawing>
+                </mc:Choice>
+                <mc:Fallback>
+                  <w:pict>
+                    <v:group w14:anchorId="0E7C5342" id="그룹 2" o:spid="_x0000_s1026" style="position:absolute;margin-left:276pt;margin-top:121.4pt;width:19pt;height:20.55pt;rotation:90;z-index:251700224" coordsize="241300,261257" o:gfxdata="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">
+                      <v:rect id="직사각형 1" o:spid="_x0000_s1027" style="position:absolute;width:241300;height:261257;visibility:visible;mso-wrap-style:square;v-text-anchor:middle" o:gfxdata="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" fillcolor="#ff1dc4" strokecolor="#030e13 [484]" strokeweight="1pt"/>
+                      <v:rect id="직사각형 1" o:spid="_x0000_s1028" style="position:absolute;left:20096;top:30145;width:195943;height:80387;visibility:visible;mso-wrap-style:square;v-text-anchor:middle" o:gfxdata="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" fillcolor="#e59edc [1304]" strokecolor="#030e13 [484]" strokeweight="1pt"/>
+                    </v:group>
+                  </w:pict>
+                </mc:Fallback>
+              </mc:AlternateContent>
+            </w:r>
+            <w:r>
+              <w:rPr>
+                <w:noProof/>
+              </w:rPr>
               <w:drawing>
-                <wp:inline distT="0" distB="0" distL="0" distR="0" wp14:anchorId="60A3A71F" wp14:editId="014F3199">
+                <wp:inline distT="0" distB="0" distL="0" distR="0" wp14:anchorId="60A3A71F" wp14:editId="0F3D4FAB">
                   <wp:extent cx="2629267" cy="2086266"/>
                   <wp:effectExtent l="0" t="0" r="0" b="9525"/>
                   <wp:docPr id="741323406" name="그림 1"/>
@@ -6161,6 +8086,55 @@
               <w:pStyle w:val="a6"/>
               <w:ind w:left="0"/>
               <w:jc w:val="center"/>
+              <w:rPr>
+                <w:rFonts w:hint="eastAsia"/>
+              </w:rPr>
+            </w:pPr>
+            <w:r>
+              <w:rPr>
+                <w:rFonts w:hint="eastAsia"/>
+              </w:rPr>
+              <w:t>판매기 생성 여부</w:t>
+            </w:r>
+          </w:p>
+        </w:tc>
+        <w:tc>
+          <w:tcPr>
+            <w:tcW w:w="4012" w:type="dxa"/>
+            <w:gridSpan w:val="3"/>
+          </w:tcPr>
+          <w:p>
+            <w:pPr>
+              <w:pStyle w:val="a6"/>
+              <w:ind w:left="0"/>
+              <w:jc w:val="center"/>
+              <w:rPr>
+                <w:rFonts w:hint="eastAsia"/>
+              </w:rPr>
+            </w:pPr>
+            <w:r>
+              <w:rPr>
+                <w:rFonts w:hint="eastAsia"/>
+              </w:rPr>
+              <w:t>Y</w:t>
+            </w:r>
+          </w:p>
+        </w:tc>
+      </w:tr>
+      <w:tr>
+        <w:trPr>
+          <w:jc w:val="center"/>
+        </w:trPr>
+        <w:tc>
+          <w:tcPr>
+            <w:tcW w:w="4124" w:type="dxa"/>
+            <w:shd w:val="clear" w:color="auto" w:fill="D1D1D1" w:themeFill="background2" w:themeFillShade="E6"/>
+          </w:tcPr>
+          <w:p>
+            <w:pPr>
+              <w:pStyle w:val="a6"/>
+              <w:ind w:left="0"/>
+              <w:jc w:val="center"/>
             </w:pPr>
             <w:r>
               <w:rPr>
@@ -6486,6 +8460,265 @@
             <w:pPr>
               <w:jc w:val="center"/>
             </w:pPr>
+            <w:r>
+              <w:rPr>
+                <w:noProof/>
+              </w:rPr>
+              <mc:AlternateContent>
+                <mc:Choice Requires="wpg">
+                  <w:drawing>
+                    <wp:anchor distT="0" distB="0" distL="114300" distR="114300" simplePos="0" relativeHeight="251704320" behindDoc="0" locked="0" layoutInCell="1" allowOverlap="1" wp14:anchorId="7EB7F6CB" wp14:editId="3174851B">
+                      <wp:simplePos x="0" y="0"/>
+                      <wp:positionH relativeFrom="column">
+                        <wp:posOffset>3726312</wp:posOffset>
+                      </wp:positionH>
+                      <wp:positionV relativeFrom="paragraph">
+                        <wp:posOffset>395946</wp:posOffset>
+                      </wp:positionV>
+                      <wp:extent cx="241300" cy="261257"/>
+                      <wp:effectExtent l="0" t="0" r="25400" b="24765"/>
+                      <wp:wrapNone/>
+                      <wp:docPr id="848397430" name="그룹 2"/>
+                      <wp:cNvGraphicFramePr/>
+                      <a:graphic xmlns:a="http://schemas.openxmlformats.org/drawingml/2006/main">
+                        <a:graphicData uri="http://schemas.microsoft.com/office/word/2010/wordprocessingGroup">
+                          <wpg:wgp>
+                            <wpg:cNvGrpSpPr/>
+                            <wpg:grpSpPr>
+                              <a:xfrm>
+                                <a:off x="0" y="0"/>
+                                <a:ext cx="241300" cy="261257"/>
+                                <a:chOff x="0" y="0"/>
+                                <a:chExt cx="241300" cy="261257"/>
+                              </a:xfrm>
+                            </wpg:grpSpPr>
+                            <wps:wsp>
+                              <wps:cNvPr id="174868343" name="직사각형 1"/>
+                              <wps:cNvSpPr/>
+                              <wps:spPr>
+                                <a:xfrm>
+                                  <a:off x="0" y="0"/>
+                                  <a:ext cx="241300" cy="261257"/>
+                                </a:xfrm>
+                                <a:prstGeom prst="rect">
+                                  <a:avLst/>
+                                </a:prstGeom>
+                                <a:solidFill>
+                                  <a:srgbClr val="FF1DC4"/>
+                                </a:solidFill>
+                              </wps:spPr>
+                              <wps:style>
+                                <a:lnRef idx="2">
+                                  <a:schemeClr val="accent1">
+                                    <a:shade val="15000"/>
+                                  </a:schemeClr>
+                                </a:lnRef>
+                                <a:fillRef idx="1">
+                                  <a:schemeClr val="accent1"/>
+                                </a:fillRef>
+                                <a:effectRef idx="0">
+                                  <a:schemeClr val="accent1"/>
+                                </a:effectRef>
+                                <a:fontRef idx="minor">
+                                  <a:schemeClr val="lt1"/>
+                                </a:fontRef>
+                              </wps:style>
+                              <wps:bodyPr rot="0" spcFirstLastPara="0" vertOverflow="overflow" horzOverflow="overflow" vert="horz" wrap="square" lIns="91440" tIns="45720" rIns="91440" bIns="45720" numCol="1" spcCol="0" rtlCol="0" fromWordArt="0" anchor="ctr" anchorCtr="0" forceAA="0" compatLnSpc="1">
+                                <a:prstTxWarp prst="textNoShape">
+                                  <a:avLst/>
+                                </a:prstTxWarp>
+                                <a:noAutofit/>
+                              </wps:bodyPr>
+                            </wps:wsp>
+                            <wps:wsp>
+                              <wps:cNvPr id="1642406079" name="직사각형 1"/>
+                              <wps:cNvSpPr/>
+                              <wps:spPr>
+                                <a:xfrm>
+                                  <a:off x="20096" y="30145"/>
+                                  <a:ext cx="195943" cy="80387"/>
+                                </a:xfrm>
+                                <a:prstGeom prst="rect">
+                                  <a:avLst/>
+                                </a:prstGeom>
+                                <a:solidFill>
+                                  <a:schemeClr val="accent5">
+                                    <a:lumMod val="40000"/>
+                                    <a:lumOff val="60000"/>
+                                  </a:schemeClr>
+                                </a:solidFill>
+                              </wps:spPr>
+                              <wps:style>
+                                <a:lnRef idx="2">
+                                  <a:schemeClr val="accent1">
+                                    <a:shade val="15000"/>
+                                  </a:schemeClr>
+                                </a:lnRef>
+                                <a:fillRef idx="1">
+                                  <a:schemeClr val="accent1"/>
+                                </a:fillRef>
+                                <a:effectRef idx="0">
+                                  <a:schemeClr val="accent1"/>
+                                </a:effectRef>
+                                <a:fontRef idx="minor">
+                                  <a:schemeClr val="lt1"/>
+                                </a:fontRef>
+                              </wps:style>
+                              <wps:bodyPr rot="0" spcFirstLastPara="0" vertOverflow="overflow" horzOverflow="overflow" vert="horz" wrap="square" lIns="91440" tIns="45720" rIns="91440" bIns="45720" numCol="1" spcCol="0" rtlCol="0" fromWordArt="0" anchor="ctr" anchorCtr="0" forceAA="0" compatLnSpc="1">
+                                <a:prstTxWarp prst="textNoShape">
+                                  <a:avLst/>
+                                </a:prstTxWarp>
+                                <a:noAutofit/>
+                              </wps:bodyPr>
+                            </wps:wsp>
+                          </wpg:wgp>
+                        </a:graphicData>
+                      </a:graphic>
+                    </wp:anchor>
+                  </w:drawing>
+                </mc:Choice>
+                <mc:Fallback>
+                  <w:pict>
+                    <v:group w14:anchorId="6920B348" id="그룹 2" o:spid="_x0000_s1026" style="position:absolute;margin-left:293.4pt;margin-top:31.2pt;width:19pt;height:20.55pt;z-index:251704320" coordsize="241300,261257" o:gfxdata="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">
+                      <v:rect id="직사각형 1" o:spid="_x0000_s1027" style="position:absolute;width:241300;height:261257;visibility:visible;mso-wrap-style:square;v-text-anchor:middle" o:gfxdata="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" fillcolor="#ff1dc4" strokecolor="#030e13 [484]" strokeweight="1pt"/>
+                      <v:rect id="직사각형 1" o:spid="_x0000_s1028" style="position:absolute;left:20096;top:30145;width:195943;height:80387;visibility:visible;mso-wrap-style:square;v-text-anchor:middle" o:gfxdata="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" fillcolor="#e59edc [1304]" strokecolor="#030e13 [484]" strokeweight="1pt"/>
+                    </v:group>
+                  </w:pict>
+                </mc:Fallback>
+              </mc:AlternateContent>
+            </w:r>
+            <w:r>
+              <w:rPr>
+                <w:noProof/>
+              </w:rPr>
+              <mc:AlternateContent>
+                <mc:Choice Requires="wpg">
+                  <w:drawing>
+                    <wp:anchor distT="0" distB="0" distL="114300" distR="114300" simplePos="0" relativeHeight="251702272" behindDoc="0" locked="0" layoutInCell="1" allowOverlap="1" wp14:anchorId="78FC2C0A" wp14:editId="00157B7C">
+                      <wp:simplePos x="0" y="0"/>
+                      <wp:positionH relativeFrom="column">
+                        <wp:posOffset>944714</wp:posOffset>
+                      </wp:positionH>
+                      <wp:positionV relativeFrom="paragraph">
+                        <wp:posOffset>2716847</wp:posOffset>
+                      </wp:positionV>
+                      <wp:extent cx="241300" cy="261257"/>
+                      <wp:effectExtent l="9207" t="0" r="15558" b="15557"/>
+                      <wp:wrapNone/>
+                      <wp:docPr id="635256325" name="그룹 2"/>
+                      <wp:cNvGraphicFramePr/>
+                      <a:graphic xmlns:a="http://schemas.openxmlformats.org/drawingml/2006/main">
+                        <a:graphicData uri="http://schemas.microsoft.com/office/word/2010/wordprocessingGroup">
+                          <wpg:wgp>
+                            <wpg:cNvGrpSpPr/>
+                            <wpg:grpSpPr>
+                              <a:xfrm rot="16200000">
+                                <a:off x="0" y="0"/>
+                                <a:ext cx="241300" cy="261257"/>
+                                <a:chOff x="0" y="0"/>
+                                <a:chExt cx="241300" cy="261257"/>
+                              </a:xfrm>
+                            </wpg:grpSpPr>
+                            <wps:wsp>
+                              <wps:cNvPr id="1999159293" name="직사각형 1"/>
+                              <wps:cNvSpPr/>
+                              <wps:spPr>
+                                <a:xfrm>
+                                  <a:off x="0" y="0"/>
+                                  <a:ext cx="241300" cy="261257"/>
+                                </a:xfrm>
+                                <a:prstGeom prst="rect">
+                                  <a:avLst/>
+                                </a:prstGeom>
+                                <a:solidFill>
+                                  <a:srgbClr val="FF1DC4">
+                                    <a:alpha val="30196"/>
+                                  </a:srgbClr>
+                                </a:solidFill>
+                              </wps:spPr>
+                              <wps:style>
+                                <a:lnRef idx="2">
+                                  <a:schemeClr val="accent1">
+                                    <a:shade val="15000"/>
+                                  </a:schemeClr>
+                                </a:lnRef>
+                                <a:fillRef idx="1">
+                                  <a:schemeClr val="accent1"/>
+                                </a:fillRef>
+                                <a:effectRef idx="0">
+                                  <a:schemeClr val="accent1"/>
+                                </a:effectRef>
+                                <a:fontRef idx="minor">
+                                  <a:schemeClr val="lt1"/>
+                                </a:fontRef>
+                              </wps:style>
+                              <wps:bodyPr rot="0" spcFirstLastPara="0" vertOverflow="overflow" horzOverflow="overflow" vert="horz" wrap="square" lIns="91440" tIns="45720" rIns="91440" bIns="45720" numCol="1" spcCol="0" rtlCol="0" fromWordArt="0" anchor="ctr" anchorCtr="0" forceAA="0" compatLnSpc="1">
+                                <a:prstTxWarp prst="textNoShape">
+                                  <a:avLst/>
+                                </a:prstTxWarp>
+                                <a:noAutofit/>
+                              </wps:bodyPr>
+                            </wps:wsp>
+                            <wps:wsp>
+                              <wps:cNvPr id="1718643723" name="직사각형 1"/>
+                              <wps:cNvSpPr/>
+                              <wps:spPr>
+                                <a:xfrm>
+                                  <a:off x="20096" y="30145"/>
+                                  <a:ext cx="195943" cy="80387"/>
+                                </a:xfrm>
+                                <a:prstGeom prst="rect">
+                                  <a:avLst/>
+                                </a:prstGeom>
+                                <a:solidFill>
+                                  <a:srgbClr val="E59EDD">
+                                    <a:alpha val="40000"/>
+                                  </a:srgbClr>
+                                </a:solidFill>
+                              </wps:spPr>
+                              <wps:style>
+                                <a:lnRef idx="2">
+                                  <a:schemeClr val="accent1">
+                                    <a:shade val="15000"/>
+                                  </a:schemeClr>
+                                </a:lnRef>
+                                <a:fillRef idx="1">
+                                  <a:schemeClr val="accent1"/>
+                                </a:fillRef>
+                                <a:effectRef idx="0">
+                                  <a:schemeClr val="accent1"/>
+                                </a:effectRef>
+                                <a:fontRef idx="minor">
+                                  <a:schemeClr val="lt1"/>
+                                </a:fontRef>
+                              </wps:style>
+                              <wps:bodyPr rot="0" spcFirstLastPara="0" vertOverflow="overflow" horzOverflow="overflow" vert="horz" wrap="square" lIns="91440" tIns="45720" rIns="91440" bIns="45720" numCol="1" spcCol="0" rtlCol="0" fromWordArt="0" anchor="ctr" anchorCtr="0" forceAA="0" compatLnSpc="1">
+                                <a:prstTxWarp prst="textNoShape">
+                                  <a:avLst/>
+                                </a:prstTxWarp>
+                                <a:noAutofit/>
+                              </wps:bodyPr>
+                            </wps:wsp>
+                          </wpg:wgp>
+                        </a:graphicData>
+                      </a:graphic>
+                    </wp:anchor>
+                  </w:drawing>
+                </mc:Choice>
+                <mc:Fallback>
+                  <w:pict>
+                    <v:group w14:anchorId="542933E1" id="그룹 2" o:spid="_x0000_s1026" style="position:absolute;margin-left:74.4pt;margin-top:213.9pt;width:19pt;height:20.55pt;rotation:-90;z-index:251702272" coordsize="241300,261257" o:gfxdata="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">
+                      <v:rect id="직사각형 1" o:spid="_x0000_s1027" style="position:absolute;width:241300;height:261257;visibility:visible;mso-wrap-style:square;v-text-anchor:middle" o:gfxdata="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" fillcolor="#ff1dc4" strokecolor="#030e13 [484]" strokeweight="1pt">
+                        <v:fill opacity="19789f"/>
+                      </v:rect>
+                      <v:rect id="직사각형 1" o:spid="_x0000_s1028" style="position:absolute;left:20096;top:30145;width:195943;height:80387;visibility:visible;mso-wrap-style:square;v-text-anchor:middle" o:gfxdata="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" fillcolor="#e59edd" strokecolor="#030e13 [484]" strokeweight="1pt">
+                        <v:fill opacity="26214f"/>
+                      </v:rect>
+                    </v:group>
+                  </w:pict>
+                </mc:Fallback>
+              </mc:AlternateContent>
+            </w:r>
             <w:r>
               <w:rPr>
                 <w:rFonts w:hint="eastAsia"/>
@@ -6567,7 +8800,7 @@
                 <w:noProof/>
               </w:rPr>
               <w:drawing>
-                <wp:inline distT="0" distB="0" distL="0" distR="0" wp14:anchorId="5AB745F1" wp14:editId="4233B9A6">
+                <wp:inline distT="0" distB="0" distL="0" distR="0" wp14:anchorId="5AB745F1" wp14:editId="2C79BBC2">
                   <wp:extent cx="3211373" cy="2878884"/>
                   <wp:effectExtent l="0" t="0" r="8255" b="0"/>
                   <wp:docPr id="1021474114" name="그림 1"/>
@@ -6796,6 +9029,52 @@
               <w:pStyle w:val="a6"/>
               <w:ind w:left="0"/>
               <w:jc w:val="center"/>
+              <w:rPr>
+                <w:rFonts w:hint="eastAsia"/>
+              </w:rPr>
+            </w:pPr>
+            <w:r>
+              <w:rPr>
+                <w:rFonts w:hint="eastAsia"/>
+              </w:rPr>
+              <w:t>판매기 생성 여부</w:t>
+            </w:r>
+          </w:p>
+        </w:tc>
+        <w:tc>
+          <w:tcPr>
+            <w:tcW w:w="4012" w:type="dxa"/>
+            <w:gridSpan w:val="3"/>
+          </w:tcPr>
+          <w:p>
+            <w:pPr>
+              <w:pStyle w:val="a6"/>
+              <w:ind w:left="0"/>
+              <w:jc w:val="center"/>
+              <w:rPr>
+                <w:rFonts w:hint="eastAsia"/>
+              </w:rPr>
+            </w:pPr>
+            <w:r>
+              <w:rPr>
+                <w:rFonts w:hint="eastAsia"/>
+              </w:rPr>
+              <w:t>Y</w:t>
+            </w:r>
+          </w:p>
+        </w:tc>
+      </w:tr>
+      <w:tr>
+        <w:tc>
+          <w:tcPr>
+            <w:tcW w:w="4124" w:type="dxa"/>
+            <w:shd w:val="clear" w:color="auto" w:fill="D1D1D1" w:themeFill="background2" w:themeFillShade="E6"/>
+          </w:tcPr>
+          <w:p>
+            <w:pPr>
+              <w:pStyle w:val="a6"/>
+              <w:ind w:left="0"/>
+              <w:jc w:val="center"/>
             </w:pPr>
             <w:r>
               <w:rPr>
@@ -7372,69 +9651,38 @@
               <w:pStyle w:val="a6"/>
               <w:ind w:left="0"/>
               <w:jc w:val="center"/>
-            </w:pPr>
-            <w:r>
-              <w:rPr>
-                <w:rFonts w:hint="eastAsia"/>
-              </w:rPr>
-              <w:t>맵 난이도</w:t>
-            </w:r>
-          </w:p>
-        </w:tc>
-        <w:tc>
-          <w:tcPr>
-            <w:tcW w:w="1337" w:type="dxa"/>
-            <w:shd w:val="clear" w:color="auto" w:fill="E8E8E8" w:themeFill="background2"/>
-          </w:tcPr>
-          <w:p>
-            <w:pPr>
-              <w:pStyle w:val="a6"/>
-              <w:ind w:left="0"/>
-              <w:jc w:val="center"/>
-            </w:pPr>
-            <w:r>
-              <w:rPr>
-                <w:rFonts w:hint="eastAsia"/>
-              </w:rPr>
-              <w:t>쉬움</w:t>
-            </w:r>
-          </w:p>
-        </w:tc>
-        <w:tc>
-          <w:tcPr>
-            <w:tcW w:w="1337" w:type="dxa"/>
-            <w:shd w:val="clear" w:color="auto" w:fill="E8E8E8" w:themeFill="background2"/>
-          </w:tcPr>
-          <w:p>
-            <w:pPr>
-              <w:pStyle w:val="a6"/>
-              <w:ind w:left="0"/>
-              <w:jc w:val="center"/>
-            </w:pPr>
-            <w:r>
-              <w:rPr>
-                <w:rFonts w:hint="eastAsia"/>
-              </w:rPr>
-              <w:t>보통</w:t>
-            </w:r>
-          </w:p>
-        </w:tc>
-        <w:tc>
-          <w:tcPr>
-            <w:tcW w:w="1338" w:type="dxa"/>
-            <w:shd w:val="clear" w:color="auto" w:fill="E8E8E8" w:themeFill="background2"/>
-          </w:tcPr>
-          <w:p>
-            <w:pPr>
-              <w:pStyle w:val="a6"/>
-              <w:ind w:left="0"/>
-              <w:jc w:val="center"/>
-            </w:pPr>
-            <w:r>
-              <w:rPr>
-                <w:rFonts w:hint="eastAsia"/>
-              </w:rPr>
-              <w:t>어려움</w:t>
+              <w:rPr>
+                <w:rFonts w:hint="eastAsia"/>
+              </w:rPr>
+            </w:pPr>
+            <w:r>
+              <w:rPr>
+                <w:rFonts w:hint="eastAsia"/>
+              </w:rPr>
+              <w:lastRenderedPageBreak/>
+              <w:t>판매기 생성 여부</w:t>
+            </w:r>
+          </w:p>
+        </w:tc>
+        <w:tc>
+          <w:tcPr>
+            <w:tcW w:w="4012" w:type="dxa"/>
+            <w:gridSpan w:val="3"/>
+          </w:tcPr>
+          <w:p>
+            <w:pPr>
+              <w:pStyle w:val="a6"/>
+              <w:ind w:left="0"/>
+              <w:jc w:val="center"/>
+              <w:rPr>
+                <w:rFonts w:hint="eastAsia"/>
+              </w:rPr>
+            </w:pPr>
+            <w:r>
+              <w:rPr>
+                <w:rFonts w:hint="eastAsia"/>
+              </w:rPr>
+              <w:t>N</w:t>
             </w:r>
           </w:p>
         </w:tc>
@@ -7458,7 +9706,87 @@
               <w:rPr>
                 <w:rFonts w:hint="eastAsia"/>
               </w:rPr>
-              <w:lastRenderedPageBreak/>
+              <w:t>맵 난이도</w:t>
+            </w:r>
+          </w:p>
+        </w:tc>
+        <w:tc>
+          <w:tcPr>
+            <w:tcW w:w="1337" w:type="dxa"/>
+            <w:shd w:val="clear" w:color="auto" w:fill="E8E8E8" w:themeFill="background2"/>
+          </w:tcPr>
+          <w:p>
+            <w:pPr>
+              <w:pStyle w:val="a6"/>
+              <w:ind w:left="0"/>
+              <w:jc w:val="center"/>
+            </w:pPr>
+            <w:r>
+              <w:rPr>
+                <w:rFonts w:hint="eastAsia"/>
+              </w:rPr>
+              <w:t>쉬움</w:t>
+            </w:r>
+          </w:p>
+        </w:tc>
+        <w:tc>
+          <w:tcPr>
+            <w:tcW w:w="1337" w:type="dxa"/>
+            <w:shd w:val="clear" w:color="auto" w:fill="E8E8E8" w:themeFill="background2"/>
+          </w:tcPr>
+          <w:p>
+            <w:pPr>
+              <w:pStyle w:val="a6"/>
+              <w:ind w:left="0"/>
+              <w:jc w:val="center"/>
+            </w:pPr>
+            <w:r>
+              <w:rPr>
+                <w:rFonts w:hint="eastAsia"/>
+              </w:rPr>
+              <w:t>보통</w:t>
+            </w:r>
+          </w:p>
+        </w:tc>
+        <w:tc>
+          <w:tcPr>
+            <w:tcW w:w="1338" w:type="dxa"/>
+            <w:shd w:val="clear" w:color="auto" w:fill="E8E8E8" w:themeFill="background2"/>
+          </w:tcPr>
+          <w:p>
+            <w:pPr>
+              <w:pStyle w:val="a6"/>
+              <w:ind w:left="0"/>
+              <w:jc w:val="center"/>
+            </w:pPr>
+            <w:r>
+              <w:rPr>
+                <w:rFonts w:hint="eastAsia"/>
+              </w:rPr>
+              <w:t>어려움</w:t>
+            </w:r>
+          </w:p>
+        </w:tc>
+      </w:tr>
+      <w:tr>
+        <w:trPr>
+          <w:jc w:val="center"/>
+        </w:trPr>
+        <w:tc>
+          <w:tcPr>
+            <w:tcW w:w="4124" w:type="dxa"/>
+            <w:shd w:val="clear" w:color="auto" w:fill="D1D1D1" w:themeFill="background2" w:themeFillShade="E6"/>
+          </w:tcPr>
+          <w:p>
+            <w:pPr>
+              <w:pStyle w:val="a6"/>
+              <w:ind w:left="0"/>
+              <w:jc w:val="center"/>
+            </w:pPr>
+            <w:r>
+              <w:rPr>
+                <w:rFonts w:hint="eastAsia"/>
+              </w:rPr>
               <w:t>방 최소/최대 생성 개수</w:t>
             </w:r>
           </w:p>
@@ -7938,6 +10266,55 @@
               <w:pStyle w:val="a6"/>
               <w:ind w:left="0"/>
               <w:jc w:val="center"/>
+              <w:rPr>
+                <w:rFonts w:hint="eastAsia"/>
+              </w:rPr>
+            </w:pPr>
+            <w:r>
+              <w:rPr>
+                <w:rFonts w:hint="eastAsia"/>
+              </w:rPr>
+              <w:t>판매기 생성 여부</w:t>
+            </w:r>
+          </w:p>
+        </w:tc>
+        <w:tc>
+          <w:tcPr>
+            <w:tcW w:w="4012" w:type="dxa"/>
+            <w:gridSpan w:val="3"/>
+          </w:tcPr>
+          <w:p>
+            <w:pPr>
+              <w:pStyle w:val="a6"/>
+              <w:ind w:left="0"/>
+              <w:jc w:val="center"/>
+              <w:rPr>
+                <w:rFonts w:hint="eastAsia"/>
+              </w:rPr>
+            </w:pPr>
+            <w:r>
+              <w:rPr>
+                <w:rFonts w:hint="eastAsia"/>
+              </w:rPr>
+              <w:t>N</w:t>
+            </w:r>
+          </w:p>
+        </w:tc>
+      </w:tr>
+      <w:tr>
+        <w:trPr>
+          <w:jc w:val="center"/>
+        </w:trPr>
+        <w:tc>
+          <w:tcPr>
+            <w:tcW w:w="4124" w:type="dxa"/>
+            <w:shd w:val="clear" w:color="auto" w:fill="D1D1D1" w:themeFill="background2" w:themeFillShade="E6"/>
+          </w:tcPr>
+          <w:p>
+            <w:pPr>
+              <w:pStyle w:val="a6"/>
+              <w:ind w:left="0"/>
+              <w:jc w:val="center"/>
             </w:pPr>
             <w:r>
               <w:rPr>
@@ -8396,6 +10773,7 @@
               <w:rPr>
                 <w:rFonts w:hint="eastAsia"/>
               </w:rPr>
+              <w:lastRenderedPageBreak/>
               <w:t>아이템 생성 여부</w:t>
             </w:r>
           </w:p>
@@ -8477,69 +10855,37 @@
               <w:pStyle w:val="a6"/>
               <w:ind w:left="0"/>
               <w:jc w:val="center"/>
-            </w:pPr>
-            <w:r>
-              <w:rPr>
-                <w:rFonts w:hint="eastAsia"/>
-              </w:rPr>
-              <w:t>맵 난이도</w:t>
-            </w:r>
-          </w:p>
-        </w:tc>
-        <w:tc>
-          <w:tcPr>
-            <w:tcW w:w="1337" w:type="dxa"/>
-            <w:shd w:val="clear" w:color="auto" w:fill="E8E8E8" w:themeFill="background2"/>
-          </w:tcPr>
-          <w:p>
-            <w:pPr>
-              <w:pStyle w:val="a6"/>
-              <w:ind w:left="0"/>
-              <w:jc w:val="center"/>
-            </w:pPr>
-            <w:r>
-              <w:rPr>
-                <w:rFonts w:hint="eastAsia"/>
-              </w:rPr>
-              <w:t>쉬움</w:t>
-            </w:r>
-          </w:p>
-        </w:tc>
-        <w:tc>
-          <w:tcPr>
-            <w:tcW w:w="1337" w:type="dxa"/>
-            <w:shd w:val="clear" w:color="auto" w:fill="E8E8E8" w:themeFill="background2"/>
-          </w:tcPr>
-          <w:p>
-            <w:pPr>
-              <w:pStyle w:val="a6"/>
-              <w:ind w:left="0"/>
-              <w:jc w:val="center"/>
-            </w:pPr>
-            <w:r>
-              <w:rPr>
-                <w:rFonts w:hint="eastAsia"/>
-              </w:rPr>
-              <w:t>보통</w:t>
-            </w:r>
-          </w:p>
-        </w:tc>
-        <w:tc>
-          <w:tcPr>
-            <w:tcW w:w="1338" w:type="dxa"/>
-            <w:shd w:val="clear" w:color="auto" w:fill="E8E8E8" w:themeFill="background2"/>
-          </w:tcPr>
-          <w:p>
-            <w:pPr>
-              <w:pStyle w:val="a6"/>
-              <w:ind w:left="0"/>
-              <w:jc w:val="center"/>
-            </w:pPr>
-            <w:r>
-              <w:rPr>
-                <w:rFonts w:hint="eastAsia"/>
-              </w:rPr>
-              <w:t>어려움</w:t>
+              <w:rPr>
+                <w:rFonts w:hint="eastAsia"/>
+              </w:rPr>
+            </w:pPr>
+            <w:r>
+              <w:rPr>
+                <w:rFonts w:hint="eastAsia"/>
+              </w:rPr>
+              <w:t>판매기 생성 여부</w:t>
+            </w:r>
+          </w:p>
+        </w:tc>
+        <w:tc>
+          <w:tcPr>
+            <w:tcW w:w="4012" w:type="dxa"/>
+            <w:gridSpan w:val="3"/>
+          </w:tcPr>
+          <w:p>
+            <w:pPr>
+              <w:pStyle w:val="a6"/>
+              <w:ind w:left="0"/>
+              <w:jc w:val="center"/>
+              <w:rPr>
+                <w:rFonts w:hint="eastAsia"/>
+              </w:rPr>
+            </w:pPr>
+            <w:r>
+              <w:rPr>
+                <w:rFonts w:hint="eastAsia"/>
+              </w:rPr>
+              <w:t>N</w:t>
             </w:r>
           </w:p>
         </w:tc>
@@ -8563,7 +10909,87 @@
               <w:rPr>
                 <w:rFonts w:hint="eastAsia"/>
               </w:rPr>
-              <w:lastRenderedPageBreak/>
+              <w:t>맵 난이도</w:t>
+            </w:r>
+          </w:p>
+        </w:tc>
+        <w:tc>
+          <w:tcPr>
+            <w:tcW w:w="1337" w:type="dxa"/>
+            <w:shd w:val="clear" w:color="auto" w:fill="E8E8E8" w:themeFill="background2"/>
+          </w:tcPr>
+          <w:p>
+            <w:pPr>
+              <w:pStyle w:val="a6"/>
+              <w:ind w:left="0"/>
+              <w:jc w:val="center"/>
+            </w:pPr>
+            <w:r>
+              <w:rPr>
+                <w:rFonts w:hint="eastAsia"/>
+              </w:rPr>
+              <w:t>쉬움</w:t>
+            </w:r>
+          </w:p>
+        </w:tc>
+        <w:tc>
+          <w:tcPr>
+            <w:tcW w:w="1337" w:type="dxa"/>
+            <w:shd w:val="clear" w:color="auto" w:fill="E8E8E8" w:themeFill="background2"/>
+          </w:tcPr>
+          <w:p>
+            <w:pPr>
+              <w:pStyle w:val="a6"/>
+              <w:ind w:left="0"/>
+              <w:jc w:val="center"/>
+            </w:pPr>
+            <w:r>
+              <w:rPr>
+                <w:rFonts w:hint="eastAsia"/>
+              </w:rPr>
+              <w:t>보통</w:t>
+            </w:r>
+          </w:p>
+        </w:tc>
+        <w:tc>
+          <w:tcPr>
+            <w:tcW w:w="1338" w:type="dxa"/>
+            <w:shd w:val="clear" w:color="auto" w:fill="E8E8E8" w:themeFill="background2"/>
+          </w:tcPr>
+          <w:p>
+            <w:pPr>
+              <w:pStyle w:val="a6"/>
+              <w:ind w:left="0"/>
+              <w:jc w:val="center"/>
+            </w:pPr>
+            <w:r>
+              <w:rPr>
+                <w:rFonts w:hint="eastAsia"/>
+              </w:rPr>
+              <w:t>어려움</w:t>
+            </w:r>
+          </w:p>
+        </w:tc>
+      </w:tr>
+      <w:tr>
+        <w:trPr>
+          <w:jc w:val="center"/>
+        </w:trPr>
+        <w:tc>
+          <w:tcPr>
+            <w:tcW w:w="4124" w:type="dxa"/>
+            <w:shd w:val="clear" w:color="auto" w:fill="D1D1D1" w:themeFill="background2" w:themeFillShade="E6"/>
+          </w:tcPr>
+          <w:p>
+            <w:pPr>
+              <w:pStyle w:val="a6"/>
+              <w:ind w:left="0"/>
+              <w:jc w:val="center"/>
+            </w:pPr>
+            <w:r>
+              <w:rPr>
+                <w:rFonts w:hint="eastAsia"/>
+              </w:rPr>
               <w:t>방 최소/최대 생성 개수</w:t>
             </w:r>
           </w:p>
@@ -8859,6 +11285,133 @@
               <w:ind w:left="0"/>
               <w:jc w:val="center"/>
             </w:pPr>
+            <w:r>
+              <w:rPr>
+                <w:noProof/>
+              </w:rPr>
+              <mc:AlternateContent>
+                <mc:Choice Requires="wpg">
+                  <w:drawing>
+                    <wp:anchor distT="0" distB="0" distL="114300" distR="114300" simplePos="0" relativeHeight="251706368" behindDoc="0" locked="0" layoutInCell="1" allowOverlap="1" wp14:anchorId="39D599BD" wp14:editId="1C6868B8">
+                      <wp:simplePos x="0" y="0"/>
+                      <wp:positionH relativeFrom="column">
+                        <wp:posOffset>1958991</wp:posOffset>
+                      </wp:positionH>
+                      <wp:positionV relativeFrom="paragraph">
+                        <wp:posOffset>1289537</wp:posOffset>
+                      </wp:positionV>
+                      <wp:extent cx="241300" cy="261257"/>
+                      <wp:effectExtent l="9207" t="0" r="15558" b="15557"/>
+                      <wp:wrapNone/>
+                      <wp:docPr id="877433520" name="그룹 2"/>
+                      <wp:cNvGraphicFramePr/>
+                      <a:graphic xmlns:a="http://schemas.openxmlformats.org/drawingml/2006/main">
+                        <a:graphicData uri="http://schemas.microsoft.com/office/word/2010/wordprocessingGroup">
+                          <wpg:wgp>
+                            <wpg:cNvGrpSpPr/>
+                            <wpg:grpSpPr>
+                              <a:xfrm rot="16200000">
+                                <a:off x="0" y="0"/>
+                                <a:ext cx="241300" cy="261257"/>
+                                <a:chOff x="0" y="0"/>
+                                <a:chExt cx="241300" cy="261257"/>
+                              </a:xfrm>
+                            </wpg:grpSpPr>
+                            <wps:wsp>
+                              <wps:cNvPr id="1795717862" name="직사각형 1"/>
+                              <wps:cNvSpPr/>
+                              <wps:spPr>
+                                <a:xfrm>
+                                  <a:off x="0" y="0"/>
+                                  <a:ext cx="241300" cy="261257"/>
+                                </a:xfrm>
+                                <a:prstGeom prst="rect">
+                                  <a:avLst/>
+                                </a:prstGeom>
+                                <a:solidFill>
+                                  <a:srgbClr val="FF1DC4"/>
+                                </a:solidFill>
+                              </wps:spPr>
+                              <wps:style>
+                                <a:lnRef idx="2">
+                                  <a:schemeClr val="accent1">
+                                    <a:shade val="15000"/>
+                                  </a:schemeClr>
+                                </a:lnRef>
+                                <a:fillRef idx="1">
+                                  <a:schemeClr val="accent1"/>
+                                </a:fillRef>
+                                <a:effectRef idx="0">
+                                  <a:schemeClr val="accent1"/>
+                                </a:effectRef>
+                                <a:fontRef idx="minor">
+                                  <a:schemeClr val="lt1"/>
+                                </a:fontRef>
+                              </wps:style>
+                              <wps:bodyPr rot="0" spcFirstLastPara="0" vertOverflow="overflow" horzOverflow="overflow" vert="horz" wrap="square" lIns="91440" tIns="45720" rIns="91440" bIns="45720" numCol="1" spcCol="0" rtlCol="0" fromWordArt="0" anchor="ctr" anchorCtr="0" forceAA="0" compatLnSpc="1">
+                                <a:prstTxWarp prst="textNoShape">
+                                  <a:avLst/>
+                                </a:prstTxWarp>
+                                <a:noAutofit/>
+                              </wps:bodyPr>
+                            </wps:wsp>
+                            <wps:wsp>
+                              <wps:cNvPr id="1898094357" name="직사각형 1"/>
+                              <wps:cNvSpPr/>
+                              <wps:spPr>
+                                <a:xfrm>
+                                  <a:off x="20096" y="30145"/>
+                                  <a:ext cx="195943" cy="80387"/>
+                                </a:xfrm>
+                                <a:prstGeom prst="rect">
+                                  <a:avLst/>
+                                </a:prstGeom>
+                                <a:solidFill>
+                                  <a:schemeClr val="accent5">
+                                    <a:lumMod val="40000"/>
+                                    <a:lumOff val="60000"/>
+                                  </a:schemeClr>
+                                </a:solidFill>
+                              </wps:spPr>
+                              <wps:style>
+                                <a:lnRef idx="2">
+                                  <a:schemeClr val="accent1">
+                                    <a:shade val="15000"/>
+                                  </a:schemeClr>
+                                </a:lnRef>
+                                <a:fillRef idx="1">
+                                  <a:schemeClr val="accent1"/>
+                                </a:fillRef>
+                                <a:effectRef idx="0">
+                                  <a:schemeClr val="accent1"/>
+                                </a:effectRef>
+                                <a:fontRef idx="minor">
+                                  <a:schemeClr val="lt1"/>
+                                </a:fontRef>
+                              </wps:style>
+                              <wps:bodyPr rot="0" spcFirstLastPara="0" vertOverflow="overflow" horzOverflow="overflow" vert="horz" wrap="square" lIns="91440" tIns="45720" rIns="91440" bIns="45720" numCol="1" spcCol="0" rtlCol="0" fromWordArt="0" anchor="ctr" anchorCtr="0" forceAA="0" compatLnSpc="1">
+                                <a:prstTxWarp prst="textNoShape">
+                                  <a:avLst/>
+                                </a:prstTxWarp>
+                                <a:noAutofit/>
+                              </wps:bodyPr>
+                            </wps:wsp>
+                          </wpg:wgp>
+                        </a:graphicData>
+                      </a:graphic>
+                    </wp:anchor>
+                  </w:drawing>
+                </mc:Choice>
+                <mc:Fallback>
+                  <w:pict>
+                    <v:group w14:anchorId="697AA8FB" id="그룹 2" o:spid="_x0000_s1026" style="position:absolute;margin-left:154.25pt;margin-top:101.55pt;width:19pt;height:20.55pt;rotation:-90;z-index:251706368" coordsize="241300,261257" o:gfxdata="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">
+                      <v:rect id="직사각형 1" o:spid="_x0000_s1027" style="position:absolute;width:241300;height:261257;visibility:visible;mso-wrap-style:square;v-text-anchor:middle" o:gfxdata="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" fillcolor="#ff1dc4" strokecolor="#030e13 [484]" strokeweight="1pt"/>
+                      <v:rect id="직사각형 1" o:spid="_x0000_s1028" style="position:absolute;left:20096;top:30145;width:195943;height:80387;visibility:visible;mso-wrap-style:square;v-text-anchor:middle" o:gfxdata="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" fillcolor="#e59edc [1304]" strokecolor="#030e13 [484]" strokeweight="1pt"/>
+                    </v:group>
+                  </w:pict>
+                </mc:Fallback>
+              </mc:AlternateContent>
+            </w:r>
             <w:r>
               <w:rPr>
                 <w:rFonts w:hint="eastAsia"/>
@@ -9330,69 +11883,37 @@
               <w:pStyle w:val="a6"/>
               <w:ind w:left="0"/>
               <w:jc w:val="center"/>
-            </w:pPr>
-            <w:r>
-              <w:rPr>
-                <w:rFonts w:hint="eastAsia"/>
-              </w:rPr>
-              <w:t>맵 난이도</w:t>
-            </w:r>
-          </w:p>
-        </w:tc>
-        <w:tc>
-          <w:tcPr>
-            <w:tcW w:w="1337" w:type="dxa"/>
-            <w:shd w:val="clear" w:color="auto" w:fill="E8E8E8" w:themeFill="background2"/>
-          </w:tcPr>
-          <w:p>
-            <w:pPr>
-              <w:pStyle w:val="a6"/>
-              <w:ind w:left="0"/>
-              <w:jc w:val="center"/>
-            </w:pPr>
-            <w:r>
-              <w:rPr>
-                <w:rFonts w:hint="eastAsia"/>
-              </w:rPr>
-              <w:t>쉬움</w:t>
-            </w:r>
-          </w:p>
-        </w:tc>
-        <w:tc>
-          <w:tcPr>
-            <w:tcW w:w="1337" w:type="dxa"/>
-            <w:shd w:val="clear" w:color="auto" w:fill="E8E8E8" w:themeFill="background2"/>
-          </w:tcPr>
-          <w:p>
-            <w:pPr>
-              <w:pStyle w:val="a6"/>
-              <w:ind w:left="0"/>
-              <w:jc w:val="center"/>
-            </w:pPr>
-            <w:r>
-              <w:rPr>
-                <w:rFonts w:hint="eastAsia"/>
-              </w:rPr>
-              <w:t>보통</w:t>
-            </w:r>
-          </w:p>
-        </w:tc>
-        <w:tc>
-          <w:tcPr>
-            <w:tcW w:w="1338" w:type="dxa"/>
-            <w:shd w:val="clear" w:color="auto" w:fill="E8E8E8" w:themeFill="background2"/>
-          </w:tcPr>
-          <w:p>
-            <w:pPr>
-              <w:pStyle w:val="a6"/>
-              <w:ind w:left="0"/>
-              <w:jc w:val="center"/>
-            </w:pPr>
-            <w:r>
-              <w:rPr>
-                <w:rFonts w:hint="eastAsia"/>
-              </w:rPr>
-              <w:t>어려움</w:t>
+              <w:rPr>
+                <w:rFonts w:hint="eastAsia"/>
+              </w:rPr>
+            </w:pPr>
+            <w:r>
+              <w:rPr>
+                <w:rFonts w:hint="eastAsia"/>
+              </w:rPr>
+              <w:t>판매기 생성 여부</w:t>
+            </w:r>
+          </w:p>
+        </w:tc>
+        <w:tc>
+          <w:tcPr>
+            <w:tcW w:w="4012" w:type="dxa"/>
+            <w:gridSpan w:val="3"/>
+          </w:tcPr>
+          <w:p>
+            <w:pPr>
+              <w:pStyle w:val="a6"/>
+              <w:ind w:left="0"/>
+              <w:jc w:val="center"/>
+              <w:rPr>
+                <w:rFonts w:hint="eastAsia"/>
+              </w:rPr>
+            </w:pPr>
+            <w:r>
+              <w:rPr>
+                <w:rFonts w:hint="eastAsia"/>
+              </w:rPr>
+              <w:t>Y</w:t>
             </w:r>
           </w:p>
         </w:tc>
@@ -9416,23 +11937,64 @@
               <w:rPr>
                 <w:rFonts w:hint="eastAsia"/>
               </w:rPr>
-              <w:t>방 최소/최대 생성 개수</w:t>
-            </w:r>
-          </w:p>
-        </w:tc>
-        <w:tc>
-          <w:tcPr>
-            <w:tcW w:w="4012" w:type="dxa"/>
-            <w:gridSpan w:val="3"/>
-          </w:tcPr>
-          <w:p>
-            <w:pPr>
-              <w:pStyle w:val="a6"/>
-              <w:ind w:left="0"/>
-              <w:jc w:val="center"/>
-            </w:pPr>
-            <w:r>
-              <w:t>'최소/최대 층수 - 1'</w:t>
+              <w:t>맵 난이도</w:t>
+            </w:r>
+          </w:p>
+        </w:tc>
+        <w:tc>
+          <w:tcPr>
+            <w:tcW w:w="1337" w:type="dxa"/>
+            <w:shd w:val="clear" w:color="auto" w:fill="E8E8E8" w:themeFill="background2"/>
+          </w:tcPr>
+          <w:p>
+            <w:pPr>
+              <w:pStyle w:val="a6"/>
+              <w:ind w:left="0"/>
+              <w:jc w:val="center"/>
+            </w:pPr>
+            <w:r>
+              <w:rPr>
+                <w:rFonts w:hint="eastAsia"/>
+              </w:rPr>
+              <w:t>쉬움</w:t>
+            </w:r>
+          </w:p>
+        </w:tc>
+        <w:tc>
+          <w:tcPr>
+            <w:tcW w:w="1337" w:type="dxa"/>
+            <w:shd w:val="clear" w:color="auto" w:fill="E8E8E8" w:themeFill="background2"/>
+          </w:tcPr>
+          <w:p>
+            <w:pPr>
+              <w:pStyle w:val="a6"/>
+              <w:ind w:left="0"/>
+              <w:jc w:val="center"/>
+            </w:pPr>
+            <w:r>
+              <w:rPr>
+                <w:rFonts w:hint="eastAsia"/>
+              </w:rPr>
+              <w:t>보통</w:t>
+            </w:r>
+          </w:p>
+        </w:tc>
+        <w:tc>
+          <w:tcPr>
+            <w:tcW w:w="1338" w:type="dxa"/>
+            <w:shd w:val="clear" w:color="auto" w:fill="E8E8E8" w:themeFill="background2"/>
+          </w:tcPr>
+          <w:p>
+            <w:pPr>
+              <w:pStyle w:val="a6"/>
+              <w:ind w:left="0"/>
+              <w:jc w:val="center"/>
+            </w:pPr>
+            <w:r>
+              <w:rPr>
+                <w:rFonts w:hint="eastAsia"/>
+              </w:rPr>
+              <w:t>어려움</w:t>
             </w:r>
           </w:p>
         </w:tc>
@@ -9456,44 +12018,24 @@
               <w:rPr>
                 <w:rFonts w:hint="eastAsia"/>
               </w:rPr>
-              <w:t>방 추가 생성 확률</w:t>
-            </w:r>
-          </w:p>
-        </w:tc>
-        <w:tc>
-          <w:tcPr>
-            <w:tcW w:w="1337" w:type="dxa"/>
-          </w:tcPr>
-          <w:p>
-            <w:pPr>
-              <w:pStyle w:val="a6"/>
-              <w:ind w:left="0"/>
-              <w:jc w:val="center"/>
-            </w:pPr>
-          </w:p>
-        </w:tc>
-        <w:tc>
-          <w:tcPr>
-            <w:tcW w:w="1337" w:type="dxa"/>
-          </w:tcPr>
-          <w:p>
-            <w:pPr>
-              <w:pStyle w:val="a6"/>
-              <w:ind w:left="0"/>
-              <w:jc w:val="center"/>
-            </w:pPr>
-          </w:p>
-        </w:tc>
-        <w:tc>
-          <w:tcPr>
-            <w:tcW w:w="1338" w:type="dxa"/>
-          </w:tcPr>
-          <w:p>
-            <w:pPr>
-              <w:pStyle w:val="a6"/>
-              <w:ind w:left="0"/>
-              <w:jc w:val="center"/>
-            </w:pPr>
+              <w:t>방 최소/최대 생성 개수</w:t>
+            </w:r>
+          </w:p>
+        </w:tc>
+        <w:tc>
+          <w:tcPr>
+            <w:tcW w:w="4012" w:type="dxa"/>
+            <w:gridSpan w:val="3"/>
+          </w:tcPr>
+          <w:p>
+            <w:pPr>
+              <w:pStyle w:val="a6"/>
+              <w:ind w:left="0"/>
+              <w:jc w:val="center"/>
+            </w:pPr>
+            <w:r>
+              <w:t>'최소/최대 층수 - 1'</w:t>
+            </w:r>
           </w:p>
         </w:tc>
       </w:tr>
@@ -9516,27 +12058,44 @@
               <w:rPr>
                 <w:rFonts w:hint="eastAsia"/>
               </w:rPr>
-              <w:t>문 최소/최대 생성 개수</w:t>
-            </w:r>
-          </w:p>
-        </w:tc>
-        <w:tc>
-          <w:tcPr>
-            <w:tcW w:w="4012" w:type="dxa"/>
-            <w:gridSpan w:val="3"/>
-          </w:tcPr>
-          <w:p>
-            <w:pPr>
-              <w:pStyle w:val="a6"/>
-              <w:ind w:left="0"/>
-              <w:jc w:val="center"/>
-            </w:pPr>
-            <w:r>
-              <w:rPr>
-                <w:rFonts w:hint="eastAsia"/>
-              </w:rPr>
-              <w:t>2~4</w:t>
-            </w:r>
+              <w:t>방 추가 생성 확률</w:t>
+            </w:r>
+          </w:p>
+        </w:tc>
+        <w:tc>
+          <w:tcPr>
+            <w:tcW w:w="1337" w:type="dxa"/>
+          </w:tcPr>
+          <w:p>
+            <w:pPr>
+              <w:pStyle w:val="a6"/>
+              <w:ind w:left="0"/>
+              <w:jc w:val="center"/>
+            </w:pPr>
+          </w:p>
+        </w:tc>
+        <w:tc>
+          <w:tcPr>
+            <w:tcW w:w="1337" w:type="dxa"/>
+          </w:tcPr>
+          <w:p>
+            <w:pPr>
+              <w:pStyle w:val="a6"/>
+              <w:ind w:left="0"/>
+              <w:jc w:val="center"/>
+            </w:pPr>
+          </w:p>
+        </w:tc>
+        <w:tc>
+          <w:tcPr>
+            <w:tcW w:w="1338" w:type="dxa"/>
+          </w:tcPr>
+          <w:p>
+            <w:pPr>
+              <w:pStyle w:val="a6"/>
+              <w:ind w:left="0"/>
+              <w:jc w:val="center"/>
+            </w:pPr>
           </w:p>
         </w:tc>
       </w:tr>
@@ -9559,6 +12118,49 @@
               <w:rPr>
                 <w:rFonts w:hint="eastAsia"/>
               </w:rPr>
+              <w:t>문 최소/최대 생성 개수</w:t>
+            </w:r>
+          </w:p>
+        </w:tc>
+        <w:tc>
+          <w:tcPr>
+            <w:tcW w:w="4012" w:type="dxa"/>
+            <w:gridSpan w:val="3"/>
+          </w:tcPr>
+          <w:p>
+            <w:pPr>
+              <w:pStyle w:val="a6"/>
+              <w:ind w:left="0"/>
+              <w:jc w:val="center"/>
+            </w:pPr>
+            <w:r>
+              <w:rPr>
+                <w:rFonts w:hint="eastAsia"/>
+              </w:rPr>
+              <w:t>2~4</w:t>
+            </w:r>
+          </w:p>
+        </w:tc>
+      </w:tr>
+      <w:tr>
+        <w:trPr>
+          <w:jc w:val="center"/>
+        </w:trPr>
+        <w:tc>
+          <w:tcPr>
+            <w:tcW w:w="4124" w:type="dxa"/>
+            <w:shd w:val="clear" w:color="auto" w:fill="D1D1D1" w:themeFill="background2" w:themeFillShade="E6"/>
+          </w:tcPr>
+          <w:p>
+            <w:pPr>
+              <w:pStyle w:val="a6"/>
+              <w:ind w:left="0"/>
+              <w:jc w:val="center"/>
+            </w:pPr>
+            <w:r>
+              <w:rPr>
+                <w:rFonts w:hint="eastAsia"/>
+              </w:rPr>
               <w:t>층 당 문 필수 개수</w:t>
             </w:r>
           </w:p>
@@ -9587,6 +12189,9 @@
     <w:p>
       <w:pPr>
         <w:jc w:val="both"/>
+        <w:rPr>
+          <w:rFonts w:hint="eastAsia"/>
+        </w:rPr>
       </w:pPr>
     </w:p>
     <w:sectPr>
@@ -11687,7 +14292,33 @@
       </a:bgFillStyleLst>
     </a:fmtScheme>
   </a:themeElements>
-  <a:objectDefaults/>
+  <a:objectDefaults>
+    <a:spDef>
+      <a:spPr>
+        <a:solidFill>
+          <a:srgbClr val="FF1DC4"/>
+        </a:solidFill>
+      </a:spPr>
+      <a:bodyPr rtlCol="0" anchor="ctr"/>
+      <a:lstStyle/>
+      <a:style>
+        <a:lnRef idx="2">
+          <a:schemeClr val="accent1">
+            <a:shade val="15000"/>
+          </a:schemeClr>
+        </a:lnRef>
+        <a:fillRef idx="1">
+          <a:schemeClr val="accent1"/>
+        </a:fillRef>
+        <a:effectRef idx="0">
+          <a:schemeClr val="accent1"/>
+        </a:effectRef>
+        <a:fontRef idx="minor">
+          <a:schemeClr val="lt1"/>
+        </a:fontRef>
+      </a:style>
+    </a:spDef>
+  </a:objectDefaults>
   <a:extraClrSchemeLst/>
   <a:extLst>
     <a:ext uri="{05A4C25C-085E-4340-85A3-A5531E510DB2}">

</xml_diff>

<commit_message>
큐브 GapRoom 발판(step) 추가
기획서에 step 포함한 그림으로 변경, 사이즈 다시 작성
</commit_message>
<xml_diff>
--- a/기획/공장 맵_방 구조 규칙.docx
+++ b/기획/공장 맵_방 구조 규칙.docx
@@ -1015,9 +1015,6 @@
               <w:pStyle w:val="a6"/>
               <w:ind w:left="0"/>
               <w:jc w:val="center"/>
-              <w:rPr>
-                <w:rFonts w:hint="eastAsia"/>
-              </w:rPr>
             </w:pPr>
             <w:r>
               <w:rPr>
@@ -1037,9 +1034,6 @@
               <w:pStyle w:val="a6"/>
               <w:ind w:left="0"/>
               <w:jc w:val="center"/>
-              <w:rPr>
-                <w:rFonts w:hint="eastAsia"/>
-              </w:rPr>
             </w:pPr>
             <w:r>
               <w:rPr>
@@ -1512,10 +1506,10 @@
                 <w:noProof/>
               </w:rPr>
               <w:drawing>
-                <wp:inline distT="0" distB="0" distL="0" distR="0" wp14:anchorId="00A960C8" wp14:editId="0FFD5FA7">
-                  <wp:extent cx="3091909" cy="1518249"/>
-                  <wp:effectExtent l="0" t="0" r="0" b="6350"/>
-                  <wp:docPr id="1700396889" name="그림 1"/>
+                <wp:inline distT="0" distB="0" distL="0" distR="0" wp14:anchorId="1BFF4DE6" wp14:editId="62D8000F">
+                  <wp:extent cx="3677340" cy="1871331"/>
+                  <wp:effectExtent l="0" t="0" r="0" b="0"/>
+                  <wp:docPr id="2037608806" name="그림 1"/>
                   <wp:cNvGraphicFramePr>
                     <a:graphicFrameLocks xmlns:a="http://schemas.openxmlformats.org/drawingml/2006/main" noChangeAspect="1"/>
                   </wp:cNvGraphicFramePr>
@@ -1523,23 +1517,38 @@
                     <a:graphicData uri="http://schemas.openxmlformats.org/drawingml/2006/picture">
                       <pic:pic xmlns:pic="http://schemas.openxmlformats.org/drawingml/2006/picture">
                         <pic:nvPicPr>
-                          <pic:cNvPr id="1700396889" name=""/>
+                          <pic:cNvPr id="2037608806" name="그림 1"/>
                           <pic:cNvPicPr/>
                         </pic:nvPicPr>
-                        <pic:blipFill>
-                          <a:blip r:embed="rId10"/>
+                        <pic:blipFill rotWithShape="1">
+                          <a:blip r:embed="rId10">
+                            <a:extLst>
+                              <a:ext uri="{28A0092B-C50C-407E-A947-70E740481C1C}">
+                                <a14:useLocalDpi xmlns:a14="http://schemas.microsoft.com/office/drawing/2010/main" val="0"/>
+                              </a:ext>
+                            </a:extLst>
+                          </a:blip>
+                          <a:srcRect b="3022"/>
                           <a:stretch>
                             <a:fillRect/>
                           </a:stretch>
                         </pic:blipFill>
-                        <pic:spPr>
+                        <pic:spPr bwMode="auto">
                           <a:xfrm>
                             <a:off x="0" y="0"/>
-                            <a:ext cx="3097575" cy="1521031"/>
+                            <a:ext cx="3705509" cy="1885666"/>
                           </a:xfrm>
                           <a:prstGeom prst="rect">
                             <a:avLst/>
                           </a:prstGeom>
+                          <a:ln>
+                            <a:noFill/>
+                          </a:ln>
+                          <a:extLst>
+                            <a:ext uri="{53640926-AAD7-44D8-BBD7-CCE9431645EC}">
+                              <a14:shadowObscured xmlns:a14="http://schemas.microsoft.com/office/drawing/2010/main"/>
+                            </a:ext>
+                          </a:extLst>
                         </pic:spPr>
                       </pic:pic>
                     </a:graphicData>
@@ -1710,9 +1719,6 @@
               <w:pStyle w:val="a6"/>
               <w:ind w:left="0"/>
               <w:jc w:val="center"/>
-              <w:rPr>
-                <w:rFonts w:hint="eastAsia"/>
-              </w:rPr>
             </w:pPr>
             <w:r>
               <w:rPr>
@@ -1732,9 +1738,6 @@
               <w:pStyle w:val="a6"/>
               <w:ind w:left="0"/>
               <w:jc w:val="center"/>
-              <w:rPr>
-                <w:rFonts w:hint="eastAsia"/>
-              </w:rPr>
             </w:pPr>
             <w:r>
               <w:rPr>
@@ -2160,7 +2163,6 @@
                 <w:bCs/>
                 <w:sz w:val="24"/>
               </w:rPr>
-              <w:lastRenderedPageBreak/>
               <w:t xml:space="preserve">2 </w:t>
             </w:r>
             <w:proofErr w:type="spellStart"/>
@@ -2488,9 +2490,6 @@
               <w:pStyle w:val="a6"/>
               <w:ind w:left="0"/>
               <w:jc w:val="center"/>
-              <w:rPr>
-                <w:rFonts w:hint="eastAsia"/>
-              </w:rPr>
             </w:pPr>
             <w:r>
               <w:rPr>
@@ -2510,9 +2509,6 @@
               <w:pStyle w:val="a6"/>
               <w:ind w:left="0"/>
               <w:jc w:val="center"/>
-              <w:rPr>
-                <w:rFonts w:hint="eastAsia"/>
-              </w:rPr>
             </w:pPr>
             <w:r>
               <w:rPr>
@@ -3266,14 +3262,12 @@
               <w:pStyle w:val="a6"/>
               <w:ind w:left="0"/>
               <w:jc w:val="center"/>
-              <w:rPr>
-                <w:rFonts w:hint="eastAsia"/>
-              </w:rPr>
-            </w:pPr>
-            <w:r>
-              <w:rPr>
-                <w:rFonts w:hint="eastAsia"/>
-              </w:rPr>
+            </w:pPr>
+            <w:r>
+              <w:rPr>
+                <w:rFonts w:hint="eastAsia"/>
+              </w:rPr>
+              <w:lastRenderedPageBreak/>
               <w:t>스크랩 최대 생성 개수</w:t>
             </w:r>
           </w:p>
@@ -3288,9 +3282,6 @@
               <w:pStyle w:val="a6"/>
               <w:ind w:left="0"/>
               <w:jc w:val="center"/>
-              <w:rPr>
-                <w:rFonts w:hint="eastAsia"/>
-              </w:rPr>
             </w:pPr>
             <w:r>
               <w:rPr>
@@ -3320,7 +3311,6 @@
               <w:rPr>
                 <w:rFonts w:hint="eastAsia"/>
               </w:rPr>
-              <w:lastRenderedPageBreak/>
               <w:t>비상구 생성 여부</w:t>
             </w:r>
           </w:p>
@@ -4530,9 +4520,6 @@
               <w:pStyle w:val="a6"/>
               <w:ind w:left="0"/>
               <w:jc w:val="center"/>
-              <w:rPr>
-                <w:rFonts w:hint="eastAsia"/>
-              </w:rPr>
             </w:pPr>
             <w:r>
               <w:rPr>
@@ -4552,9 +4539,6 @@
               <w:pStyle w:val="a6"/>
               <w:ind w:left="0"/>
               <w:jc w:val="center"/>
-              <w:rPr>
-                <w:rFonts w:hint="eastAsia"/>
-              </w:rPr>
             </w:pPr>
             <w:r>
               <w:rPr>
@@ -4751,6 +4735,7 @@
               <w:rPr>
                 <w:rFonts w:hint="eastAsia"/>
               </w:rPr>
+              <w:lastRenderedPageBreak/>
               <w:t>방 최소/최대 생성 개수</w:t>
             </w:r>
           </w:p>
@@ -4829,7 +4814,6 @@
               <w:rPr>
                 <w:rFonts w:hint="eastAsia"/>
               </w:rPr>
-              <w:lastRenderedPageBreak/>
               <w:t>방 추가 생성 확률</w:t>
             </w:r>
           </w:p>
@@ -5530,9 +5514,6 @@
               <w:pStyle w:val="a6"/>
               <w:ind w:left="0"/>
               <w:jc w:val="center"/>
-              <w:rPr>
-                <w:rFonts w:hint="eastAsia"/>
-              </w:rPr>
             </w:pPr>
             <w:r>
               <w:rPr>
@@ -5552,9 +5533,6 @@
               <w:pStyle w:val="a6"/>
               <w:ind w:left="0"/>
               <w:jc w:val="center"/>
-              <w:rPr>
-                <w:rFonts w:hint="eastAsia"/>
-              </w:rPr>
             </w:pPr>
             <w:r>
               <w:rPr>
@@ -6471,9 +6449,6 @@
               <w:pStyle w:val="a6"/>
               <w:ind w:left="0"/>
               <w:jc w:val="center"/>
-              <w:rPr>
-                <w:rFonts w:hint="eastAsia"/>
-              </w:rPr>
             </w:pPr>
             <w:r>
               <w:rPr>
@@ -6493,9 +6468,6 @@
               <w:pStyle w:val="a6"/>
               <w:ind w:left="0"/>
               <w:jc w:val="center"/>
-              <w:rPr>
-                <w:rFonts w:hint="eastAsia"/>
-              </w:rPr>
             </w:pPr>
             <w:r>
               <w:rPr>
@@ -7476,9 +7448,6 @@
               <w:pStyle w:val="a6"/>
               <w:ind w:left="0"/>
               <w:jc w:val="center"/>
-              <w:rPr>
-                <w:rFonts w:hint="eastAsia"/>
-              </w:rPr>
             </w:pPr>
             <w:r>
               <w:rPr>
@@ -7498,9 +7467,6 @@
               <w:pStyle w:val="a6"/>
               <w:ind w:left="0"/>
               <w:jc w:val="center"/>
-              <w:rPr>
-                <w:rFonts w:hint="eastAsia"/>
-              </w:rPr>
             </w:pPr>
             <w:r>
               <w:rPr>
@@ -8387,9 +8353,6 @@
               <w:pStyle w:val="a6"/>
               <w:ind w:left="0"/>
               <w:jc w:val="center"/>
-              <w:rPr>
-                <w:rFonts w:hint="eastAsia"/>
-              </w:rPr>
             </w:pPr>
             <w:r>
               <w:rPr>
@@ -8409,9 +8372,6 @@
               <w:pStyle w:val="a6"/>
               <w:ind w:left="0"/>
               <w:jc w:val="center"/>
-              <w:rPr>
-                <w:rFonts w:hint="eastAsia"/>
-              </w:rPr>
             </w:pPr>
             <w:r>
               <w:rPr>
@@ -9187,7 +9147,7 @@
                 <w:noProof/>
               </w:rPr>
               <w:drawing>
-                <wp:inline distT="0" distB="0" distL="0" distR="0" wp14:anchorId="5AB745F1" wp14:editId="4E906637">
+                <wp:inline distT="0" distB="0" distL="0" distR="0" wp14:anchorId="5AB745F1" wp14:editId="13871DF0">
                   <wp:extent cx="3211373" cy="2878884"/>
                   <wp:effectExtent l="0" t="0" r="8255" b="0"/>
                   <wp:docPr id="1021474114" name="그림 1"/>
@@ -9375,9 +9335,6 @@
               <w:pStyle w:val="a6"/>
               <w:ind w:left="0"/>
               <w:jc w:val="center"/>
-              <w:rPr>
-                <w:rFonts w:hint="eastAsia"/>
-              </w:rPr>
             </w:pPr>
             <w:r>
               <w:rPr>
@@ -9397,9 +9354,6 @@
               <w:pStyle w:val="a6"/>
               <w:ind w:left="0"/>
               <w:jc w:val="center"/>
-              <w:rPr>
-                <w:rFonts w:hint="eastAsia"/>
-              </w:rPr>
             </w:pPr>
             <w:r>
               <w:rPr>
@@ -10035,9 +9989,6 @@
               <w:pStyle w:val="a6"/>
               <w:ind w:left="0"/>
               <w:jc w:val="center"/>
-              <w:rPr>
-                <w:rFonts w:hint="eastAsia"/>
-              </w:rPr>
             </w:pPr>
             <w:r>
               <w:rPr>
@@ -10057,9 +10008,6 @@
               <w:pStyle w:val="a6"/>
               <w:ind w:left="0"/>
               <w:jc w:val="center"/>
-              <w:rPr>
-                <w:rFonts w:hint="eastAsia"/>
-              </w:rPr>
             </w:pPr>
             <w:r>
               <w:rPr>
@@ -10692,9 +10640,6 @@
               <w:pStyle w:val="a6"/>
               <w:ind w:left="0"/>
               <w:jc w:val="center"/>
-              <w:rPr>
-                <w:rFonts w:hint="eastAsia"/>
-              </w:rPr>
             </w:pPr>
             <w:r>
               <w:rPr>
@@ -10714,9 +10659,6 @@
               <w:pStyle w:val="a6"/>
               <w:ind w:left="0"/>
               <w:jc w:val="center"/>
-              <w:rPr>
-                <w:rFonts w:hint="eastAsia"/>
-              </w:rPr>
             </w:pPr>
           </w:p>
         </w:tc>
@@ -11318,9 +11260,6 @@
               <w:pStyle w:val="a6"/>
               <w:ind w:left="0"/>
               <w:jc w:val="center"/>
-              <w:rPr>
-                <w:rFonts w:hint="eastAsia"/>
-              </w:rPr>
             </w:pPr>
             <w:r>
               <w:rPr>
@@ -11340,9 +11279,6 @@
               <w:pStyle w:val="a6"/>
               <w:ind w:left="0"/>
               <w:jc w:val="center"/>
-              <w:rPr>
-                <w:rFonts w:hint="eastAsia"/>
-              </w:rPr>
             </w:pPr>
             <w:r>
               <w:rPr>
@@ -12390,9 +12326,6 @@
               <w:pStyle w:val="a6"/>
               <w:ind w:left="0"/>
               <w:jc w:val="center"/>
-              <w:rPr>
-                <w:rFonts w:hint="eastAsia"/>
-              </w:rPr>
             </w:pPr>
             <w:r>
               <w:rPr>
@@ -12412,9 +12345,6 @@
               <w:pStyle w:val="a6"/>
               <w:ind w:left="0"/>
               <w:jc w:val="center"/>
-              <w:rPr>
-                <w:rFonts w:hint="eastAsia"/>
-              </w:rPr>
             </w:pPr>
             <w:r>
               <w:rPr>

</xml_diff>

<commit_message>
가구 ServerRacks 추가, ServerRoom 블루프린트 수정
- 기획서에 ServerRacks 배치된 그림 추가
- 리소스 출처 기재
</commit_message>
<xml_diff>
--- a/기획/공장 맵_방 구조 규칙.docx
+++ b/기획/공장 맵_방 구조 규칙.docx
@@ -64,28 +64,12 @@
     </w:p>
     <w:p/>
     <w:p>
-      <w:proofErr w:type="gramStart"/>
       <w:r>
         <w:rPr>
           <w:rFonts w:hint="eastAsia"/>
         </w:rPr>
-        <w:t>[ 참고</w:t>
+        <w:t>[ 참고 사항 ]</w:t>
       </w:r>
-      <w:proofErr w:type="gramEnd"/>
-      <w:r>
-        <w:rPr>
-          <w:rFonts w:hint="eastAsia"/>
-        </w:rPr>
-        <w:t xml:space="preserve"> </w:t>
-      </w:r>
-      <w:proofErr w:type="gramStart"/>
-      <w:r>
-        <w:rPr>
-          <w:rFonts w:hint="eastAsia"/>
-        </w:rPr>
-        <w:t>사항 ]</w:t>
-      </w:r>
-      <w:proofErr w:type="gramEnd"/>
     </w:p>
     <w:p>
       <w:pPr>
@@ -307,23 +291,13 @@
           <w:bCs/>
         </w:rPr>
       </w:pPr>
-      <w:proofErr w:type="spellStart"/>
       <w:r>
         <w:rPr>
           <w:rFonts w:hint="eastAsia"/>
           <w:b/>
           <w:bCs/>
         </w:rPr>
-        <w:t>DoorSocket</w:t>
-      </w:r>
-      <w:proofErr w:type="spellEnd"/>
-      <w:r>
-        <w:rPr>
-          <w:rFonts w:hint="eastAsia"/>
-          <w:b/>
-          <w:bCs/>
-        </w:rPr>
-        <w:t>(벽에 난 문 구멍): 150*275</w:t>
+        <w:t>DoorSocket(벽에 난 문 구멍): 150*275</w:t>
       </w:r>
     </w:p>
     <w:p>
@@ -368,24 +342,15 @@
           <w:bCs/>
         </w:rPr>
       </w:pPr>
-      <w:proofErr w:type="spellStart"/>
       <w:r>
         <w:rPr>
           <w:rFonts w:hint="eastAsia"/>
         </w:rPr>
-        <w:t>SellingMachine</w:t>
-      </w:r>
-      <w:proofErr w:type="spellEnd"/>
-      <w:r>
-        <w:rPr>
-          <w:rFonts w:hint="eastAsia"/>
-        </w:rPr>
-        <w:t>(판매기): 큐브 안에서 생길 수 있는 위치는 여러 곳이지만, 큐브 하나 당 하나의 판매기가 생성됨</w:t>
+        <w:t>SellingMachine(판매기): 큐브 안에서 생길 수 있는 위치는 여러 곳이지만, 큐브 하나 당 하나의 판매기가 생성됨</w:t>
       </w:r>
     </w:p>
     <w:p/>
     <w:p>
-      <w:proofErr w:type="gramStart"/>
       <w:r>
         <w:rPr>
           <w:rFonts w:hint="eastAsia"/>
@@ -402,14 +367,7 @@
         <w:rPr>
           <w:rFonts w:hint="eastAsia"/>
         </w:rPr>
-        <w:t>모든</w:t>
-      </w:r>
-      <w:proofErr w:type="gramEnd"/>
-      <w:r>
-        <w:rPr>
-          <w:rFonts w:hint="eastAsia"/>
-        </w:rPr>
-        <w:t xml:space="preserve"> 스테이지 </w:t>
+        <w:t xml:space="preserve">모든 스테이지 </w:t>
       </w:r>
       <w:r>
         <w:rPr>
@@ -427,14 +385,7 @@
         <w:rPr>
           <w:rFonts w:hint="eastAsia"/>
         </w:rPr>
-        <w:t xml:space="preserve"> &amp; </w:t>
-      </w:r>
-      <w:proofErr w:type="gramStart"/>
-      <w:r>
-        <w:rPr>
-          <w:rFonts w:hint="eastAsia"/>
-        </w:rPr>
-        <w:t>규칙</w:t>
+        <w:t xml:space="preserve"> &amp; 규칙</w:t>
       </w:r>
       <w:r>
         <w:rPr>
@@ -442,7 +393,6 @@
         </w:rPr>
         <w:t xml:space="preserve"> ]</w:t>
       </w:r>
-      <w:proofErr w:type="gramEnd"/>
     </w:p>
     <w:p>
       <w:pPr>
@@ -470,19 +420,11 @@
       <w:r>
         <w:t>’</w:t>
       </w:r>
-      <w:proofErr w:type="spellStart"/>
       <w:r>
         <w:rPr>
           <w:rFonts w:hint="eastAsia"/>
         </w:rPr>
-        <w:t>를</w:t>
-      </w:r>
-      <w:proofErr w:type="spellEnd"/>
-      <w:r>
-        <w:rPr>
-          <w:rFonts w:hint="eastAsia"/>
-        </w:rPr>
-        <w:t xml:space="preserve"> 이용하여 열 수 있다.</w:t>
+        <w:t>를 이용하여 열 수 있다.</w:t>
       </w:r>
     </w:p>
     <w:p>
@@ -497,21 +439,7 @@
         <w:rPr>
           <w:rFonts w:hint="eastAsia"/>
         </w:rPr>
-        <w:t xml:space="preserve">코어(장치)는 한 </w:t>
-      </w:r>
-      <w:proofErr w:type="spellStart"/>
-      <w:r>
-        <w:rPr>
-          <w:rFonts w:hint="eastAsia"/>
-        </w:rPr>
-        <w:t>맵에</w:t>
-      </w:r>
-      <w:proofErr w:type="spellEnd"/>
-      <w:r>
-        <w:rPr>
-          <w:rFonts w:hint="eastAsia"/>
-        </w:rPr>
-        <w:t xml:space="preserve"> 하나만 생성될 수 있다.</w:t>
+        <w:t>코어(장치)는 한 맵에 하나만 생성될 수 있다.</w:t>
       </w:r>
     </w:p>
     <w:p>
@@ -618,19 +546,11 @@
       <w:r>
         <w:t>’</w:t>
       </w:r>
-      <w:proofErr w:type="spellStart"/>
       <w:r>
         <w:rPr>
           <w:rFonts w:hint="eastAsia"/>
         </w:rPr>
-        <w:t>끼리는</w:t>
-      </w:r>
-      <w:proofErr w:type="spellEnd"/>
-      <w:r>
-        <w:rPr>
-          <w:rFonts w:hint="eastAsia"/>
-        </w:rPr>
-        <w:t xml:space="preserve"> 바로 연결될 수 없다.</w:t>
+        <w:t>끼리는 바로 연결될 수 없다.</w:t>
       </w:r>
     </w:p>
     <w:p>
@@ -653,19 +573,11 @@
       <w:r>
         <w:t>’</w:t>
       </w:r>
-      <w:proofErr w:type="spellStart"/>
       <w:r>
         <w:rPr>
           <w:rFonts w:hint="eastAsia"/>
         </w:rPr>
-        <w:t>끼리는</w:t>
-      </w:r>
-      <w:proofErr w:type="spellEnd"/>
-      <w:r>
-        <w:rPr>
-          <w:rFonts w:hint="eastAsia"/>
-        </w:rPr>
-        <w:t xml:space="preserve"> 바로 연결될 수 있다.</w:t>
+        <w:t>끼리는 바로 연결될 수 있다.</w:t>
       </w:r>
     </w:p>
     <w:p>
@@ -688,19 +600,11 @@
       <w:r>
         <w:t>’</w:t>
       </w:r>
-      <w:proofErr w:type="spellStart"/>
       <w:r>
         <w:rPr>
           <w:rFonts w:hint="eastAsia"/>
         </w:rPr>
-        <w:t>끼리는</w:t>
-      </w:r>
-      <w:proofErr w:type="spellEnd"/>
-      <w:r>
-        <w:rPr>
-          <w:rFonts w:hint="eastAsia"/>
-        </w:rPr>
-        <w:t xml:space="preserve"> 바로 연결될 수 있다.</w:t>
+        <w:t>끼리는 바로 연결될 수 있다.</w:t>
       </w:r>
     </w:p>
     <w:p>
@@ -758,38 +662,7 @@
                 <w:sz w:val="24"/>
               </w:rPr>
               <w:lastRenderedPageBreak/>
-              <w:t xml:space="preserve">0 </w:t>
-            </w:r>
-            <w:proofErr w:type="spellStart"/>
-            <w:proofErr w:type="gramStart"/>
-            <w:r>
-              <w:rPr>
-                <w:rFonts w:hint="eastAsia"/>
-                <w:b/>
-                <w:bCs/>
-                <w:sz w:val="24"/>
-              </w:rPr>
-              <w:t>MainEntranceRoom</w:t>
-            </w:r>
-            <w:proofErr w:type="spellEnd"/>
-            <w:r>
-              <w:rPr>
-                <w:rFonts w:hint="eastAsia"/>
-                <w:b/>
-                <w:bCs/>
-                <w:sz w:val="24"/>
-              </w:rPr>
-              <w:t xml:space="preserve"> /</w:t>
-            </w:r>
-            <w:proofErr w:type="gramEnd"/>
-            <w:r>
-              <w:rPr>
-                <w:rFonts w:hint="eastAsia"/>
-                <w:b/>
-                <w:bCs/>
-                <w:sz w:val="24"/>
-              </w:rPr>
-              <w:t xml:space="preserve"> 메인 입구 방</w:t>
+              <w:t>0 MainEntranceRoom / 메인 입구 방</w:t>
             </w:r>
           </w:p>
         </w:tc>
@@ -1450,38 +1323,7 @@
                 <w:bCs/>
                 <w:sz w:val="24"/>
               </w:rPr>
-              <w:t xml:space="preserve">1 </w:t>
-            </w:r>
-            <w:proofErr w:type="spellStart"/>
-            <w:proofErr w:type="gramStart"/>
-            <w:r>
-              <w:rPr>
-                <w:rFonts w:hint="eastAsia"/>
-                <w:b/>
-                <w:bCs/>
-                <w:sz w:val="24"/>
-              </w:rPr>
-              <w:t>GapRoom</w:t>
-            </w:r>
-            <w:proofErr w:type="spellEnd"/>
-            <w:r>
-              <w:rPr>
-                <w:rFonts w:hint="eastAsia"/>
-                <w:b/>
-                <w:bCs/>
-                <w:sz w:val="24"/>
-              </w:rPr>
-              <w:t xml:space="preserve"> /</w:t>
-            </w:r>
-            <w:proofErr w:type="gramEnd"/>
-            <w:r>
-              <w:rPr>
-                <w:rFonts w:hint="eastAsia"/>
-                <w:b/>
-                <w:bCs/>
-                <w:sz w:val="24"/>
-              </w:rPr>
-              <w:t xml:space="preserve"> 끊어진 방</w:t>
+              <w:t>1 GapRoom / 끊어진 방</w:t>
             </w:r>
           </w:p>
         </w:tc>
@@ -2163,38 +2005,7 @@
                 <w:bCs/>
                 <w:sz w:val="24"/>
               </w:rPr>
-              <w:t xml:space="preserve">2 </w:t>
-            </w:r>
-            <w:proofErr w:type="spellStart"/>
-            <w:proofErr w:type="gramStart"/>
-            <w:r>
-              <w:rPr>
-                <w:rFonts w:hint="eastAsia"/>
-                <w:b/>
-                <w:bCs/>
-                <w:sz w:val="24"/>
-              </w:rPr>
-              <w:t>ApparatusRoom</w:t>
-            </w:r>
-            <w:proofErr w:type="spellEnd"/>
-            <w:r>
-              <w:rPr>
-                <w:rFonts w:hint="eastAsia"/>
-                <w:b/>
-                <w:bCs/>
-                <w:sz w:val="24"/>
-              </w:rPr>
-              <w:t xml:space="preserve"> /</w:t>
-            </w:r>
-            <w:proofErr w:type="gramEnd"/>
-            <w:r>
-              <w:rPr>
-                <w:rFonts w:hint="eastAsia"/>
-                <w:b/>
-                <w:bCs/>
-                <w:sz w:val="24"/>
-              </w:rPr>
-              <w:t xml:space="preserve"> 장치 방(구조 1, 구조 2)</w:t>
+              <w:t>2 ApparatusRoom / 장치 방(구조 1, 구조 2)</w:t>
             </w:r>
           </w:p>
         </w:tc>
@@ -3011,38 +2822,7 @@
                 <w:bCs/>
                 <w:sz w:val="24"/>
               </w:rPr>
-              <w:t xml:space="preserve">3 </w:t>
-            </w:r>
-            <w:proofErr w:type="spellStart"/>
-            <w:proofErr w:type="gramStart"/>
-            <w:r>
-              <w:rPr>
-                <w:rFonts w:hint="eastAsia"/>
-                <w:b/>
-                <w:bCs/>
-                <w:sz w:val="24"/>
-              </w:rPr>
-              <w:t>ServerRoom</w:t>
-            </w:r>
-            <w:proofErr w:type="spellEnd"/>
-            <w:r>
-              <w:rPr>
-                <w:rFonts w:hint="eastAsia"/>
-                <w:b/>
-                <w:bCs/>
-                <w:sz w:val="24"/>
-              </w:rPr>
-              <w:t xml:space="preserve"> /</w:t>
-            </w:r>
-            <w:proofErr w:type="gramEnd"/>
-            <w:r>
-              <w:rPr>
-                <w:rFonts w:hint="eastAsia"/>
-                <w:b/>
-                <w:bCs/>
-                <w:sz w:val="24"/>
-              </w:rPr>
-              <w:t xml:space="preserve"> 서버 방</w:t>
+              <w:t>3 ServerRoom / 서버 방</w:t>
             </w:r>
           </w:p>
         </w:tc>
@@ -3064,6 +2844,10 @@
                 <w:tab w:val="left" w:pos="7100"/>
               </w:tabs>
               <w:ind w:left="0"/>
+              <w:jc w:val="right"/>
+              <w:rPr>
+                <w:rFonts w:hint="eastAsia"/>
+              </w:rPr>
             </w:pPr>
             <w:r>
               <w:tab/>
@@ -3109,7 +2893,73 @@
               </w:drawing>
             </w:r>
             <w:r>
+              <w:rPr>
+                <w:rFonts w:hint="eastAsia"/>
+              </w:rPr>
+              <w:t xml:space="preserve">   </w:t>
+            </w:r>
+            <w:r>
+              <w:rPr>
+                <w:noProof/>
+              </w:rPr>
+              <w:drawing>
+                <wp:inline distT="0" distB="0" distL="0" distR="0" wp14:anchorId="7CFBC1B3" wp14:editId="791B2A96">
+                  <wp:extent cx="2483356" cy="2407158"/>
+                  <wp:effectExtent l="0" t="0" r="0" b="0"/>
+                  <wp:docPr id="1774985944" name="그림 30"/>
+                  <wp:cNvGraphicFramePr>
+                    <a:graphicFrameLocks xmlns:a="http://schemas.openxmlformats.org/drawingml/2006/main" noChangeAspect="1"/>
+                  </wp:cNvGraphicFramePr>
+                  <a:graphic xmlns:a="http://schemas.openxmlformats.org/drawingml/2006/main">
+                    <a:graphicData uri="http://schemas.openxmlformats.org/drawingml/2006/picture">
+                      <pic:pic xmlns:pic="http://schemas.openxmlformats.org/drawingml/2006/picture">
+                        <pic:nvPicPr>
+                          <pic:cNvPr id="1774985944" name="그림 1774985944"/>
+                          <pic:cNvPicPr/>
+                        </pic:nvPicPr>
+                        <pic:blipFill>
+                          <a:blip r:embed="rId13" cstate="print">
+                            <a:extLst>
+                              <a:ext uri="{28A0092B-C50C-407E-A947-70E740481C1C}">
+                                <a14:useLocalDpi xmlns:a14="http://schemas.microsoft.com/office/drawing/2010/main" val="0"/>
+                              </a:ext>
+                            </a:extLst>
+                          </a:blip>
+                          <a:stretch>
+                            <a:fillRect/>
+                          </a:stretch>
+                        </pic:blipFill>
+                        <pic:spPr>
+                          <a:xfrm>
+                            <a:off x="0" y="0"/>
+                            <a:ext cx="2483356" cy="2407158"/>
+                          </a:xfrm>
+                          <a:prstGeom prst="rect">
+                            <a:avLst/>
+                          </a:prstGeom>
+                        </pic:spPr>
+                      </pic:pic>
+                    </a:graphicData>
+                  </a:graphic>
+                </wp:inline>
+              </w:drawing>
+            </w:r>
+            <w:r>
               <w:tab/>
+            </w:r>
+            <w:r>
+              <w:rPr>
+                <w:rFonts w:hint="eastAsia"/>
+              </w:rPr>
+              <w:t>ㄴ</w:t>
+            </w:r>
+            <w:r>
+              <w:rPr>
+                <w:rFonts w:hint="eastAsia"/>
+                <w:sz w:val="20"/>
+                <w:szCs w:val="20"/>
+              </w:rPr>
+              <w:t>서버랙 배치 버전. 서버랙 높이: 175cm</w:t>
             </w:r>
           </w:p>
         </w:tc>
@@ -3133,6 +2983,7 @@
               <w:rPr>
                 <w:rFonts w:hint="eastAsia"/>
               </w:rPr>
+              <w:lastRenderedPageBreak/>
               <w:t xml:space="preserve">방 사이즈 </w:t>
             </w:r>
             <w:r>
@@ -3267,7 +3118,6 @@
               <w:rPr>
                 <w:rFonts w:hint="eastAsia"/>
               </w:rPr>
-              <w:lastRenderedPageBreak/>
               <w:t>스크랩 최대 생성 개수</w:t>
             </w:r>
           </w:p>
@@ -3687,58 +3537,7 @@
                 <w:bCs/>
                 <w:sz w:val="24"/>
               </w:rPr>
-              <w:t xml:space="preserve">4 </w:t>
-            </w:r>
-            <w:proofErr w:type="spellStart"/>
-            <w:proofErr w:type="gramStart"/>
-            <w:r>
-              <w:rPr>
-                <w:rFonts w:hint="eastAsia"/>
-                <w:b/>
-                <w:bCs/>
-                <w:sz w:val="24"/>
-              </w:rPr>
-              <w:t>CabinetRoom</w:t>
-            </w:r>
-            <w:proofErr w:type="spellEnd"/>
-            <w:r>
-              <w:rPr>
-                <w:rFonts w:hint="eastAsia"/>
-                <w:b/>
-                <w:bCs/>
-                <w:sz w:val="24"/>
-              </w:rPr>
-              <w:t xml:space="preserve"> /</w:t>
-            </w:r>
-            <w:proofErr w:type="gramEnd"/>
-            <w:r>
-              <w:rPr>
-                <w:rFonts w:hint="eastAsia"/>
-                <w:b/>
-                <w:bCs/>
-                <w:sz w:val="24"/>
-              </w:rPr>
-              <w:t xml:space="preserve"> </w:t>
-            </w:r>
-            <w:proofErr w:type="spellStart"/>
-            <w:r>
-              <w:rPr>
-                <w:rFonts w:hint="eastAsia"/>
-                <w:b/>
-                <w:bCs/>
-                <w:sz w:val="24"/>
-              </w:rPr>
-              <w:t>캐비넷</w:t>
-            </w:r>
-            <w:proofErr w:type="spellEnd"/>
-            <w:r>
-              <w:rPr>
-                <w:rFonts w:hint="eastAsia"/>
-                <w:b/>
-                <w:bCs/>
-                <w:sz w:val="24"/>
-              </w:rPr>
-              <w:t xml:space="preserve"> 방</w:t>
+              <w:t>4 CabinetRoom / 캐비넷 방</w:t>
             </w:r>
           </w:p>
         </w:tc>
@@ -4192,7 +3991,7 @@
                           <pic:cNvPicPr/>
                         </pic:nvPicPr>
                         <pic:blipFill rotWithShape="1">
-                          <a:blip r:embed="rId13"/>
+                          <a:blip r:embed="rId14"/>
                           <a:srcRect r="54557"/>
                           <a:stretch>
                             <a:fillRect/>
@@ -4253,7 +4052,7 @@
                           <pic:cNvPicPr/>
                         </pic:nvPicPr>
                         <pic:blipFill rotWithShape="1">
-                          <a:blip r:embed="rId13"/>
+                          <a:blip r:embed="rId14"/>
                           <a:srcRect l="45663"/>
                           <a:stretch>
                             <a:fillRect/>
@@ -4321,7 +4120,7 @@
                           <pic:cNvPicPr/>
                         </pic:nvPicPr>
                         <pic:blipFill>
-                          <a:blip r:embed="rId14"/>
+                          <a:blip r:embed="rId15"/>
                           <a:stretch>
                             <a:fillRect/>
                           </a:stretch>
@@ -4611,6 +4410,7 @@
               <w:rPr>
                 <w:rFonts w:hint="eastAsia"/>
               </w:rPr>
+              <w:lastRenderedPageBreak/>
               <w:t>판매기 생성 여부</w:t>
             </w:r>
           </w:p>
@@ -4735,7 +4535,6 @@
               <w:rPr>
                 <w:rFonts w:hint="eastAsia"/>
               </w:rPr>
-              <w:lastRenderedPageBreak/>
               <w:t>방 최소/최대 생성 개수</w:t>
             </w:r>
           </w:p>
@@ -4974,35 +4773,7 @@
         <w:rPr>
           <w:rFonts w:hint="eastAsia"/>
         </w:rPr>
-        <w:t xml:space="preserve">: 대각선으로 마주보는 모서리에 최대 2개의 </w:t>
-      </w:r>
-      <w:proofErr w:type="spellStart"/>
-      <w:r>
-        <w:rPr>
-          <w:rFonts w:hint="eastAsia"/>
-        </w:rPr>
-        <w:t>캐비넷이</w:t>
-      </w:r>
-      <w:proofErr w:type="spellEnd"/>
-      <w:r>
-        <w:rPr>
-          <w:rFonts w:hint="eastAsia"/>
-        </w:rPr>
-        <w:t xml:space="preserve"> 생성될 수 있다. </w:t>
-      </w:r>
-      <w:proofErr w:type="spellStart"/>
-      <w:r>
-        <w:rPr>
-          <w:rFonts w:hint="eastAsia"/>
-        </w:rPr>
-        <w:t>캐비넷은</w:t>
-      </w:r>
-      <w:proofErr w:type="spellEnd"/>
-      <w:r>
-        <w:rPr>
-          <w:rFonts w:hint="eastAsia"/>
-        </w:rPr>
-        <w:t xml:space="preserve"> 생성되더라도 열리지 않을 수도 있다.</w:t>
+        <w:t>: 대각선으로 마주보는 모서리에 최대 2개의 캐비넷이 생성될 수 있다. 캐비넷은 생성되더라도 열리지 않을 수도 있다.</w:t>
       </w:r>
     </w:p>
     <w:p>
@@ -5349,7 +5120,7 @@
                           <pic:cNvPicPr/>
                         </pic:nvPicPr>
                         <pic:blipFill>
-                          <a:blip r:embed="rId15"/>
+                          <a:blip r:embed="rId16"/>
                           <a:stretch>
                             <a:fillRect/>
                           </a:stretch>
@@ -6284,7 +6055,7 @@
                           <pic:cNvPicPr/>
                         </pic:nvPicPr>
                         <pic:blipFill>
-                          <a:blip r:embed="rId16"/>
+                          <a:blip r:embed="rId17"/>
                           <a:stretch>
                             <a:fillRect/>
                           </a:stretch>
@@ -7217,7 +6988,7 @@
                           <pic:cNvPicPr/>
                         </pic:nvPicPr>
                         <pic:blipFill>
-                          <a:blip r:embed="rId17"/>
+                          <a:blip r:embed="rId18"/>
                           <a:stretch>
                             <a:fillRect/>
                           </a:stretch>
@@ -7263,7 +7034,7 @@
                           <pic:cNvPicPr/>
                         </pic:nvPicPr>
                         <pic:blipFill>
-                          <a:blip r:embed="rId18"/>
+                          <a:blip r:embed="rId19"/>
                           <a:stretch>
                             <a:fillRect/>
                           </a:stretch>
@@ -7898,21 +7669,7 @@
         <w:rPr>
           <w:rFonts w:hint="eastAsia"/>
         </w:rPr>
-        <w:t xml:space="preserve">: </w:t>
-      </w:r>
-      <w:proofErr w:type="spellStart"/>
-      <w:r>
-        <w:rPr>
-          <w:rFonts w:hint="eastAsia"/>
-        </w:rPr>
-        <w:t>꺾임형</w:t>
-      </w:r>
-      <w:proofErr w:type="spellEnd"/>
-      <w:r>
-        <w:rPr>
-          <w:rFonts w:hint="eastAsia"/>
-        </w:rPr>
-        <w:t xml:space="preserve"> </w:t>
+        <w:t xml:space="preserve">: 꺾임형 </w:t>
       </w:r>
       <w:r>
         <w:t>–</w:t>
@@ -8194,7 +7951,7 @@
                           <pic:cNvPicPr/>
                         </pic:nvPicPr>
                         <pic:blipFill>
-                          <a:blip r:embed="rId19"/>
+                          <a:blip r:embed="rId20"/>
                           <a:stretch>
                             <a:fillRect/>
                           </a:stretch>
@@ -9099,7 +8856,7 @@
                           <pic:cNvPicPr/>
                         </pic:nvPicPr>
                         <pic:blipFill>
-                          <a:blip r:embed="rId20">
+                          <a:blip r:embed="rId21">
                             <a:extLst>
                               <a:ext uri="{28A0092B-C50C-407E-A947-70E740481C1C}">
                                 <a14:useLocalDpi xmlns:a14="http://schemas.microsoft.com/office/drawing/2010/main" val="0"/>
@@ -9147,7 +8904,7 @@
                 <w:noProof/>
               </w:rPr>
               <w:drawing>
-                <wp:inline distT="0" distB="0" distL="0" distR="0" wp14:anchorId="5AB745F1" wp14:editId="13871DF0">
+                <wp:inline distT="0" distB="0" distL="0" distR="0" wp14:anchorId="5AB745F1" wp14:editId="64465441">
                   <wp:extent cx="3211373" cy="2878884"/>
                   <wp:effectExtent l="0" t="0" r="8255" b="0"/>
                   <wp:docPr id="1021474114" name="그림 1"/>
@@ -9162,7 +8919,7 @@
                           <pic:cNvPicPr/>
                         </pic:nvPicPr>
                         <pic:blipFill>
-                          <a:blip r:embed="rId21" cstate="print">
+                          <a:blip r:embed="rId22" cstate="print">
                             <a:extLst>
                               <a:ext uri="{28A0092B-C50C-407E-A947-70E740481C1C}">
                                 <a14:useLocalDpi xmlns:a14="http://schemas.microsoft.com/office/drawing/2010/main" val="0"/>
@@ -9812,7 +9569,7 @@
                           <pic:cNvPicPr/>
                         </pic:nvPicPr>
                         <pic:blipFill>
-                          <a:blip r:embed="rId22"/>
+                          <a:blip r:embed="rId23"/>
                           <a:stretch>
                             <a:fillRect/>
                           </a:stretch>
@@ -10474,7 +10231,7 @@
                           <pic:cNvPicPr/>
                         </pic:nvPicPr>
                         <pic:blipFill>
-                          <a:blip r:embed="rId23"/>
+                          <a:blip r:embed="rId24"/>
                           <a:stretch>
                             <a:fillRect/>
                           </a:stretch>
@@ -11131,7 +10888,7 @@
                           <pic:cNvPicPr/>
                         </pic:nvPicPr>
                         <pic:blipFill>
-                          <a:blip r:embed="rId24"/>
+                          <a:blip r:embed="rId25"/>
                           <a:stretch>
                             <a:fillRect/>
                           </a:stretch>
@@ -11930,58 +11687,6 @@
                           <pic:cNvPicPr/>
                         </pic:nvPicPr>
                         <pic:blipFill>
-                          <a:blip r:embed="rId25"/>
-                          <a:stretch>
-                            <a:fillRect/>
-                          </a:stretch>
-                        </pic:blipFill>
-                        <pic:spPr>
-                          <a:xfrm>
-                            <a:off x="0" y="0"/>
-                            <a:ext cx="1800000" cy="1800000"/>
-                          </a:xfrm>
-                          <a:prstGeom prst="rect">
-                            <a:avLst/>
-                          </a:prstGeom>
-                        </pic:spPr>
-                      </pic:pic>
-                    </a:graphicData>
-                  </a:graphic>
-                </wp:inline>
-              </w:drawing>
-            </w:r>
-            <w:r>
-              <w:rPr>
-                <w:rFonts w:hint="eastAsia"/>
-              </w:rPr>
-              <w:t xml:space="preserve"> 2.</w:t>
-            </w:r>
-            <w:r>
-              <w:rPr>
-                <w:noProof/>
-              </w:rPr>
-              <w:t xml:space="preserve"> </w:t>
-            </w:r>
-            <w:r>
-              <w:rPr>
-                <w:noProof/>
-              </w:rPr>
-              <w:drawing>
-                <wp:inline distT="0" distB="0" distL="0" distR="0" wp14:anchorId="5255D08D" wp14:editId="47F584F6">
-                  <wp:extent cx="1800000" cy="1800000"/>
-                  <wp:effectExtent l="0" t="0" r="0" b="0"/>
-                  <wp:docPr id="625361329" name="그림 1"/>
-                  <wp:cNvGraphicFramePr>
-                    <a:graphicFrameLocks xmlns:a="http://schemas.openxmlformats.org/drawingml/2006/main" noChangeAspect="1"/>
-                  </wp:cNvGraphicFramePr>
-                  <a:graphic xmlns:a="http://schemas.openxmlformats.org/drawingml/2006/main">
-                    <a:graphicData uri="http://schemas.openxmlformats.org/drawingml/2006/picture">
-                      <pic:pic xmlns:pic="http://schemas.openxmlformats.org/drawingml/2006/picture">
-                        <pic:nvPicPr>
-                          <pic:cNvPr id="625361329" name=""/>
-                          <pic:cNvPicPr/>
-                        </pic:nvPicPr>
-                        <pic:blipFill>
                           <a:blip r:embed="rId26"/>
                           <a:stretch>
                             <a:fillRect/>
@@ -12006,36 +11711,23 @@
               <w:rPr>
                 <w:rFonts w:hint="eastAsia"/>
               </w:rPr>
+              <w:t xml:space="preserve"> 2.</w:t>
+            </w:r>
+            <w:r>
+              <w:rPr>
+                <w:noProof/>
+              </w:rPr>
               <w:t xml:space="preserve"> </w:t>
             </w:r>
-          </w:p>
-          <w:p>
-            <w:pPr>
-              <w:pStyle w:val="a6"/>
-              <w:ind w:left="0"/>
-              <w:jc w:val="center"/>
-            </w:pPr>
-            <w:r>
-              <w:rPr>
-                <w:rFonts w:hint="eastAsia"/>
-              </w:rPr>
-              <w:t>3.</w:t>
-            </w:r>
             <w:r>
               <w:rPr>
                 <w:noProof/>
               </w:rPr>
-              <w:t xml:space="preserve"> </w:t>
-            </w:r>
-            <w:r>
-              <w:rPr>
-                <w:noProof/>
-              </w:rPr>
               <w:drawing>
-                <wp:inline distT="0" distB="0" distL="0" distR="0" wp14:anchorId="1BF0444C" wp14:editId="1919FDDD">
+                <wp:inline distT="0" distB="0" distL="0" distR="0" wp14:anchorId="5255D08D" wp14:editId="47F584F6">
                   <wp:extent cx="1800000" cy="1800000"/>
                   <wp:effectExtent l="0" t="0" r="0" b="0"/>
-                  <wp:docPr id="53721540" name="그림 1"/>
+                  <wp:docPr id="625361329" name="그림 1"/>
                   <wp:cNvGraphicFramePr>
                     <a:graphicFrameLocks xmlns:a="http://schemas.openxmlformats.org/drawingml/2006/main" noChangeAspect="1"/>
                   </wp:cNvGraphicFramePr>
@@ -12043,7 +11735,7 @@
                     <a:graphicData uri="http://schemas.openxmlformats.org/drawingml/2006/picture">
                       <pic:pic xmlns:pic="http://schemas.openxmlformats.org/drawingml/2006/picture">
                         <pic:nvPicPr>
-                          <pic:cNvPr id="53721540" name=""/>
+                          <pic:cNvPr id="625361329" name=""/>
                           <pic:cNvPicPr/>
                         </pic:nvPicPr>
                         <pic:blipFill>
@@ -12070,6 +11762,71 @@
             <w:r>
               <w:rPr>
                 <w:rFonts w:hint="eastAsia"/>
+              </w:rPr>
+              <w:t xml:space="preserve"> </w:t>
+            </w:r>
+          </w:p>
+          <w:p>
+            <w:pPr>
+              <w:pStyle w:val="a6"/>
+              <w:ind w:left="0"/>
+              <w:jc w:val="center"/>
+            </w:pPr>
+            <w:r>
+              <w:rPr>
+                <w:rFonts w:hint="eastAsia"/>
+              </w:rPr>
+              <w:t>3.</w:t>
+            </w:r>
+            <w:r>
+              <w:rPr>
+                <w:noProof/>
+              </w:rPr>
+              <w:t xml:space="preserve"> </w:t>
+            </w:r>
+            <w:r>
+              <w:rPr>
+                <w:noProof/>
+              </w:rPr>
+              <w:drawing>
+                <wp:inline distT="0" distB="0" distL="0" distR="0" wp14:anchorId="1BF0444C" wp14:editId="1919FDDD">
+                  <wp:extent cx="1800000" cy="1800000"/>
+                  <wp:effectExtent l="0" t="0" r="0" b="0"/>
+                  <wp:docPr id="53721540" name="그림 1"/>
+                  <wp:cNvGraphicFramePr>
+                    <a:graphicFrameLocks xmlns:a="http://schemas.openxmlformats.org/drawingml/2006/main" noChangeAspect="1"/>
+                  </wp:cNvGraphicFramePr>
+                  <a:graphic xmlns:a="http://schemas.openxmlformats.org/drawingml/2006/main">
+                    <a:graphicData uri="http://schemas.openxmlformats.org/drawingml/2006/picture">
+                      <pic:pic xmlns:pic="http://schemas.openxmlformats.org/drawingml/2006/picture">
+                        <pic:nvPicPr>
+                          <pic:cNvPr id="53721540" name=""/>
+                          <pic:cNvPicPr/>
+                        </pic:nvPicPr>
+                        <pic:blipFill>
+                          <a:blip r:embed="rId28"/>
+                          <a:stretch>
+                            <a:fillRect/>
+                          </a:stretch>
+                        </pic:blipFill>
+                        <pic:spPr>
+                          <a:xfrm>
+                            <a:off x="0" y="0"/>
+                            <a:ext cx="1800000" cy="1800000"/>
+                          </a:xfrm>
+                          <a:prstGeom prst="rect">
+                            <a:avLst/>
+                          </a:prstGeom>
+                        </pic:spPr>
+                      </pic:pic>
+                    </a:graphicData>
+                  </a:graphic>
+                </wp:inline>
+              </w:drawing>
+            </w:r>
+            <w:r>
+              <w:rPr>
+                <w:rFonts w:hint="eastAsia"/>
                 <w:noProof/>
               </w:rPr>
               <w:t xml:space="preserve">4. </w:t>
@@ -12100,7 +11857,7 @@
                           <pic:cNvPicPr/>
                         </pic:nvPicPr>
                         <pic:blipFill>
-                          <a:blip r:embed="rId28"/>
+                          <a:blip r:embed="rId29"/>
                           <a:stretch>
                             <a:fillRect/>
                           </a:stretch>

</xml_diff>

<commit_message>
CubeInfos.json에 Shelf 위치 추가
</commit_message>
<xml_diff>
--- a/기획/공장 맵_방 구조 규칙.docx
+++ b/기획/공장 맵_방 구조 규칙.docx
@@ -64,12 +64,28 @@
     </w:p>
     <w:p/>
     <w:p>
+      <w:proofErr w:type="gramStart"/>
       <w:r>
         <w:rPr>
           <w:rFonts w:hint="eastAsia"/>
         </w:rPr>
-        <w:t>[ 참고 사항 ]</w:t>
+        <w:t>[ 참고</w:t>
       </w:r>
+      <w:proofErr w:type="gramEnd"/>
+      <w:r>
+        <w:rPr>
+          <w:rFonts w:hint="eastAsia"/>
+        </w:rPr>
+        <w:t xml:space="preserve"> </w:t>
+      </w:r>
+      <w:proofErr w:type="gramStart"/>
+      <w:r>
+        <w:rPr>
+          <w:rFonts w:hint="eastAsia"/>
+        </w:rPr>
+        <w:t>사항 ]</w:t>
+      </w:r>
+      <w:proofErr w:type="gramEnd"/>
     </w:p>
     <w:p>
       <w:pPr>
@@ -291,13 +307,23 @@
           <w:bCs/>
         </w:rPr>
       </w:pPr>
+      <w:proofErr w:type="spellStart"/>
       <w:r>
         <w:rPr>
           <w:rFonts w:hint="eastAsia"/>
           <w:b/>
           <w:bCs/>
         </w:rPr>
-        <w:t>DoorSocket(벽에 난 문 구멍): 150*275</w:t>
+        <w:t>DoorSocket</w:t>
+      </w:r>
+      <w:proofErr w:type="spellEnd"/>
+      <w:r>
+        <w:rPr>
+          <w:rFonts w:hint="eastAsia"/>
+          <w:b/>
+          <w:bCs/>
+        </w:rPr>
+        <w:t>(벽에 난 문 구멍): 150*275</w:t>
       </w:r>
     </w:p>
     <w:p>
@@ -342,15 +368,24 @@
           <w:bCs/>
         </w:rPr>
       </w:pPr>
+      <w:proofErr w:type="spellStart"/>
       <w:r>
         <w:rPr>
           <w:rFonts w:hint="eastAsia"/>
         </w:rPr>
-        <w:t>SellingMachine(판매기): 큐브 안에서 생길 수 있는 위치는 여러 곳이지만, 큐브 하나 당 하나의 판매기가 생성됨</w:t>
+        <w:t>SellingMachine</w:t>
+      </w:r>
+      <w:proofErr w:type="spellEnd"/>
+      <w:r>
+        <w:rPr>
+          <w:rFonts w:hint="eastAsia"/>
+        </w:rPr>
+        <w:t>(판매기): 큐브 안에서 생길 수 있는 위치는 여러 곳이지만, 큐브 하나 당 하나의 판매기가 생성됨</w:t>
       </w:r>
     </w:p>
     <w:p/>
     <w:p>
+      <w:proofErr w:type="gramStart"/>
       <w:r>
         <w:rPr>
           <w:rFonts w:hint="eastAsia"/>
@@ -367,7 +402,14 @@
         <w:rPr>
           <w:rFonts w:hint="eastAsia"/>
         </w:rPr>
-        <w:t xml:space="preserve">모든 스테이지 </w:t>
+        <w:t>모든</w:t>
+      </w:r>
+      <w:proofErr w:type="gramEnd"/>
+      <w:r>
+        <w:rPr>
+          <w:rFonts w:hint="eastAsia"/>
+        </w:rPr>
+        <w:t xml:space="preserve"> 스테이지 </w:t>
       </w:r>
       <w:r>
         <w:rPr>
@@ -385,7 +427,14 @@
         <w:rPr>
           <w:rFonts w:hint="eastAsia"/>
         </w:rPr>
-        <w:t xml:space="preserve"> &amp; 규칙</w:t>
+        <w:t xml:space="preserve"> &amp; </w:t>
+      </w:r>
+      <w:proofErr w:type="gramStart"/>
+      <w:r>
+        <w:rPr>
+          <w:rFonts w:hint="eastAsia"/>
+        </w:rPr>
+        <w:t>규칙</w:t>
       </w:r>
       <w:r>
         <w:rPr>
@@ -393,6 +442,7 @@
         </w:rPr>
         <w:t xml:space="preserve"> ]</w:t>
       </w:r>
+      <w:proofErr w:type="gramEnd"/>
     </w:p>
     <w:p>
       <w:pPr>
@@ -420,11 +470,19 @@
       <w:r>
         <w:t>’</w:t>
       </w:r>
+      <w:proofErr w:type="spellStart"/>
       <w:r>
         <w:rPr>
           <w:rFonts w:hint="eastAsia"/>
         </w:rPr>
-        <w:t>를 이용하여 열 수 있다.</w:t>
+        <w:t>를</w:t>
+      </w:r>
+      <w:proofErr w:type="spellEnd"/>
+      <w:r>
+        <w:rPr>
+          <w:rFonts w:hint="eastAsia"/>
+        </w:rPr>
+        <w:t xml:space="preserve"> 이용하여 열 수 있다.</w:t>
       </w:r>
     </w:p>
     <w:p>
@@ -439,7 +497,21 @@
         <w:rPr>
           <w:rFonts w:hint="eastAsia"/>
         </w:rPr>
-        <w:t>코어(장치)는 한 맵에 하나만 생성될 수 있다.</w:t>
+        <w:t xml:space="preserve">코어(장치)는 한 </w:t>
+      </w:r>
+      <w:proofErr w:type="spellStart"/>
+      <w:r>
+        <w:rPr>
+          <w:rFonts w:hint="eastAsia"/>
+        </w:rPr>
+        <w:t>맵에</w:t>
+      </w:r>
+      <w:proofErr w:type="spellEnd"/>
+      <w:r>
+        <w:rPr>
+          <w:rFonts w:hint="eastAsia"/>
+        </w:rPr>
+        <w:t xml:space="preserve"> 하나만 생성될 수 있다.</w:t>
       </w:r>
     </w:p>
     <w:p>
@@ -546,11 +618,19 @@
       <w:r>
         <w:t>’</w:t>
       </w:r>
+      <w:proofErr w:type="spellStart"/>
       <w:r>
         <w:rPr>
           <w:rFonts w:hint="eastAsia"/>
         </w:rPr>
-        <w:t>끼리는 바로 연결될 수 없다.</w:t>
+        <w:t>끼리는</w:t>
+      </w:r>
+      <w:proofErr w:type="spellEnd"/>
+      <w:r>
+        <w:rPr>
+          <w:rFonts w:hint="eastAsia"/>
+        </w:rPr>
+        <w:t xml:space="preserve"> 바로 연결될 수 없다.</w:t>
       </w:r>
     </w:p>
     <w:p>
@@ -573,11 +653,19 @@
       <w:r>
         <w:t>’</w:t>
       </w:r>
+      <w:proofErr w:type="spellStart"/>
       <w:r>
         <w:rPr>
           <w:rFonts w:hint="eastAsia"/>
         </w:rPr>
-        <w:t>끼리는 바로 연결될 수 있다.</w:t>
+        <w:t>끼리는</w:t>
+      </w:r>
+      <w:proofErr w:type="spellEnd"/>
+      <w:r>
+        <w:rPr>
+          <w:rFonts w:hint="eastAsia"/>
+        </w:rPr>
+        <w:t xml:space="preserve"> 바로 연결될 수 있다.</w:t>
       </w:r>
     </w:p>
     <w:p>
@@ -600,11 +688,19 @@
       <w:r>
         <w:t>’</w:t>
       </w:r>
+      <w:proofErr w:type="spellStart"/>
       <w:r>
         <w:rPr>
           <w:rFonts w:hint="eastAsia"/>
         </w:rPr>
-        <w:t>끼리는 바로 연결될 수 있다.</w:t>
+        <w:t>끼리는</w:t>
+      </w:r>
+      <w:proofErr w:type="spellEnd"/>
+      <w:r>
+        <w:rPr>
+          <w:rFonts w:hint="eastAsia"/>
+        </w:rPr>
+        <w:t xml:space="preserve"> 바로 연결될 수 있다.</w:t>
       </w:r>
     </w:p>
     <w:p>
@@ -662,7 +758,38 @@
                 <w:sz w:val="24"/>
               </w:rPr>
               <w:lastRenderedPageBreak/>
-              <w:t>0 MainEntranceRoom / 메인 입구 방</w:t>
+              <w:t xml:space="preserve">0 </w:t>
+            </w:r>
+            <w:proofErr w:type="spellStart"/>
+            <w:proofErr w:type="gramStart"/>
+            <w:r>
+              <w:rPr>
+                <w:rFonts w:hint="eastAsia"/>
+                <w:b/>
+                <w:bCs/>
+                <w:sz w:val="24"/>
+              </w:rPr>
+              <w:t>MainEntranceRoom</w:t>
+            </w:r>
+            <w:proofErr w:type="spellEnd"/>
+            <w:r>
+              <w:rPr>
+                <w:rFonts w:hint="eastAsia"/>
+                <w:b/>
+                <w:bCs/>
+                <w:sz w:val="24"/>
+              </w:rPr>
+              <w:t xml:space="preserve"> /</w:t>
+            </w:r>
+            <w:proofErr w:type="gramEnd"/>
+            <w:r>
+              <w:rPr>
+                <w:rFonts w:hint="eastAsia"/>
+                <w:b/>
+                <w:bCs/>
+                <w:sz w:val="24"/>
+              </w:rPr>
+              <w:t xml:space="preserve"> 메인 입구 방</w:t>
             </w:r>
           </w:p>
         </w:tc>
@@ -1323,7 +1450,38 @@
                 <w:bCs/>
                 <w:sz w:val="24"/>
               </w:rPr>
-              <w:t>1 GapRoom / 끊어진 방</w:t>
+              <w:t xml:space="preserve">1 </w:t>
+            </w:r>
+            <w:proofErr w:type="spellStart"/>
+            <w:proofErr w:type="gramStart"/>
+            <w:r>
+              <w:rPr>
+                <w:rFonts w:hint="eastAsia"/>
+                <w:b/>
+                <w:bCs/>
+                <w:sz w:val="24"/>
+              </w:rPr>
+              <w:t>GapRoom</w:t>
+            </w:r>
+            <w:proofErr w:type="spellEnd"/>
+            <w:r>
+              <w:rPr>
+                <w:rFonts w:hint="eastAsia"/>
+                <w:b/>
+                <w:bCs/>
+                <w:sz w:val="24"/>
+              </w:rPr>
+              <w:t xml:space="preserve"> /</w:t>
+            </w:r>
+            <w:proofErr w:type="gramEnd"/>
+            <w:r>
+              <w:rPr>
+                <w:rFonts w:hint="eastAsia"/>
+                <w:b/>
+                <w:bCs/>
+                <w:sz w:val="24"/>
+              </w:rPr>
+              <w:t xml:space="preserve"> 끊어진 방</w:t>
             </w:r>
           </w:p>
         </w:tc>
@@ -2005,7 +2163,38 @@
                 <w:bCs/>
                 <w:sz w:val="24"/>
               </w:rPr>
-              <w:t>2 ApparatusRoom / 장치 방(구조 1, 구조 2)</w:t>
+              <w:t xml:space="preserve">2 </w:t>
+            </w:r>
+            <w:proofErr w:type="spellStart"/>
+            <w:proofErr w:type="gramStart"/>
+            <w:r>
+              <w:rPr>
+                <w:rFonts w:hint="eastAsia"/>
+                <w:b/>
+                <w:bCs/>
+                <w:sz w:val="24"/>
+              </w:rPr>
+              <w:t>ApparatusRoom</w:t>
+            </w:r>
+            <w:proofErr w:type="spellEnd"/>
+            <w:r>
+              <w:rPr>
+                <w:rFonts w:hint="eastAsia"/>
+                <w:b/>
+                <w:bCs/>
+                <w:sz w:val="24"/>
+              </w:rPr>
+              <w:t xml:space="preserve"> /</w:t>
+            </w:r>
+            <w:proofErr w:type="gramEnd"/>
+            <w:r>
+              <w:rPr>
+                <w:rFonts w:hint="eastAsia"/>
+                <w:b/>
+                <w:bCs/>
+                <w:sz w:val="24"/>
+              </w:rPr>
+              <w:t xml:space="preserve"> 장치 방(구조 1, 구조 2)</w:t>
             </w:r>
           </w:p>
         </w:tc>
@@ -2822,7 +3011,38 @@
                 <w:bCs/>
                 <w:sz w:val="24"/>
               </w:rPr>
-              <w:t>3 ServerRoom / 서버 방</w:t>
+              <w:t xml:space="preserve">3 </w:t>
+            </w:r>
+            <w:proofErr w:type="spellStart"/>
+            <w:proofErr w:type="gramStart"/>
+            <w:r>
+              <w:rPr>
+                <w:rFonts w:hint="eastAsia"/>
+                <w:b/>
+                <w:bCs/>
+                <w:sz w:val="24"/>
+              </w:rPr>
+              <w:t>ServerRoom</w:t>
+            </w:r>
+            <w:proofErr w:type="spellEnd"/>
+            <w:r>
+              <w:rPr>
+                <w:rFonts w:hint="eastAsia"/>
+                <w:b/>
+                <w:bCs/>
+                <w:sz w:val="24"/>
+              </w:rPr>
+              <w:t xml:space="preserve"> /</w:t>
+            </w:r>
+            <w:proofErr w:type="gramEnd"/>
+            <w:r>
+              <w:rPr>
+                <w:rFonts w:hint="eastAsia"/>
+                <w:b/>
+                <w:bCs/>
+                <w:sz w:val="24"/>
+              </w:rPr>
+              <w:t xml:space="preserve"> 서버 방</w:t>
             </w:r>
           </w:p>
         </w:tc>
@@ -2845,9 +3065,6 @@
               </w:tabs>
               <w:ind w:left="0"/>
               <w:jc w:val="right"/>
-              <w:rPr>
-                <w:rFonts w:hint="eastAsia"/>
-              </w:rPr>
             </w:pPr>
             <w:r>
               <w:tab/>
@@ -2903,9 +3120,9 @@
                 <w:noProof/>
               </w:rPr>
               <w:drawing>
-                <wp:inline distT="0" distB="0" distL="0" distR="0" wp14:anchorId="7CFBC1B3" wp14:editId="791B2A96">
-                  <wp:extent cx="2483356" cy="2407158"/>
-                  <wp:effectExtent l="0" t="0" r="0" b="0"/>
+                <wp:inline distT="0" distB="0" distL="0" distR="0" wp14:anchorId="7CFBC1B3" wp14:editId="775CBA2A">
+                  <wp:extent cx="2574546" cy="2495549"/>
+                  <wp:effectExtent l="0" t="0" r="0" b="635"/>
                   <wp:docPr id="1774985944" name="그림 30"/>
                   <wp:cNvGraphicFramePr>
                     <a:graphicFrameLocks xmlns:a="http://schemas.openxmlformats.org/drawingml/2006/main" noChangeAspect="1"/>
@@ -2914,7 +3131,7 @@
                     <a:graphicData uri="http://schemas.openxmlformats.org/drawingml/2006/picture">
                       <pic:pic xmlns:pic="http://schemas.openxmlformats.org/drawingml/2006/picture">
                         <pic:nvPicPr>
-                          <pic:cNvPr id="1774985944" name="그림 1774985944"/>
+                          <pic:cNvPr id="1774985944" name="그림 30"/>
                           <pic:cNvPicPr/>
                         </pic:nvPicPr>
                         <pic:blipFill>
@@ -2932,7 +3149,7 @@
                         <pic:spPr>
                           <a:xfrm>
                             <a:off x="0" y="0"/>
-                            <a:ext cx="2483356" cy="2407158"/>
+                            <a:ext cx="2574546" cy="2495549"/>
                           </a:xfrm>
                           <a:prstGeom prst="rect">
                             <a:avLst/>
@@ -2947,6 +3164,7 @@
             <w:r>
               <w:tab/>
             </w:r>
+            <w:proofErr w:type="spellStart"/>
             <w:r>
               <w:rPr>
                 <w:rFonts w:hint="eastAsia"/>
@@ -2959,7 +3177,34 @@
                 <w:sz w:val="20"/>
                 <w:szCs w:val="20"/>
               </w:rPr>
-              <w:t>서버랙 배치 버전. 서버랙 높이: 175cm</w:t>
+              <w:t>서버랙</w:t>
+            </w:r>
+            <w:proofErr w:type="spellEnd"/>
+            <w:r>
+              <w:rPr>
+                <w:rFonts w:hint="eastAsia"/>
+                <w:sz w:val="20"/>
+                <w:szCs w:val="20"/>
+              </w:rPr>
+              <w:t xml:space="preserve"> 배치 버전. </w:t>
+            </w:r>
+            <w:proofErr w:type="spellStart"/>
+            <w:r>
+              <w:rPr>
+                <w:rFonts w:hint="eastAsia"/>
+                <w:sz w:val="20"/>
+                <w:szCs w:val="20"/>
+              </w:rPr>
+              <w:t>서버랙</w:t>
+            </w:r>
+            <w:proofErr w:type="spellEnd"/>
+            <w:r>
+              <w:rPr>
+                <w:rFonts w:hint="eastAsia"/>
+                <w:sz w:val="20"/>
+                <w:szCs w:val="20"/>
+              </w:rPr>
+              <w:t xml:space="preserve"> 높이: 175cm</w:t>
             </w:r>
           </w:p>
         </w:tc>
@@ -3537,7 +3782,58 @@
                 <w:bCs/>
                 <w:sz w:val="24"/>
               </w:rPr>
-              <w:t>4 CabinetRoom / 캐비넷 방</w:t>
+              <w:t xml:space="preserve">4 </w:t>
+            </w:r>
+            <w:proofErr w:type="spellStart"/>
+            <w:proofErr w:type="gramStart"/>
+            <w:r>
+              <w:rPr>
+                <w:rFonts w:hint="eastAsia"/>
+                <w:b/>
+                <w:bCs/>
+                <w:sz w:val="24"/>
+              </w:rPr>
+              <w:t>CabinetRoom</w:t>
+            </w:r>
+            <w:proofErr w:type="spellEnd"/>
+            <w:r>
+              <w:rPr>
+                <w:rFonts w:hint="eastAsia"/>
+                <w:b/>
+                <w:bCs/>
+                <w:sz w:val="24"/>
+              </w:rPr>
+              <w:t xml:space="preserve"> /</w:t>
+            </w:r>
+            <w:proofErr w:type="gramEnd"/>
+            <w:r>
+              <w:rPr>
+                <w:rFonts w:hint="eastAsia"/>
+                <w:b/>
+                <w:bCs/>
+                <w:sz w:val="24"/>
+              </w:rPr>
+              <w:t xml:space="preserve"> </w:t>
+            </w:r>
+            <w:proofErr w:type="spellStart"/>
+            <w:r>
+              <w:rPr>
+                <w:rFonts w:hint="eastAsia"/>
+                <w:b/>
+                <w:bCs/>
+                <w:sz w:val="24"/>
+              </w:rPr>
+              <w:t>캐비넷</w:t>
+            </w:r>
+            <w:proofErr w:type="spellEnd"/>
+            <w:r>
+              <w:rPr>
+                <w:rFonts w:hint="eastAsia"/>
+                <w:b/>
+                <w:bCs/>
+                <w:sz w:val="24"/>
+              </w:rPr>
+              <w:t xml:space="preserve"> 방</w:t>
             </w:r>
           </w:p>
         </w:tc>
@@ -4773,7 +5069,35 @@
         <w:rPr>
           <w:rFonts w:hint="eastAsia"/>
         </w:rPr>
-        <w:t>: 대각선으로 마주보는 모서리에 최대 2개의 캐비넷이 생성될 수 있다. 캐비넷은 생성되더라도 열리지 않을 수도 있다.</w:t>
+        <w:t xml:space="preserve">: 대각선으로 마주보는 모서리에 최대 2개의 </w:t>
+      </w:r>
+      <w:proofErr w:type="spellStart"/>
+      <w:r>
+        <w:rPr>
+          <w:rFonts w:hint="eastAsia"/>
+        </w:rPr>
+        <w:t>캐비넷이</w:t>
+      </w:r>
+      <w:proofErr w:type="spellEnd"/>
+      <w:r>
+        <w:rPr>
+          <w:rFonts w:hint="eastAsia"/>
+        </w:rPr>
+        <w:t xml:space="preserve"> 생성될 수 있다. </w:t>
+      </w:r>
+      <w:proofErr w:type="spellStart"/>
+      <w:r>
+        <w:rPr>
+          <w:rFonts w:hint="eastAsia"/>
+        </w:rPr>
+        <w:t>캐비넷은</w:t>
+      </w:r>
+      <w:proofErr w:type="spellEnd"/>
+      <w:r>
+        <w:rPr>
+          <w:rFonts w:hint="eastAsia"/>
+        </w:rPr>
+        <w:t xml:space="preserve"> 생성되더라도 열리지 않을 수도 있다.</w:t>
       </w:r>
     </w:p>
     <w:p>
@@ -4853,13 +5177,13 @@
               <mc:AlternateContent>
                 <mc:Choice Requires="wpg">
                   <w:drawing>
-                    <wp:anchor distT="0" distB="0" distL="114300" distR="114300" simplePos="0" relativeHeight="251708416" behindDoc="0" locked="0" layoutInCell="1" allowOverlap="1" wp14:anchorId="401925FC" wp14:editId="6CBFF42E">
+                    <wp:anchor distT="0" distB="0" distL="114300" distR="114300" simplePos="0" relativeHeight="251708416" behindDoc="0" locked="0" layoutInCell="1" allowOverlap="1" wp14:anchorId="401925FC" wp14:editId="5C1BB33C">
                       <wp:simplePos x="0" y="0"/>
                       <wp:positionH relativeFrom="column">
-                        <wp:posOffset>3307922</wp:posOffset>
+                        <wp:posOffset>3264265</wp:posOffset>
                       </wp:positionH>
                       <wp:positionV relativeFrom="paragraph">
-                        <wp:posOffset>993707</wp:posOffset>
+                        <wp:posOffset>993458</wp:posOffset>
                       </wp:positionV>
                       <wp:extent cx="241300" cy="261257"/>
                       <wp:effectExtent l="9207" t="0" r="15558" b="15557"/>
@@ -4965,7 +5289,7 @@
                 </mc:Choice>
                 <mc:Fallback>
                   <w:pict>
-                    <v:group w14:anchorId="4278F07D" id="그룹 2" o:spid="_x0000_s1026" style="position:absolute;margin-left:260.45pt;margin-top:78.25pt;width:19pt;height:20.55pt;rotation:90;z-index:251708416" coordsize="241300,261257" o:gfxdata="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">
+                    <v:group w14:anchorId="7DAD610B" id="그룹 2" o:spid="_x0000_s1026" style="position:absolute;margin-left:257.05pt;margin-top:78.25pt;width:19pt;height:20.55pt;rotation:90;z-index:251708416" coordsize="241300,261257" o:gfxdata="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">
                       <v:rect id="직사각형 1" o:spid="_x0000_s1027" style="position:absolute;width:241300;height:261257;visibility:visible;mso-wrap-style:square;v-text-anchor:middle" o:gfxdata="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" fillcolor="#ff1dc4" strokecolor="#030e13 [484]" strokeweight="1pt"/>
                       <v:rect id="직사각형 1" o:spid="_x0000_s1028" style="position:absolute;left:20096;top:30145;width:195943;height:80387;visibility:visible;mso-wrap-style:square;v-text-anchor:middle" o:gfxdata="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" fillcolor="#e59edc [1304]" strokecolor="#030e13 [484]" strokeweight="1pt"/>
                     </v:group>
@@ -5105,9 +5429,9 @@
                 <w:noProof/>
               </w:rPr>
               <w:drawing>
-                <wp:inline distT="0" distB="0" distL="0" distR="0" wp14:anchorId="74170433" wp14:editId="17C42D19">
-                  <wp:extent cx="2772162" cy="1905266"/>
-                  <wp:effectExtent l="0" t="0" r="9525" b="0"/>
+                <wp:inline distT="0" distB="0" distL="0" distR="0" wp14:anchorId="74170433" wp14:editId="0189A6DE">
+                  <wp:extent cx="2662725" cy="1905266"/>
+                  <wp:effectExtent l="0" t="0" r="4445" b="0"/>
                   <wp:docPr id="1181075830" name="그림 1"/>
                   <wp:cNvGraphicFramePr>
                     <a:graphicFrameLocks xmlns:a="http://schemas.openxmlformats.org/drawingml/2006/main" noChangeAspect="1"/>
@@ -5116,11 +5440,17 @@
                     <a:graphicData uri="http://schemas.openxmlformats.org/drawingml/2006/picture">
                       <pic:pic xmlns:pic="http://schemas.openxmlformats.org/drawingml/2006/picture">
                         <pic:nvPicPr>
-                          <pic:cNvPr id="1181075830" name=""/>
+                          <pic:cNvPr id="1181075830" name="그림 1"/>
                           <pic:cNvPicPr/>
                         </pic:nvPicPr>
                         <pic:blipFill>
-                          <a:blip r:embed="rId16"/>
+                          <a:blip r:embed="rId16">
+                            <a:extLst>
+                              <a:ext uri="{28A0092B-C50C-407E-A947-70E740481C1C}">
+                                <a14:useLocalDpi xmlns:a14="http://schemas.microsoft.com/office/drawing/2010/main" val="0"/>
+                              </a:ext>
+                            </a:extLst>
+                          </a:blip>
                           <a:stretch>
                             <a:fillRect/>
                           </a:stretch>
@@ -5128,7 +5458,7 @@
                         <pic:spPr>
                           <a:xfrm>
                             <a:off x="0" y="0"/>
-                            <a:ext cx="2772162" cy="1905266"/>
+                            <a:ext cx="2662725" cy="1905266"/>
                           </a:xfrm>
                           <a:prstGeom prst="rect">
                             <a:avLst/>
@@ -6040,9 +6370,9 @@
                 <w:noProof/>
               </w:rPr>
               <w:drawing>
-                <wp:inline distT="0" distB="0" distL="0" distR="0" wp14:anchorId="497362DE" wp14:editId="6CC63A66">
-                  <wp:extent cx="3096057" cy="2581635"/>
-                  <wp:effectExtent l="0" t="0" r="9525" b="9525"/>
+                <wp:inline distT="0" distB="0" distL="0" distR="0" wp14:anchorId="497362DE" wp14:editId="5B46FE99">
+                  <wp:extent cx="3096057" cy="2545063"/>
+                  <wp:effectExtent l="0" t="0" r="0" b="8255"/>
                   <wp:docPr id="2040789360" name="그림 1"/>
                   <wp:cNvGraphicFramePr>
                     <a:graphicFrameLocks xmlns:a="http://schemas.openxmlformats.org/drawingml/2006/main" noChangeAspect="1"/>
@@ -6051,11 +6381,17 @@
                     <a:graphicData uri="http://schemas.openxmlformats.org/drawingml/2006/picture">
                       <pic:pic xmlns:pic="http://schemas.openxmlformats.org/drawingml/2006/picture">
                         <pic:nvPicPr>
-                          <pic:cNvPr id="2040789360" name=""/>
+                          <pic:cNvPr id="2040789360" name="그림 1"/>
                           <pic:cNvPicPr/>
                         </pic:nvPicPr>
                         <pic:blipFill>
-                          <a:blip r:embed="rId17"/>
+                          <a:blip r:embed="rId17">
+                            <a:extLst>
+                              <a:ext uri="{28A0092B-C50C-407E-A947-70E740481C1C}">
+                                <a14:useLocalDpi xmlns:a14="http://schemas.microsoft.com/office/drawing/2010/main" val="0"/>
+                              </a:ext>
+                            </a:extLst>
+                          </a:blip>
                           <a:stretch>
                             <a:fillRect/>
                           </a:stretch>
@@ -6063,7 +6399,7 @@
                         <pic:spPr>
                           <a:xfrm>
                             <a:off x="0" y="0"/>
-                            <a:ext cx="3096057" cy="2581635"/>
+                            <a:ext cx="3096057" cy="2545063"/>
                           </a:xfrm>
                           <a:prstGeom prst="rect">
                             <a:avLst/>
@@ -7669,7 +8005,21 @@
         <w:rPr>
           <w:rFonts w:hint="eastAsia"/>
         </w:rPr>
-        <w:t xml:space="preserve">: 꺾임형 </w:t>
+        <w:t xml:space="preserve">: </w:t>
+      </w:r>
+      <w:proofErr w:type="spellStart"/>
+      <w:r>
+        <w:rPr>
+          <w:rFonts w:hint="eastAsia"/>
+        </w:rPr>
+        <w:t>꺾임형</w:t>
+      </w:r>
+      <w:proofErr w:type="spellEnd"/>
+      <w:r>
+        <w:rPr>
+          <w:rFonts w:hint="eastAsia"/>
+        </w:rPr>
+        <w:t xml:space="preserve"> </w:t>
       </w:r>
       <w:r>
         <w:t>–</w:t>
@@ -8569,6 +8919,330 @@
                 <w:noProof/>
               </w:rPr>
               <w:lastRenderedPageBreak/>
+              <mc:AlternateContent>
+                <mc:Choice Requires="wps">
+                  <w:drawing>
+                    <wp:anchor distT="0" distB="0" distL="114300" distR="114300" simplePos="0" relativeHeight="251716608" behindDoc="0" locked="0" layoutInCell="1" allowOverlap="1" wp14:anchorId="2CEA3F86" wp14:editId="233775E6">
+                      <wp:simplePos x="0" y="0"/>
+                      <wp:positionH relativeFrom="column">
+                        <wp:posOffset>2184615</wp:posOffset>
+                      </wp:positionH>
+                      <wp:positionV relativeFrom="paragraph">
+                        <wp:posOffset>2840221</wp:posOffset>
+                      </wp:positionV>
+                      <wp:extent cx="295532" cy="94533"/>
+                      <wp:effectExtent l="5398" t="0" r="14922" b="14923"/>
+                      <wp:wrapNone/>
+                      <wp:docPr id="801133582" name="직사각형 1"/>
+                      <wp:cNvGraphicFramePr/>
+                      <a:graphic xmlns:a="http://schemas.openxmlformats.org/drawingml/2006/main">
+                        <a:graphicData uri="http://schemas.microsoft.com/office/word/2010/wordprocessingShape">
+                          <wps:wsp>
+                            <wps:cNvSpPr/>
+                            <wps:spPr>
+                              <a:xfrm rot="16200000">
+                                <a:off x="0" y="0"/>
+                                <a:ext cx="295532" cy="94533"/>
+                              </a:xfrm>
+                              <a:prstGeom prst="rect">
+                                <a:avLst/>
+                              </a:prstGeom>
+                              <a:solidFill>
+                                <a:srgbClr val="BE6720">
+                                  <a:alpha val="80000"/>
+                                </a:srgbClr>
+                              </a:solidFill>
+                            </wps:spPr>
+                            <wps:style>
+                              <a:lnRef idx="2">
+                                <a:schemeClr val="accent1">
+                                  <a:shade val="15000"/>
+                                </a:schemeClr>
+                              </a:lnRef>
+                              <a:fillRef idx="1">
+                                <a:schemeClr val="accent1"/>
+                              </a:fillRef>
+                              <a:effectRef idx="0">
+                                <a:schemeClr val="accent1"/>
+                              </a:effectRef>
+                              <a:fontRef idx="minor">
+                                <a:schemeClr val="lt1"/>
+                              </a:fontRef>
+                            </wps:style>
+                            <wps:bodyPr rot="0" spcFirstLastPara="0" vertOverflow="overflow" horzOverflow="overflow" vert="horz" wrap="square" lIns="91440" tIns="45720" rIns="91440" bIns="45720" numCol="1" spcCol="0" rtlCol="0" fromWordArt="0" anchor="ctr" anchorCtr="0" forceAA="0" compatLnSpc="1">
+                              <a:prstTxWarp prst="textNoShape">
+                                <a:avLst/>
+                              </a:prstTxWarp>
+                              <a:noAutofit/>
+                            </wps:bodyPr>
+                          </wps:wsp>
+                        </a:graphicData>
+                      </a:graphic>
+                      <wp14:sizeRelH relativeFrom="margin">
+                        <wp14:pctWidth>0</wp14:pctWidth>
+                      </wp14:sizeRelH>
+                      <wp14:sizeRelV relativeFrom="margin">
+                        <wp14:pctHeight>0</wp14:pctHeight>
+                      </wp14:sizeRelV>
+                    </wp:anchor>
+                  </w:drawing>
+                </mc:Choice>
+                <mc:Fallback>
+                  <w:pict>
+                    <v:rect w14:anchorId="140AB152" id="직사각형 1" o:spid="_x0000_s1026" style="position:absolute;margin-left:172pt;margin-top:223.65pt;width:23.25pt;height:7.45pt;rotation:-90;z-index:251716608;visibility:visible;mso-wrap-style:square;mso-width-percent:0;mso-height-percent:0;mso-wrap-distance-left:9pt;mso-wrap-distance-top:0;mso-wrap-distance-right:9pt;mso-wrap-distance-bottom:0;mso-position-horizontal:absolute;mso-position-horizontal-relative:text;mso-position-vertical:absolute;mso-position-vertical-relative:text;mso-width-percent:0;mso-height-percent:0;mso-width-relative:margin;mso-height-relative:margin;v-text-anchor:middle" o:gfxdata="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" fillcolor="#be6720" strokecolor="#030e13 [484]" strokeweight="1pt">
+                      <v:fill opacity="52428f"/>
+                    </v:rect>
+                  </w:pict>
+                </mc:Fallback>
+              </mc:AlternateContent>
+            </w:r>
+            <w:r>
+              <w:rPr>
+                <w:noProof/>
+              </w:rPr>
+              <mc:AlternateContent>
+                <mc:Choice Requires="wps">
+                  <w:drawing>
+                    <wp:anchor distT="0" distB="0" distL="114300" distR="114300" simplePos="0" relativeHeight="251714560" behindDoc="0" locked="0" layoutInCell="1" allowOverlap="1" wp14:anchorId="6C718E6E" wp14:editId="28B14949">
+                      <wp:simplePos x="0" y="0"/>
+                      <wp:positionH relativeFrom="column">
+                        <wp:posOffset>2638915</wp:posOffset>
+                      </wp:positionH>
+                      <wp:positionV relativeFrom="paragraph">
+                        <wp:posOffset>2825744</wp:posOffset>
+                      </wp:positionV>
+                      <wp:extent cx="295532" cy="94533"/>
+                      <wp:effectExtent l="5398" t="0" r="14922" b="14923"/>
+                      <wp:wrapNone/>
+                      <wp:docPr id="647207606" name="직사각형 1"/>
+                      <wp:cNvGraphicFramePr/>
+                      <a:graphic xmlns:a="http://schemas.openxmlformats.org/drawingml/2006/main">
+                        <a:graphicData uri="http://schemas.microsoft.com/office/word/2010/wordprocessingShape">
+                          <wps:wsp>
+                            <wps:cNvSpPr/>
+                            <wps:spPr>
+                              <a:xfrm rot="16200000">
+                                <a:off x="0" y="0"/>
+                                <a:ext cx="295532" cy="94533"/>
+                              </a:xfrm>
+                              <a:prstGeom prst="rect">
+                                <a:avLst/>
+                              </a:prstGeom>
+                              <a:solidFill>
+                                <a:srgbClr val="BE6720">
+                                  <a:alpha val="80000"/>
+                                </a:srgbClr>
+                              </a:solidFill>
+                            </wps:spPr>
+                            <wps:style>
+                              <a:lnRef idx="2">
+                                <a:schemeClr val="accent1">
+                                  <a:shade val="15000"/>
+                                </a:schemeClr>
+                              </a:lnRef>
+                              <a:fillRef idx="1">
+                                <a:schemeClr val="accent1"/>
+                              </a:fillRef>
+                              <a:effectRef idx="0">
+                                <a:schemeClr val="accent1"/>
+                              </a:effectRef>
+                              <a:fontRef idx="minor">
+                                <a:schemeClr val="lt1"/>
+                              </a:fontRef>
+                            </wps:style>
+                            <wps:bodyPr rot="0" spcFirstLastPara="0" vertOverflow="overflow" horzOverflow="overflow" vert="horz" wrap="square" lIns="91440" tIns="45720" rIns="91440" bIns="45720" numCol="1" spcCol="0" rtlCol="0" fromWordArt="0" anchor="ctr" anchorCtr="0" forceAA="0" compatLnSpc="1">
+                              <a:prstTxWarp prst="textNoShape">
+                                <a:avLst/>
+                              </a:prstTxWarp>
+                              <a:noAutofit/>
+                            </wps:bodyPr>
+                          </wps:wsp>
+                        </a:graphicData>
+                      </a:graphic>
+                      <wp14:sizeRelH relativeFrom="margin">
+                        <wp14:pctWidth>0</wp14:pctWidth>
+                      </wp14:sizeRelH>
+                      <wp14:sizeRelV relativeFrom="margin">
+                        <wp14:pctHeight>0</wp14:pctHeight>
+                      </wp14:sizeRelV>
+                    </wp:anchor>
+                  </w:drawing>
+                </mc:Choice>
+                <mc:Fallback>
+                  <w:pict>
+                    <v:rect w14:anchorId="05C77791" id="직사각형 1" o:spid="_x0000_s1026" style="position:absolute;margin-left:207.8pt;margin-top:222.5pt;width:23.25pt;height:7.45pt;rotation:-90;z-index:251714560;visibility:visible;mso-wrap-style:square;mso-width-percent:0;mso-height-percent:0;mso-wrap-distance-left:9pt;mso-wrap-distance-top:0;mso-wrap-distance-right:9pt;mso-wrap-distance-bottom:0;mso-position-horizontal:absolute;mso-position-horizontal-relative:text;mso-position-vertical:absolute;mso-position-vertical-relative:text;mso-width-percent:0;mso-height-percent:0;mso-width-relative:margin;mso-height-relative:margin;v-text-anchor:middle" o:gfxdata="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" fillcolor="#be6720" strokecolor="#030e13 [484]" strokeweight="1pt">
+                      <v:fill opacity="52428f"/>
+                    </v:rect>
+                  </w:pict>
+                </mc:Fallback>
+              </mc:AlternateContent>
+            </w:r>
+            <w:r>
+              <w:rPr>
+                <w:noProof/>
+              </w:rPr>
+              <mc:AlternateContent>
+                <mc:Choice Requires="wps">
+                  <w:drawing>
+                    <wp:anchor distT="0" distB="0" distL="114300" distR="114300" simplePos="0" relativeHeight="251712512" behindDoc="0" locked="0" layoutInCell="1" allowOverlap="1" wp14:anchorId="20BEFFC0" wp14:editId="1BAF5B43">
+                      <wp:simplePos x="0" y="0"/>
+                      <wp:positionH relativeFrom="column">
+                        <wp:posOffset>2416493</wp:posOffset>
+                      </wp:positionH>
+                      <wp:positionV relativeFrom="paragraph">
+                        <wp:posOffset>2809576</wp:posOffset>
+                      </wp:positionV>
+                      <wp:extent cx="295532" cy="94533"/>
+                      <wp:effectExtent l="5398" t="0" r="14922" b="14923"/>
+                      <wp:wrapNone/>
+                      <wp:docPr id="2074340703" name="직사각형 1"/>
+                      <wp:cNvGraphicFramePr/>
+                      <a:graphic xmlns:a="http://schemas.openxmlformats.org/drawingml/2006/main">
+                        <a:graphicData uri="http://schemas.microsoft.com/office/word/2010/wordprocessingShape">
+                          <wps:wsp>
+                            <wps:cNvSpPr/>
+                            <wps:spPr>
+                              <a:xfrm rot="16200000">
+                                <a:off x="0" y="0"/>
+                                <a:ext cx="295532" cy="94533"/>
+                              </a:xfrm>
+                              <a:prstGeom prst="rect">
+                                <a:avLst/>
+                              </a:prstGeom>
+                              <a:solidFill>
+                                <a:srgbClr val="BE6720">
+                                  <a:alpha val="80000"/>
+                                </a:srgbClr>
+                              </a:solidFill>
+                            </wps:spPr>
+                            <wps:style>
+                              <a:lnRef idx="2">
+                                <a:schemeClr val="accent1">
+                                  <a:shade val="15000"/>
+                                </a:schemeClr>
+                              </a:lnRef>
+                              <a:fillRef idx="1">
+                                <a:schemeClr val="accent1"/>
+                              </a:fillRef>
+                              <a:effectRef idx="0">
+                                <a:schemeClr val="accent1"/>
+                              </a:effectRef>
+                              <a:fontRef idx="minor">
+                                <a:schemeClr val="lt1"/>
+                              </a:fontRef>
+                            </wps:style>
+                            <wps:bodyPr rot="0" spcFirstLastPara="0" vertOverflow="overflow" horzOverflow="overflow" vert="horz" wrap="square" lIns="91440" tIns="45720" rIns="91440" bIns="45720" numCol="1" spcCol="0" rtlCol="0" fromWordArt="0" anchor="ctr" anchorCtr="0" forceAA="0" compatLnSpc="1">
+                              <a:prstTxWarp prst="textNoShape">
+                                <a:avLst/>
+                              </a:prstTxWarp>
+                              <a:noAutofit/>
+                            </wps:bodyPr>
+                          </wps:wsp>
+                        </a:graphicData>
+                      </a:graphic>
+                      <wp14:sizeRelH relativeFrom="margin">
+                        <wp14:pctWidth>0</wp14:pctWidth>
+                      </wp14:sizeRelH>
+                      <wp14:sizeRelV relativeFrom="margin">
+                        <wp14:pctHeight>0</wp14:pctHeight>
+                      </wp14:sizeRelV>
+                    </wp:anchor>
+                  </w:drawing>
+                </mc:Choice>
+                <mc:Fallback>
+                  <w:pict>
+                    <v:rect w14:anchorId="00BB4FD2" id="직사각형 1" o:spid="_x0000_s1026" style="position:absolute;margin-left:190.3pt;margin-top:221.25pt;width:23.25pt;height:7.45pt;rotation:-90;z-index:251712512;visibility:visible;mso-wrap-style:square;mso-width-percent:0;mso-height-percent:0;mso-wrap-distance-left:9pt;mso-wrap-distance-top:0;mso-wrap-distance-right:9pt;mso-wrap-distance-bottom:0;mso-position-horizontal:absolute;mso-position-horizontal-relative:text;mso-position-vertical:absolute;mso-position-vertical-relative:text;mso-width-percent:0;mso-height-percent:0;mso-width-relative:margin;mso-height-relative:margin;v-text-anchor:middle" o:gfxdata="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" fillcolor="#be6720" strokecolor="#030e13 [484]" strokeweight="1pt">
+                      <v:fill opacity="52428f"/>
+                    </v:rect>
+                  </w:pict>
+                </mc:Fallback>
+              </mc:AlternateContent>
+            </w:r>
+            <w:r>
+              <w:rPr>
+                <w:noProof/>
+              </w:rPr>
+              <mc:AlternateContent>
+                <mc:Choice Requires="wps">
+                  <w:drawing>
+                    <wp:anchor distT="0" distB="0" distL="114300" distR="114300" simplePos="0" relativeHeight="251710464" behindDoc="0" locked="0" layoutInCell="1" allowOverlap="1" wp14:anchorId="332B21D6" wp14:editId="36153D9B">
+                      <wp:simplePos x="0" y="0"/>
+                      <wp:positionH relativeFrom="column">
+                        <wp:posOffset>3606815</wp:posOffset>
+                      </wp:positionH>
+                      <wp:positionV relativeFrom="paragraph">
+                        <wp:posOffset>1656765</wp:posOffset>
+                      </wp:positionV>
+                      <wp:extent cx="295532" cy="94533"/>
+                      <wp:effectExtent l="5398" t="0" r="14922" b="14923"/>
+                      <wp:wrapNone/>
+                      <wp:docPr id="2133381798" name="직사각형 1"/>
+                      <wp:cNvGraphicFramePr/>
+                      <a:graphic xmlns:a="http://schemas.openxmlformats.org/drawingml/2006/main">
+                        <a:graphicData uri="http://schemas.microsoft.com/office/word/2010/wordprocessingShape">
+                          <wps:wsp>
+                            <wps:cNvSpPr/>
+                            <wps:spPr>
+                              <a:xfrm rot="16200000">
+                                <a:off x="0" y="0"/>
+                                <a:ext cx="295532" cy="94533"/>
+                              </a:xfrm>
+                              <a:prstGeom prst="rect">
+                                <a:avLst/>
+                              </a:prstGeom>
+                              <a:solidFill>
+                                <a:srgbClr val="BE6720">
+                                  <a:alpha val="80000"/>
+                                </a:srgbClr>
+                              </a:solidFill>
+                            </wps:spPr>
+                            <wps:style>
+                              <a:lnRef idx="2">
+                                <a:schemeClr val="accent1">
+                                  <a:shade val="15000"/>
+                                </a:schemeClr>
+                              </a:lnRef>
+                              <a:fillRef idx="1">
+                                <a:schemeClr val="accent1"/>
+                              </a:fillRef>
+                              <a:effectRef idx="0">
+                                <a:schemeClr val="accent1"/>
+                              </a:effectRef>
+                              <a:fontRef idx="minor">
+                                <a:schemeClr val="lt1"/>
+                              </a:fontRef>
+                            </wps:style>
+                            <wps:bodyPr rot="0" spcFirstLastPara="0" vertOverflow="overflow" horzOverflow="overflow" vert="horz" wrap="square" lIns="91440" tIns="45720" rIns="91440" bIns="45720" numCol="1" spcCol="0" rtlCol="0" fromWordArt="0" anchor="ctr" anchorCtr="0" forceAA="0" compatLnSpc="1">
+                              <a:prstTxWarp prst="textNoShape">
+                                <a:avLst/>
+                              </a:prstTxWarp>
+                              <a:noAutofit/>
+                            </wps:bodyPr>
+                          </wps:wsp>
+                        </a:graphicData>
+                      </a:graphic>
+                      <wp14:sizeRelH relativeFrom="margin">
+                        <wp14:pctWidth>0</wp14:pctWidth>
+                      </wp14:sizeRelH>
+                      <wp14:sizeRelV relativeFrom="margin">
+                        <wp14:pctHeight>0</wp14:pctHeight>
+                      </wp14:sizeRelV>
+                    </wp:anchor>
+                  </w:drawing>
+                </mc:Choice>
+                <mc:Fallback>
+                  <w:pict>
+                    <v:rect w14:anchorId="1D8CBA34" id="직사각형 1" o:spid="_x0000_s1026" style="position:absolute;margin-left:284pt;margin-top:130.45pt;width:23.25pt;height:7.45pt;rotation:-90;z-index:251710464;visibility:visible;mso-wrap-style:square;mso-width-percent:0;mso-height-percent:0;mso-wrap-distance-left:9pt;mso-wrap-distance-top:0;mso-wrap-distance-right:9pt;mso-wrap-distance-bottom:0;mso-position-horizontal:absolute;mso-position-horizontal-relative:text;mso-position-vertical:absolute;mso-position-vertical-relative:text;mso-width-percent:0;mso-height-percent:0;mso-width-relative:margin;mso-height-relative:margin;v-text-anchor:middle" o:gfxdata="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" fillcolor="#be6720" strokecolor="#030e13 [484]" strokeweight="1pt">
+                      <v:fill opacity="52428f"/>
+                    </v:rect>
+                  </w:pict>
+                </mc:Fallback>
+              </mc:AlternateContent>
+            </w:r>
+            <w:r>
+              <w:rPr>
+                <w:noProof/>
+              </w:rPr>
               <mc:AlternateContent>
                 <mc:Choice Requires="wpg">
                   <w:drawing>
@@ -8904,7 +9578,7 @@
                 <w:noProof/>
               </w:rPr>
               <w:drawing>
-                <wp:inline distT="0" distB="0" distL="0" distR="0" wp14:anchorId="5AB745F1" wp14:editId="64465441">
+                <wp:inline distT="0" distB="0" distL="0" distR="0" wp14:anchorId="5AB745F1" wp14:editId="667FCE54">
                   <wp:extent cx="3211373" cy="2878884"/>
                   <wp:effectExtent l="0" t="0" r="8255" b="0"/>
                   <wp:docPr id="1021474114" name="그림 1"/>

</xml_diff>